<commit_message>
Nop ban nen ngay de co diem truoc (theo loi thay); cap nhat so tay va file Word
Co-Authored-By: Claude Opus 5.5 <noreply@anthropic.com>
</commit_message>
<xml_diff>
--- a/KIT_BAI1/HUONG_DAN_THI.docx
+++ b/KIT_BAI1/HUONG_DAN_THI.docx
@@ -737,7 +737,7 @@
               <w:rPr>
                 <w:b w:val="0"/>
               </w:rPr>
-              <w:t>3–4</w:t>
+              <w:t>2–4</w:t>
             </w:r>
           </w:p>
         </w:tc>
@@ -748,9 +748,24 @@
           <w:p>
             <w:r>
               <w:rPr>
+                <w:b/>
+              </w:rPr>
+              <w:t>vẫn nộp bản nền ngay</w:t>
+            </w:r>
+            <w:r>
+              <w:rPr>
                 <w:b w:val="0"/>
               </w:rPr>
-              <w:t>không nộp bản nền; chờ bản nâng cao rồi nộp một lần</w:t>
+              <w:t xml:space="preserve"> để có điểm (lời thầy); bản nâng cao chỉ nộp nếu script ghi </w:t>
+            </w:r>
+            <w:r>
+              <w:rPr>
+                <w:rFonts w:ascii="Consolas" w:hAnsi="Consolas"/>
+                <w:b w:val="0"/>
+                <w:color w:val="A31F34"/>
+                <w:sz w:val="20"/>
+              </w:rPr>
+              <w:t>TỐT HƠN</w:t>
             </w:r>
           </w:p>
         </w:tc>
@@ -765,7 +780,7 @@
               <w:rPr>
                 <w:b w:val="0"/>
               </w:rPr>
-              <w:t>1–2</w:t>
+              <w:t>chỉ 1</w:t>
             </w:r>
           </w:p>
         </w:tc>
@@ -778,7 +793,7 @@
               <w:rPr>
                 <w:b w:val="0"/>
               </w:rPr>
-              <w:t>chỉ nộp một lần vào cuối giờ, chọn file có điểm tự chấm cao nhất trong sổ</w:t>
+              <w:t>chờ bản nâng cao (hoặc cuối giờ), nộp file có điểm tự chấm cao nhất trong sổ</w:t>
             </w:r>
           </w:p>
         </w:tc>
@@ -2854,7 +2869,7 @@
               <w:rPr>
                 <w:b w:val="0"/>
               </w:rPr>
-              <w:t>3–4</w:t>
+              <w:t>2–4</w:t>
             </w:r>
           </w:p>
         </w:tc>
@@ -2867,13 +2882,28 @@
               <w:rPr>
                 <w:b/>
               </w:rPr>
-              <w:t>không</w:t>
+              <w:t>vẫn nộp bản nền ngay</w:t>
             </w:r>
             <w:r>
               <w:rPr>
                 <w:b w:val="0"/>
               </w:rPr>
-              <w:t xml:space="preserve"> nộp bản nền; chờ bản nâng cao rồi nộp một lần; còn lại để dành cho cải tiến</w:t>
+              <w:t xml:space="preserve"> để có điểm (lời thầy); bản nâng cao chỉ nộp nếu script ghi </w:t>
+            </w:r>
+            <w:r>
+              <w:rPr>
+                <w:rFonts w:ascii="Consolas" w:hAnsi="Consolas"/>
+                <w:b w:val="0"/>
+                <w:color w:val="A31F34"/>
+                <w:sz w:val="20"/>
+              </w:rPr>
+              <w:t>TỐT HƠN</w:t>
+            </w:r>
+            <w:r>
+              <w:rPr>
+                <w:b w:val="0"/>
+              </w:rPr>
+              <w:t>; giữ ít nhất 1 lượt cho cải tiến</w:t>
             </w:r>
           </w:p>
         </w:tc>
@@ -2888,7 +2918,7 @@
               <w:rPr>
                 <w:b w:val="0"/>
               </w:rPr>
-              <w:t>1–2</w:t>
+              <w:t>chỉ 1</w:t>
             </w:r>
           </w:p>
         </w:tc>
@@ -2901,7 +2931,7 @@
               <w:rPr>
                 <w:b w:val="0"/>
               </w:rPr>
-              <w:t xml:space="preserve">chỉ nộp một lần vào cuối giờ, chọn file có điểm tự chấm cao nhất trong </w:t>
+              <w:t xml:space="preserve">chờ bản nâng cao (hoặc cuối giờ), nộp file có điểm tự chấm cao nhất trong </w:t>
             </w:r>
             <w:r>
               <w:rPr>
@@ -9318,7 +9348,7 @@
         <w:rPr>
           <w:b/>
         </w:rPr>
-        <w:t>Thứ tự nên làm:</w:t>
+        <w:t>Thứ tự nên làm (lời thầy: nộp nhanh một bản có điểm trước, cải tiến sau):</w:t>
       </w:r>
       <w:r>
         <w:rPr>

</xml_diff>

<commit_message>
File Word: ghi cach tinh diem (lan nop cao nhat, trung binh 2 bai)
Co-Authored-By: Claude Opus 5.5 <noreply@anthropic.com>
</commit_message>
<xml_diff>
--- a/KIT_BAI1/HUONG_DAN_THI.docx
+++ b/KIT_BAI1/HUONG_DAN_THI.docx
@@ -94,6 +94,84 @@
           <w:b w:val="0"/>
         </w:rPr>
         <w:t>Trước giờ thi</w:t>
+      </w:r>
+    </w:p>
+    <w:p>
+      <w:r>
+        <w:rPr>
+          <w:b/>
+        </w:rPr>
+        <w:t>Cách tính điểm (BTC đã nói):</w:t>
+      </w:r>
+      <w:r>
+        <w:rPr>
+          <w:b w:val="0"/>
+        </w:rPr>
+        <w:t xml:space="preserve"> mỗi bài lấy </w:t>
+      </w:r>
+      <w:r>
+        <w:rPr>
+          <w:b/>
+        </w:rPr>
+        <w:t>lần nộp cao nhất</w:t>
+      </w:r>
+      <w:r>
+        <w:rPr>
+          <w:b w:val="0"/>
+        </w:rPr>
+        <w:t xml:space="preserve">, điểm cuối = </w:t>
+      </w:r>
+      <w:r>
+        <w:rPr>
+          <w:b/>
+        </w:rPr>
+        <w:t>trung bình của bài 1 và bài 2</w:t>
+      </w:r>
+      <w:r>
+        <w:rPr>
+          <w:b w:val="0"/>
+        </w:rPr>
+        <w:t>. Vì vậy:</w:t>
+      </w:r>
+    </w:p>
+    <w:p>
+      <w:pPr>
+        <w:pStyle w:val="ListBullet"/>
+      </w:pPr>
+      <w:r>
+        <w:rPr>
+          <w:b w:val="0"/>
+        </w:rPr>
+        <w:t xml:space="preserve">Nộp một file kém hơn </w:t>
+      </w:r>
+      <w:r>
+        <w:rPr>
+          <w:b/>
+        </w:rPr>
+        <w:t>không làm mất điểm</w:t>
+      </w:r>
+      <w:r>
+        <w:rPr>
+          <w:b w:val="0"/>
+        </w:rPr>
+        <w:t xml:space="preserve"> (chỉ tốn một lượt), không cần nộp lại file tốt nhất vào cuối giờ.</w:t>
+      </w:r>
+    </w:p>
+    <w:p>
+      <w:pPr>
+        <w:pStyle w:val="ListBullet"/>
+      </w:pPr>
+      <w:r>
+        <w:rPr>
+          <w:b/>
+        </w:rPr>
+        <w:t>Bài 2 quan trọng ngang bài 1.</w:t>
+      </w:r>
+      <w:r>
+        <w:rPr>
+          <w:b w:val="0"/>
+        </w:rPr>
+        <w:t xml:space="preserve"> Bài 1 có điểm rồi thì dồn sức (và token AI) cho bài 2; được 0 điểm bài 2 là mất một nửa tổng điểm.</w:t>
       </w:r>
     </w:p>
     <w:p>

</xml_diff>

<commit_message>
Bai 2 CV: DINOv2, CLIP doan theo ten nhan, tinh chinh MobileNetV3; YOLO11 khoanh / to vung (CHAY_YOLO.bat); EasyOCR doc chu (CHAY_OCR.bat)
Co-Authored-By: Claude Opus 5.5 <noreply@anthropic.com>
</commit_message>
<xml_diff>
--- a/KIT_BAI1/HUONG_DAN_THI.docx
+++ b/KIT_BAI1/HUONG_DAN_THI.docx
@@ -1485,6 +1485,324 @@
           <w:b w:val="0"/>
         </w:rPr>
         <w:t>.</w:t>
+      </w:r>
+    </w:p>
+    <w:p>
+      <w:r>
+        <w:rPr>
+          <w:b w:val="0"/>
+        </w:rPr>
+        <w:t xml:space="preserve">Đề về ẢNH (CV), chọn file </w:t>
+      </w:r>
+      <w:r>
+        <w:rPr>
+          <w:rFonts w:ascii="Consolas" w:hAnsi="Consolas"/>
+          <w:b w:val="0"/>
+          <w:color w:val="A31F34"/>
+          <w:sz w:val="20"/>
+        </w:rPr>
+        <w:t>.bat</w:t>
+      </w:r>
+      <w:r>
+        <w:rPr>
+          <w:b w:val="0"/>
+        </w:rPr>
+        <w:t xml:space="preserve"> theo việc đề yêu cầu:</w:t>
+      </w:r>
+    </w:p>
+    <w:tbl>
+      <w:tblPr>
+        <w:tblStyle w:val="TableGrid"/>
+        <w:tblW w:type="auto" w:w="0"/>
+        <w:tblLook w:firstColumn="1" w:firstRow="1" w:lastColumn="0" w:lastRow="0" w:noHBand="0" w:noVBand="1" w:val="04A0"/>
+      </w:tblPr>
+      <w:tblGrid>
+        <w:gridCol w:w="2880"/>
+        <w:gridCol w:w="2880"/>
+        <w:gridCol w:w="2880"/>
+      </w:tblGrid>
+      <w:tr>
+        <w:tc>
+          <w:tcPr>
+            <w:tcW w:type="dxa" w:w="2880"/>
+            <w:shd w:val="clear" w:color="auto" w:fill="DCE6F1"/>
+          </w:tcPr>
+          <w:p>
+            <w:r>
+              <w:rPr>
+                <w:b/>
+              </w:rPr>
+              <w:t>đề yêu cầu</w:t>
+            </w:r>
+          </w:p>
+        </w:tc>
+        <w:tc>
+          <w:tcPr>
+            <w:tcW w:type="dxa" w:w="2880"/>
+            <w:shd w:val="clear" w:color="auto" w:fill="DCE6F1"/>
+          </w:tcPr>
+          <w:p>
+            <w:r>
+              <w:rPr>
+                <w:b/>
+              </w:rPr>
+              <w:t>bấm đúp</w:t>
+            </w:r>
+          </w:p>
+        </w:tc>
+        <w:tc>
+          <w:tcPr>
+            <w:tcW w:type="dxa" w:w="2880"/>
+            <w:shd w:val="clear" w:color="auto" w:fill="DCE6F1"/>
+          </w:tcPr>
+          <w:p>
+            <w:r>
+              <w:rPr>
+                <w:b/>
+              </w:rPr>
+              <w:t>xem sổ tay bài 2</w:t>
+            </w:r>
+          </w:p>
+        </w:tc>
+      </w:tr>
+      <w:tr>
+        <w:tc>
+          <w:tcPr>
+            <w:tcW w:type="dxa" w:w="2880"/>
+          </w:tcPr>
+          <w:p>
+            <w:r>
+              <w:rPr>
+                <w:b w:val="0"/>
+              </w:rPr>
+              <w:t>ảnh này là loại gì (phân loại ảnh)</w:t>
+            </w:r>
+          </w:p>
+        </w:tc>
+        <w:tc>
+          <w:tcPr>
+            <w:tcW w:type="dxa" w:w="2880"/>
+          </w:tcPr>
+          <w:p>
+            <w:r>
+              <w:rPr>
+                <w:rFonts w:ascii="Consolas" w:hAnsi="Consolas"/>
+                <w:b w:val="0"/>
+                <w:color w:val="A31F34"/>
+                <w:sz w:val="20"/>
+              </w:rPr>
+              <w:t>CHAY_BAI2.bat</w:t>
+            </w:r>
+            <w:r>
+              <w:rPr>
+                <w:b w:val="0"/>
+              </w:rPr>
+              <w:t>, chọn kiểu 3 (tinh chỉnh: Enter = có)</w:t>
+            </w:r>
+          </w:p>
+        </w:tc>
+        <w:tc>
+          <w:tcPr>
+            <w:tcW w:type="dxa" w:w="2880"/>
+          </w:tcPr>
+          <w:p>
+            <w:r>
+              <w:rPr>
+                <w:b w:val="0"/>
+              </w:rPr>
+              <w:t>Phần B</w:t>
+            </w:r>
+          </w:p>
+        </w:tc>
+      </w:tr>
+      <w:tr>
+        <w:tc>
+          <w:tcPr>
+            <w:tcW w:type="dxa" w:w="2880"/>
+          </w:tcPr>
+          <w:p>
+            <w:r>
+              <w:rPr>
+                <w:b w:val="0"/>
+              </w:rPr>
+              <w:t>khoanh / đếm vật thể, tô vùng</w:t>
+            </w:r>
+          </w:p>
+        </w:tc>
+        <w:tc>
+          <w:tcPr>
+            <w:tcW w:type="dxa" w:w="2880"/>
+          </w:tcPr>
+          <w:p>
+            <w:r>
+              <w:rPr>
+                <w:rFonts w:ascii="Consolas" w:hAnsi="Consolas"/>
+                <w:b w:val="0"/>
+                <w:color w:val="A31F34"/>
+                <w:sz w:val="20"/>
+              </w:rPr>
+              <w:t>CHAY_YOLO.bat</w:t>
+            </w:r>
+          </w:p>
+        </w:tc>
+        <w:tc>
+          <w:tcPr>
+            <w:tcW w:type="dxa" w:w="2880"/>
+          </w:tcPr>
+          <w:p>
+            <w:r>
+              <w:rPr>
+                <w:b w:val="0"/>
+              </w:rPr>
+              <w:t>Phần B2</w:t>
+            </w:r>
+          </w:p>
+        </w:tc>
+      </w:tr>
+      <w:tr>
+        <w:tc>
+          <w:tcPr>
+            <w:tcW w:type="dxa" w:w="2880"/>
+          </w:tcPr>
+          <w:p>
+            <w:r>
+              <w:rPr>
+                <w:b w:val="0"/>
+              </w:rPr>
+              <w:t>đọc chữ trong ảnh</w:t>
+            </w:r>
+          </w:p>
+        </w:tc>
+        <w:tc>
+          <w:tcPr>
+            <w:tcW w:type="dxa" w:w="2880"/>
+          </w:tcPr>
+          <w:p>
+            <w:r>
+              <w:rPr>
+                <w:rFonts w:ascii="Consolas" w:hAnsi="Consolas"/>
+                <w:b w:val="0"/>
+                <w:color w:val="A31F34"/>
+                <w:sz w:val="20"/>
+              </w:rPr>
+              <w:t>CHAY_OCR.bat</w:t>
+            </w:r>
+          </w:p>
+        </w:tc>
+        <w:tc>
+          <w:tcPr>
+            <w:tcW w:type="dxa" w:w="2880"/>
+          </w:tcPr>
+          <w:p>
+            <w:r>
+              <w:rPr>
+                <w:b w:val="0"/>
+              </w:rPr>
+              <w:t>Phần B3</w:t>
+            </w:r>
+          </w:p>
+        </w:tc>
+      </w:tr>
+      <w:tr>
+        <w:tc>
+          <w:tcPr>
+            <w:tcW w:type="dxa" w:w="2880"/>
+          </w:tcPr>
+          <w:p>
+            <w:r>
+              <w:rPr>
+                <w:b w:val="0"/>
+              </w:rPr>
+              <w:t>video (vd ngôn ngữ ký hiệu)</w:t>
+            </w:r>
+          </w:p>
+        </w:tc>
+        <w:tc>
+          <w:tcPr>
+            <w:tcW w:type="dxa" w:w="2880"/>
+          </w:tcPr>
+          <w:p>
+            <w:r>
+              <w:rPr>
+                <w:rFonts w:ascii="Consolas" w:hAnsi="Consolas"/>
+                <w:b w:val="0"/>
+                <w:color w:val="A31F34"/>
+                <w:sz w:val="20"/>
+              </w:rPr>
+              <w:t>CHAY_BAI2.bat</w:t>
+            </w:r>
+            <w:r>
+              <w:rPr>
+                <w:b w:val="0"/>
+              </w:rPr>
+              <w:t>, chọn kiểu 6</w:t>
+            </w:r>
+          </w:p>
+        </w:tc>
+        <w:tc>
+          <w:tcPr>
+            <w:tcW w:type="dxa" w:w="2880"/>
+          </w:tcPr>
+          <w:p>
+            <w:r>
+              <w:rPr>
+                <w:b w:val="0"/>
+              </w:rPr>
+              <w:t>Phần B</w:t>
+            </w:r>
+          </w:p>
+        </w:tc>
+      </w:tr>
+    </w:tbl>
+    <w:p/>
+    <w:p>
+      <w:r>
+        <w:rPr>
+          <w:b w:val="0"/>
+        </w:rPr>
+        <w:t xml:space="preserve">YOLO và OCR ra file kết quả </w:t>
+      </w:r>
+      <w:r>
+        <w:rPr>
+          <w:rFonts w:ascii="Consolas" w:hAnsi="Consolas"/>
+          <w:b w:val="0"/>
+          <w:color w:val="A31F34"/>
+          <w:sz w:val="20"/>
+        </w:rPr>
+        <w:t>du_doan.csv</w:t>
+      </w:r>
+      <w:r>
+        <w:rPr>
+          <w:b w:val="0"/>
+        </w:rPr>
+        <w:t xml:space="preserve"> / </w:t>
+      </w:r>
+      <w:r>
+        <w:rPr>
+          <w:rFonts w:ascii="Consolas" w:hAnsi="Consolas"/>
+          <w:b w:val="0"/>
+          <w:color w:val="A31F34"/>
+          <w:sz w:val="20"/>
+        </w:rPr>
+        <w:t>chu_doc_duoc.csv</w:t>
+      </w:r>
+      <w:r>
+        <w:rPr>
+          <w:b w:val="0"/>
+        </w:rPr>
+        <w:t xml:space="preserve">; đổi sang đúng định dạng nộp bằng </w:t>
+      </w:r>
+      <w:r>
+        <w:rPr>
+          <w:b/>
+        </w:rPr>
+        <w:t>mẫu D</w:t>
+      </w:r>
+      <w:r>
+        <w:rPr>
+          <w:b w:val="0"/>
+        </w:rPr>
+        <w:t xml:space="preserve"> (nhờ AI của BTC, tốn ít token).</w:t>
       </w:r>
     </w:p>
     <w:p>
@@ -7728,9 +8046,243 @@
           <w:p>
             <w:r>
               <w:rPr>
-                <w:b w:val="0"/>
-              </w:rPr>
-              <w:t>khoanh vật thể (hộp), tô vùng (mask), sinh ảnh</w:t>
+                <w:b/>
+              </w:rPr>
+              <w:t>khoanh vật thể</w:t>
+            </w:r>
+            <w:r>
+              <w:rPr>
+                <w:b w:val="0"/>
+              </w:rPr>
+              <w:t xml:space="preserve"> (hộp), </w:t>
+            </w:r>
+            <w:r>
+              <w:rPr>
+                <w:b/>
+              </w:rPr>
+              <w:t>đếm</w:t>
+            </w:r>
+            <w:r>
+              <w:rPr>
+                <w:b w:val="0"/>
+              </w:rPr>
+              <w:t xml:space="preserve"> vật thể</w:t>
+            </w:r>
+          </w:p>
+        </w:tc>
+        <w:tc>
+          <w:tcPr>
+            <w:tcW w:type="dxa" w:w="2160"/>
+          </w:tcPr>
+          <w:p>
+            <w:r>
+              <w:rPr>
+                <w:b/>
+              </w:rPr>
+              <w:t>8. KHOANH</w:t>
+            </w:r>
+            <w:r>
+              <w:rPr>
+                <w:b w:val="0"/>
+              </w:rPr>
+              <w:t xml:space="preserve"> (</w:t>
+            </w:r>
+            <w:r>
+              <w:rPr>
+                <w:rFonts w:ascii="Consolas" w:hAnsi="Consolas"/>
+                <w:b w:val="0"/>
+                <w:color w:val="A31F34"/>
+                <w:sz w:val="20"/>
+              </w:rPr>
+              <w:t>CHAY_YOLO.bat</w:t>
+            </w:r>
+            <w:r>
+              <w:rPr>
+                <w:b w:val="0"/>
+              </w:rPr>
+              <w:t>)</w:t>
+            </w:r>
+          </w:p>
+        </w:tc>
+        <w:tc>
+          <w:tcPr>
+            <w:tcW w:type="dxa" w:w="2160"/>
+          </w:tcPr>
+          <w:p>
+            <w:r>
+              <w:rPr>
+                <w:b w:val="0"/>
+              </w:rPr>
+              <w:t>có → Phần B2</w:t>
+            </w:r>
+          </w:p>
+        </w:tc>
+      </w:tr>
+      <w:tr>
+        <w:tc>
+          <w:tcPr>
+            <w:tcW w:type="dxa" w:w="2160"/>
+          </w:tcPr>
+          <w:p>
+            <w:r>
+              <w:rPr>
+                <w:b w:val="0"/>
+              </w:rPr>
+              <w:t>ảnh</w:t>
+            </w:r>
+          </w:p>
+        </w:tc>
+        <w:tc>
+          <w:tcPr>
+            <w:tcW w:type="dxa" w:w="2160"/>
+          </w:tcPr>
+          <w:p>
+            <w:r>
+              <w:rPr>
+                <w:b/>
+              </w:rPr>
+              <w:t>tô vùng</w:t>
+            </w:r>
+            <w:r>
+              <w:rPr>
+                <w:b w:val="0"/>
+              </w:rPr>
+              <w:t xml:space="preserve"> (mask, segmentation)</w:t>
+            </w:r>
+          </w:p>
+        </w:tc>
+        <w:tc>
+          <w:tcPr>
+            <w:tcW w:type="dxa" w:w="2160"/>
+          </w:tcPr>
+          <w:p>
+            <w:r>
+              <w:rPr>
+                <w:b/>
+              </w:rPr>
+              <w:t>8. KHOANH</w:t>
+            </w:r>
+            <w:r>
+              <w:rPr>
+                <w:b w:val="0"/>
+              </w:rPr>
+              <w:t xml:space="preserve"> việc 3–4</w:t>
+            </w:r>
+          </w:p>
+        </w:tc>
+        <w:tc>
+          <w:tcPr>
+            <w:tcW w:type="dxa" w:w="2160"/>
+          </w:tcPr>
+          <w:p>
+            <w:r>
+              <w:rPr>
+                <w:b w:val="0"/>
+              </w:rPr>
+              <w:t>có (cần dữ liệu định dạng YOLO) → Phần B2</w:t>
+            </w:r>
+          </w:p>
+        </w:tc>
+      </w:tr>
+      <w:tr>
+        <w:tc>
+          <w:tcPr>
+            <w:tcW w:type="dxa" w:w="2160"/>
+          </w:tcPr>
+          <w:p>
+            <w:r>
+              <w:rPr>
+                <w:b w:val="0"/>
+              </w:rPr>
+              <w:t>ảnh có chữ (biển số, hoá đơn, biển hiệu...)</w:t>
+            </w:r>
+          </w:p>
+        </w:tc>
+        <w:tc>
+          <w:tcPr>
+            <w:tcW w:type="dxa" w:w="2160"/>
+          </w:tcPr>
+          <w:p>
+            <w:r>
+              <w:rPr>
+                <w:b/>
+              </w:rPr>
+              <w:t>đọc chữ</w:t>
+            </w:r>
+          </w:p>
+        </w:tc>
+        <w:tc>
+          <w:tcPr>
+            <w:tcW w:type="dxa" w:w="2160"/>
+          </w:tcPr>
+          <w:p>
+            <w:r>
+              <w:rPr>
+                <w:b/>
+              </w:rPr>
+              <w:t>9. ĐỌC CHỮ</w:t>
+            </w:r>
+            <w:r>
+              <w:rPr>
+                <w:b w:val="0"/>
+              </w:rPr>
+              <w:t xml:space="preserve"> (</w:t>
+            </w:r>
+            <w:r>
+              <w:rPr>
+                <w:rFonts w:ascii="Consolas" w:hAnsi="Consolas"/>
+                <w:b w:val="0"/>
+                <w:color w:val="A31F34"/>
+                <w:sz w:val="20"/>
+              </w:rPr>
+              <w:t>CHAY_OCR.bat</w:t>
+            </w:r>
+            <w:r>
+              <w:rPr>
+                <w:b w:val="0"/>
+              </w:rPr>
+              <w:t>)</w:t>
+            </w:r>
+          </w:p>
+        </w:tc>
+        <w:tc>
+          <w:tcPr>
+            <w:tcW w:type="dxa" w:w="2160"/>
+          </w:tcPr>
+          <w:p>
+            <w:r>
+              <w:rPr>
+                <w:b w:val="0"/>
+              </w:rPr>
+              <w:t>có → Phần B3</w:t>
+            </w:r>
+          </w:p>
+        </w:tc>
+      </w:tr>
+      <w:tr>
+        <w:tc>
+          <w:tcPr>
+            <w:tcW w:type="dxa" w:w="2160"/>
+          </w:tcPr>
+          <w:p>
+            <w:r>
+              <w:rPr>
+                <w:b w:val="0"/>
+              </w:rPr>
+              <w:t>ảnh</w:t>
+            </w:r>
+          </w:p>
+        </w:tc>
+        <w:tc>
+          <w:tcPr>
+            <w:tcW w:type="dxa" w:w="2160"/>
+          </w:tcPr>
+          <w:p>
+            <w:r>
+              <w:rPr>
+                <w:b w:val="0"/>
+              </w:rPr>
+              <w:t>sinh ảnh mới</w:t>
             </w:r>
           </w:p>
         </w:tc>
@@ -8481,6 +9033,86 @@
           </w:p>
         </w:tc>
       </w:tr>
+      <w:tr>
+        <w:tc>
+          <w:tcPr>
+            <w:tcW w:type="dxa" w:w="4320"/>
+          </w:tcPr>
+          <w:p>
+            <w:r>
+              <w:rPr>
+                <w:rFonts w:ascii="Consolas" w:hAnsi="Consolas"/>
+                <w:b w:val="0"/>
+                <w:color w:val="A31F34"/>
+                <w:sz w:val="20"/>
+              </w:rPr>
+              <w:t>TINH CHỈNH thêm mạng nơ-ron? 1=CÓ 2=KHÔNG</w:t>
+            </w:r>
+            <w:r>
+              <w:rPr>
+                <w:b w:val="0"/>
+              </w:rPr>
+              <w:t xml:space="preserve"> (kiểu 3)</w:t>
+            </w:r>
+          </w:p>
+        </w:tc>
+        <w:tc>
+          <w:tcPr>
+            <w:tcW w:type="dxa" w:w="4320"/>
+          </w:tcPr>
+          <w:p>
+            <w:r>
+              <w:rPr>
+                <w:b w:val="0"/>
+              </w:rPr>
+              <w:t xml:space="preserve">Enter (= CÓ). Máy </w:t>
+            </w:r>
+            <w:r>
+              <w:rPr>
+                <w:b/>
+              </w:rPr>
+              <w:t>ghi file nộp chính trước</w:t>
+            </w:r>
+            <w:r>
+              <w:rPr>
+                <w:b w:val="0"/>
+              </w:rPr>
+              <w:t>, rồi mới tinh chỉnh</w:t>
+            </w:r>
+          </w:p>
+        </w:tc>
+      </w:tr>
+      <w:tr>
+        <w:tc>
+          <w:tcPr>
+            <w:tcW w:type="dxa" w:w="4320"/>
+          </w:tcPr>
+          <w:p>
+            <w:r>
+              <w:rPr>
+                <w:rFonts w:ascii="Consolas" w:hAnsi="Consolas"/>
+                <w:b w:val="0"/>
+                <w:color w:val="A31F34"/>
+                <w:sz w:val="20"/>
+              </w:rPr>
+              <w:t>Tinh chỉnh tối đa bao nhiêu phút?</w:t>
+            </w:r>
+          </w:p>
+        </w:tc>
+        <w:tc>
+          <w:tcPr>
+            <w:tcW w:type="dxa" w:w="4320"/>
+          </w:tcPr>
+          <w:p>
+            <w:r>
+              <w:rPr>
+                <w:b w:val="0"/>
+              </w:rPr>
+              <w:t>Enter (= 20). Ít thời gian thì gõ 10</w:t>
+            </w:r>
+          </w:p>
+        </w:tc>
+      </w:tr>
     </w:tbl>
     <w:p/>
     <w:p>
@@ -9077,22 +9709,17 @@
       </w:r>
     </w:p>
     <w:p>
-      <w:pPr>
-        <w:pStyle w:val="Heading2"/>
-      </w:pPr>
-      <w:r>
-        <w:rPr>
-          <w:b w:val="0"/>
-        </w:rPr>
-        <w:t>PHẦN C. Gặp lỗi</w:t>
-      </w:r>
-    </w:p>
-    <w:p>
-      <w:r>
-        <w:rPr>
-          <w:b w:val="0"/>
-        </w:rPr>
-        <w:t xml:space="preserve">Máy in </w:t>
+      <w:r>
+        <w:rPr>
+          <w:b/>
+        </w:rPr>
+        <w:t>Riêng kiểu 3 (ẢNH):</w:t>
+      </w:r>
+      <w:r>
+        <w:rPr>
+          <w:b w:val="0"/>
+        </w:rPr>
+        <w:t xml:space="preserve"> máy thử 3 bộ đọc ảnh có sẵn (ResNet50, CLIP, DINOv2), ghép cả ba, và "CLIP đoán theo tên nhãn" (không học, chỉ hợp khi nhãn là chữ tiếng Anh như </w:t>
       </w:r>
       <w:r>
         <w:rPr>
@@ -9101,13 +9728,28 @@
           <w:color w:val="A31F34"/>
           <w:sz w:val="20"/>
         </w:rPr>
-        <w:t>!!! LỖI: ...</w:t>
-      </w:r>
-      <w:r>
-        <w:rPr>
-          <w:b w:val="0"/>
-        </w:rPr>
-        <w:t xml:space="preserve"> kèm khoảng 20 dòng phía trên.</w:t>
+        <w:t>cat</w:t>
+      </w:r>
+      <w:r>
+        <w:rPr>
+          <w:b w:val="0"/>
+        </w:rPr>
+        <w:t xml:space="preserve">, </w:t>
+      </w:r>
+      <w:r>
+        <w:rPr>
+          <w:rFonts w:ascii="Consolas" w:hAnsi="Consolas"/>
+          <w:b w:val="0"/>
+          <w:color w:val="A31F34"/>
+          <w:sz w:val="20"/>
+        </w:rPr>
+        <w:t>dog</w:t>
+      </w:r>
+      <w:r>
+        <w:rPr>
+          <w:b w:val="0"/>
+        </w:rPr>
+        <w:t>). Khi đã có file nộp chính, nếu chọn tinh chỉnh, máy học tiếp cả mạng MobileNetV3 trên ảnh của đề, rồi in một trong hai dòng:</w:t>
       </w:r>
     </w:p>
     <w:tbl>
@@ -9131,7 +9773,7 @@
               <w:rPr>
                 <w:b/>
               </w:rPr>
-              <w:t>dòng lỗi có chữ</w:t>
+              <w:t>dòng hiện ra</w:t>
             </w:r>
           </w:p>
         </w:tc>
@@ -9145,7 +9787,7 @@
               <w:rPr>
                 <w:b/>
               </w:rPr>
-              <w:t>cách xử lý</w:t>
+              <w:t>em làm gì</w:t>
             </w:r>
           </w:p>
         </w:tc>
@@ -9163,7 +9805,7 @@
                 <w:color w:val="A31F34"/>
                 <w:sz w:val="20"/>
               </w:rPr>
-              <w:t>Không thấy file / thư mục đó</w:t>
+              <w:t>&gt;&gt;&gt; Tinh chỉnh TỐT HƠN ... Nên nộp: ...\tinh_chinh\submission.csv</w:t>
             </w:r>
           </w:p>
         </w:tc>
@@ -9176,7 +9818,7 @@
               <w:rPr>
                 <w:b w:val="0"/>
               </w:rPr>
-              <w:t>kéo thả lại đúng file</w:t>
+              <w:t>nộp file đó</w:t>
             </w:r>
           </w:p>
         </w:tc>
@@ -9194,7 +9836,7 @@
                 <w:color w:val="A31F34"/>
                 <w:sz w:val="20"/>
               </w:rPr>
-              <w:t>Không thấy ... file (vd ...)</w:t>
+              <w:t>&gt;&gt;&gt; Tinh chỉnh KHÔNG hơn rõ ... Giữ file nộp chính</w:t>
             </w:r>
           </w:p>
         </w:tc>
@@ -9207,195 +9849,7 @@
               <w:rPr>
                 <w:b w:val="0"/>
               </w:rPr>
-              <w:t xml:space="preserve">sai thư mục chứa ảnh / tiếng: chạy lại, kéo đúng thư mục ở câu </w:t>
-            </w:r>
-            <w:r>
-              <w:rPr>
-                <w:rFonts w:ascii="Consolas" w:hAnsi="Consolas"/>
-                <w:b w:val="0"/>
-                <w:color w:val="A31F34"/>
-                <w:sz w:val="20"/>
-              </w:rPr>
-              <w:t>THƯ MỤC chứa các file đó</w:t>
-            </w:r>
-          </w:p>
-        </w:tc>
-      </w:tr>
-      <w:tr>
-        <w:tc>
-          <w:tcPr>
-            <w:tcW w:type="dxa" w:w="4320"/>
-          </w:tcPr>
-          <w:p>
-            <w:r>
-              <w:rPr>
-                <w:rFonts w:ascii="Consolas" w:hAnsi="Consolas"/>
-                <w:b w:val="0"/>
-                <w:color w:val="A31F34"/>
-                <w:sz w:val="20"/>
-              </w:rPr>
-              <w:t>Thư mục train phải có thư mục con cho từng lớp</w:t>
-            </w:r>
-          </w:p>
-        </w:tc>
-        <w:tc>
-          <w:tcPr>
-            <w:tcW w:type="dxa" w:w="4320"/>
-          </w:tcPr>
-          <w:p>
-            <w:r>
-              <w:rPr>
-                <w:b w:val="0"/>
-              </w:rPr>
-              <w:t>thư mục ảnh không chia theo lớp: dùng file bảng (csv) của đề thay cho thư mục</w:t>
-            </w:r>
-          </w:p>
-        </w:tc>
-      </w:tr>
-      <w:tr>
-        <w:tc>
-          <w:tcPr>
-            <w:tcW w:type="dxa" w:w="4320"/>
-          </w:tcPr>
-          <w:p>
-            <w:r>
-              <w:rPr>
-                <w:rFonts w:ascii="Consolas" w:hAnsi="Consolas"/>
-                <w:b w:val="0"/>
-                <w:color w:val="A31F34"/>
-                <w:sz w:val="20"/>
-              </w:rPr>
-              <w:t>KeyError: '&lt;tên cột&gt;'</w:t>
-            </w:r>
-          </w:p>
-        </w:tc>
-        <w:tc>
-          <w:tcPr>
-            <w:tcW w:type="dxa" w:w="4320"/>
-          </w:tcPr>
-          <w:p>
-            <w:r>
-              <w:rPr>
-                <w:b w:val="0"/>
-              </w:rPr>
-              <w:t xml:space="preserve">gõ sai tên cột: chạy lại, gõ </w:t>
-            </w:r>
-            <w:r>
-              <w:rPr>
-                <w:b/>
-              </w:rPr>
-              <w:t>số thứ tự</w:t>
-            </w:r>
-            <w:r>
-              <w:rPr>
-                <w:b w:val="0"/>
-              </w:rPr>
-              <w:t xml:space="preserve"> cột cho chắc</w:t>
-            </w:r>
-          </w:p>
-        </w:tc>
-      </w:tr>
-      <w:tr>
-        <w:tc>
-          <w:tcPr>
-            <w:tcW w:type="dxa" w:w="4320"/>
-          </w:tcPr>
-          <w:p>
-            <w:r>
-              <w:rPr>
-                <w:rFonts w:ascii="Consolas" w:hAnsi="Consolas"/>
-                <w:b w:val="0"/>
-                <w:color w:val="A31F34"/>
-                <w:sz w:val="20"/>
-              </w:rPr>
-              <w:t>No module named ...</w:t>
-            </w:r>
-          </w:p>
-        </w:tc>
-        <w:tc>
-          <w:tcPr>
-            <w:tcW w:type="dxa" w:w="4320"/>
-          </w:tcPr>
-          <w:p>
-            <w:r>
-              <w:rPr>
-                <w:b w:val="0"/>
-              </w:rPr>
-              <w:t xml:space="preserve">đang chạy nhầm Python: phải chạy bằng file </w:t>
-            </w:r>
-            <w:r>
-              <w:rPr>
-                <w:rFonts w:ascii="Consolas" w:hAnsi="Consolas"/>
-                <w:b w:val="0"/>
-                <w:color w:val="A31F34"/>
-                <w:sz w:val="20"/>
-              </w:rPr>
-              <w:t>.bat</w:t>
-            </w:r>
-          </w:p>
-        </w:tc>
-      </w:tr>
-      <w:tr>
-        <w:tc>
-          <w:tcPr>
-            <w:tcW w:type="dxa" w:w="4320"/>
-          </w:tcPr>
-          <w:p>
-            <w:r>
-              <w:rPr>
-                <w:rFonts w:ascii="Consolas" w:hAnsi="Consolas"/>
-                <w:b w:val="0"/>
-                <w:color w:val="A31F34"/>
-                <w:sz w:val="20"/>
-              </w:rPr>
-              <w:t>MemoryError</w:t>
-            </w:r>
-            <w:r>
-              <w:rPr>
-                <w:b w:val="0"/>
-              </w:rPr>
-              <w:t xml:space="preserve"> hoặc máy đơ</w:t>
-            </w:r>
-          </w:p>
-        </w:tc>
-        <w:tc>
-          <w:tcPr>
-            <w:tcW w:type="dxa" w:w="4320"/>
-          </w:tcPr>
-          <w:p>
-            <w:r>
-              <w:rPr>
-                <w:b w:val="0"/>
-              </w:rPr>
-              <w:t>dữ liệu quá lớn: hỏi AI theo mẫu A, thêm câu "dữ liệu lớn, hãy lấy mẫu bớt"</w:t>
-            </w:r>
-          </w:p>
-        </w:tc>
-      </w:tr>
-      <w:tr>
-        <w:tc>
-          <w:tcPr>
-            <w:tcW w:type="dxa" w:w="4320"/>
-          </w:tcPr>
-          <w:p>
-            <w:r>
-              <w:rPr>
-                <w:b w:val="0"/>
-              </w:rPr>
-              <w:t>lỗi khác</w:t>
-            </w:r>
-          </w:p>
-        </w:tc>
-        <w:tc>
-          <w:tcPr>
-            <w:tcW w:type="dxa" w:w="4320"/>
-          </w:tcPr>
-          <w:p>
-            <w:r>
-              <w:rPr>
-                <w:b w:val="0"/>
-              </w:rPr>
-              <w:t>dùng mẫu A ở Phần D</w:t>
+              <w:t>không nộp gì thêm</w:t>
             </w:r>
           </w:p>
         </w:tc>
@@ -9403,36 +9857,37 @@
     </w:tbl>
     <w:p/>
     <w:p>
-      <w:pPr>
-        <w:pStyle w:val="Heading2"/>
-      </w:pPr>
-      <w:r>
-        <w:rPr>
-          <w:b w:val="0"/>
-        </w:rPr>
-        <w:t>PHẦN D. Dùng AI của BTC cho bài 2</w:t>
+      <w:r>
+        <w:rPr>
+          <w:b w:val="0"/>
+        </w:rPr>
+        <w:t xml:space="preserve">Còn lượt nộp thì thử thêm </w:t>
+      </w:r>
+      <w:r>
+        <w:rPr>
+          <w:rFonts w:ascii="Consolas" w:hAnsi="Consolas"/>
+          <w:b w:val="0"/>
+          <w:color w:val="A31F34"/>
+          <w:sz w:val="20"/>
+        </w:rPr>
+        <w:t>ket_qua\&lt;tên&gt;\tron_ca_hai\submission.csv</w:t>
+      </w:r>
+      <w:r>
+        <w:rPr>
+          <w:b w:val="0"/>
+        </w:rPr>
+        <w:t xml:space="preserve"> (trộn hai cách, thường tốt nhất). Web lấy lần nộp cao nhất nên thử không mất gì.</w:t>
       </w:r>
     </w:p>
     <w:p>
-      <w:r>
-        <w:rPr>
-          <w:b w:val="0"/>
-        </w:rPr>
-        <w:t>Bài 2 là nơi đáng dùng token nhất, vì bài 1 đã chạy tự động.</w:t>
-      </w:r>
-    </w:p>
-    <w:p>
-      <w:r>
-        <w:rPr>
-          <w:b/>
-        </w:rPr>
-        <w:t>Thứ tự nên làm (lời thầy: nộp nhanh một bản có điểm trước, cải tiến sau):</w:t>
-      </w:r>
-      <w:r>
-        <w:rPr>
-          <w:b w:val="0"/>
-        </w:rPr>
-        <w:t xml:space="preserve"> đọc đề → chạy </w:t>
+      <w:pPr>
+        <w:pStyle w:val="Heading3"/>
+      </w:pPr>
+      <w:r>
+        <w:rPr>
+          <w:b w:val="0"/>
+        </w:rPr>
+        <w:t xml:space="preserve">B2. Kiểu 8: KHOANH VẬT THỂ / TÔ VÙNG (bấm đúp </w:t>
       </w:r>
       <w:r>
         <w:rPr>
@@ -9441,457 +9896,13 @@
           <w:color w:val="A31F34"/>
           <w:sz w:val="20"/>
         </w:rPr>
-        <w:t>CHAY_BAI2.bat</w:t>
-      </w:r>
-      <w:r>
-        <w:rPr>
-          <w:b w:val="0"/>
-        </w:rPr>
-        <w:t xml:space="preserve"> nếu khớp một trong 5 kiểu → nộp lấy điểm nền → </w:t>
-      </w:r>
-      <w:r>
-        <w:rPr>
-          <w:b/>
-        </w:rPr>
-        <w:t>rồi mới</w:t>
-      </w:r>
-      <w:r>
-        <w:rPr>
-          <w:b w:val="0"/>
-        </w:rPr>
-        <w:t xml:space="preserve"> dùng AI để tăng điểm hoặc làm phần chưa khớp.</w:t>
-      </w:r>
-    </w:p>
-    <w:p>
-      <w:r>
-        <w:rPr>
-          <w:b/>
-        </w:rPr>
-        <w:t>Mẫu A — có lỗi:</w:t>
-      </w:r>
-    </w:p>
-    <w:tbl>
-      <w:tblPr>
-        <w:tblStyle w:val="TableGrid"/>
-        <w:tblW w:type="auto" w:w="0"/>
-        <w:tblLook w:firstColumn="1" w:firstRow="1" w:lastColumn="0" w:lastRow="0" w:noHBand="0" w:noVBand="1" w:val="04A0"/>
-      </w:tblPr>
-      <w:tblGrid>
-        <w:gridCol w:w="8640"/>
-      </w:tblGrid>
-      <w:tr>
-        <w:tc>
-          <w:tcPr>
-            <w:tcW w:type="dxa" w:w="8640"/>
-            <w:shd w:val="clear" w:color="auto" w:fill="F2F2F2"/>
-          </w:tcPr>
-          <w:p>
-            <w:r>
-              <w:rPr>
-                <w:rFonts w:ascii="Consolas" w:hAnsi="Consolas"/>
-                <w:sz w:val="19"/>
-              </w:rPr>
-              <w:t>Tôi chạy một script Python và bị lỗi. 20 dòng cuối:</w:t>
-              <w:br/>
-            </w:r>
-            <w:r>
-              <w:rPr>
-                <w:rFonts w:ascii="Consolas" w:hAnsi="Consolas"/>
-                <w:sz w:val="19"/>
-              </w:rPr>
-              <w:t>&lt;dán&gt;</w:t>
-              <w:br/>
-            </w:r>
-            <w:r>
-              <w:rPr>
-                <w:rFonts w:ascii="Consolas" w:hAnsi="Consolas"/>
-                <w:sz w:val="19"/>
-              </w:rPr>
-              <w:br/>
-            </w:r>
-            <w:r>
-              <w:rPr>
-                <w:rFonts w:ascii="Consolas" w:hAnsi="Consolas"/>
-                <w:sz w:val="19"/>
-              </w:rPr>
-              <w:t>Hàm chứa dòng lỗi (file bai2.py):</w:t>
-              <w:br/>
-            </w:r>
-            <w:r>
-              <w:rPr>
-                <w:rFonts w:ascii="Consolas" w:hAnsi="Consolas"/>
-                <w:sz w:val="19"/>
-              </w:rPr>
-              <w:t>&lt;dán đúng hàm đó&gt;</w:t>
-              <w:br/>
-            </w:r>
-            <w:r>
-              <w:rPr>
-                <w:rFonts w:ascii="Consolas" w:hAnsi="Consolas"/>
-                <w:sz w:val="19"/>
-              </w:rPr>
-              <w:br/>
-            </w:r>
-            <w:r>
-              <w:rPr>
-                <w:rFonts w:ascii="Consolas" w:hAnsi="Consolas"/>
-                <w:sz w:val="19"/>
-              </w:rPr>
-              <w:t>Chỉ ra nguyên nhân và cách sửa ngắn nhất. Trả lời ngắn: chỉ đưa lại hàm đã sửa, đầy đủ.</w:t>
-            </w:r>
-          </w:p>
-        </w:tc>
-      </w:tr>
-    </w:tbl>
-    <w:p/>
-    <w:p>
-      <w:r>
-        <w:rPr>
-          <w:b/>
-        </w:rPr>
-        <w:t>Mẫu B — đề không khớp kiểu nào:</w:t>
-      </w:r>
-    </w:p>
-    <w:tbl>
-      <w:tblPr>
-        <w:tblStyle w:val="TableGrid"/>
-        <w:tblW w:type="auto" w:w="0"/>
-        <w:tblLook w:firstColumn="1" w:firstRow="1" w:lastColumn="0" w:lastRow="0" w:noHBand="0" w:noVBand="1" w:val="04A0"/>
-      </w:tblPr>
-      <w:tblGrid>
-        <w:gridCol w:w="8640"/>
-      </w:tblGrid>
-      <w:tr>
-        <w:tc>
-          <w:tcPr>
-            <w:tcW w:type="dxa" w:w="8640"/>
-            <w:shd w:val="clear" w:color="auto" w:fill="F2F2F2"/>
-          </w:tcPr>
-          <w:p>
-            <w:r>
-              <w:rPr>
-                <w:rFonts w:ascii="Consolas" w:hAnsi="Consolas"/>
-                <w:sz w:val="19"/>
-              </w:rPr>
-              <w:t>Đề bài: &lt;dán nguyên đoạn mô tả nhiệm vụ, dữ liệu, cách chấm, định dạng file nộp&gt;</w:t>
-              <w:br/>
-            </w:r>
-            <w:r>
-              <w:rPr>
-                <w:rFonts w:ascii="Consolas" w:hAnsi="Consolas"/>
-                <w:sz w:val="19"/>
-              </w:rPr>
-              <w:br/>
-            </w:r>
-            <w:r>
-              <w:rPr>
-                <w:rFonts w:ascii="Consolas" w:hAnsi="Consolas"/>
-                <w:sz w:val="19"/>
-              </w:rPr>
-              <w:t>5 dòng đầu của file train: &lt;dán&gt;</w:t>
-              <w:br/>
-            </w:r>
-            <w:r>
-              <w:rPr>
-                <w:rFonts w:ascii="Consolas" w:hAnsi="Consolas"/>
-                <w:sz w:val="19"/>
-              </w:rPr>
-              <w:t>5 dòng đầu của file nộp mẫu: &lt;dán&gt;</w:t>
-              <w:br/>
-            </w:r>
-            <w:r>
-              <w:rPr>
-                <w:rFonts w:ascii="Consolas" w:hAnsi="Consolas"/>
-                <w:sz w:val="19"/>
-              </w:rPr>
-              <w:br/>
-            </w:r>
-            <w:r>
-              <w:rPr>
-                <w:rFonts w:ascii="Consolas" w:hAnsi="Consolas"/>
-                <w:sz w:val="19"/>
-              </w:rPr>
-              <w:t>Máy tôi: Windows, CPU (không GPU), Python 3.13, KHÔNG có mạng. Đã cài: numpy, pandas, scikit-learn, lightgbm, torch, torchvision, transformers, sentence-transformers, sentencepiece, sacrebleu, opencv, pillow, soundfile, scipy, matplotlib.</w:t>
-              <w:br/>
-            </w:r>
-            <w:r>
-              <w:rPr>
-                <w:rFonts w:ascii="Consolas" w:hAnsi="Consolas"/>
-                <w:sz w:val="19"/>
-              </w:rPr>
-              <w:t>Mô hình có sẵn offline: ResNet18/50, MobileNetV3, EfficientNet-B0 (torchvision); openai/clip-vit-base-patch32; intfloat/multilingual-e5-small; bkai-foundation-models/vietnamese-bi-encoder; paraphrase-multilingual-MiniLM-L12-v2; Helsinki-NLP/opus-mt-zh-vi, opus-mt-en-vi, opus-mt-vi-en, opus-mt-en-zh; facebook/nllb-200-distilled-600M.</w:t>
-              <w:br/>
-            </w:r>
-            <w:r>
-              <w:rPr>
-                <w:rFonts w:ascii="Consolas" w:hAnsi="Consolas"/>
-                <w:sz w:val="19"/>
-              </w:rPr>
-              <w:br/>
-            </w:r>
-            <w:r>
-              <w:rPr>
-                <w:rFonts w:ascii="Consolas" w:hAnsi="Consolas"/>
-                <w:sz w:val="19"/>
-              </w:rPr>
-              <w:t>Viết MỘT file Python hoàn chỉnh, chạy được ngay, đọc train/test từ đường dẫn tôi sẽ điền ở đầu file, và ghi submission.csv đúng định dạng file nộp mẫu. Ưu tiên cách đơn giản, chạy nhanh trên CPU. Không giải thích dài.</w:t>
-            </w:r>
-          </w:p>
-        </w:tc>
-      </w:tr>
-    </w:tbl>
-    <w:p/>
-    <w:p>
-      <w:r>
-        <w:rPr>
-          <w:b/>
-        </w:rPr>
-        <w:t>Mẫu C — đã có điểm nền, muốn tăng điểm:</w:t>
-      </w:r>
-    </w:p>
-    <w:tbl>
-      <w:tblPr>
-        <w:tblStyle w:val="TableGrid"/>
-        <w:tblW w:type="auto" w:w="0"/>
-        <w:tblLook w:firstColumn="1" w:firstRow="1" w:lastColumn="0" w:lastRow="0" w:noHBand="0" w:noVBand="1" w:val="04A0"/>
-      </w:tblPr>
-      <w:tblGrid>
-        <w:gridCol w:w="8640"/>
-      </w:tblGrid>
-      <w:tr>
-        <w:tc>
-          <w:tcPr>
-            <w:tcW w:type="dxa" w:w="8640"/>
-            <w:shd w:val="clear" w:color="auto" w:fill="F2F2F2"/>
-          </w:tcPr>
-          <w:p>
-            <w:r>
-              <w:rPr>
-                <w:rFonts w:ascii="Consolas" w:hAnsi="Consolas"/>
-                <w:sz w:val="19"/>
-              </w:rPr>
-              <w:t>Bài toán: &lt;1-2 câu&gt;. Tôi đang dùng &lt;dán dòng "=&gt; CHỌN: ..." và bảng điểm máy in ra&gt;.</w:t>
-              <w:br/>
-            </w:r>
-            <w:r>
-              <w:rPr>
-                <w:rFonts w:ascii="Consolas" w:hAnsi="Consolas"/>
-                <w:sz w:val="19"/>
-              </w:rPr>
-              <w:t>Thước đo của đề: &lt;tên thước đo&gt;.</w:t>
-              <w:br/>
-            </w:r>
-            <w:r>
-              <w:rPr>
-                <w:rFonts w:ascii="Consolas" w:hAnsi="Consolas"/>
-                <w:sz w:val="19"/>
-              </w:rPr>
-              <w:br/>
-            </w:r>
-            <w:r>
-              <w:rPr>
-                <w:rFonts w:ascii="Consolas" w:hAnsi="Consolas"/>
-                <w:sz w:val="19"/>
-              </w:rPr>
-              <w:t>Đây là hàm tạo đặc trưng tôi đang dùng (file bai2.py): &lt;dán hàm table_features / text_features / image_features tương ứng&gt;</w:t>
-              <w:br/>
-            </w:r>
-            <w:r>
-              <w:rPr>
-                <w:rFonts w:ascii="Consolas" w:hAnsi="Consolas"/>
-                <w:sz w:val="19"/>
-              </w:rPr>
-              <w:br/>
-            </w:r>
-            <w:r>
-              <w:rPr>
-                <w:rFonts w:ascii="Consolas" w:hAnsi="Consolas"/>
-                <w:sz w:val="19"/>
-              </w:rPr>
-              <w:t>Đề xuất 2-3 thay đổi có khả năng tăng điểm nhất và đưa lại hàm đã sửa, đầy đủ. Trả lời ngắn.</w:t>
-            </w:r>
-          </w:p>
-        </w:tc>
-      </w:tr>
-    </w:tbl>
-    <w:p/>
-    <w:p>
-      <w:r>
-        <w:rPr>
-          <w:b/>
-        </w:rPr>
-        <w:t>Cách chạy code AI viết (mẫu B):</w:t>
-      </w:r>
-      <w:r>
-        <w:rPr>
-          <w:b w:val="0"/>
-        </w:rPr>
-        <w:t xml:space="preserve"> trong VS Code tạo file mới trong </w:t>
-      </w:r>
-      <w:r>
-        <w:rPr>
-          <w:rFonts w:ascii="Consolas" w:hAnsi="Consolas"/>
-          <w:b w:val="0"/>
-          <w:color w:val="A31F34"/>
-          <w:sz w:val="20"/>
-        </w:rPr>
-        <w:t>KIT_BAI2</w:t>
-      </w:r>
-      <w:r>
-        <w:rPr>
-          <w:b w:val="0"/>
-        </w:rPr>
-        <w:t xml:space="preserve">, đặt tên </w:t>
-      </w:r>
-      <w:r>
-        <w:rPr>
-          <w:rFonts w:ascii="Consolas" w:hAnsi="Consolas"/>
-          <w:b w:val="0"/>
-          <w:color w:val="A31F34"/>
-          <w:sz w:val="20"/>
-        </w:rPr>
-        <w:t>giai.py</w:t>
-      </w:r>
-      <w:r>
-        <w:rPr>
-          <w:b w:val="0"/>
-        </w:rPr>
-        <w:t>, dán code vào, sửa đường dẫn ở đầu file, lưu. Mở Terminal trong VS Code (</w:t>
-      </w:r>
-      <w:r>
-        <w:rPr>
-          <w:b/>
-        </w:rPr>
-        <w:t>Ctrl + `</w:t>
-      </w:r>
-      <w:r>
-        <w:rPr>
-          <w:b w:val="0"/>
-        </w:rPr>
-        <w:t>) và gõ:</w:t>
-      </w:r>
-    </w:p>
-    <w:p>
-      <w:r>
-        <w:rPr>
-          <w:rFonts w:ascii="Consolas" w:hAnsi="Consolas"/>
-          <w:b w:val="0"/>
-          <w:color w:val="A31F34"/>
-          <w:sz w:val="20"/>
-        </w:rPr>
-        <w:t>&amp; "C:\Users\Thanh Hue\.venv\Scripts\python.exe" giai.py</w:t>
-      </w:r>
-    </w:p>
-    <w:p>
-      <w:r>
-        <w:rPr>
-          <w:b/>
-        </w:rPr>
-        <w:t xml:space="preserve">Cách sửa một hàm trong </w:t>
-      </w:r>
-      <w:r>
-        <w:rPr>
-          <w:rFonts w:ascii="Consolas" w:hAnsi="Consolas"/>
-          <w:b/>
-          <w:color w:val="A31F34"/>
-          <w:sz w:val="20"/>
-        </w:rPr>
-        <w:t>bai2.py</w:t>
-      </w:r>
-      <w:r>
-        <w:rPr>
-          <w:b/>
-        </w:rPr>
-        <w:t xml:space="preserve"> (mẫu A, C):</w:t>
-      </w:r>
-      <w:r>
-        <w:rPr>
-          <w:b w:val="0"/>
-        </w:rPr>
-        <w:t xml:space="preserve"> sao lưu file (Ctrl + C, Ctrl + V trong File Explorer) → mở </w:t>
-      </w:r>
-      <w:r>
-        <w:rPr>
-          <w:rFonts w:ascii="Consolas" w:hAnsi="Consolas"/>
-          <w:b w:val="0"/>
-          <w:color w:val="A31F34"/>
-          <w:sz w:val="20"/>
-        </w:rPr>
-        <w:t>bai2.py</w:t>
-      </w:r>
-      <w:r>
-        <w:rPr>
-          <w:b w:val="0"/>
-        </w:rPr>
-        <w:t xml:space="preserve"> → Ctrl + F gõ </w:t>
-      </w:r>
-      <w:r>
-        <w:rPr>
-          <w:rFonts w:ascii="Consolas" w:hAnsi="Consolas"/>
-          <w:b w:val="0"/>
-          <w:color w:val="A31F34"/>
-          <w:sz w:val="20"/>
-        </w:rPr>
-        <w:t>def &lt;tên hàm&gt;</w:t>
-      </w:r>
-      <w:r>
-        <w:rPr>
-          <w:b w:val="0"/>
-        </w:rPr>
-        <w:t xml:space="preserve"> → bôi đen cả hàm → dán hàm mới đè lên → Ctrl + S → kéo </w:t>
-      </w:r>
-      <w:r>
-        <w:rPr>
-          <w:rFonts w:ascii="Consolas" w:hAnsi="Consolas"/>
-          <w:b w:val="0"/>
-          <w:color w:val="A31F34"/>
-          <w:sz w:val="20"/>
-        </w:rPr>
-        <w:t>cau_hinh.json</w:t>
-      </w:r>
-      <w:r>
-        <w:rPr>
-          <w:b w:val="0"/>
-        </w:rPr>
-        <w:t xml:space="preserve"> thả lên </w:t>
-      </w:r>
-      <w:r>
-        <w:rPr>
-          <w:rFonts w:ascii="Consolas" w:hAnsi="Consolas"/>
-          <w:b w:val="0"/>
-          <w:color w:val="A31F34"/>
-          <w:sz w:val="20"/>
-        </w:rPr>
-        <w:t>CHAY_LAI_BAI2.bat</w:t>
-      </w:r>
-      <w:r>
-        <w:rPr>
-          <w:b w:val="0"/>
-        </w:rPr>
-        <w:t>.</w:t>
-      </w:r>
-    </w:p>
-    <w:p>
-      <w:r>
-        <w:rPr>
-          <w:b w:val="0"/>
-        </w:rPr>
-        <w:t xml:space="preserve">Các hàm chính trong </w:t>
-      </w:r>
-      <w:r>
-        <w:rPr>
-          <w:rFonts w:ascii="Consolas" w:hAnsi="Consolas"/>
-          <w:b w:val="0"/>
-          <w:color w:val="A31F34"/>
-          <w:sz w:val="20"/>
-        </w:rPr>
-        <w:t>bai2.py</w:t>
-      </w:r>
-      <w:r>
-        <w:rPr>
-          <w:b w:val="0"/>
-        </w:rPr>
-        <w:t>:</w:t>
+        <w:t>CHAY_YOLO.bat</w:t>
+      </w:r>
+      <w:r>
+        <w:rPr>
+          <w:b w:val="0"/>
+        </w:rPr>
+        <w:t>)</w:t>
       </w:r>
     </w:p>
     <w:tbl>
@@ -9915,7 +9926,7 @@
               <w:rPr>
                 <w:b/>
               </w:rPr>
-              <w:t>việc</w:t>
+              <w:t>máy hỏi</w:t>
             </w:r>
           </w:p>
         </w:tc>
@@ -9929,7 +9940,7 @@
               <w:rPr>
                 <w:b/>
               </w:rPr>
-              <w:t>hàm</w:t>
+              <w:t>trả lời</w:t>
             </w:r>
           </w:p>
         </w:tc>
@@ -9942,9 +9953,12 @@
           <w:p>
             <w:r>
               <w:rPr>
-                <w:b w:val="0"/>
-              </w:rPr>
-              <w:t>đọc file bảng</w:t>
+                <w:rFonts w:ascii="Consolas" w:hAnsi="Consolas"/>
+                <w:b w:val="0"/>
+                <w:color w:val="A31F34"/>
+                <w:sz w:val="20"/>
+              </w:rPr>
+              <w:t>Việc gì?</w:t>
             </w:r>
           </w:p>
         </w:tc>
@@ -9955,12 +9969,51 @@
           <w:p>
             <w:r>
               <w:rPr>
-                <w:rFonts w:ascii="Consolas" w:hAnsi="Consolas"/>
-                <w:b w:val="0"/>
-                <w:color w:val="A31F34"/>
-                <w:sz w:val="20"/>
-              </w:rPr>
-              <w:t>read_table</w:t>
+                <w:b/>
+              </w:rPr>
+              <w:t>1</w:t>
+            </w:r>
+            <w:r>
+              <w:rPr>
+                <w:b w:val="0"/>
+              </w:rPr>
+              <w:t xml:space="preserve"> = chỉ khoanh / đếm các vật thể thường gặp (người, xe, chó, mèo, chai, ghế... 80 loại), không cần học. </w:t>
+            </w:r>
+            <w:r>
+              <w:rPr>
+                <w:b/>
+              </w:rPr>
+              <w:t>2</w:t>
+            </w:r>
+            <w:r>
+              <w:rPr>
+                <w:b w:val="0"/>
+              </w:rPr>
+              <w:t xml:space="preserve"> = đề có ảnh train kèm hộp → máy học rồi khoanh. </w:t>
+            </w:r>
+            <w:r>
+              <w:rPr>
+                <w:b/>
+              </w:rPr>
+              <w:t>3</w:t>
+            </w:r>
+            <w:r>
+              <w:rPr>
+                <w:b w:val="0"/>
+              </w:rPr>
+              <w:t xml:space="preserve"> = tô vùng có sẵn. </w:t>
+            </w:r>
+            <w:r>
+              <w:rPr>
+                <w:b/>
+              </w:rPr>
+              <w:t>4</w:t>
+            </w:r>
+            <w:r>
+              <w:rPr>
+                <w:b w:val="0"/>
+              </w:rPr>
+              <w:t xml:space="preserve"> = học tô vùng (đề phải cho dữ liệu định dạng YOLO)</w:t>
             </w:r>
           </w:p>
         </w:tc>
@@ -9973,9 +10026,12 @@
           <w:p>
             <w:r>
               <w:rPr>
-                <w:b w:val="0"/>
-              </w:rPr>
-              <w:t>tạo đặc trưng cho bảng</w:t>
+                <w:rFonts w:ascii="Consolas" w:hAnsi="Consolas"/>
+                <w:b w:val="0"/>
+                <w:color w:val="A31F34"/>
+                <w:sz w:val="20"/>
+              </w:rPr>
+              <w:t>Kéo thả file data.yaml ... HOẶC file csv ghi các hộp</w:t>
             </w:r>
           </w:p>
         </w:tc>
@@ -9986,12 +10042,24 @@
           <w:p>
             <w:r>
               <w:rPr>
+                <w:b w:val="0"/>
+              </w:rPr>
+              <w:t xml:space="preserve">đề cho thư mục có </w:t>
+            </w:r>
+            <w:r>
+              <w:rPr>
                 <w:rFonts w:ascii="Consolas" w:hAnsi="Consolas"/>
                 <w:b w:val="0"/>
                 <w:color w:val="A31F34"/>
                 <w:sz w:val="20"/>
               </w:rPr>
-              <w:t>table_features</w:t>
+              <w:t>data.yaml</w:t>
+            </w:r>
+            <w:r>
+              <w:rPr>
+                <w:b w:val="0"/>
+              </w:rPr>
+              <w:t xml:space="preserve"> thì kéo file đó; đề cho file csv (mỗi dòng: tên ảnh, nhãn, 4 số toạ độ) thì kéo csv, máy hỏi tiếp tên các cột và tự chuyển</w:t>
             </w:r>
           </w:p>
         </w:tc>
@@ -10004,9 +10072,12 @@
           <w:p>
             <w:r>
               <w:rPr>
-                <w:b w:val="0"/>
-              </w:rPr>
-              <w:t>tạo đặc trưng cho văn bản</w:t>
+                <w:rFonts w:ascii="Consolas" w:hAnsi="Consolas"/>
+                <w:b w:val="0"/>
+                <w:color w:val="A31F34"/>
+                <w:sz w:val="20"/>
+              </w:rPr>
+              <w:t>Toạ độ hộp kiểu gì?</w:t>
             </w:r>
           </w:p>
         </w:tc>
@@ -10017,18 +10088,36 @@
           <w:p>
             <w:r>
               <w:rPr>
+                <w:b w:val="0"/>
+              </w:rPr>
+              <w:t xml:space="preserve">xem đề: </w:t>
+            </w:r>
+            <w:r>
+              <w:rPr>
                 <w:rFonts w:ascii="Consolas" w:hAnsi="Consolas"/>
                 <w:b w:val="0"/>
                 <w:color w:val="A31F34"/>
                 <w:sz w:val="20"/>
               </w:rPr>
-              <w:t>text_features</w:t>
-            </w:r>
-            <w:r>
-              <w:rPr>
-                <w:b w:val="0"/>
-              </w:rPr>
-              <w:t xml:space="preserve">, </w:t>
+              <w:t>xmin, ymin, xmax, ymax</w:t>
+            </w:r>
+            <w:r>
+              <w:rPr>
+                <w:b w:val="0"/>
+              </w:rPr>
+              <w:t xml:space="preserve"> → </w:t>
+            </w:r>
+            <w:r>
+              <w:rPr>
+                <w:b/>
+              </w:rPr>
+              <w:t>1</w:t>
+            </w:r>
+            <w:r>
+              <w:rPr>
+                <w:b w:val="0"/>
+              </w:rPr>
+              <w:t xml:space="preserve">; </w:t>
             </w:r>
             <w:r>
               <w:rPr>
@@ -10037,7 +10126,31 @@
                 <w:color w:val="A31F34"/>
                 <w:sz w:val="20"/>
               </w:rPr>
-              <w:t>text_embed</w:t>
+              <w:t>x, y, width, height</w:t>
+            </w:r>
+            <w:r>
+              <w:rPr>
+                <w:b w:val="0"/>
+              </w:rPr>
+              <w:t xml:space="preserve"> → </w:t>
+            </w:r>
+            <w:r>
+              <w:rPr>
+                <w:b/>
+              </w:rPr>
+              <w:t>2</w:t>
+            </w:r>
+            <w:r>
+              <w:rPr>
+                <w:b w:val="0"/>
+              </w:rPr>
+              <w:t xml:space="preserve">; số nhỏ hơn 1 (đã chia cho cỡ ảnh) → </w:t>
+            </w:r>
+            <w:r>
+              <w:rPr>
+                <w:b/>
+              </w:rPr>
+              <w:t>3</w:t>
             </w:r>
           </w:p>
         </w:tc>
@@ -10050,9 +10163,12 @@
           <w:p>
             <w:r>
               <w:rPr>
-                <w:b w:val="0"/>
-              </w:rPr>
-              <w:t>tạo đặc trưng cho ảnh</w:t>
+                <w:rFonts w:ascii="Consolas" w:hAnsi="Consolas"/>
+                <w:b w:val="0"/>
+                <w:color w:val="A31F34"/>
+                <w:sz w:val="20"/>
+              </w:rPr>
+              <w:t>Học tối đa bao nhiêu phút?</w:t>
             </w:r>
           </w:p>
         </w:tc>
@@ -10063,27 +10179,9 @@
           <w:p>
             <w:r>
               <w:rPr>
-                <w:rFonts w:ascii="Consolas" w:hAnsi="Consolas"/>
-                <w:b w:val="0"/>
-                <w:color w:val="A31F34"/>
-                <w:sz w:val="20"/>
-              </w:rPr>
-              <w:t>image_features</w:t>
-            </w:r>
-            <w:r>
-              <w:rPr>
-                <w:b w:val="0"/>
-              </w:rPr>
-              <w:t xml:space="preserve">, </w:t>
-            </w:r>
-            <w:r>
-              <w:rPr>
-                <w:rFonts w:ascii="Consolas" w:hAnsi="Consolas"/>
-                <w:b w:val="0"/>
-                <w:color w:val="A31F34"/>
-                <w:sz w:val="20"/>
-              </w:rPr>
-              <w:t>image_embed</w:t>
+                <w:b w:val="0"/>
+              </w:rPr>
+              <w:t>Enter (= 30)</w:t>
             </w:r>
           </w:p>
         </w:tc>
@@ -10096,9 +10194,12 @@
           <w:p>
             <w:r>
               <w:rPr>
-                <w:b w:val="0"/>
-              </w:rPr>
-              <w:t>tạo đặc trưng cho âm thanh</w:t>
+                <w:rFonts w:ascii="Consolas" w:hAnsi="Consolas"/>
+                <w:b w:val="0"/>
+                <w:color w:val="A31F34"/>
+                <w:sz w:val="20"/>
+              </w:rPr>
+              <w:t>Cỡ ảnh</w:t>
             </w:r>
           </w:p>
         </w:tc>
@@ -10109,27 +10210,9 @@
           <w:p>
             <w:r>
               <w:rPr>
-                <w:rFonts w:ascii="Consolas" w:hAnsi="Consolas"/>
-                <w:b w:val="0"/>
-                <w:color w:val="A31F34"/>
-                <w:sz w:val="20"/>
-              </w:rPr>
-              <w:t>audio_features</w:t>
-            </w:r>
-            <w:r>
-              <w:rPr>
-                <w:b w:val="0"/>
-              </w:rPr>
-              <w:t xml:space="preserve">, </w:t>
-            </w:r>
-            <w:r>
-              <w:rPr>
-                <w:rFonts w:ascii="Consolas" w:hAnsi="Consolas"/>
-                <w:b w:val="0"/>
-                <w:color w:val="A31F34"/>
-                <w:sz w:val="20"/>
-              </w:rPr>
-              <w:t>audio_feats_one</w:t>
+                <w:b w:val="0"/>
+              </w:rPr>
+              <w:t>Enter (= 640)</w:t>
             </w:r>
           </w:p>
         </w:tc>
@@ -10142,9 +10225,12 @@
           <w:p>
             <w:r>
               <w:rPr>
-                <w:b w:val="0"/>
-              </w:rPr>
-              <w:t>các mô hình được thử</w:t>
+                <w:rFonts w:ascii="Consolas" w:hAnsi="Consolas"/>
+                <w:b w:val="0"/>
+                <w:color w:val="A31F34"/>
+                <w:sz w:val="20"/>
+              </w:rPr>
+              <w:t>THƯ MỤC ảnh test</w:t>
             </w:r>
           </w:p>
         </w:tc>
@@ -10155,12 +10241,9 @@
           <w:p>
             <w:r>
               <w:rPr>
-                <w:rFonts w:ascii="Consolas" w:hAnsi="Consolas"/>
-                <w:b w:val="0"/>
-                <w:color w:val="A31F34"/>
-                <w:sz w:val="20"/>
-              </w:rPr>
-              <w:t>make_models</w:t>
+                <w:b w:val="0"/>
+              </w:rPr>
+              <w:t>kéo thư mục ảnh test vào</w:t>
             </w:r>
           </w:p>
         </w:tc>
@@ -10173,9 +10256,12 @@
           <w:p>
             <w:r>
               <w:rPr>
-                <w:b w:val="0"/>
-              </w:rPr>
-              <w:t>chấm chéo và chọn mô hình</w:t>
+                <w:rFonts w:ascii="Consolas" w:hAnsi="Consolas"/>
+                <w:b w:val="0"/>
+                <w:color w:val="A31F34"/>
+                <w:sz w:val="20"/>
+              </w:rPr>
+              <w:t>Ngưỡng tự tin</w:t>
             </w:r>
           </w:p>
         </w:tc>
@@ -10186,120 +10272,48 @@
           <w:p>
             <w:r>
               <w:rPr>
+                <w:b w:val="0"/>
+              </w:rPr>
+              <w:t xml:space="preserve">đề chấm bằng </w:t>
+            </w:r>
+            <w:r>
+              <w:rPr>
+                <w:b/>
+              </w:rPr>
+              <w:t>mAP</w:t>
+            </w:r>
+            <w:r>
+              <w:rPr>
+                <w:b w:val="0"/>
+              </w:rPr>
+              <w:t xml:space="preserve"> → gõ </w:t>
+            </w:r>
+            <w:r>
+              <w:rPr>
                 <w:rFonts w:ascii="Consolas" w:hAnsi="Consolas"/>
                 <w:b w:val="0"/>
                 <w:color w:val="A31F34"/>
                 <w:sz w:val="20"/>
               </w:rPr>
-              <w:t>fit_predict</w:t>
-            </w:r>
-          </w:p>
-        </w:tc>
-      </w:tr>
-      <w:tr>
-        <w:tc>
-          <w:tcPr>
-            <w:tcW w:type="dxa" w:w="4320"/>
-          </w:tcPr>
-          <w:p>
-            <w:r>
-              <w:rPr>
-                <w:b w:val="0"/>
-              </w:rPr>
-              <w:t>lấy khung hình từ video</w:t>
-            </w:r>
-          </w:p>
-        </w:tc>
-        <w:tc>
-          <w:tcPr>
-            <w:tcW w:type="dxa" w:w="4320"/>
-          </w:tcPr>
-          <w:p>
-            <w:r>
-              <w:rPr>
-                <w:rFonts w:ascii="Consolas" w:hAnsi="Consolas"/>
-                <w:b w:val="0"/>
-                <w:color w:val="A31F34"/>
-                <w:sz w:val="20"/>
-              </w:rPr>
-              <w:t>frames_of</w:t>
-            </w:r>
-          </w:p>
-        </w:tc>
-      </w:tr>
-      <w:tr>
-        <w:tc>
-          <w:tcPr>
-            <w:tcW w:type="dxa" w:w="4320"/>
-          </w:tcPr>
-          <w:p>
-            <w:r>
-              <w:rPr>
-                <w:b w:val="0"/>
-              </w:rPr>
-              <w:t>dịch</w:t>
-            </w:r>
-          </w:p>
-        </w:tc>
-        <w:tc>
-          <w:tcPr>
-            <w:tcW w:type="dxa" w:w="4320"/>
-          </w:tcPr>
-          <w:p>
-            <w:r>
-              <w:rPr>
-                <w:rFonts w:ascii="Consolas" w:hAnsi="Consolas"/>
-                <w:b w:val="0"/>
-                <w:color w:val="A31F34"/>
-                <w:sz w:val="20"/>
-              </w:rPr>
-              <w:t>translate</w:t>
-            </w:r>
-            <w:r>
-              <w:rPr>
-                <w:b w:val="0"/>
-              </w:rPr>
-              <w:t xml:space="preserve">, </w:t>
-            </w:r>
-            <w:r>
-              <w:rPr>
-                <w:rFonts w:ascii="Consolas" w:hAnsi="Consolas"/>
-                <w:b w:val="0"/>
-                <w:color w:val="A31F34"/>
-                <w:sz w:val="20"/>
-              </w:rPr>
-              <w:t>run_translate</w:t>
-            </w:r>
-          </w:p>
-        </w:tc>
-      </w:tr>
-      <w:tr>
-        <w:tc>
-          <w:tcPr>
-            <w:tcW w:type="dxa" w:w="4320"/>
-          </w:tcPr>
-          <w:p>
-            <w:r>
-              <w:rPr>
-                <w:b w:val="0"/>
-              </w:rPr>
-              <w:t>ghi file nộp</w:t>
-            </w:r>
-          </w:p>
-        </w:tc>
-        <w:tc>
-          <w:tcPr>
-            <w:tcW w:type="dxa" w:w="4320"/>
-          </w:tcPr>
-          <w:p>
-            <w:r>
-              <w:rPr>
-                <w:rFonts w:ascii="Consolas" w:hAnsi="Consolas"/>
-                <w:b w:val="0"/>
-                <w:color w:val="A31F34"/>
-                <w:sz w:val="20"/>
-              </w:rPr>
-              <w:t>write_submission</w:t>
+              <w:t>0.01</w:t>
+            </w:r>
+            <w:r>
+              <w:rPr>
+                <w:b w:val="0"/>
+              </w:rPr>
+              <w:t xml:space="preserve">; đề </w:t>
+            </w:r>
+            <w:r>
+              <w:rPr>
+                <w:b/>
+              </w:rPr>
+              <w:t>đếm</w:t>
+            </w:r>
+            <w:r>
+              <w:rPr>
+                <w:b w:val="0"/>
+              </w:rPr>
+              <w:t xml:space="preserve"> số lượng → Enter (= 0.25)</w:t>
             </w:r>
           </w:p>
         </w:tc>
@@ -10307,6 +10321,249 @@
     </w:tbl>
     <w:p/>
     <w:p>
+      <w:r>
+        <w:rPr>
+          <w:b w:val="0"/>
+        </w:rPr>
+        <w:t xml:space="preserve">Máy in </w:t>
+      </w:r>
+      <w:r>
+        <w:rPr>
+          <w:rFonts w:ascii="Consolas" w:hAnsi="Consolas"/>
+          <w:b w:val="0"/>
+          <w:color w:val="A31F34"/>
+          <w:sz w:val="20"/>
+        </w:rPr>
+        <w:t>TỰ CHẤM ... mAP50 = ...</w:t>
+      </w:r>
+      <w:r>
+        <w:rPr>
+          <w:b w:val="0"/>
+        </w:rPr>
+        <w:t xml:space="preserve"> (càng gần 1 càng tốt) rồi ghi:</w:t>
+      </w:r>
+    </w:p>
+    <w:p>
+      <w:pPr>
+        <w:pStyle w:val="ListBullet"/>
+      </w:pPr>
+      <w:r>
+        <w:rPr>
+          <w:rFonts w:ascii="Consolas" w:hAnsi="Consolas"/>
+          <w:b w:val="0"/>
+          <w:color w:val="A31F34"/>
+          <w:sz w:val="20"/>
+        </w:rPr>
+        <w:t>ket_qua\&lt;tên&gt;\du_doan.csv</w:t>
+      </w:r>
+      <w:r>
+        <w:rPr>
+          <w:b w:val="0"/>
+        </w:rPr>
+        <w:t>: mỗi dòng một hộp (tên ảnh, loại, độ tin cậy, toạ độ theo cả hai kiểu);</w:t>
+      </w:r>
+    </w:p>
+    <w:p>
+      <w:pPr>
+        <w:pStyle w:val="ListBullet"/>
+      </w:pPr>
+      <w:r>
+        <w:rPr>
+          <w:rFonts w:ascii="Consolas" w:hAnsi="Consolas"/>
+          <w:b w:val="0"/>
+          <w:color w:val="A31F34"/>
+          <w:sz w:val="20"/>
+        </w:rPr>
+        <w:t>dem_so_luong.csv</w:t>
+      </w:r>
+      <w:r>
+        <w:rPr>
+          <w:b w:val="0"/>
+        </w:rPr>
+        <w:t>: số vật thể mỗi ảnh;</w:t>
+      </w:r>
+    </w:p>
+    <w:p>
+      <w:pPr>
+        <w:pStyle w:val="ListBullet"/>
+      </w:pPr>
+      <w:r>
+        <w:rPr>
+          <w:rFonts w:ascii="Consolas" w:hAnsi="Consolas"/>
+          <w:b w:val="0"/>
+          <w:color w:val="A31F34"/>
+          <w:sz w:val="20"/>
+        </w:rPr>
+        <w:t>anh_ve_hop\</w:t>
+      </w:r>
+      <w:r>
+        <w:rPr>
+          <w:b w:val="0"/>
+        </w:rPr>
+        <w:t>: 20 ảnh có vẽ hộp, mở ra xem máy khoanh có đúng không.</w:t>
+      </w:r>
+    </w:p>
+    <w:p>
+      <w:r>
+        <w:rPr>
+          <w:b w:val="0"/>
+        </w:rPr>
+        <w:t xml:space="preserve">File nộp của đề thường có định dạng riêng → dùng </w:t>
+      </w:r>
+      <w:r>
+        <w:rPr>
+          <w:b/>
+        </w:rPr>
+        <w:t>mẫu D</w:t>
+      </w:r>
+      <w:r>
+        <w:rPr>
+          <w:b w:val="0"/>
+        </w:rPr>
+        <w:t xml:space="preserve"> (Phần D) nhờ AI viết đoạn đổi </w:t>
+      </w:r>
+      <w:r>
+        <w:rPr>
+          <w:rFonts w:ascii="Consolas" w:hAnsi="Consolas"/>
+          <w:b w:val="0"/>
+          <w:color w:val="A31F34"/>
+          <w:sz w:val="20"/>
+        </w:rPr>
+        <w:t>du_doan.csv</w:t>
+      </w:r>
+      <w:r>
+        <w:rPr>
+          <w:b w:val="0"/>
+        </w:rPr>
+        <w:t xml:space="preserve"> sang đúng định dạng. Chạy lại: kéo </w:t>
+      </w:r>
+      <w:r>
+        <w:rPr>
+          <w:rFonts w:ascii="Consolas" w:hAnsi="Consolas"/>
+          <w:b w:val="0"/>
+          <w:color w:val="A31F34"/>
+          <w:sz w:val="20"/>
+        </w:rPr>
+        <w:t>cau_hinh.json</w:t>
+      </w:r>
+      <w:r>
+        <w:rPr>
+          <w:b w:val="0"/>
+        </w:rPr>
+        <w:t xml:space="preserve"> thả lên </w:t>
+      </w:r>
+      <w:r>
+        <w:rPr>
+          <w:rFonts w:ascii="Consolas" w:hAnsi="Consolas"/>
+          <w:b w:val="0"/>
+          <w:color w:val="A31F34"/>
+          <w:sz w:val="20"/>
+        </w:rPr>
+        <w:t>CHAY_LAI_YOLO.bat</w:t>
+      </w:r>
+      <w:r>
+        <w:rPr>
+          <w:b w:val="0"/>
+        </w:rPr>
+        <w:t>.</w:t>
+      </w:r>
+    </w:p>
+    <w:p>
+      <w:r>
+        <w:rPr>
+          <w:b w:val="0"/>
+        </w:rPr>
+        <w:t>Tốc độ trên CPU: khoanh khoảng 10–20 ảnh mỗi giây; học khoảng 1–3 phút mỗi vòng cho 500 ảnh. 30 phút học thường đủ cho vài trăm ảnh.</w:t>
+      </w:r>
+    </w:p>
+    <w:p>
+      <w:pPr>
+        <w:pStyle w:val="Heading3"/>
+      </w:pPr>
+      <w:r>
+        <w:rPr>
+          <w:b w:val="0"/>
+        </w:rPr>
+        <w:t xml:space="preserve">B3. Kiểu 9: ĐỌC CHỮ TRONG ẢNH (bấm đúp </w:t>
+      </w:r>
+      <w:r>
+        <w:rPr>
+          <w:rFonts w:ascii="Consolas" w:hAnsi="Consolas"/>
+          <w:b w:val="0"/>
+          <w:color w:val="A31F34"/>
+          <w:sz w:val="20"/>
+        </w:rPr>
+        <w:t>CHAY_OCR.bat</w:t>
+      </w:r>
+      <w:r>
+        <w:rPr>
+          <w:b w:val="0"/>
+        </w:rPr>
+        <w:t>)</w:t>
+      </w:r>
+    </w:p>
+    <w:p>
+      <w:r>
+        <w:rPr>
+          <w:b w:val="0"/>
+        </w:rPr>
+        <w:t xml:space="preserve">Trả lời: tên lần chạy → ngôn ngữ (Enter = Việt + Anh) → kéo thư mục ảnh → (nếu đề có file chữ đúng) kéo file đó, chọn cột tên ảnh và cột chữ để máy tự chấm </w:t>
+      </w:r>
+      <w:r>
+        <w:rPr>
+          <w:rFonts w:ascii="Consolas" w:hAnsi="Consolas"/>
+          <w:b w:val="0"/>
+          <w:color w:val="A31F34"/>
+          <w:sz w:val="20"/>
+        </w:rPr>
+        <w:t>CER</w:t>
+      </w:r>
+      <w:r>
+        <w:rPr>
+          <w:b w:val="0"/>
+        </w:rPr>
+        <w:t xml:space="preserve"> (càng thấp càng tốt).</w:t>
+      </w:r>
+    </w:p>
+    <w:p>
+      <w:r>
+        <w:rPr>
+          <w:b w:val="0"/>
+        </w:rPr>
+        <w:t xml:space="preserve">Kết quả: </w:t>
+      </w:r>
+      <w:r>
+        <w:rPr>
+          <w:rFonts w:ascii="Consolas" w:hAnsi="Consolas"/>
+          <w:b w:val="0"/>
+          <w:color w:val="A31F34"/>
+          <w:sz w:val="20"/>
+        </w:rPr>
+        <w:t>ket_qua\&lt;tên&gt;\chu_doc_duoc.csv</w:t>
+      </w:r>
+      <w:r>
+        <w:rPr>
+          <w:b w:val="0"/>
+        </w:rPr>
+        <w:t xml:space="preserve"> (mỗi ảnh một dòng chữ), </w:t>
+      </w:r>
+      <w:r>
+        <w:rPr>
+          <w:rFonts w:ascii="Consolas" w:hAnsi="Consolas"/>
+          <w:b w:val="0"/>
+          <w:color w:val="A31F34"/>
+          <w:sz w:val="20"/>
+        </w:rPr>
+        <w:t>tung_dong_chu.csv</w:t>
+      </w:r>
+      <w:r>
+        <w:rPr>
+          <w:b w:val="0"/>
+        </w:rPr>
+        <w:t xml:space="preserve"> (từng đoạn chữ + toạ độ). Định dạng nộp khác thì dùng mẫu D. Tốc độ: khoảng 1–3 giây mỗi ảnh.</w:t>
+      </w:r>
+    </w:p>
+    <w:p>
       <w:pPr>
         <w:pStyle w:val="Heading2"/>
       </w:pPr>
@@ -10314,7 +10571,30 @@
         <w:rPr>
           <w:b w:val="0"/>
         </w:rPr>
-        <w:t>PHẦN E. Bộ này dùng gì (đối chiếu với danh mục kiến thức IOAI)</w:t>
+        <w:t>PHẦN C. Gặp lỗi</w:t>
+      </w:r>
+    </w:p>
+    <w:p>
+      <w:r>
+        <w:rPr>
+          <w:b w:val="0"/>
+        </w:rPr>
+        <w:t xml:space="preserve">Máy in </w:t>
+      </w:r>
+      <w:r>
+        <w:rPr>
+          <w:rFonts w:ascii="Consolas" w:hAnsi="Consolas"/>
+          <w:b w:val="0"/>
+          <w:color w:val="A31F34"/>
+          <w:sz w:val="20"/>
+        </w:rPr>
+        <w:t>!!! LỖI: ...</w:t>
+      </w:r>
+      <w:r>
+        <w:rPr>
+          <w:b w:val="0"/>
+        </w:rPr>
+        <w:t xml:space="preserve"> kèm khoảng 20 dòng phía trên.</w:t>
       </w:r>
     </w:p>
     <w:tbl>
@@ -10338,7 +10618,7 @@
               <w:rPr>
                 <w:b/>
               </w:rPr>
-              <w:t>mục trong danh mục</w:t>
+              <w:t>dòng lỗi có chữ</w:t>
             </w:r>
           </w:p>
         </w:tc>
@@ -10352,7 +10632,7 @@
               <w:rPr>
                 <w:b/>
               </w:rPr>
-              <w:t>có trong bộ này</w:t>
+              <w:t>cách xử lý</w:t>
             </w:r>
           </w:p>
         </w:tc>
@@ -10365,9 +10645,12 @@
           <w:p>
             <w:r>
               <w:rPr>
-                <w:b w:val="0"/>
-              </w:rPr>
-              <w:t>Pandas, NumPy, scikit-learn, xử lý dữ liệu thiếu, cột loại, cột ngày giờ</w:t>
+                <w:rFonts w:ascii="Consolas" w:hAnsi="Consolas"/>
+                <w:b w:val="0"/>
+                <w:color w:val="A31F34"/>
+                <w:sz w:val="20"/>
+              </w:rPr>
+              <w:t>Không thấy file / thư mục đó</w:t>
             </w:r>
           </w:p>
         </w:tc>
@@ -10380,7 +10663,7 @@
               <w:rPr>
                 <w:b w:val="0"/>
               </w:rPr>
-              <w:t>có (kiểu 1)</w:t>
+              <w:t>kéo thả lại đúng file</w:t>
             </w:r>
           </w:p>
         </w:tc>
@@ -10393,9 +10676,12 @@
           <w:p>
             <w:r>
               <w:rPr>
-                <w:b w:val="0"/>
-              </w:rPr>
-              <w:t>Hồi quy tuyến tính / logistic, Gradient Boosting, chấm chéo, accuracy / F1 / RMSE</w:t>
+                <w:rFonts w:ascii="Consolas" w:hAnsi="Consolas"/>
+                <w:b w:val="0"/>
+                <w:color w:val="A31F34"/>
+                <w:sz w:val="20"/>
+              </w:rPr>
+              <w:t>Không thấy ... file (vd ...)</w:t>
             </w:r>
           </w:p>
         </w:tc>
@@ -10408,7 +10694,16 @@
               <w:rPr>
                 <w:b w:val="0"/>
               </w:rPr>
-              <w:t>có (mọi kiểu)</w:t>
+              <w:t xml:space="preserve">sai thư mục chứa ảnh / tiếng: chạy lại, kéo đúng thư mục ở câu </w:t>
+            </w:r>
+            <w:r>
+              <w:rPr>
+                <w:rFonts w:ascii="Consolas" w:hAnsi="Consolas"/>
+                <w:b w:val="0"/>
+                <w:color w:val="A31F34"/>
+                <w:sz w:val="20"/>
+              </w:rPr>
+              <w:t>THƯ MỤC chứa các file đó</w:t>
             </w:r>
           </w:p>
         </w:tc>
@@ -10421,9 +10716,12 @@
           <w:p>
             <w:r>
               <w:rPr>
-                <w:b w:val="0"/>
-              </w:rPr>
-              <w:t>K-Means, PCA</w:t>
+                <w:rFonts w:ascii="Consolas" w:hAnsi="Consolas"/>
+                <w:b w:val="0"/>
+                <w:color w:val="A31F34"/>
+                <w:sz w:val="20"/>
+              </w:rPr>
+              <w:t>Thư mục train phải có thư mục con cho từng lớp</w:t>
             </w:r>
           </w:p>
         </w:tc>
@@ -10436,7 +10734,7 @@
               <w:rPr>
                 <w:b w:val="0"/>
               </w:rPr>
-              <w:t>có (kiểu 5)</w:t>
+              <w:t>thư mục ảnh không chia theo lớp: dùng file bảng (csv) của đề thay cho thư mục</w:t>
             </w:r>
           </w:p>
         </w:tc>
@@ -10449,9 +10747,12 @@
           <w:p>
             <w:r>
               <w:rPr>
-                <w:b w:val="0"/>
-              </w:rPr>
-              <w:t>Nhúng văn bản bằng mô hình có sẵn, phân loại văn bản, TF-IDF</w:t>
+                <w:rFonts w:ascii="Consolas" w:hAnsi="Consolas"/>
+                <w:b w:val="0"/>
+                <w:color w:val="A31F34"/>
+                <w:sz w:val="20"/>
+              </w:rPr>
+              <w:t>KeyError: '&lt;tên cột&gt;'</w:t>
             </w:r>
           </w:p>
         </w:tc>
@@ -10464,7 +10765,19 @@
               <w:rPr>
                 <w:b w:val="0"/>
               </w:rPr>
-              <w:t>có (kiểu 2)</w:t>
+              <w:t xml:space="preserve">gõ sai tên cột: chạy lại, gõ </w:t>
+            </w:r>
+            <w:r>
+              <w:rPr>
+                <w:b/>
+              </w:rPr>
+              <w:t>số thứ tự</w:t>
+            </w:r>
+            <w:r>
+              <w:rPr>
+                <w:b w:val="0"/>
+              </w:rPr>
+              <w:t xml:space="preserve"> cột cho chắc</w:t>
             </w:r>
           </w:p>
         </w:tc>
@@ -10477,9 +10790,12 @@
           <w:p>
             <w:r>
               <w:rPr>
-                <w:b w:val="0"/>
-              </w:rPr>
-              <w:t>Bộ mã hóa ảnh có sẵn (ResNet), CLIP, phân loại ảnh</w:t>
+                <w:rFonts w:ascii="Consolas" w:hAnsi="Consolas"/>
+                <w:b w:val="0"/>
+                <w:color w:val="A31F34"/>
+                <w:sz w:val="20"/>
+              </w:rPr>
+              <w:t>No module named ...</w:t>
             </w:r>
           </w:p>
         </w:tc>
@@ -10492,7 +10808,16 @@
               <w:rPr>
                 <w:b w:val="0"/>
               </w:rPr>
-              <w:t>có (kiểu 3)</w:t>
+              <w:t xml:space="preserve">đang chạy nhầm Python: phải chạy bằng file </w:t>
+            </w:r>
+            <w:r>
+              <w:rPr>
+                <w:rFonts w:ascii="Consolas" w:hAnsi="Consolas"/>
+                <w:b w:val="0"/>
+                <w:color w:val="A31F34"/>
+                <w:sz w:val="20"/>
+              </w:rPr>
+              <w:t>.bat</w:t>
             </w:r>
           </w:p>
         </w:tc>
@@ -10505,9 +10830,18 @@
           <w:p>
             <w:r>
               <w:rPr>
-                <w:b w:val="0"/>
-              </w:rPr>
-              <w:t>Âm thanh</w:t>
+                <w:rFonts w:ascii="Consolas" w:hAnsi="Consolas"/>
+                <w:b w:val="0"/>
+                <w:color w:val="A31F34"/>
+                <w:sz w:val="20"/>
+              </w:rPr>
+              <w:t>MemoryError</w:t>
+            </w:r>
+            <w:r>
+              <w:rPr>
+                <w:b w:val="0"/>
+              </w:rPr>
+              <w:t xml:space="preserve"> hoặc máy đơ</w:t>
             </w:r>
           </w:p>
         </w:tc>
@@ -10520,19 +10854,7 @@
               <w:rPr>
                 <w:b w:val="0"/>
               </w:rPr>
-              <w:t xml:space="preserve">chỉ có đặc trưng phổ mel; </w:t>
-            </w:r>
-            <w:r>
-              <w:rPr>
-                <w:b/>
-              </w:rPr>
-              <w:t>không</w:t>
-            </w:r>
-            <w:r>
-              <w:rPr>
-                <w:b w:val="0"/>
-              </w:rPr>
-              <w:t xml:space="preserve"> có HuBERT / Whisper</w:t>
+              <w:t>dữ liệu quá lớn: hỏi AI theo mẫu A, thêm câu "dữ liệu lớn, hãy lấy mẫu bớt"</w:t>
             </w:r>
           </w:p>
         </w:tc>
@@ -10547,7 +10869,7 @@
               <w:rPr>
                 <w:b w:val="0"/>
               </w:rPr>
-              <w:t>Mô hình mã hóa - giải mã (dịch máy)</w:t>
+              <w:t>lỗi khác</w:t>
             </w:r>
           </w:p>
         </w:tc>
@@ -10560,7 +10882,623 @@
               <w:rPr>
                 <w:b w:val="0"/>
               </w:rPr>
-              <w:t>có (kiểu 7): opus-mt Trung→Việt, Anh↔Việt, Anh→Trung; NLLB-200 cho mọi cặp. Chỉ dùng nguyên trạng, không tinh chỉnh</w:t>
+              <w:t>dùng mẫu A ở Phần D</w:t>
+            </w:r>
+          </w:p>
+        </w:tc>
+      </w:tr>
+    </w:tbl>
+    <w:p/>
+    <w:p>
+      <w:pPr>
+        <w:pStyle w:val="Heading2"/>
+      </w:pPr>
+      <w:r>
+        <w:rPr>
+          <w:b w:val="0"/>
+        </w:rPr>
+        <w:t>PHẦN D. Dùng AI của BTC cho bài 2</w:t>
+      </w:r>
+    </w:p>
+    <w:p>
+      <w:r>
+        <w:rPr>
+          <w:b w:val="0"/>
+        </w:rPr>
+        <w:t>Bài 2 là nơi đáng dùng token nhất, vì bài 1 đã chạy tự động.</w:t>
+      </w:r>
+    </w:p>
+    <w:p>
+      <w:r>
+        <w:rPr>
+          <w:b/>
+        </w:rPr>
+        <w:t>Thứ tự nên làm (lời thầy: nộp nhanh một bản có điểm trước, cải tiến sau):</w:t>
+      </w:r>
+      <w:r>
+        <w:rPr>
+          <w:b w:val="0"/>
+        </w:rPr>
+        <w:t xml:space="preserve"> đọc đề → chạy </w:t>
+      </w:r>
+      <w:r>
+        <w:rPr>
+          <w:rFonts w:ascii="Consolas" w:hAnsi="Consolas"/>
+          <w:b w:val="0"/>
+          <w:color w:val="A31F34"/>
+          <w:sz w:val="20"/>
+        </w:rPr>
+        <w:t>CHAY_BAI2.bat</w:t>
+      </w:r>
+      <w:r>
+        <w:rPr>
+          <w:b w:val="0"/>
+        </w:rPr>
+        <w:t xml:space="preserve"> nếu khớp một trong 5 kiểu → nộp lấy điểm nền → </w:t>
+      </w:r>
+      <w:r>
+        <w:rPr>
+          <w:b/>
+        </w:rPr>
+        <w:t>rồi mới</w:t>
+      </w:r>
+      <w:r>
+        <w:rPr>
+          <w:b w:val="0"/>
+        </w:rPr>
+        <w:t xml:space="preserve"> dùng AI để tăng điểm hoặc làm phần chưa khớp.</w:t>
+      </w:r>
+    </w:p>
+    <w:p>
+      <w:r>
+        <w:rPr>
+          <w:b/>
+        </w:rPr>
+        <w:t>Mẫu A — có lỗi:</w:t>
+      </w:r>
+    </w:p>
+    <w:tbl>
+      <w:tblPr>
+        <w:tblStyle w:val="TableGrid"/>
+        <w:tblW w:type="auto" w:w="0"/>
+        <w:tblLook w:firstColumn="1" w:firstRow="1" w:lastColumn="0" w:lastRow="0" w:noHBand="0" w:noVBand="1" w:val="04A0"/>
+      </w:tblPr>
+      <w:tblGrid>
+        <w:gridCol w:w="8640"/>
+      </w:tblGrid>
+      <w:tr>
+        <w:tc>
+          <w:tcPr>
+            <w:tcW w:type="dxa" w:w="8640"/>
+            <w:shd w:val="clear" w:color="auto" w:fill="F2F2F2"/>
+          </w:tcPr>
+          <w:p>
+            <w:r>
+              <w:rPr>
+                <w:rFonts w:ascii="Consolas" w:hAnsi="Consolas"/>
+                <w:sz w:val="19"/>
+              </w:rPr>
+              <w:t>Tôi chạy một script Python và bị lỗi. 20 dòng cuối:</w:t>
+              <w:br/>
+            </w:r>
+            <w:r>
+              <w:rPr>
+                <w:rFonts w:ascii="Consolas" w:hAnsi="Consolas"/>
+                <w:sz w:val="19"/>
+              </w:rPr>
+              <w:t>&lt;dán&gt;</w:t>
+              <w:br/>
+            </w:r>
+            <w:r>
+              <w:rPr>
+                <w:rFonts w:ascii="Consolas" w:hAnsi="Consolas"/>
+                <w:sz w:val="19"/>
+              </w:rPr>
+              <w:br/>
+            </w:r>
+            <w:r>
+              <w:rPr>
+                <w:rFonts w:ascii="Consolas" w:hAnsi="Consolas"/>
+                <w:sz w:val="19"/>
+              </w:rPr>
+              <w:t>Hàm chứa dòng lỗi (file bai2.py):</w:t>
+              <w:br/>
+            </w:r>
+            <w:r>
+              <w:rPr>
+                <w:rFonts w:ascii="Consolas" w:hAnsi="Consolas"/>
+                <w:sz w:val="19"/>
+              </w:rPr>
+              <w:t>&lt;dán đúng hàm đó&gt;</w:t>
+              <w:br/>
+            </w:r>
+            <w:r>
+              <w:rPr>
+                <w:rFonts w:ascii="Consolas" w:hAnsi="Consolas"/>
+                <w:sz w:val="19"/>
+              </w:rPr>
+              <w:br/>
+            </w:r>
+            <w:r>
+              <w:rPr>
+                <w:rFonts w:ascii="Consolas" w:hAnsi="Consolas"/>
+                <w:sz w:val="19"/>
+              </w:rPr>
+              <w:t>Chỉ ra nguyên nhân và cách sửa ngắn nhất. Trả lời ngắn: chỉ đưa lại hàm đã sửa, đầy đủ.</w:t>
+            </w:r>
+          </w:p>
+        </w:tc>
+      </w:tr>
+    </w:tbl>
+    <w:p/>
+    <w:p>
+      <w:r>
+        <w:rPr>
+          <w:b/>
+        </w:rPr>
+        <w:t>Mẫu B — đề không khớp kiểu nào:</w:t>
+      </w:r>
+    </w:p>
+    <w:tbl>
+      <w:tblPr>
+        <w:tblStyle w:val="TableGrid"/>
+        <w:tblW w:type="auto" w:w="0"/>
+        <w:tblLook w:firstColumn="1" w:firstRow="1" w:lastColumn="0" w:lastRow="0" w:noHBand="0" w:noVBand="1" w:val="04A0"/>
+      </w:tblPr>
+      <w:tblGrid>
+        <w:gridCol w:w="8640"/>
+      </w:tblGrid>
+      <w:tr>
+        <w:tc>
+          <w:tcPr>
+            <w:tcW w:type="dxa" w:w="8640"/>
+            <w:shd w:val="clear" w:color="auto" w:fill="F2F2F2"/>
+          </w:tcPr>
+          <w:p>
+            <w:r>
+              <w:rPr>
+                <w:rFonts w:ascii="Consolas" w:hAnsi="Consolas"/>
+                <w:sz w:val="19"/>
+              </w:rPr>
+              <w:t>Đề bài: &lt;dán nguyên đoạn mô tả nhiệm vụ, dữ liệu, cách chấm, định dạng file nộp&gt;</w:t>
+              <w:br/>
+            </w:r>
+            <w:r>
+              <w:rPr>
+                <w:rFonts w:ascii="Consolas" w:hAnsi="Consolas"/>
+                <w:sz w:val="19"/>
+              </w:rPr>
+              <w:br/>
+            </w:r>
+            <w:r>
+              <w:rPr>
+                <w:rFonts w:ascii="Consolas" w:hAnsi="Consolas"/>
+                <w:sz w:val="19"/>
+              </w:rPr>
+              <w:t>5 dòng đầu của file train: &lt;dán&gt;</w:t>
+              <w:br/>
+            </w:r>
+            <w:r>
+              <w:rPr>
+                <w:rFonts w:ascii="Consolas" w:hAnsi="Consolas"/>
+                <w:sz w:val="19"/>
+              </w:rPr>
+              <w:t>5 dòng đầu của file nộp mẫu: &lt;dán&gt;</w:t>
+              <w:br/>
+            </w:r>
+            <w:r>
+              <w:rPr>
+                <w:rFonts w:ascii="Consolas" w:hAnsi="Consolas"/>
+                <w:sz w:val="19"/>
+              </w:rPr>
+              <w:br/>
+            </w:r>
+            <w:r>
+              <w:rPr>
+                <w:rFonts w:ascii="Consolas" w:hAnsi="Consolas"/>
+                <w:sz w:val="19"/>
+              </w:rPr>
+              <w:t>Máy tôi: Windows, CPU (không GPU), Python 3.13, KHÔNG có mạng. Đã cài: numpy, pandas, scikit-learn, lightgbm, torch, torchvision, transformers, sentence-transformers, sentencepiece, sacrebleu, opencv, pillow, soundfile, scipy, matplotlib.</w:t>
+              <w:br/>
+            </w:r>
+            <w:r>
+              <w:rPr>
+                <w:rFonts w:ascii="Consolas" w:hAnsi="Consolas"/>
+                <w:sz w:val="19"/>
+              </w:rPr>
+              <w:t>Đã cài thêm: ultralytics (YOLO11), easyocr. Mô hình có sẵn offline: ResNet18/50, MobileNetV3, EfficientNet-B0 (torchvision); YOLO11n và YOLO11n-seg ở KIT_BAI2\mo_hinh\yolo11n.pt, yolo11n-seg.pt; EasyOCR vi+en, ch_sim+en; facebook/dinov2-small; openai/clip-vit-base-patch32; intfloat/multilingual-e5-small; bkai-foundation-models/vietnamese-bi-encoder; paraphrase-multilingual-MiniLM-L12-v2; Helsinki-NLP/opus-mt-zh-vi, opus-mt-en-vi, opus-mt-vi-en, opus-mt-en-zh; facebook/nllb-200-distilled-600M.</w:t>
+              <w:br/>
+            </w:r>
+            <w:r>
+              <w:rPr>
+                <w:rFonts w:ascii="Consolas" w:hAnsi="Consolas"/>
+                <w:sz w:val="19"/>
+              </w:rPr>
+              <w:br/>
+            </w:r>
+            <w:r>
+              <w:rPr>
+                <w:rFonts w:ascii="Consolas" w:hAnsi="Consolas"/>
+                <w:sz w:val="19"/>
+              </w:rPr>
+              <w:t>Viết MỘT file Python hoàn chỉnh, chạy được ngay, đọc train/test từ đường dẫn tôi sẽ điền ở đầu file, và ghi submission.csv đúng định dạng file nộp mẫu. Ưu tiên cách đơn giản, chạy nhanh trên CPU. Không giải thích dài.</w:t>
+            </w:r>
+          </w:p>
+        </w:tc>
+      </w:tr>
+    </w:tbl>
+    <w:p/>
+    <w:p>
+      <w:r>
+        <w:rPr>
+          <w:b/>
+        </w:rPr>
+        <w:t>Mẫu C — đã có điểm nền, muốn tăng điểm:</w:t>
+      </w:r>
+    </w:p>
+    <w:tbl>
+      <w:tblPr>
+        <w:tblStyle w:val="TableGrid"/>
+        <w:tblW w:type="auto" w:w="0"/>
+        <w:tblLook w:firstColumn="1" w:firstRow="1" w:lastColumn="0" w:lastRow="0" w:noHBand="0" w:noVBand="1" w:val="04A0"/>
+      </w:tblPr>
+      <w:tblGrid>
+        <w:gridCol w:w="8640"/>
+      </w:tblGrid>
+      <w:tr>
+        <w:tc>
+          <w:tcPr>
+            <w:tcW w:type="dxa" w:w="8640"/>
+            <w:shd w:val="clear" w:color="auto" w:fill="F2F2F2"/>
+          </w:tcPr>
+          <w:p>
+            <w:r>
+              <w:rPr>
+                <w:rFonts w:ascii="Consolas" w:hAnsi="Consolas"/>
+                <w:sz w:val="19"/>
+              </w:rPr>
+              <w:t>Bài toán: &lt;1-2 câu&gt;. Tôi đang dùng &lt;dán dòng "=&gt; CHỌN: ..." và bảng điểm máy in ra&gt;.</w:t>
+              <w:br/>
+            </w:r>
+            <w:r>
+              <w:rPr>
+                <w:rFonts w:ascii="Consolas" w:hAnsi="Consolas"/>
+                <w:sz w:val="19"/>
+              </w:rPr>
+              <w:t>Thước đo của đề: &lt;tên thước đo&gt;.</w:t>
+              <w:br/>
+            </w:r>
+            <w:r>
+              <w:rPr>
+                <w:rFonts w:ascii="Consolas" w:hAnsi="Consolas"/>
+                <w:sz w:val="19"/>
+              </w:rPr>
+              <w:br/>
+            </w:r>
+            <w:r>
+              <w:rPr>
+                <w:rFonts w:ascii="Consolas" w:hAnsi="Consolas"/>
+                <w:sz w:val="19"/>
+              </w:rPr>
+              <w:t>Đây là hàm tạo đặc trưng tôi đang dùng (file bai2.py): &lt;dán hàm table_features / text_features / image_features tương ứng&gt;</w:t>
+              <w:br/>
+            </w:r>
+            <w:r>
+              <w:rPr>
+                <w:rFonts w:ascii="Consolas" w:hAnsi="Consolas"/>
+                <w:sz w:val="19"/>
+              </w:rPr>
+              <w:br/>
+            </w:r>
+            <w:r>
+              <w:rPr>
+                <w:rFonts w:ascii="Consolas" w:hAnsi="Consolas"/>
+                <w:sz w:val="19"/>
+              </w:rPr>
+              <w:t>Đề xuất 2-3 thay đổi có khả năng tăng điểm nhất và đưa lại hàm đã sửa, đầy đủ. Trả lời ngắn.</w:t>
+            </w:r>
+          </w:p>
+        </w:tc>
+      </w:tr>
+    </w:tbl>
+    <w:p/>
+    <w:p>
+      <w:r>
+        <w:rPr>
+          <w:b/>
+        </w:rPr>
+        <w:t>Mẫu D — đổi kết quả sang đúng định dạng nộp (hay dùng với kiểu 8, 9):</w:t>
+      </w:r>
+    </w:p>
+    <w:tbl>
+      <w:tblPr>
+        <w:tblStyle w:val="TableGrid"/>
+        <w:tblW w:type="auto" w:w="0"/>
+        <w:tblLook w:firstColumn="1" w:firstRow="1" w:lastColumn="0" w:lastRow="0" w:noHBand="0" w:noVBand="1" w:val="04A0"/>
+      </w:tblPr>
+      <w:tblGrid>
+        <w:gridCol w:w="8640"/>
+      </w:tblGrid>
+      <w:tr>
+        <w:tc>
+          <w:tcPr>
+            <w:tcW w:type="dxa" w:w="8640"/>
+            <w:shd w:val="clear" w:color="auto" w:fill="F2F2F2"/>
+          </w:tcPr>
+          <w:p>
+            <w:r>
+              <w:rPr>
+                <w:rFonts w:ascii="Consolas" w:hAnsi="Consolas"/>
+                <w:sz w:val="19"/>
+              </w:rPr>
+              <w:t>Tôi có file kết quả du_doan.csv, 5 dòng đầu:</w:t>
+              <w:br/>
+            </w:r>
+            <w:r>
+              <w:rPr>
+                <w:rFonts w:ascii="Consolas" w:hAnsi="Consolas"/>
+                <w:sz w:val="19"/>
+              </w:rPr>
+              <w:t>&lt;dán&gt;</w:t>
+              <w:br/>
+            </w:r>
+            <w:r>
+              <w:rPr>
+                <w:rFonts w:ascii="Consolas" w:hAnsi="Consolas"/>
+                <w:sz w:val="19"/>
+              </w:rPr>
+              <w:br/>
+            </w:r>
+            <w:r>
+              <w:rPr>
+                <w:rFonts w:ascii="Consolas" w:hAnsi="Consolas"/>
+                <w:sz w:val="19"/>
+              </w:rPr>
+              <w:t>Đề yêu cầu file nộp dạng (mô tả của đề + 5 dòng đầu file nộp mẫu):</w:t>
+              <w:br/>
+            </w:r>
+            <w:r>
+              <w:rPr>
+                <w:rFonts w:ascii="Consolas" w:hAnsi="Consolas"/>
+                <w:sz w:val="19"/>
+              </w:rPr>
+              <w:t>&lt;dán&gt;</w:t>
+              <w:br/>
+            </w:r>
+            <w:r>
+              <w:rPr>
+                <w:rFonts w:ascii="Consolas" w:hAnsi="Consolas"/>
+                <w:sz w:val="19"/>
+              </w:rPr>
+              <w:br/>
+            </w:r>
+            <w:r>
+              <w:rPr>
+                <w:rFonts w:ascii="Consolas" w:hAnsi="Consolas"/>
+                <w:sz w:val="19"/>
+              </w:rPr>
+              <w:t>Viết đoạn Python ngắn (pandas) đọc du_doan.csv và ghi submission.csv đúng định dạng trên. Ảnh không có vật thể nào vẫn phải có dòng nếu đề yêu cầu. Chỉ đưa code.</w:t>
+            </w:r>
+          </w:p>
+        </w:tc>
+      </w:tr>
+    </w:tbl>
+    <w:p/>
+    <w:p>
+      <w:r>
+        <w:rPr>
+          <w:b/>
+        </w:rPr>
+        <w:t>Cách chạy code AI viết (mẫu B, D):</w:t>
+      </w:r>
+      <w:r>
+        <w:rPr>
+          <w:b w:val="0"/>
+        </w:rPr>
+        <w:t xml:space="preserve"> trong VS Code tạo file mới trong </w:t>
+      </w:r>
+      <w:r>
+        <w:rPr>
+          <w:rFonts w:ascii="Consolas" w:hAnsi="Consolas"/>
+          <w:b w:val="0"/>
+          <w:color w:val="A31F34"/>
+          <w:sz w:val="20"/>
+        </w:rPr>
+        <w:t>KIT_BAI2</w:t>
+      </w:r>
+      <w:r>
+        <w:rPr>
+          <w:b w:val="0"/>
+        </w:rPr>
+        <w:t xml:space="preserve">, đặt tên </w:t>
+      </w:r>
+      <w:r>
+        <w:rPr>
+          <w:rFonts w:ascii="Consolas" w:hAnsi="Consolas"/>
+          <w:b w:val="0"/>
+          <w:color w:val="A31F34"/>
+          <w:sz w:val="20"/>
+        </w:rPr>
+        <w:t>giai.py</w:t>
+      </w:r>
+      <w:r>
+        <w:rPr>
+          <w:b w:val="0"/>
+        </w:rPr>
+        <w:t>, dán code vào, sửa đường dẫn ở đầu file, lưu. Mở Terminal trong VS Code (</w:t>
+      </w:r>
+      <w:r>
+        <w:rPr>
+          <w:b/>
+        </w:rPr>
+        <w:t>Ctrl + `</w:t>
+      </w:r>
+      <w:r>
+        <w:rPr>
+          <w:b w:val="0"/>
+        </w:rPr>
+        <w:t>) và gõ:</w:t>
+      </w:r>
+    </w:p>
+    <w:p>
+      <w:r>
+        <w:rPr>
+          <w:rFonts w:ascii="Consolas" w:hAnsi="Consolas"/>
+          <w:b w:val="0"/>
+          <w:color w:val="A31F34"/>
+          <w:sz w:val="20"/>
+        </w:rPr>
+        <w:t>&amp; "C:\Users\Thanh Hue\.venv\Scripts\python.exe" giai.py</w:t>
+      </w:r>
+    </w:p>
+    <w:p>
+      <w:r>
+        <w:rPr>
+          <w:b/>
+        </w:rPr>
+        <w:t xml:space="preserve">Cách sửa một hàm trong </w:t>
+      </w:r>
+      <w:r>
+        <w:rPr>
+          <w:rFonts w:ascii="Consolas" w:hAnsi="Consolas"/>
+          <w:b/>
+          <w:color w:val="A31F34"/>
+          <w:sz w:val="20"/>
+        </w:rPr>
+        <w:t>bai2.py</w:t>
+      </w:r>
+      <w:r>
+        <w:rPr>
+          <w:b/>
+        </w:rPr>
+        <w:t xml:space="preserve"> (mẫu A, C):</w:t>
+      </w:r>
+      <w:r>
+        <w:rPr>
+          <w:b w:val="0"/>
+        </w:rPr>
+        <w:t xml:space="preserve"> sao lưu file (Ctrl + C, Ctrl + V trong File Explorer) → mở </w:t>
+      </w:r>
+      <w:r>
+        <w:rPr>
+          <w:rFonts w:ascii="Consolas" w:hAnsi="Consolas"/>
+          <w:b w:val="0"/>
+          <w:color w:val="A31F34"/>
+          <w:sz w:val="20"/>
+        </w:rPr>
+        <w:t>bai2.py</w:t>
+      </w:r>
+      <w:r>
+        <w:rPr>
+          <w:b w:val="0"/>
+        </w:rPr>
+        <w:t xml:space="preserve"> → Ctrl + F gõ </w:t>
+      </w:r>
+      <w:r>
+        <w:rPr>
+          <w:rFonts w:ascii="Consolas" w:hAnsi="Consolas"/>
+          <w:b w:val="0"/>
+          <w:color w:val="A31F34"/>
+          <w:sz w:val="20"/>
+        </w:rPr>
+        <w:t>def &lt;tên hàm&gt;</w:t>
+      </w:r>
+      <w:r>
+        <w:rPr>
+          <w:b w:val="0"/>
+        </w:rPr>
+        <w:t xml:space="preserve"> → bôi đen cả hàm → dán hàm mới đè lên → Ctrl + S → kéo </w:t>
+      </w:r>
+      <w:r>
+        <w:rPr>
+          <w:rFonts w:ascii="Consolas" w:hAnsi="Consolas"/>
+          <w:b w:val="0"/>
+          <w:color w:val="A31F34"/>
+          <w:sz w:val="20"/>
+        </w:rPr>
+        <w:t>cau_hinh.json</w:t>
+      </w:r>
+      <w:r>
+        <w:rPr>
+          <w:b w:val="0"/>
+        </w:rPr>
+        <w:t xml:space="preserve"> thả lên </w:t>
+      </w:r>
+      <w:r>
+        <w:rPr>
+          <w:rFonts w:ascii="Consolas" w:hAnsi="Consolas"/>
+          <w:b w:val="0"/>
+          <w:color w:val="A31F34"/>
+          <w:sz w:val="20"/>
+        </w:rPr>
+        <w:t>CHAY_LAI_BAI2.bat</w:t>
+      </w:r>
+      <w:r>
+        <w:rPr>
+          <w:b w:val="0"/>
+        </w:rPr>
+        <w:t>.</w:t>
+      </w:r>
+    </w:p>
+    <w:p>
+      <w:r>
+        <w:rPr>
+          <w:b w:val="0"/>
+        </w:rPr>
+        <w:t xml:space="preserve">Các hàm chính trong </w:t>
+      </w:r>
+      <w:r>
+        <w:rPr>
+          <w:rFonts w:ascii="Consolas" w:hAnsi="Consolas"/>
+          <w:b w:val="0"/>
+          <w:color w:val="A31F34"/>
+          <w:sz w:val="20"/>
+        </w:rPr>
+        <w:t>bai2.py</w:t>
+      </w:r>
+      <w:r>
+        <w:rPr>
+          <w:b w:val="0"/>
+        </w:rPr>
+        <w:t>:</w:t>
+      </w:r>
+    </w:p>
+    <w:tbl>
+      <w:tblPr>
+        <w:tblStyle w:val="TableGrid"/>
+        <w:tblW w:type="auto" w:w="0"/>
+        <w:tblLook w:firstColumn="1" w:firstRow="1" w:lastColumn="0" w:lastRow="0" w:noHBand="0" w:noVBand="1" w:val="04A0"/>
+      </w:tblPr>
+      <w:tblGrid>
+        <w:gridCol w:w="4320"/>
+        <w:gridCol w:w="4320"/>
+      </w:tblGrid>
+      <w:tr>
+        <w:tc>
+          <w:tcPr>
+            <w:tcW w:type="dxa" w:w="4320"/>
+            <w:shd w:val="clear" w:color="auto" w:fill="DCE6F1"/>
+          </w:tcPr>
+          <w:p>
+            <w:r>
+              <w:rPr>
+                <w:b/>
+              </w:rPr>
+              <w:t>việc</w:t>
+            </w:r>
+          </w:p>
+        </w:tc>
+        <w:tc>
+          <w:tcPr>
+            <w:tcW w:type="dxa" w:w="4320"/>
+            <w:shd w:val="clear" w:color="auto" w:fill="DCE6F1"/>
+          </w:tcPr>
+          <w:p>
+            <w:r>
+              <w:rPr>
+                <w:b/>
+              </w:rPr>
+              <w:t>hàm</w:t>
             </w:r>
           </w:p>
         </w:tc>
@@ -10575,7 +11513,7 @@
               <w:rPr>
                 <w:b w:val="0"/>
               </w:rPr>
-              <w:t>Video</w:t>
+              <w:t>đọc file bảng</w:t>
             </w:r>
           </w:p>
         </w:tc>
@@ -10586,9 +11524,12 @@
           <w:p>
             <w:r>
               <w:rPr>
-                <w:b w:val="0"/>
-              </w:rPr>
-              <w:t>có (kiểu 6), mức cơ bản</w:t>
+                <w:rFonts w:ascii="Consolas" w:hAnsi="Consolas"/>
+                <w:b w:val="0"/>
+                <w:color w:val="A31F34"/>
+                <w:sz w:val="20"/>
+              </w:rPr>
+              <w:t>read_table</w:t>
             </w:r>
           </w:p>
         </w:tc>
@@ -10603,7 +11544,7 @@
               <w:rPr>
                 <w:b w:val="0"/>
               </w:rPr>
-              <w:t>Tự huấn luyện mạng nơ-ron, tinh chỉnh (finetune), CNN từ đầu</w:t>
+              <w:t>tạo đặc trưng cho bảng</w:t>
             </w:r>
           </w:p>
         </w:tc>
@@ -10614,15 +11555,12 @@
           <w:p>
             <w:r>
               <w:rPr>
-                <w:b/>
-              </w:rPr>
-              <w:t>không</w:t>
-            </w:r>
-            <w:r>
-              <w:rPr>
-                <w:b w:val="0"/>
-              </w:rPr>
-              <w:t xml:space="preserve"> (máy không có GPU)</w:t>
+                <w:rFonts w:ascii="Consolas" w:hAnsi="Consolas"/>
+                <w:b w:val="0"/>
+                <w:color w:val="A31F34"/>
+                <w:sz w:val="20"/>
+              </w:rPr>
+              <w:t>table_features</w:t>
             </w:r>
           </w:p>
         </w:tc>
@@ -10637,7 +11575,694 @@
               <w:rPr>
                 <w:b w:val="0"/>
               </w:rPr>
-              <w:t>Phát hiện vật thể (YOLO), phân vùng ảnh (U-Net), GAN, Diffusion</w:t>
+              <w:t>tạo đặc trưng cho văn bản</w:t>
+            </w:r>
+          </w:p>
+        </w:tc>
+        <w:tc>
+          <w:tcPr>
+            <w:tcW w:type="dxa" w:w="4320"/>
+          </w:tcPr>
+          <w:p>
+            <w:r>
+              <w:rPr>
+                <w:rFonts w:ascii="Consolas" w:hAnsi="Consolas"/>
+                <w:b w:val="0"/>
+                <w:color w:val="A31F34"/>
+                <w:sz w:val="20"/>
+              </w:rPr>
+              <w:t>text_features</w:t>
+            </w:r>
+            <w:r>
+              <w:rPr>
+                <w:b w:val="0"/>
+              </w:rPr>
+              <w:t xml:space="preserve">, </w:t>
+            </w:r>
+            <w:r>
+              <w:rPr>
+                <w:rFonts w:ascii="Consolas" w:hAnsi="Consolas"/>
+                <w:b w:val="0"/>
+                <w:color w:val="A31F34"/>
+                <w:sz w:val="20"/>
+              </w:rPr>
+              <w:t>text_embed</w:t>
+            </w:r>
+          </w:p>
+        </w:tc>
+      </w:tr>
+      <w:tr>
+        <w:tc>
+          <w:tcPr>
+            <w:tcW w:type="dxa" w:w="4320"/>
+          </w:tcPr>
+          <w:p>
+            <w:r>
+              <w:rPr>
+                <w:b w:val="0"/>
+              </w:rPr>
+              <w:t>tạo đặc trưng cho ảnh</w:t>
+            </w:r>
+          </w:p>
+        </w:tc>
+        <w:tc>
+          <w:tcPr>
+            <w:tcW w:type="dxa" w:w="4320"/>
+          </w:tcPr>
+          <w:p>
+            <w:r>
+              <w:rPr>
+                <w:rFonts w:ascii="Consolas" w:hAnsi="Consolas"/>
+                <w:b w:val="0"/>
+                <w:color w:val="A31F34"/>
+                <w:sz w:val="20"/>
+              </w:rPr>
+              <w:t>image_features</w:t>
+            </w:r>
+            <w:r>
+              <w:rPr>
+                <w:b w:val="0"/>
+              </w:rPr>
+              <w:t xml:space="preserve">, </w:t>
+            </w:r>
+            <w:r>
+              <w:rPr>
+                <w:rFonts w:ascii="Consolas" w:hAnsi="Consolas"/>
+                <w:b w:val="0"/>
+                <w:color w:val="A31F34"/>
+                <w:sz w:val="20"/>
+              </w:rPr>
+              <w:t>image_embed</w:t>
+            </w:r>
+          </w:p>
+        </w:tc>
+      </w:tr>
+      <w:tr>
+        <w:tc>
+          <w:tcPr>
+            <w:tcW w:type="dxa" w:w="4320"/>
+          </w:tcPr>
+          <w:p>
+            <w:r>
+              <w:rPr>
+                <w:b w:val="0"/>
+              </w:rPr>
+              <w:t>tạo đặc trưng cho âm thanh</w:t>
+            </w:r>
+          </w:p>
+        </w:tc>
+        <w:tc>
+          <w:tcPr>
+            <w:tcW w:type="dxa" w:w="4320"/>
+          </w:tcPr>
+          <w:p>
+            <w:r>
+              <w:rPr>
+                <w:rFonts w:ascii="Consolas" w:hAnsi="Consolas"/>
+                <w:b w:val="0"/>
+                <w:color w:val="A31F34"/>
+                <w:sz w:val="20"/>
+              </w:rPr>
+              <w:t>audio_features</w:t>
+            </w:r>
+            <w:r>
+              <w:rPr>
+                <w:b w:val="0"/>
+              </w:rPr>
+              <w:t xml:space="preserve">, </w:t>
+            </w:r>
+            <w:r>
+              <w:rPr>
+                <w:rFonts w:ascii="Consolas" w:hAnsi="Consolas"/>
+                <w:b w:val="0"/>
+                <w:color w:val="A31F34"/>
+                <w:sz w:val="20"/>
+              </w:rPr>
+              <w:t>audio_feats_one</w:t>
+            </w:r>
+          </w:p>
+        </w:tc>
+      </w:tr>
+      <w:tr>
+        <w:tc>
+          <w:tcPr>
+            <w:tcW w:type="dxa" w:w="4320"/>
+          </w:tcPr>
+          <w:p>
+            <w:r>
+              <w:rPr>
+                <w:b w:val="0"/>
+              </w:rPr>
+              <w:t>các mô hình được thử</w:t>
+            </w:r>
+          </w:p>
+        </w:tc>
+        <w:tc>
+          <w:tcPr>
+            <w:tcW w:type="dxa" w:w="4320"/>
+          </w:tcPr>
+          <w:p>
+            <w:r>
+              <w:rPr>
+                <w:rFonts w:ascii="Consolas" w:hAnsi="Consolas"/>
+                <w:b w:val="0"/>
+                <w:color w:val="A31F34"/>
+                <w:sz w:val="20"/>
+              </w:rPr>
+              <w:t>make_models</w:t>
+            </w:r>
+          </w:p>
+        </w:tc>
+      </w:tr>
+      <w:tr>
+        <w:tc>
+          <w:tcPr>
+            <w:tcW w:type="dxa" w:w="4320"/>
+          </w:tcPr>
+          <w:p>
+            <w:r>
+              <w:rPr>
+                <w:b w:val="0"/>
+              </w:rPr>
+              <w:t>chấm chéo và chọn mô hình</w:t>
+            </w:r>
+          </w:p>
+        </w:tc>
+        <w:tc>
+          <w:tcPr>
+            <w:tcW w:type="dxa" w:w="4320"/>
+          </w:tcPr>
+          <w:p>
+            <w:r>
+              <w:rPr>
+                <w:rFonts w:ascii="Consolas" w:hAnsi="Consolas"/>
+                <w:b w:val="0"/>
+                <w:color w:val="A31F34"/>
+                <w:sz w:val="20"/>
+              </w:rPr>
+              <w:t>fit_predict</w:t>
+            </w:r>
+          </w:p>
+        </w:tc>
+      </w:tr>
+      <w:tr>
+        <w:tc>
+          <w:tcPr>
+            <w:tcW w:type="dxa" w:w="4320"/>
+          </w:tcPr>
+          <w:p>
+            <w:r>
+              <w:rPr>
+                <w:b w:val="0"/>
+              </w:rPr>
+              <w:t>lấy khung hình từ video</w:t>
+            </w:r>
+          </w:p>
+        </w:tc>
+        <w:tc>
+          <w:tcPr>
+            <w:tcW w:type="dxa" w:w="4320"/>
+          </w:tcPr>
+          <w:p>
+            <w:r>
+              <w:rPr>
+                <w:rFonts w:ascii="Consolas" w:hAnsi="Consolas"/>
+                <w:b w:val="0"/>
+                <w:color w:val="A31F34"/>
+                <w:sz w:val="20"/>
+              </w:rPr>
+              <w:t>frames_of</w:t>
+            </w:r>
+          </w:p>
+        </w:tc>
+      </w:tr>
+      <w:tr>
+        <w:tc>
+          <w:tcPr>
+            <w:tcW w:type="dxa" w:w="4320"/>
+          </w:tcPr>
+          <w:p>
+            <w:r>
+              <w:rPr>
+                <w:b w:val="0"/>
+              </w:rPr>
+              <w:t>dịch</w:t>
+            </w:r>
+          </w:p>
+        </w:tc>
+        <w:tc>
+          <w:tcPr>
+            <w:tcW w:type="dxa" w:w="4320"/>
+          </w:tcPr>
+          <w:p>
+            <w:r>
+              <w:rPr>
+                <w:rFonts w:ascii="Consolas" w:hAnsi="Consolas"/>
+                <w:b w:val="0"/>
+                <w:color w:val="A31F34"/>
+                <w:sz w:val="20"/>
+              </w:rPr>
+              <w:t>translate</w:t>
+            </w:r>
+            <w:r>
+              <w:rPr>
+                <w:b w:val="0"/>
+              </w:rPr>
+              <w:t xml:space="preserve">, </w:t>
+            </w:r>
+            <w:r>
+              <w:rPr>
+                <w:rFonts w:ascii="Consolas" w:hAnsi="Consolas"/>
+                <w:b w:val="0"/>
+                <w:color w:val="A31F34"/>
+                <w:sz w:val="20"/>
+              </w:rPr>
+              <w:t>run_translate</w:t>
+            </w:r>
+          </w:p>
+        </w:tc>
+      </w:tr>
+      <w:tr>
+        <w:tc>
+          <w:tcPr>
+            <w:tcW w:type="dxa" w:w="4320"/>
+          </w:tcPr>
+          <w:p>
+            <w:r>
+              <w:rPr>
+                <w:b w:val="0"/>
+              </w:rPr>
+              <w:t>ghi file nộp</w:t>
+            </w:r>
+          </w:p>
+        </w:tc>
+        <w:tc>
+          <w:tcPr>
+            <w:tcW w:type="dxa" w:w="4320"/>
+          </w:tcPr>
+          <w:p>
+            <w:r>
+              <w:rPr>
+                <w:rFonts w:ascii="Consolas" w:hAnsi="Consolas"/>
+                <w:b w:val="0"/>
+                <w:color w:val="A31F34"/>
+                <w:sz w:val="20"/>
+              </w:rPr>
+              <w:t>write_submission</w:t>
+            </w:r>
+          </w:p>
+        </w:tc>
+      </w:tr>
+    </w:tbl>
+    <w:p/>
+    <w:p>
+      <w:pPr>
+        <w:pStyle w:val="Heading2"/>
+      </w:pPr>
+      <w:r>
+        <w:rPr>
+          <w:b w:val="0"/>
+        </w:rPr>
+        <w:t>PHẦN E. Bộ này dùng gì (đối chiếu với danh mục kiến thức IOAI)</w:t>
+      </w:r>
+    </w:p>
+    <w:tbl>
+      <w:tblPr>
+        <w:tblStyle w:val="TableGrid"/>
+        <w:tblW w:type="auto" w:w="0"/>
+        <w:tblLook w:firstColumn="1" w:firstRow="1" w:lastColumn="0" w:lastRow="0" w:noHBand="0" w:noVBand="1" w:val="04A0"/>
+      </w:tblPr>
+      <w:tblGrid>
+        <w:gridCol w:w="4320"/>
+        <w:gridCol w:w="4320"/>
+      </w:tblGrid>
+      <w:tr>
+        <w:tc>
+          <w:tcPr>
+            <w:tcW w:type="dxa" w:w="4320"/>
+            <w:shd w:val="clear" w:color="auto" w:fill="DCE6F1"/>
+          </w:tcPr>
+          <w:p>
+            <w:r>
+              <w:rPr>
+                <w:b/>
+              </w:rPr>
+              <w:t>mục trong danh mục</w:t>
+            </w:r>
+          </w:p>
+        </w:tc>
+        <w:tc>
+          <w:tcPr>
+            <w:tcW w:type="dxa" w:w="4320"/>
+            <w:shd w:val="clear" w:color="auto" w:fill="DCE6F1"/>
+          </w:tcPr>
+          <w:p>
+            <w:r>
+              <w:rPr>
+                <w:b/>
+              </w:rPr>
+              <w:t>có trong bộ này</w:t>
+            </w:r>
+          </w:p>
+        </w:tc>
+      </w:tr>
+      <w:tr>
+        <w:tc>
+          <w:tcPr>
+            <w:tcW w:type="dxa" w:w="4320"/>
+          </w:tcPr>
+          <w:p>
+            <w:r>
+              <w:rPr>
+                <w:b w:val="0"/>
+              </w:rPr>
+              <w:t>Pandas, NumPy, scikit-learn, xử lý dữ liệu thiếu, cột loại, cột ngày giờ</w:t>
+            </w:r>
+          </w:p>
+        </w:tc>
+        <w:tc>
+          <w:tcPr>
+            <w:tcW w:type="dxa" w:w="4320"/>
+          </w:tcPr>
+          <w:p>
+            <w:r>
+              <w:rPr>
+                <w:b w:val="0"/>
+              </w:rPr>
+              <w:t>có (kiểu 1)</w:t>
+            </w:r>
+          </w:p>
+        </w:tc>
+      </w:tr>
+      <w:tr>
+        <w:tc>
+          <w:tcPr>
+            <w:tcW w:type="dxa" w:w="4320"/>
+          </w:tcPr>
+          <w:p>
+            <w:r>
+              <w:rPr>
+                <w:b w:val="0"/>
+              </w:rPr>
+              <w:t>Hồi quy tuyến tính / logistic, Gradient Boosting, chấm chéo, accuracy / F1 / RMSE</w:t>
+            </w:r>
+          </w:p>
+        </w:tc>
+        <w:tc>
+          <w:tcPr>
+            <w:tcW w:type="dxa" w:w="4320"/>
+          </w:tcPr>
+          <w:p>
+            <w:r>
+              <w:rPr>
+                <w:b w:val="0"/>
+              </w:rPr>
+              <w:t>có (mọi kiểu)</w:t>
+            </w:r>
+          </w:p>
+        </w:tc>
+      </w:tr>
+      <w:tr>
+        <w:tc>
+          <w:tcPr>
+            <w:tcW w:type="dxa" w:w="4320"/>
+          </w:tcPr>
+          <w:p>
+            <w:r>
+              <w:rPr>
+                <w:b w:val="0"/>
+              </w:rPr>
+              <w:t>K-Means, PCA</w:t>
+            </w:r>
+          </w:p>
+        </w:tc>
+        <w:tc>
+          <w:tcPr>
+            <w:tcW w:type="dxa" w:w="4320"/>
+          </w:tcPr>
+          <w:p>
+            <w:r>
+              <w:rPr>
+                <w:b w:val="0"/>
+              </w:rPr>
+              <w:t>có (kiểu 5)</w:t>
+            </w:r>
+          </w:p>
+        </w:tc>
+      </w:tr>
+      <w:tr>
+        <w:tc>
+          <w:tcPr>
+            <w:tcW w:type="dxa" w:w="4320"/>
+          </w:tcPr>
+          <w:p>
+            <w:r>
+              <w:rPr>
+                <w:b w:val="0"/>
+              </w:rPr>
+              <w:t>Nhúng văn bản bằng mô hình có sẵn, phân loại văn bản, TF-IDF</w:t>
+            </w:r>
+          </w:p>
+        </w:tc>
+        <w:tc>
+          <w:tcPr>
+            <w:tcW w:type="dxa" w:w="4320"/>
+          </w:tcPr>
+          <w:p>
+            <w:r>
+              <w:rPr>
+                <w:b w:val="0"/>
+              </w:rPr>
+              <w:t>có (kiểu 2)</w:t>
+            </w:r>
+          </w:p>
+        </w:tc>
+      </w:tr>
+      <w:tr>
+        <w:tc>
+          <w:tcPr>
+            <w:tcW w:type="dxa" w:w="4320"/>
+          </w:tcPr>
+          <w:p>
+            <w:r>
+              <w:rPr>
+                <w:b w:val="0"/>
+              </w:rPr>
+              <w:t>Bộ mã hóa ảnh có sẵn (ResNet), CLIP, DINOv2, phân loại ảnh, tinh chỉnh (transfer learning), tăng cường dữ liệu (lật, cắt)</w:t>
+            </w:r>
+          </w:p>
+        </w:tc>
+        <w:tc>
+          <w:tcPr>
+            <w:tcW w:type="dxa" w:w="4320"/>
+          </w:tcPr>
+          <w:p>
+            <w:r>
+              <w:rPr>
+                <w:b w:val="0"/>
+              </w:rPr>
+              <w:t>có (kiểu 3)</w:t>
+            </w:r>
+          </w:p>
+        </w:tc>
+      </w:tr>
+      <w:tr>
+        <w:tc>
+          <w:tcPr>
+            <w:tcW w:type="dxa" w:w="4320"/>
+          </w:tcPr>
+          <w:p>
+            <w:r>
+              <w:rPr>
+                <w:b w:val="0"/>
+              </w:rPr>
+              <w:t>Phát hiện vật thể (YOLO), phân vùng ảnh</w:t>
+            </w:r>
+          </w:p>
+        </w:tc>
+        <w:tc>
+          <w:tcPr>
+            <w:tcW w:type="dxa" w:w="4320"/>
+          </w:tcPr>
+          <w:p>
+            <w:r>
+              <w:rPr>
+                <w:b w:val="0"/>
+              </w:rPr>
+              <w:t>có (kiểu 8, YOLO11n bản nhỏ, học trên CPU)</w:t>
+            </w:r>
+          </w:p>
+        </w:tc>
+      </w:tr>
+      <w:tr>
+        <w:tc>
+          <w:tcPr>
+            <w:tcW w:type="dxa" w:w="4320"/>
+          </w:tcPr>
+          <w:p>
+            <w:r>
+              <w:rPr>
+                <w:b w:val="0"/>
+              </w:rPr>
+              <w:t>Đọc chữ trong ảnh (OCR)</w:t>
+            </w:r>
+          </w:p>
+        </w:tc>
+        <w:tc>
+          <w:tcPr>
+            <w:tcW w:type="dxa" w:w="4320"/>
+          </w:tcPr>
+          <w:p>
+            <w:r>
+              <w:rPr>
+                <w:b w:val="0"/>
+              </w:rPr>
+              <w:t>có (kiểu 9, EasyOCR)</w:t>
+            </w:r>
+          </w:p>
+        </w:tc>
+      </w:tr>
+      <w:tr>
+        <w:tc>
+          <w:tcPr>
+            <w:tcW w:type="dxa" w:w="4320"/>
+          </w:tcPr>
+          <w:p>
+            <w:r>
+              <w:rPr>
+                <w:b w:val="0"/>
+              </w:rPr>
+              <w:t>Âm thanh</w:t>
+            </w:r>
+          </w:p>
+        </w:tc>
+        <w:tc>
+          <w:tcPr>
+            <w:tcW w:type="dxa" w:w="4320"/>
+          </w:tcPr>
+          <w:p>
+            <w:r>
+              <w:rPr>
+                <w:b w:val="0"/>
+              </w:rPr>
+              <w:t xml:space="preserve">chỉ có đặc trưng phổ mel; </w:t>
+            </w:r>
+            <w:r>
+              <w:rPr>
+                <w:b/>
+              </w:rPr>
+              <w:t>không</w:t>
+            </w:r>
+            <w:r>
+              <w:rPr>
+                <w:b w:val="0"/>
+              </w:rPr>
+              <w:t xml:space="preserve"> có HuBERT / Whisper</w:t>
+            </w:r>
+          </w:p>
+        </w:tc>
+      </w:tr>
+      <w:tr>
+        <w:tc>
+          <w:tcPr>
+            <w:tcW w:type="dxa" w:w="4320"/>
+          </w:tcPr>
+          <w:p>
+            <w:r>
+              <w:rPr>
+                <w:b w:val="0"/>
+              </w:rPr>
+              <w:t>Mô hình mã hóa - giải mã (dịch máy)</w:t>
+            </w:r>
+          </w:p>
+        </w:tc>
+        <w:tc>
+          <w:tcPr>
+            <w:tcW w:type="dxa" w:w="4320"/>
+          </w:tcPr>
+          <w:p>
+            <w:r>
+              <w:rPr>
+                <w:b w:val="0"/>
+              </w:rPr>
+              <w:t>có (kiểu 7): opus-mt Trung→Việt, Anh↔Việt, Anh→Trung; NLLB-200 cho mọi cặp. Chỉ dùng nguyên trạng, không tinh chỉnh</w:t>
+            </w:r>
+          </w:p>
+        </w:tc>
+      </w:tr>
+      <w:tr>
+        <w:tc>
+          <w:tcPr>
+            <w:tcW w:type="dxa" w:w="4320"/>
+          </w:tcPr>
+          <w:p>
+            <w:r>
+              <w:rPr>
+                <w:b w:val="0"/>
+              </w:rPr>
+              <w:t>Video</w:t>
+            </w:r>
+          </w:p>
+        </w:tc>
+        <w:tc>
+          <w:tcPr>
+            <w:tcW w:type="dxa" w:w="4320"/>
+          </w:tcPr>
+          <w:p>
+            <w:r>
+              <w:rPr>
+                <w:b w:val="0"/>
+              </w:rPr>
+              <w:t>có (kiểu 6), mức cơ bản</w:t>
+            </w:r>
+          </w:p>
+        </w:tc>
+      </w:tr>
+      <w:tr>
+        <w:tc>
+          <w:tcPr>
+            <w:tcW w:type="dxa" w:w="4320"/>
+          </w:tcPr>
+          <w:p>
+            <w:r>
+              <w:rPr>
+                <w:b w:val="0"/>
+              </w:rPr>
+              <w:t>CNN tự viết từ đầu, mạng lớn</w:t>
+            </w:r>
+          </w:p>
+        </w:tc>
+        <w:tc>
+          <w:tcPr>
+            <w:tcW w:type="dxa" w:w="4320"/>
+          </w:tcPr>
+          <w:p>
+            <w:r>
+              <w:rPr>
+                <w:b/>
+              </w:rPr>
+              <w:t>không</w:t>
+            </w:r>
+            <w:r>
+              <w:rPr>
+                <w:b w:val="0"/>
+              </w:rPr>
+              <w:t xml:space="preserve"> (máy không có GPU)</w:t>
+            </w:r>
+          </w:p>
+        </w:tc>
+      </w:tr>
+      <w:tr>
+        <w:tc>
+          <w:tcPr>
+            <w:tcW w:type="dxa" w:w="4320"/>
+          </w:tcPr>
+          <w:p>
+            <w:r>
+              <w:rPr>
+                <w:b w:val="0"/>
+              </w:rPr>
+              <w:t>U-Net, GAN, Diffusion</w:t>
             </w:r>
           </w:p>
         </w:tc>

</xml_diff>

<commit_message>
File Word: them phan bao ve cuoi gio
Co-Authored-By: Claude Opus 5.5 <noreply@anthropic.com>
</commit_message>
<xml_diff>
--- a/KIT_BAI1/HUONG_DAN_THI.docx
+++ b/KIT_BAI1/HUONG_DAN_THI.docx
@@ -1871,6 +1871,757 @@
           <w:b w:val="0"/>
         </w:rPr>
         <w:t>Ưu tiên: bài 1 lỗi chưa có file nộp → bài 2 chưa có điểm → tăng điểm.</w:t>
+      </w:r>
+    </w:p>
+    <w:p>
+      <w:pPr>
+        <w:pStyle w:val="Heading2"/>
+      </w:pPr>
+      <w:r>
+        <w:rPr>
+          <w:b w:val="0"/>
+        </w:rPr>
+        <w:t>BẢO VỆ CUỐI GIỜ (đọc thuộc, 3–5 phút)</w:t>
+      </w:r>
+    </w:p>
+    <w:p>
+      <w:r>
+        <w:rPr>
+          <w:b w:val="0"/>
+        </w:rPr>
+        <w:t xml:space="preserve">Nguyên tắc: nói </w:t>
+      </w:r>
+      <w:r>
+        <w:rPr>
+          <w:b/>
+        </w:rPr>
+        <w:t>luồng xử lý</w:t>
+      </w:r>
+      <w:r>
+        <w:rPr>
+          <w:b w:val="0"/>
+        </w:rPr>
+        <w:t xml:space="preserve"> (đầu vào → các khâu → đầu ra), </w:t>
+      </w:r>
+      <w:r>
+        <w:rPr>
+          <w:b/>
+        </w:rPr>
+        <w:t>vì sao chọn cách đó</w:t>
+      </w:r>
+      <w:r>
+        <w:rPr>
+          <w:b w:val="0"/>
+        </w:rPr>
+        <w:t xml:space="preserve">, </w:t>
+      </w:r>
+      <w:r>
+        <w:rPr>
+          <w:b/>
+        </w:rPr>
+        <w:t>điểm số</w:t>
+      </w:r>
+      <w:r>
+        <w:rPr>
+          <w:b w:val="0"/>
+        </w:rPr>
+        <w:t xml:space="preserve">, </w:t>
+      </w:r>
+      <w:r>
+        <w:rPr>
+          <w:b/>
+        </w:rPr>
+        <w:t>hạn chế</w:t>
+      </w:r>
+      <w:r>
+        <w:rPr>
+          <w:b w:val="0"/>
+        </w:rPr>
+        <w:t>. Không cần đọc code. Ai hỏi chi tiết thì trả lời bằng ý, không bằng dòng code.</w:t>
+      </w:r>
+    </w:p>
+    <w:p>
+      <w:pPr>
+        <w:pStyle w:val="Heading3"/>
+      </w:pPr>
+      <w:r>
+        <w:rPr>
+          <w:b w:val="0"/>
+        </w:rPr>
+        <w:t>Bài 1 (2–3 phút)</w:t>
+      </w:r>
+    </w:p>
+    <w:p>
+      <w:pPr>
+        <w:ind w:left="360"/>
+      </w:pPr>
+      <w:r>
+        <w:rPr>
+          <w:b/>
+        </w:rPr>
+        <w:t xml:space="preserve">1. </w:t>
+      </w:r>
+      <w:r>
+        <w:rPr>
+          <w:b/>
+        </w:rPr>
+        <w:t>Bài toán:</w:t>
+      </w:r>
+      <w:r>
+        <w:rPr>
+          <w:b w:val="0"/>
+        </w:rPr>
+        <w:t xml:space="preserve"> mỗi cảnh có một ảnh bản đồ và một câu tiếng Việt giao nhiệm vụ; phải đoán bước đi đầu tiên của robot (lên / xuống / trái / phải).</w:t>
+      </w:r>
+    </w:p>
+    <w:p>
+      <w:pPr>
+        <w:ind w:left="360"/>
+      </w:pPr>
+      <w:r>
+        <w:rPr>
+          <w:b/>
+        </w:rPr>
+        <w:t xml:space="preserve">2. </w:t>
+      </w:r>
+      <w:r>
+        <w:rPr>
+          <w:b/>
+        </w:rPr>
+        <w:t>Đội chia làm 3 khâu nối tiếp:</w:t>
+      </w:r>
+    </w:p>
+    <w:p>
+      <w:pPr>
+        <w:pStyle w:val="ListBullet2"/>
+      </w:pPr>
+      <w:r>
+        <w:rPr>
+          <w:b/>
+        </w:rPr>
+        <w:t>Đọc ảnh (thị giác máy tính):</w:t>
+      </w:r>
+      <w:r>
+        <w:rPr>
+          <w:b w:val="0"/>
+        </w:rPr>
+        <w:t xml:space="preserve"> mô hình mạng nơ-ron tích chập (CNN) và mạng nhiều lớp (MLP) nhận diện từng ô của bản đồ: tường, đường, địa điểm, robot.</w:t>
+      </w:r>
+    </w:p>
+    <w:p>
+      <w:pPr>
+        <w:pStyle w:val="ListBullet2"/>
+      </w:pPr>
+      <w:r>
+        <w:rPr>
+          <w:b/>
+        </w:rPr>
+        <w:t>Hiểu câu (xử lý ngôn ngữ):</w:t>
+      </w:r>
+      <w:r>
+        <w:rPr>
+          <w:b w:val="0"/>
+        </w:rPr>
+        <w:t xml:space="preserve"> bộ phân tích câu kết hợp mô hình nhúng câu đa ngữ </w:t>
+      </w:r>
+      <w:r>
+        <w:rPr>
+          <w:b/>
+        </w:rPr>
+        <w:t>multilingual-e5-small</w:t>
+      </w:r>
+      <w:r>
+        <w:rPr>
+          <w:b w:val="0"/>
+        </w:rPr>
+        <w:t xml:space="preserve"> để lấy ra: robot nào, đi đâu, ghé đâu, có điều kiện gì (ban đêm, hàng nặng, đính chính...). Xử lý được cả câu không dấu.</w:t>
+      </w:r>
+    </w:p>
+    <w:p>
+      <w:pPr>
+        <w:pStyle w:val="ListBullet2"/>
+      </w:pPr>
+      <w:r>
+        <w:rPr>
+          <w:b/>
+        </w:rPr>
+        <w:t>Chiến thuật:</w:t>
+      </w:r>
+      <w:r>
+        <w:rPr>
+          <w:b w:val="0"/>
+        </w:rPr>
+        <w:t xml:space="preserve"> mỗi robot có thói quen di chuyển riêng mà đề không nói rõ. Với mỗi hướng đi có thể, đội tính các đặc trưng (đường ngắn nhất, có gần đích không, có qua điểm ghé không...) rồi cho </w:t>
+      </w:r>
+      <w:r>
+        <w:rPr>
+          <w:b/>
+        </w:rPr>
+        <w:t>mỗi robot một mô hình học máy riêng</w:t>
+      </w:r>
+      <w:r>
+        <w:rPr>
+          <w:b w:val="0"/>
+        </w:rPr>
+        <w:t xml:space="preserve"> (HistGradientBoosting) học thói quen của robot đó từ dữ liệu train.</w:t>
+      </w:r>
+    </w:p>
+    <w:p>
+      <w:pPr>
+        <w:ind w:left="360"/>
+      </w:pPr>
+      <w:r>
+        <w:rPr>
+          <w:b/>
+        </w:rPr>
+        <w:t xml:space="preserve">3. </w:t>
+      </w:r>
+      <w:r>
+        <w:rPr>
+          <w:b/>
+        </w:rPr>
+        <w:t>Bản nâng cao:</w:t>
+      </w:r>
+      <w:r>
+        <w:rPr>
+          <w:b w:val="0"/>
+        </w:rPr>
+        <w:t xml:space="preserve"> thêm mô hình "siêu tuyến tính" học trên các đường đi tốt nhất (Pareto), luật tham lam cho robot khó, rồi </w:t>
+      </w:r>
+      <w:r>
+        <w:rPr>
+          <w:b/>
+        </w:rPr>
+        <w:t>tự chọn cách tốt nhất cho từng robot theo điểm trên tập validation</w:t>
+      </w:r>
+      <w:r>
+        <w:rPr>
+          <w:b w:val="0"/>
+        </w:rPr>
+        <w:t>.</w:t>
+      </w:r>
+    </w:p>
+    <w:p>
+      <w:pPr>
+        <w:ind w:left="360"/>
+      </w:pPr>
+      <w:r>
+        <w:rPr>
+          <w:b/>
+        </w:rPr>
+        <w:t xml:space="preserve">4. </w:t>
+      </w:r>
+      <w:r>
+        <w:rPr>
+          <w:b/>
+        </w:rPr>
+        <w:t>Kiểm tra dữ liệu:</w:t>
+      </w:r>
+      <w:r>
+        <w:rPr>
+          <w:b w:val="0"/>
+        </w:rPr>
+        <w:t xml:space="preserve"> trước khi học, đội so sánh đặc trưng của train / validation / test (độ dài câu, tỉ lệ câu không dấu, độ sáng ảnh...) để biết test có khác không. &lt;đọc 1–2 dòng LỆCH nếu có&gt;</w:t>
+      </w:r>
+    </w:p>
+    <w:p>
+      <w:pPr>
+        <w:ind w:left="360"/>
+      </w:pPr>
+      <w:r>
+        <w:rPr>
+          <w:b/>
+        </w:rPr>
+        <w:t xml:space="preserve">5. </w:t>
+      </w:r>
+      <w:r>
+        <w:rPr>
+          <w:b/>
+        </w:rPr>
+        <w:t>Kết quả:</w:t>
+      </w:r>
+      <w:r>
+        <w:rPr>
+          <w:b w:val="0"/>
+        </w:rPr>
+        <w:t xml:space="preserve"> điểm tự chấm validation &lt;điểm trong nhat_ky_diem.txt&gt;, điểm web &lt;điểm&gt;. Điểm web thấp hơn vì &lt;dòng LỆCH, vd câu test dài hơn, nhiều câu không dấu hơn&gt;.</w:t>
+      </w:r>
+    </w:p>
+    <w:p>
+      <w:pPr>
+        <w:ind w:left="360"/>
+      </w:pPr>
+      <w:r>
+        <w:rPr>
+          <w:b/>
+        </w:rPr>
+        <w:t xml:space="preserve">6. </w:t>
+      </w:r>
+      <w:r>
+        <w:rPr>
+          <w:b/>
+        </w:rPr>
+        <w:t>Đề nâng cấp ở chỗ:</w:t>
+      </w:r>
+      <w:r>
+        <w:rPr>
+          <w:b w:val="0"/>
+        </w:rPr>
+        <w:t xml:space="preserve"> &lt;đọc các dòng KHÁC mà script in ra đầu giờ&gt;. Đội xử lý bằng cách &lt;học lại trên dữ liệu mới / sửa phần đọc câu...&gt;.</w:t>
+      </w:r>
+    </w:p>
+    <w:p>
+      <w:pPr>
+        <w:pStyle w:val="Heading3"/>
+      </w:pPr>
+      <w:r>
+        <w:rPr>
+          <w:b w:val="0"/>
+        </w:rPr>
+        <w:t>Bài 2 (1–2 phút)</w:t>
+      </w:r>
+    </w:p>
+    <w:p>
+      <w:pPr>
+        <w:ind w:left="360"/>
+      </w:pPr>
+      <w:r>
+        <w:rPr>
+          <w:b/>
+        </w:rPr>
+        <w:t xml:space="preserve">1. </w:t>
+      </w:r>
+      <w:r>
+        <w:rPr>
+          <w:b/>
+        </w:rPr>
+        <w:t>Bài toán:</w:t>
+      </w:r>
+      <w:r>
+        <w:rPr>
+          <w:b w:val="0"/>
+        </w:rPr>
+        <w:t xml:space="preserve"> &lt;1 câu: dữ liệu gì, đoán gì, chấm bằng gì&gt;.</w:t>
+      </w:r>
+    </w:p>
+    <w:p>
+      <w:pPr>
+        <w:ind w:left="360"/>
+      </w:pPr>
+      <w:r>
+        <w:rPr>
+          <w:b/>
+        </w:rPr>
+        <w:t xml:space="preserve">2. </w:t>
+      </w:r>
+      <w:r>
+        <w:rPr>
+          <w:b/>
+        </w:rPr>
+        <w:t>Cách làm:</w:t>
+      </w:r>
+      <w:r>
+        <w:rPr>
+          <w:b w:val="0"/>
+        </w:rPr>
+        <w:t xml:space="preserve"> &lt;chọn 1 dòng&gt;</w:t>
+      </w:r>
+    </w:p>
+    <w:p>
+      <w:pPr>
+        <w:pStyle w:val="ListBullet2"/>
+      </w:pPr>
+      <w:r>
+        <w:rPr>
+          <w:b w:val="0"/>
+        </w:rPr>
+        <w:t>Bảng: LightGBM + hồi quy tuyến tính, chấm chéo 5 phần, lấy trung bình 3 mô hình tốt nhất.</w:t>
+      </w:r>
+    </w:p>
+    <w:p>
+      <w:pPr>
+        <w:pStyle w:val="ListBullet2"/>
+      </w:pPr>
+      <w:r>
+        <w:rPr>
+          <w:b w:val="0"/>
+        </w:rPr>
+        <w:t>Văn bản: TF-IDF + mô hình nhúng câu (e5, vietnamese-bi-encoder) + hồi quy logistic.</w:t>
+      </w:r>
+    </w:p>
+    <w:p>
+      <w:pPr>
+        <w:pStyle w:val="ListBullet2"/>
+      </w:pPr>
+      <w:r>
+        <w:rPr>
+          <w:b w:val="0"/>
+        </w:rPr>
+        <w:t>Ảnh: rút đặc trưng bằng mô hình học sẵn (ResNet50, CLIP, DINOv2) + hồi quy logistic, sau đó tinh chỉnh MobileNetV3 có tăng cường dữ liệu (lật, cắt ảnh).</w:t>
+      </w:r>
+    </w:p>
+    <w:p>
+      <w:pPr>
+        <w:pStyle w:val="ListBullet2"/>
+      </w:pPr>
+      <w:r>
+        <w:rPr>
+          <w:b w:val="0"/>
+        </w:rPr>
+        <w:t>Khoanh vật thể: YOLO11 học trên dữ liệu đề. Đọc chữ: EasyOCR.</w:t>
+      </w:r>
+    </w:p>
+    <w:p>
+      <w:pPr>
+        <w:pStyle w:val="ListBullet2"/>
+      </w:pPr>
+      <w:r>
+        <w:rPr>
+          <w:b w:val="0"/>
+        </w:rPr>
+        <w:t>Dịch: mô hình dịch có sẵn opus-mt / NLLB-200, chấm bằng BLEU.</w:t>
+      </w:r>
+    </w:p>
+    <w:p>
+      <w:pPr>
+        <w:ind w:left="360"/>
+      </w:pPr>
+      <w:r>
+        <w:rPr>
+          <w:b/>
+        </w:rPr>
+        <w:t xml:space="preserve">3. </w:t>
+      </w:r>
+      <w:r>
+        <w:rPr>
+          <w:b/>
+        </w:rPr>
+        <w:t>Vì sao:</w:t>
+      </w:r>
+      <w:r>
+        <w:rPr>
+          <w:b w:val="0"/>
+        </w:rPr>
+        <w:t xml:space="preserve"> máy chỉ có CPU, 5 tiếng cho 2 bài → chọn mô hình học sẵn + bộ phân loại nhẹ, chạy nhanh mà vẫn mạnh; chấm chéo để chọn mô hình khách quan, tránh học vẹt.</w:t>
+      </w:r>
+    </w:p>
+    <w:p>
+      <w:pPr>
+        <w:ind w:left="360"/>
+      </w:pPr>
+      <w:r>
+        <w:rPr>
+          <w:b/>
+        </w:rPr>
+        <w:t xml:space="preserve">4. </w:t>
+      </w:r>
+      <w:r>
+        <w:rPr>
+          <w:b/>
+        </w:rPr>
+        <w:t>Kết quả:</w:t>
+      </w:r>
+      <w:r>
+        <w:rPr>
+          <w:b w:val="0"/>
+        </w:rPr>
+        <w:t xml:space="preserve"> tự chấm &lt;điểm&gt;, web &lt;điểm&gt;.</w:t>
+      </w:r>
+    </w:p>
+    <w:p>
+      <w:pPr>
+        <w:pStyle w:val="Heading3"/>
+      </w:pPr>
+      <w:r>
+        <w:rPr>
+          <w:b w:val="0"/>
+        </w:rPr>
+        <w:t>Kết (30 giây)</w:t>
+      </w:r>
+    </w:p>
+    <w:p>
+      <w:r>
+        <w:rPr>
+          <w:b w:val="0"/>
+        </w:rPr>
+        <w:t>"Đội ưu tiên có lời giải chạy được sớm rồi cải tiến dần; mọi lựa chọn đều dựa vào điểm tự chấm trên validation / chấm chéo. Nếu có thêm thời gian, đội sẽ &lt;bài 1: tinh chỉnh phần đọc câu cho câu dài, không dấu; bài 2: tinh chỉnh mô hình lớn hơn bằng GPU&gt;."</w:t>
+      </w:r>
+    </w:p>
+    <w:p>
+      <w:pPr>
+        <w:pStyle w:val="Heading3"/>
+      </w:pPr>
+      <w:r>
+        <w:rPr>
+          <w:b w:val="0"/>
+        </w:rPr>
+        <w:t>Câu hỏi hay gặp</w:t>
+      </w:r>
+    </w:p>
+    <w:tbl>
+      <w:tblPr>
+        <w:tblStyle w:val="TableGrid"/>
+        <w:tblW w:type="auto" w:w="0"/>
+        <w:tblLook w:firstColumn="1" w:firstRow="1" w:lastColumn="0" w:lastRow="0" w:noHBand="0" w:noVBand="1" w:val="04A0"/>
+      </w:tblPr>
+      <w:tblGrid>
+        <w:gridCol w:w="4320"/>
+        <w:gridCol w:w="4320"/>
+      </w:tblGrid>
+      <w:tr>
+        <w:tc>
+          <w:tcPr>
+            <w:tcW w:type="dxa" w:w="4320"/>
+            <w:shd w:val="clear" w:color="auto" w:fill="DCE6F1"/>
+          </w:tcPr>
+          <w:p>
+            <w:r>
+              <w:rPr>
+                <w:b/>
+              </w:rPr>
+              <w:t>hỏi</w:t>
+            </w:r>
+          </w:p>
+        </w:tc>
+        <w:tc>
+          <w:tcPr>
+            <w:tcW w:type="dxa" w:w="4320"/>
+            <w:shd w:val="clear" w:color="auto" w:fill="DCE6F1"/>
+          </w:tcPr>
+          <w:p>
+            <w:r>
+              <w:rPr>
+                <w:b/>
+              </w:rPr>
+              <w:t>trả lời</w:t>
+            </w:r>
+          </w:p>
+        </w:tc>
+      </w:tr>
+      <w:tr>
+        <w:tc>
+          <w:tcPr>
+            <w:tcW w:type="dxa" w:w="4320"/>
+          </w:tcPr>
+          <w:p>
+            <w:r>
+              <w:rPr>
+                <w:b w:val="0"/>
+              </w:rPr>
+              <w:t>Code có phải tự viết không?</w:t>
+            </w:r>
+          </w:p>
+        </w:tc>
+        <w:tc>
+          <w:tcPr>
+            <w:tcW w:type="dxa" w:w="4320"/>
+          </w:tcPr>
+          <w:p>
+            <w:r>
+              <w:rPr>
+                <w:b w:val="0"/>
+              </w:rPr>
+              <w:t xml:space="preserve">"Đội chuẩn bị sẵn khung code ở nhà (có dùng AI hỗ trợ viết, như quy định cho phép mang tài liệu), trong giờ thi đội chạy trên dữ liệu mới và chỉnh theo đề." Nói </w:t>
+            </w:r>
+            <w:r>
+              <w:rPr>
+                <w:b/>
+              </w:rPr>
+              <w:t>thật</w:t>
+            </w:r>
+            <w:r>
+              <w:rPr>
+                <w:b w:val="0"/>
+              </w:rPr>
+              <w:t>.</w:t>
+            </w:r>
+          </w:p>
+        </w:tc>
+      </w:tr>
+      <w:tr>
+        <w:tc>
+          <w:tcPr>
+            <w:tcW w:type="dxa" w:w="4320"/>
+          </w:tcPr>
+          <w:p>
+            <w:r>
+              <w:rPr>
+                <w:b w:val="0"/>
+              </w:rPr>
+              <w:t>Sao không dùng một mô hình lớn cho cả bài 1?</w:t>
+            </w:r>
+          </w:p>
+        </w:tc>
+        <w:tc>
+          <w:tcPr>
+            <w:tcW w:type="dxa" w:w="4320"/>
+          </w:tcPr>
+          <w:p>
+            <w:r>
+              <w:rPr>
+                <w:b w:val="0"/>
+              </w:rPr>
+              <w:t>Dữ liệu ít, máy CPU; chia 3 khâu thì khâu nào sai biết ngay để sửa, và mỗi khâu nhẹ, nhanh.</w:t>
+            </w:r>
+          </w:p>
+        </w:tc>
+      </w:tr>
+      <w:tr>
+        <w:tc>
+          <w:tcPr>
+            <w:tcW w:type="dxa" w:w="4320"/>
+          </w:tcPr>
+          <w:p>
+            <w:r>
+              <w:rPr>
+                <w:b w:val="0"/>
+              </w:rPr>
+              <w:t>Sao mỗi robot một mô hình?</w:t>
+            </w:r>
+          </w:p>
+        </w:tc>
+        <w:tc>
+          <w:tcPr>
+            <w:tcW w:type="dxa" w:w="4320"/>
+          </w:tcPr>
+          <w:p>
+            <w:r>
+              <w:rPr>
+                <w:b w:val="0"/>
+              </w:rPr>
+              <w:t>Mỗi robot có luật đi riêng; học chung sẽ lẫn luật của robot này với robot kia.</w:t>
+            </w:r>
+          </w:p>
+        </w:tc>
+      </w:tr>
+      <w:tr>
+        <w:tc>
+          <w:tcPr>
+            <w:tcW w:type="dxa" w:w="4320"/>
+          </w:tcPr>
+          <w:p>
+            <w:r>
+              <w:rPr>
+                <w:b w:val="0"/>
+              </w:rPr>
+              <w:t>Làm sao biết không học vẹt?</w:t>
+            </w:r>
+          </w:p>
+        </w:tc>
+        <w:tc>
+          <w:tcPr>
+            <w:tcW w:type="dxa" w:w="4320"/>
+          </w:tcPr>
+          <w:p>
+            <w:r>
+              <w:rPr>
+                <w:b w:val="0"/>
+              </w:rPr>
+              <w:t>Chỉ học trên train, chấm trên validation / chấm chéo; không học gì trên test.</w:t>
+            </w:r>
+          </w:p>
+        </w:tc>
+      </w:tr>
+      <w:tr>
+        <w:tc>
+          <w:tcPr>
+            <w:tcW w:type="dxa" w:w="4320"/>
+          </w:tcPr>
+          <w:p>
+            <w:r>
+              <w:rPr>
+                <w:b w:val="0"/>
+              </w:rPr>
+              <w:t>Điểm web thấp hơn tự chấm?</w:t>
+            </w:r>
+          </w:p>
+        </w:tc>
+        <w:tc>
+          <w:tcPr>
+            <w:tcW w:type="dxa" w:w="4320"/>
+          </w:tcPr>
+          <w:p>
+            <w:r>
+              <w:rPr>
+                <w:b w:val="0"/>
+              </w:rPr>
+              <w:t>Test khác validation (bảng so sánh đặc trưng chỉ ra chỗ lệch), nên đó là bình thường.</w:t>
+            </w:r>
+          </w:p>
+        </w:tc>
+      </w:tr>
+      <w:tr>
+        <w:tc>
+          <w:tcPr>
+            <w:tcW w:type="dxa" w:w="4320"/>
+          </w:tcPr>
+          <w:p>
+            <w:r>
+              <w:rPr>
+                <w:b w:val="0"/>
+              </w:rPr>
+              <w:t>Khâu nào yếu nhất?</w:t>
+            </w:r>
+          </w:p>
+        </w:tc>
+        <w:tc>
+          <w:tcPr>
+            <w:tcW w:type="dxa" w:w="4320"/>
+          </w:tcPr>
+          <w:p>
+            <w:r>
+              <w:rPr>
+                <w:b w:val="0"/>
+              </w:rPr>
+              <w:t>Xem bảng CHẨN ĐOÁN bài 1: dòng có điểm thấp nhất (thường là chiến thuật của vài robot).</w:t>
+            </w:r>
+          </w:p>
+        </w:tc>
+      </w:tr>
+    </w:tbl>
+    <w:p/>
+    <w:p>
+      <w:r>
+        <w:rPr>
+          <w:b/>
+        </w:rPr>
+        <w:t>Trước giờ bảo vệ 15 phút:</w:t>
+      </w:r>
+      <w:r>
+        <w:rPr>
+          <w:b w:val="0"/>
+        </w:rPr>
+        <w:t xml:space="preserve"> điền các chỗ </w:t>
+      </w:r>
+      <w:r>
+        <w:rPr>
+          <w:rFonts w:ascii="Consolas" w:hAnsi="Consolas"/>
+          <w:b w:val="0"/>
+          <w:color w:val="A31F34"/>
+          <w:sz w:val="20"/>
+        </w:rPr>
+        <w:t>&lt; &gt;</w:t>
+      </w:r>
+      <w:r>
+        <w:rPr>
+          <w:b w:val="0"/>
+        </w:rPr>
+        <w:t xml:space="preserve"> bằng số thật (lấy từ </w:t>
+      </w:r>
+      <w:r>
+        <w:rPr>
+          <w:rFonts w:ascii="Consolas" w:hAnsi="Consolas"/>
+          <w:b w:val="0"/>
+          <w:color w:val="A31F34"/>
+          <w:sz w:val="20"/>
+        </w:rPr>
+        <w:t>nhat_ky_diem.txt</w:t>
+      </w:r>
+      <w:r>
+        <w:rPr>
+          <w:b w:val="0"/>
+        </w:rPr>
+        <w:t>, bảng CHẨN ĐOÁN, điểm web, các dòng KHÁC / LỆCH đầu giờ). Phân công: một bạn nói bài 1, một bạn nói bài 2, bạn còn lại trả lời câu hỏi.</w:t>
       </w:r>
     </w:p>
     <w:p>

</xml_diff>

<commit_message>
Chay tren JupyterHub: thu muc JUPYTER (cai_dat.sh, bai1.sh, hoc_lai.sh, notebook, dong_goi.py, huong dan); GPU cho YOLO va tinh chinh anh; tai du mo hinh bai 2
Co-Authored-By: Claude Opus 5.5 <noreply@anthropic.com>
</commit_message>
<xml_diff>
--- a/KIT_BAI1/HUONG_DAN_THI.docx
+++ b/KIT_BAI1/HUONG_DAN_THI.docx
@@ -18,19 +18,31 @@
         <w:rPr>
           <w:b w:val="0"/>
         </w:rPr>
-        <w:t xml:space="preserve">Tài liệu gồm ba phần: </w:t>
+        <w:t xml:space="preserve">Tài liệu gồm: </w:t>
       </w:r>
       <w:r>
         <w:rPr>
           <w:b/>
         </w:rPr>
-        <w:t>Trang 1 — tóm tắt nhanh</w:t>
+        <w:t>Tóm tắt nhanh</w:t>
       </w:r>
       <w:r>
         <w:rPr>
           <w:b w:val="0"/>
         </w:rPr>
         <w:t xml:space="preserve"> (đọc trước), </w:t>
+      </w:r>
+      <w:r>
+        <w:rPr>
+          <w:b/>
+        </w:rPr>
+        <w:t>Chạy trên JupyterHub</w:t>
+      </w:r>
+      <w:r>
+        <w:rPr>
+          <w:b w:val="0"/>
+        </w:rPr>
+        <w:t xml:space="preserve">, </w:t>
       </w:r>
       <w:r>
         <w:rPr>
@@ -243,6 +255,352 @@
         <w:t>Chuẩn bị giấy bút để ghi: tên file đã nộp và điểm trên web của mỗi lần nộp.</w:t>
       </w:r>
     </w:p>
+    <w:p>
+      <w:pPr>
+        <w:pStyle w:val="Heading3"/>
+      </w:pPr>
+      <w:r>
+        <w:rPr>
+          <w:b w:val="0"/>
+        </w:rPr>
+        <w:t>Nếu BTC bắt chạy trên JupyterHub</w:t>
+      </w:r>
+    </w:p>
+    <w:p>
+      <w:r>
+        <w:rPr>
+          <w:b w:val="0"/>
+        </w:rPr>
+        <w:t xml:space="preserve">Không bấm </w:t>
+      </w:r>
+      <w:r>
+        <w:rPr>
+          <w:rFonts w:ascii="Consolas" w:hAnsi="Consolas"/>
+          <w:b w:val="0"/>
+          <w:color w:val="A31F34"/>
+          <w:sz w:val="20"/>
+        </w:rPr>
+        <w:t>.bat</w:t>
+      </w:r>
+      <w:r>
+        <w:rPr>
+          <w:b w:val="0"/>
+        </w:rPr>
+        <w:t xml:space="preserve">. Mở </w:t>
+      </w:r>
+      <w:r>
+        <w:rPr>
+          <w:b/>
+        </w:rPr>
+        <w:t>Terminal</w:t>
+      </w:r>
+      <w:r>
+        <w:rPr>
+          <w:b w:val="0"/>
+        </w:rPr>
+        <w:t xml:space="preserve"> trong JupyterHub (Launcher → Terminal), dán lệnh rồi Enter. Chi tiết từng bước: phần </w:t>
+      </w:r>
+      <w:r>
+        <w:rPr>
+          <w:b/>
+        </w:rPr>
+        <w:t>CHẠY TRÊN JUPYTERHUB</w:t>
+      </w:r>
+      <w:r>
+        <w:rPr>
+          <w:b w:val="0"/>
+        </w:rPr>
+        <w:t xml:space="preserve"> ngay sau phần tóm tắt này.</w:t>
+      </w:r>
+    </w:p>
+    <w:tbl>
+      <w:tblPr>
+        <w:tblStyle w:val="TableGrid"/>
+        <w:tblW w:type="auto" w:w="0"/>
+        <w:tblLook w:firstColumn="1" w:firstRow="1" w:lastColumn="0" w:lastRow="0" w:noHBand="0" w:noVBand="1" w:val="04A0"/>
+      </w:tblPr>
+      <w:tblGrid>
+        <w:gridCol w:w="4320"/>
+        <w:gridCol w:w="4320"/>
+      </w:tblGrid>
+      <w:tr>
+        <w:tc>
+          <w:tcPr>
+            <w:tcW w:type="dxa" w:w="4320"/>
+            <w:shd w:val="clear" w:color="auto" w:fill="DCE6F1"/>
+          </w:tcPr>
+          <w:p>
+            <w:r>
+              <w:rPr>
+                <w:b/>
+              </w:rPr>
+              <w:t>việc</w:t>
+            </w:r>
+          </w:p>
+        </w:tc>
+        <w:tc>
+          <w:tcPr>
+            <w:tcW w:type="dxa" w:w="4320"/>
+            <w:shd w:val="clear" w:color="auto" w:fill="DCE6F1"/>
+          </w:tcPr>
+          <w:p>
+            <w:r>
+              <w:rPr>
+                <w:b/>
+              </w:rPr>
+              <w:t>lệnh dán vào Terminal</w:t>
+            </w:r>
+          </w:p>
+        </w:tc>
+      </w:tr>
+      <w:tr>
+        <w:tc>
+          <w:tcPr>
+            <w:tcW w:type="dxa" w:w="4320"/>
+          </w:tcPr>
+          <w:p>
+            <w:r>
+              <w:rPr>
+                <w:b w:val="0"/>
+              </w:rPr>
+              <w:t xml:space="preserve">giải nén bộ đồ nghề (sau khi upload </w:t>
+            </w:r>
+            <w:r>
+              <w:rPr>
+                <w:rFonts w:ascii="Consolas" w:hAnsi="Consolas"/>
+                <w:b w:val="0"/>
+                <w:color w:val="A31F34"/>
+                <w:sz w:val="20"/>
+              </w:rPr>
+              <w:t>kit.zip</w:t>
+            </w:r>
+            <w:r>
+              <w:rPr>
+                <w:b w:val="0"/>
+              </w:rPr>
+              <w:t>)</w:t>
+            </w:r>
+          </w:p>
+        </w:tc>
+        <w:tc>
+          <w:tcPr>
+            <w:tcW w:type="dxa" w:w="4320"/>
+          </w:tcPr>
+          <w:p>
+            <w:r>
+              <w:rPr>
+                <w:rFonts w:ascii="Consolas" w:hAnsi="Consolas"/>
+                <w:b w:val="0"/>
+                <w:color w:val="A31F34"/>
+                <w:sz w:val="20"/>
+              </w:rPr>
+              <w:t>cd ~ &amp;&amp; python -m zipfile -e kit.zip ~</w:t>
+            </w:r>
+          </w:p>
+        </w:tc>
+      </w:tr>
+      <w:tr>
+        <w:tc>
+          <w:tcPr>
+            <w:tcW w:type="dxa" w:w="4320"/>
+          </w:tcPr>
+          <w:p>
+            <w:r>
+              <w:rPr>
+                <w:b w:val="0"/>
+              </w:rPr>
+              <w:t>cài đặt, một lần</w:t>
+            </w:r>
+          </w:p>
+        </w:tc>
+        <w:tc>
+          <w:tcPr>
+            <w:tcW w:type="dxa" w:w="4320"/>
+          </w:tcPr>
+          <w:p>
+            <w:r>
+              <w:rPr>
+                <w:rFonts w:ascii="Consolas" w:hAnsi="Consolas"/>
+                <w:b w:val="0"/>
+                <w:color w:val="A31F34"/>
+                <w:sz w:val="20"/>
+              </w:rPr>
+              <w:t>bash ~/B1/JUPYTER/cai_dat.sh</w:t>
+            </w:r>
+          </w:p>
+        </w:tc>
+      </w:tr>
+      <w:tr>
+        <w:tc>
+          <w:tcPr>
+            <w:tcW w:type="dxa" w:w="4320"/>
+          </w:tcPr>
+          <w:p>
+            <w:r>
+              <w:rPr>
+                <w:b w:val="0"/>
+              </w:rPr>
+              <w:t>bài 1</w:t>
+            </w:r>
+          </w:p>
+        </w:tc>
+        <w:tc>
+          <w:tcPr>
+            <w:tcW w:type="dxa" w:w="4320"/>
+          </w:tcPr>
+          <w:p>
+            <w:r>
+              <w:rPr>
+                <w:rFonts w:ascii="Consolas" w:hAnsi="Consolas"/>
+                <w:b w:val="0"/>
+                <w:color w:val="A31F34"/>
+                <w:sz w:val="20"/>
+              </w:rPr>
+              <w:t xml:space="preserve">bash ~/B1/JUPYTER/bai1.sh </w:t>
+            </w:r>
+            <w:r>
+              <w:rPr>
+                <w:b w:val="0"/>
+              </w:rPr>
+              <w:t xml:space="preserve"> + dán đường dẫn (chuột phải thư mục → Copy Path)</w:t>
+            </w:r>
+          </w:p>
+        </w:tc>
+      </w:tr>
+      <w:tr>
+        <w:tc>
+          <w:tcPr>
+            <w:tcW w:type="dxa" w:w="4320"/>
+          </w:tcPr>
+          <w:p>
+            <w:r>
+              <w:rPr>
+                <w:b w:val="0"/>
+              </w:rPr>
+              <w:t>học lại sau khi sửa code</w:t>
+            </w:r>
+          </w:p>
+        </w:tc>
+        <w:tc>
+          <w:tcPr>
+            <w:tcW w:type="dxa" w:w="4320"/>
+          </w:tcPr>
+          <w:p>
+            <w:r>
+              <w:rPr>
+                <w:rFonts w:ascii="Consolas" w:hAnsi="Consolas"/>
+                <w:b w:val="0"/>
+                <w:color w:val="A31F34"/>
+                <w:sz w:val="20"/>
+              </w:rPr>
+              <w:t>bash ~/B1/JUPYTER/hoc_lai.sh</w:t>
+            </w:r>
+          </w:p>
+        </w:tc>
+      </w:tr>
+      <w:tr>
+        <w:tc>
+          <w:tcPr>
+            <w:tcW w:type="dxa" w:w="4320"/>
+          </w:tcPr>
+          <w:p>
+            <w:r>
+              <w:rPr>
+                <w:b w:val="0"/>
+              </w:rPr>
+              <w:t>bài 2</w:t>
+            </w:r>
+          </w:p>
+        </w:tc>
+        <w:tc>
+          <w:tcPr>
+            <w:tcW w:type="dxa" w:w="4320"/>
+          </w:tcPr>
+          <w:p>
+            <w:r>
+              <w:rPr>
+                <w:rFonts w:ascii="Consolas" w:hAnsi="Consolas"/>
+                <w:b w:val="0"/>
+                <w:color w:val="A31F34"/>
+                <w:sz w:val="20"/>
+              </w:rPr>
+              <w:t>cd ~/B1/KIT_BAI2 &amp;&amp; python bai2.py</w:t>
+            </w:r>
+            <w:r>
+              <w:rPr>
+                <w:b w:val="0"/>
+              </w:rPr>
+              <w:t xml:space="preserve"> (hoặc </w:t>
+            </w:r>
+            <w:r>
+              <w:rPr>
+                <w:rFonts w:ascii="Consolas" w:hAnsi="Consolas"/>
+                <w:b w:val="0"/>
+                <w:color w:val="A31F34"/>
+                <w:sz w:val="20"/>
+              </w:rPr>
+              <w:t>yolo_mau.py</w:t>
+            </w:r>
+            <w:r>
+              <w:rPr>
+                <w:b w:val="0"/>
+              </w:rPr>
+              <w:t xml:space="preserve">, </w:t>
+            </w:r>
+            <w:r>
+              <w:rPr>
+                <w:rFonts w:ascii="Consolas" w:hAnsi="Consolas"/>
+                <w:b w:val="0"/>
+                <w:color w:val="A31F34"/>
+                <w:sz w:val="20"/>
+              </w:rPr>
+              <w:t>ocr_mau.py</w:t>
+            </w:r>
+            <w:r>
+              <w:rPr>
+                <w:b w:val="0"/>
+              </w:rPr>
+              <w:t>)</w:t>
+            </w:r>
+          </w:p>
+        </w:tc>
+      </w:tr>
+      <w:tr>
+        <w:tc>
+          <w:tcPr>
+            <w:tcW w:type="dxa" w:w="4320"/>
+          </w:tcPr>
+          <w:p>
+            <w:r>
+              <w:rPr>
+                <w:b w:val="0"/>
+              </w:rPr>
+              <w:t>lấy file nộp về máy</w:t>
+            </w:r>
+          </w:p>
+        </w:tc>
+        <w:tc>
+          <w:tcPr>
+            <w:tcW w:type="dxa" w:w="4320"/>
+          </w:tcPr>
+          <w:p>
+            <w:r>
+              <w:rPr>
+                <w:b w:val="0"/>
+              </w:rPr>
+              <w:t xml:space="preserve">cây thư mục bên trái → chuột phải file → </w:t>
+            </w:r>
+            <w:r>
+              <w:rPr>
+                <w:b/>
+              </w:rPr>
+              <w:t>Download</w:t>
+            </w:r>
+          </w:p>
+        </w:tc>
+      </w:tr>
+    </w:tbl>
+    <w:p/>
     <w:p>
       <w:pPr>
         <w:pStyle w:val="Heading3"/>
@@ -2622,6 +2980,1796 @@
           <w:b w:val="0"/>
         </w:rPr>
         <w:t>, bảng CHẨN ĐOÁN, điểm web, các dòng KHÁC / LỆCH đầu giờ). Phân công: một bạn nói bài 1, một bạn nói bài 2, bạn còn lại trả lời câu hỏi.</w:t>
+      </w:r>
+    </w:p>
+    <w:p>
+      <w:r>
+        <w:br w:type="page"/>
+      </w:r>
+    </w:p>
+    <w:p>
+      <w:pPr>
+        <w:pStyle w:val="Heading1"/>
+      </w:pPr>
+      <w:r>
+        <w:rPr>
+          <w:b w:val="0"/>
+        </w:rPr>
+        <w:t>CHẠY TRÊN JUPYTERHUB (máy chủ của BTC)</w:t>
+      </w:r>
+    </w:p>
+    <w:p>
+      <w:r>
+        <w:rPr>
+          <w:b w:val="0"/>
+        </w:rPr>
+        <w:t xml:space="preserve">JupyterHub = máy chủ của BTC, dùng qua </w:t>
+      </w:r>
+      <w:r>
+        <w:rPr>
+          <w:b/>
+        </w:rPr>
+        <w:t>trình duyệt</w:t>
+      </w:r>
+      <w:r>
+        <w:rPr>
+          <w:b w:val="0"/>
+        </w:rPr>
+        <w:t xml:space="preserve">. Không bấm </w:t>
+      </w:r>
+      <w:r>
+        <w:rPr>
+          <w:rFonts w:ascii="Consolas" w:hAnsi="Consolas"/>
+          <w:b w:val="0"/>
+          <w:color w:val="A31F34"/>
+          <w:sz w:val="20"/>
+        </w:rPr>
+        <w:t>.bat</w:t>
+      </w:r>
+      <w:r>
+        <w:rPr>
+          <w:b w:val="0"/>
+        </w:rPr>
+        <w:t xml:space="preserve"> được; thay vào đó </w:t>
+      </w:r>
+      <w:r>
+        <w:rPr>
+          <w:b/>
+        </w:rPr>
+        <w:t>dán lệnh vào Terminal</w:t>
+      </w:r>
+      <w:r>
+        <w:rPr>
+          <w:b w:val="0"/>
+        </w:rPr>
+        <w:t xml:space="preserve"> rồi Enter. Màn hình chạy y hệt cửa sổ đen trên máy mình.</w:t>
+      </w:r>
+    </w:p>
+    <w:p>
+      <w:r>
+        <w:rPr>
+          <w:b w:val="0"/>
+        </w:rPr>
+        <w:t xml:space="preserve">Mọi lệnh dưới đây: bôi đen → Ctrl + C → bấm vào Terminal → </w:t>
+      </w:r>
+      <w:r>
+        <w:rPr>
+          <w:b/>
+        </w:rPr>
+        <w:t>Ctrl + Shift + V</w:t>
+      </w:r>
+      <w:r>
+        <w:rPr>
+          <w:b w:val="0"/>
+        </w:rPr>
+        <w:t xml:space="preserve"> (hoặc chuột phải → Paste) → </w:t>
+      </w:r>
+      <w:r>
+        <w:rPr>
+          <w:b/>
+        </w:rPr>
+        <w:t>Enter</w:t>
+      </w:r>
+      <w:r>
+        <w:rPr>
+          <w:b w:val="0"/>
+        </w:rPr>
+        <w:t>.</w:t>
+      </w:r>
+    </w:p>
+    <w:p>
+      <w:pPr>
+        <w:pStyle w:val="Heading2"/>
+      </w:pPr>
+      <w:r>
+        <w:rPr>
+          <w:b w:val="0"/>
+        </w:rPr>
+        <w:t>Bước 0. Tối nay ở nhà: đóng gói (máy Huệ, cần làm một lần)</w:t>
+      </w:r>
+    </w:p>
+    <w:p>
+      <w:r>
+        <w:rPr>
+          <w:b w:val="0"/>
+        </w:rPr>
+        <w:t xml:space="preserve">Mở Terminal trong VS Code (hoặc cửa sổ lệnh) tại thư mục </w:t>
+      </w:r>
+      <w:r>
+        <w:rPr>
+          <w:rFonts w:ascii="Consolas" w:hAnsi="Consolas"/>
+          <w:b w:val="0"/>
+          <w:color w:val="A31F34"/>
+          <w:sz w:val="20"/>
+        </w:rPr>
+        <w:t>Phenikaa_Campus_Courier_2026</w:t>
+      </w:r>
+      <w:r>
+        <w:rPr>
+          <w:b w:val="0"/>
+        </w:rPr>
+        <w:t>, gõ:</w:t>
+      </w:r>
+    </w:p>
+    <w:tbl>
+      <w:tblPr>
+        <w:tblStyle w:val="TableGrid"/>
+        <w:tblW w:type="auto" w:w="0"/>
+        <w:tblLook w:firstColumn="1" w:firstRow="1" w:lastColumn="0" w:lastRow="0" w:noHBand="0" w:noVBand="1" w:val="04A0"/>
+      </w:tblPr>
+      <w:tblGrid>
+        <w:gridCol w:w="8640"/>
+      </w:tblGrid>
+      <w:tr>
+        <w:tc>
+          <w:tcPr>
+            <w:tcW w:type="dxa" w:w="8640"/>
+            <w:shd w:val="clear" w:color="auto" w:fill="F2F2F2"/>
+          </w:tcPr>
+          <w:p>
+            <w:r>
+              <w:rPr>
+                <w:rFonts w:ascii="Consolas" w:hAnsi="Consolas"/>
+                <w:sz w:val="19"/>
+              </w:rPr>
+              <w:t>&amp; "C:\Users\Thanh Hue\.venv\Scripts\python.exe" JUPYTER\dong_goi.py</w:t>
+            </w:r>
+          </w:p>
+        </w:tc>
+      </w:tr>
+    </w:tbl>
+    <w:p/>
+    <w:p>
+      <w:r>
+        <w:rPr>
+          <w:b w:val="0"/>
+        </w:rPr>
+        <w:t xml:space="preserve">Sẽ có thư mục </w:t>
+      </w:r>
+      <w:r>
+        <w:rPr>
+          <w:rFonts w:ascii="Consolas" w:hAnsi="Consolas"/>
+          <w:b/>
+          <w:color w:val="A31F34"/>
+          <w:sz w:val="20"/>
+        </w:rPr>
+        <w:t>Desktop\GOI_JUPYTER</w:t>
+      </w:r>
+      <w:r>
+        <w:rPr>
+          <w:b w:val="0"/>
+        </w:rPr>
+        <w:t xml:space="preserve"> gồm </w:t>
+      </w:r>
+      <w:r>
+        <w:rPr>
+          <w:rFonts w:ascii="Consolas" w:hAnsi="Consolas"/>
+          <w:b w:val="0"/>
+          <w:color w:val="A31F34"/>
+          <w:sz w:val="20"/>
+        </w:rPr>
+        <w:t>kit.zip</w:t>
+      </w:r>
+      <w:r>
+        <w:rPr>
+          <w:b w:val="0"/>
+        </w:rPr>
+        <w:t xml:space="preserve"> (bộ đồ nghề) và </w:t>
+      </w:r>
+      <w:r>
+        <w:rPr>
+          <w:rFonts w:ascii="Consolas" w:hAnsi="Consolas"/>
+          <w:b w:val="0"/>
+          <w:color w:val="A31F34"/>
+          <w:sz w:val="20"/>
+        </w:rPr>
+        <w:t>mo_hinh_bai2.zip</w:t>
+      </w:r>
+      <w:r>
+        <w:rPr>
+          <w:b w:val="0"/>
+        </w:rPr>
+        <w:t xml:space="preserve"> (mô hình bài 2, chỉ cần nếu máy chủ không có mạng). Chép cả thư mục này vào </w:t>
+      </w:r>
+      <w:r>
+        <w:rPr>
+          <w:b/>
+        </w:rPr>
+        <w:t>USB</w:t>
+      </w:r>
+      <w:r>
+        <w:rPr>
+          <w:b w:val="0"/>
+        </w:rPr>
+        <w:t xml:space="preserve"> để dự phòng.</w:t>
+      </w:r>
+    </w:p>
+    <w:p>
+      <w:pPr>
+        <w:pStyle w:val="Heading2"/>
+      </w:pPr>
+      <w:r>
+        <w:rPr>
+          <w:b w:val="0"/>
+        </w:rPr>
+        <w:t>Bước 1. Đăng nhập và mở Terminal</w:t>
+      </w:r>
+    </w:p>
+    <w:p>
+      <w:pPr>
+        <w:ind w:left="360"/>
+      </w:pPr>
+      <w:r>
+        <w:rPr>
+          <w:b/>
+        </w:rPr>
+        <w:t xml:space="preserve">1. </w:t>
+      </w:r>
+      <w:r>
+        <w:rPr>
+          <w:b w:val="0"/>
+        </w:rPr>
+        <w:t xml:space="preserve">Mở trình duyệt, vào địa chỉ BTC cho, đăng nhập bằng tài khoản của đội. (Nếu được hỏi chọn máy / "server options": chọn loại </w:t>
+      </w:r>
+      <w:r>
+        <w:rPr>
+          <w:b/>
+        </w:rPr>
+        <w:t>có GPU</w:t>
+      </w:r>
+      <w:r>
+        <w:rPr>
+          <w:b w:val="0"/>
+        </w:rPr>
+        <w:t>.)</w:t>
+      </w:r>
+    </w:p>
+    <w:p>
+      <w:pPr>
+        <w:ind w:left="360"/>
+      </w:pPr>
+      <w:r>
+        <w:rPr>
+          <w:b/>
+        </w:rPr>
+        <w:t xml:space="preserve">2. </w:t>
+      </w:r>
+      <w:r>
+        <w:rPr>
+          <w:b w:val="0"/>
+        </w:rPr>
+        <w:t xml:space="preserve">Màn hình chính: bên trái là </w:t>
+      </w:r>
+      <w:r>
+        <w:rPr>
+          <w:b/>
+        </w:rPr>
+        <w:t>cây thư mục</w:t>
+      </w:r>
+      <w:r>
+        <w:rPr>
+          <w:b w:val="0"/>
+        </w:rPr>
+        <w:t xml:space="preserve"> (giống File Explorer), bên phải là trang </w:t>
+      </w:r>
+      <w:r>
+        <w:rPr>
+          <w:b/>
+        </w:rPr>
+        <w:t>Launcher</w:t>
+      </w:r>
+      <w:r>
+        <w:rPr>
+          <w:b w:val="0"/>
+        </w:rPr>
+        <w:t>.</w:t>
+      </w:r>
+    </w:p>
+    <w:p>
+      <w:pPr>
+        <w:ind w:left="360"/>
+      </w:pPr>
+      <w:r>
+        <w:rPr>
+          <w:b/>
+        </w:rPr>
+        <w:t xml:space="preserve">3. </w:t>
+      </w:r>
+      <w:r>
+        <w:rPr>
+          <w:b w:val="0"/>
+        </w:rPr>
+        <w:t xml:space="preserve">Trong Launcher bấm </w:t>
+      </w:r>
+      <w:r>
+        <w:rPr>
+          <w:b/>
+        </w:rPr>
+        <w:t>Terminal</w:t>
+      </w:r>
+      <w:r>
+        <w:rPr>
+          <w:b w:val="0"/>
+        </w:rPr>
+        <w:t xml:space="preserve"> (hoặc menu </w:t>
+      </w:r>
+      <w:r>
+        <w:rPr>
+          <w:b/>
+        </w:rPr>
+        <w:t>File → New → Terminal</w:t>
+      </w:r>
+      <w:r>
+        <w:rPr>
+          <w:b w:val="0"/>
+        </w:rPr>
+        <w:t>). Cửa sổ đen hiện ra.</w:t>
+      </w:r>
+    </w:p>
+    <w:p>
+      <w:pPr>
+        <w:pStyle w:val="Heading2"/>
+      </w:pPr>
+      <w:r>
+        <w:rPr>
+          <w:b w:val="0"/>
+        </w:rPr>
+        <w:t>Bước 2. Đưa bộ đồ nghề lên (chọn một cách)</w:t>
+      </w:r>
+    </w:p>
+    <w:p>
+      <w:r>
+        <w:rPr>
+          <w:b/>
+        </w:rPr>
+        <w:t xml:space="preserve">Cách A — upload </w:t>
+      </w:r>
+      <w:r>
+        <w:rPr>
+          <w:rFonts w:ascii="Consolas" w:hAnsi="Consolas"/>
+          <w:b/>
+          <w:color w:val="A31F34"/>
+          <w:sz w:val="20"/>
+        </w:rPr>
+        <w:t>kit.zip</w:t>
+      </w:r>
+      <w:r>
+        <w:rPr>
+          <w:b/>
+        </w:rPr>
+        <w:t xml:space="preserve"> (chắc chắn chạy được):</w:t>
+      </w:r>
+    </w:p>
+    <w:p>
+      <w:pPr>
+        <w:ind w:left="360"/>
+      </w:pPr>
+      <w:r>
+        <w:rPr>
+          <w:b/>
+        </w:rPr>
+        <w:t xml:space="preserve">1. </w:t>
+      </w:r>
+      <w:r>
+        <w:rPr>
+          <w:b w:val="0"/>
+        </w:rPr>
+        <w:t xml:space="preserve">Ở cây thư mục bên trái, bấm biểu tượng </w:t>
+      </w:r>
+      <w:r>
+        <w:rPr>
+          <w:b/>
+        </w:rPr>
+        <w:t>mũi tên lên (Upload)</w:t>
+      </w:r>
+      <w:r>
+        <w:rPr>
+          <w:b w:val="0"/>
+        </w:rPr>
+        <w:t xml:space="preserve"> ở phía trên → chọn </w:t>
+      </w:r>
+      <w:r>
+        <w:rPr>
+          <w:rFonts w:ascii="Consolas" w:hAnsi="Consolas"/>
+          <w:b w:val="0"/>
+          <w:color w:val="A31F34"/>
+          <w:sz w:val="20"/>
+        </w:rPr>
+        <w:t>Desktop\GOI_JUPYTER\kit.zip</w:t>
+      </w:r>
+      <w:r>
+        <w:rPr>
+          <w:b w:val="0"/>
+        </w:rPr>
+        <w:t>. Đợi thanh tiến trình chạy xong (550 MB).</w:t>
+      </w:r>
+    </w:p>
+    <w:p>
+      <w:pPr>
+        <w:ind w:left="360"/>
+      </w:pPr>
+      <w:r>
+        <w:rPr>
+          <w:b/>
+        </w:rPr>
+        <w:t xml:space="preserve">2. </w:t>
+      </w:r>
+      <w:r>
+        <w:rPr>
+          <w:b w:val="0"/>
+        </w:rPr>
+        <w:t>Dán vào Terminal:</w:t>
+      </w:r>
+    </w:p>
+    <w:tbl>
+      <w:tblPr>
+        <w:tblStyle w:val="TableGrid"/>
+        <w:tblW w:type="auto" w:w="0"/>
+        <w:tblLook w:firstColumn="1" w:firstRow="1" w:lastColumn="0" w:lastRow="0" w:noHBand="0" w:noVBand="1" w:val="04A0"/>
+      </w:tblPr>
+      <w:tblGrid>
+        <w:gridCol w:w="8640"/>
+      </w:tblGrid>
+      <w:tr>
+        <w:tc>
+          <w:tcPr>
+            <w:tcW w:type="dxa" w:w="8640"/>
+            <w:shd w:val="clear" w:color="auto" w:fill="F2F2F2"/>
+          </w:tcPr>
+          <w:p>
+            <w:r>
+              <w:rPr>
+                <w:rFonts w:ascii="Consolas" w:hAnsi="Consolas"/>
+                <w:sz w:val="19"/>
+              </w:rPr>
+              <w:t>cd ~ &amp;&amp; python -m zipfile -e kit.zip ~ &amp;&amp; ls ~/B1</w:t>
+            </w:r>
+          </w:p>
+        </w:tc>
+      </w:tr>
+    </w:tbl>
+    <w:p/>
+    <w:p>
+      <w:r>
+        <w:rPr>
+          <w:b w:val="0"/>
+        </w:rPr>
+        <w:t xml:space="preserve">Thấy </w:t>
+      </w:r>
+      <w:r>
+        <w:rPr>
+          <w:rFonts w:ascii="Consolas" w:hAnsi="Consolas"/>
+          <w:b w:val="0"/>
+          <w:color w:val="A31F34"/>
+          <w:sz w:val="20"/>
+        </w:rPr>
+        <w:t>JUPYTER  KIT_BAI1  KIT_BAI2  du_lieu_tap_duot</w:t>
+      </w:r>
+      <w:r>
+        <w:rPr>
+          <w:b w:val="0"/>
+        </w:rPr>
+        <w:t xml:space="preserve"> là được.</w:t>
+      </w:r>
+    </w:p>
+    <w:p>
+      <w:r>
+        <w:rPr>
+          <w:b/>
+        </w:rPr>
+        <w:t>Cách B — máy chủ có mạng và có git-lfs:</w:t>
+      </w:r>
+    </w:p>
+    <w:tbl>
+      <w:tblPr>
+        <w:tblStyle w:val="TableGrid"/>
+        <w:tblW w:type="auto" w:w="0"/>
+        <w:tblLook w:firstColumn="1" w:firstRow="1" w:lastColumn="0" w:lastRow="0" w:noHBand="0" w:noVBand="1" w:val="04A0"/>
+      </w:tblPr>
+      <w:tblGrid>
+        <w:gridCol w:w="8640"/>
+      </w:tblGrid>
+      <w:tr>
+        <w:tc>
+          <w:tcPr>
+            <w:tcW w:type="dxa" w:w="8640"/>
+            <w:shd w:val="clear" w:color="auto" w:fill="F2F2F2"/>
+          </w:tcPr>
+          <w:p>
+            <w:r>
+              <w:rPr>
+                <w:rFonts w:ascii="Consolas" w:hAnsi="Consolas"/>
+                <w:sz w:val="19"/>
+              </w:rPr>
+              <w:t>cd ~ &amp;&amp; git lfs install &amp;&amp; git clone https://github.com/nguyenthithanhhue-13/B1</w:t>
+            </w:r>
+          </w:p>
+        </w:tc>
+      </w:tr>
+    </w:tbl>
+    <w:p/>
+    <w:p>
+      <w:r>
+        <w:rPr>
+          <w:b w:val="0"/>
+        </w:rPr>
+        <w:t xml:space="preserve">(Nếu bước 3 báo </w:t>
+      </w:r>
+      <w:r>
+        <w:rPr>
+          <w:rFonts w:ascii="Consolas" w:hAnsi="Consolas"/>
+          <w:b w:val="0"/>
+          <w:color w:val="A31F34"/>
+          <w:sz w:val="20"/>
+        </w:rPr>
+        <w:t>thiếu ... model.onnx</w:t>
+      </w:r>
+      <w:r>
+        <w:rPr>
+          <w:b w:val="0"/>
+        </w:rPr>
+        <w:t xml:space="preserve"> thì dùng cách A.)</w:t>
+      </w:r>
+    </w:p>
+    <w:p>
+      <w:pPr>
+        <w:pStyle w:val="Heading2"/>
+      </w:pPr>
+      <w:r>
+        <w:rPr>
+          <w:b w:val="0"/>
+        </w:rPr>
+        <w:t>Bước 3. Cài đặt (một lần, 5–20 phút)</w:t>
+      </w:r>
+    </w:p>
+    <w:tbl>
+      <w:tblPr>
+        <w:tblStyle w:val="TableGrid"/>
+        <w:tblW w:type="auto" w:w="0"/>
+        <w:tblLook w:firstColumn="1" w:firstRow="1" w:lastColumn="0" w:lastRow="0" w:noHBand="0" w:noVBand="1" w:val="04A0"/>
+      </w:tblPr>
+      <w:tblGrid>
+        <w:gridCol w:w="8640"/>
+      </w:tblGrid>
+      <w:tr>
+        <w:tc>
+          <w:tcPr>
+            <w:tcW w:type="dxa" w:w="8640"/>
+            <w:shd w:val="clear" w:color="auto" w:fill="F2F2F2"/>
+          </w:tcPr>
+          <w:p>
+            <w:r>
+              <w:rPr>
+                <w:rFonts w:ascii="Consolas" w:hAnsi="Consolas"/>
+                <w:sz w:val="19"/>
+              </w:rPr>
+              <w:t>bash ~/B1/JUPYTER/cai_dat.sh</w:t>
+            </w:r>
+          </w:p>
+        </w:tc>
+      </w:tr>
+    </w:tbl>
+    <w:p/>
+    <w:p>
+      <w:r>
+        <w:rPr>
+          <w:b w:val="0"/>
+        </w:rPr>
+        <w:t>Đọc các dòng nó in:</w:t>
+      </w:r>
+    </w:p>
+    <w:tbl>
+      <w:tblPr>
+        <w:tblStyle w:val="TableGrid"/>
+        <w:tblW w:type="auto" w:w="0"/>
+        <w:tblLook w:firstColumn="1" w:firstRow="1" w:lastColumn="0" w:lastRow="0" w:noHBand="0" w:noVBand="1" w:val="04A0"/>
+      </w:tblPr>
+      <w:tblGrid>
+        <w:gridCol w:w="4320"/>
+        <w:gridCol w:w="4320"/>
+      </w:tblGrid>
+      <w:tr>
+        <w:tc>
+          <w:tcPr>
+            <w:tcW w:type="dxa" w:w="4320"/>
+            <w:shd w:val="clear" w:color="auto" w:fill="DCE6F1"/>
+          </w:tcPr>
+          <w:p>
+            <w:r>
+              <w:rPr>
+                <w:b/>
+              </w:rPr>
+              <w:t>dòng</w:t>
+            </w:r>
+          </w:p>
+        </w:tc>
+        <w:tc>
+          <w:tcPr>
+            <w:tcW w:type="dxa" w:w="4320"/>
+            <w:shd w:val="clear" w:color="auto" w:fill="DCE6F1"/>
+          </w:tcPr>
+          <w:p>
+            <w:r>
+              <w:rPr>
+                <w:b/>
+              </w:rPr>
+              <w:t>nghĩa</w:t>
+            </w:r>
+          </w:p>
+        </w:tc>
+      </w:tr>
+      <w:tr>
+        <w:tc>
+          <w:tcPr>
+            <w:tcW w:type="dxa" w:w="4320"/>
+          </w:tcPr>
+          <w:p>
+            <w:r>
+              <w:rPr>
+                <w:rFonts w:ascii="Consolas" w:hAnsi="Consolas"/>
+                <w:b w:val="0"/>
+                <w:color w:val="A31F34"/>
+                <w:sz w:val="20"/>
+              </w:rPr>
+              <w:t>GPU: NVIDIA ...</w:t>
+            </w:r>
+          </w:p>
+        </w:tc>
+        <w:tc>
+          <w:tcPr>
+            <w:tcW w:type="dxa" w:w="4320"/>
+          </w:tcPr>
+          <w:p>
+            <w:r>
+              <w:rPr>
+                <w:b w:val="0"/>
+              </w:rPr>
+              <w:t xml:space="preserve">có GPU, tốt. </w:t>
+            </w:r>
+            <w:r>
+              <w:rPr>
+                <w:rFonts w:ascii="Consolas" w:hAnsi="Consolas"/>
+                <w:b w:val="0"/>
+                <w:color w:val="A31F34"/>
+                <w:sz w:val="20"/>
+              </w:rPr>
+              <w:t>GPU: KHÔNG CÓ</w:t>
+            </w:r>
+            <w:r>
+              <w:rPr>
+                <w:b w:val="0"/>
+              </w:rPr>
+              <w:t xml:space="preserve"> cũng chạy được, chỉ chậm hơn</w:t>
+            </w:r>
+          </w:p>
+        </w:tc>
+      </w:tr>
+      <w:tr>
+        <w:tc>
+          <w:tcPr>
+            <w:tcW w:type="dxa" w:w="4320"/>
+          </w:tcPr>
+          <w:p>
+            <w:r>
+              <w:rPr>
+                <w:rFonts w:ascii="Consolas" w:hAnsi="Consolas"/>
+                <w:b w:val="0"/>
+                <w:color w:val="A31F34"/>
+                <w:sz w:val="20"/>
+              </w:rPr>
+              <w:t>[ok] thư viện đủ</w:t>
+            </w:r>
+          </w:p>
+        </w:tc>
+        <w:tc>
+          <w:tcPr>
+            <w:tcW w:type="dxa" w:w="4320"/>
+          </w:tcPr>
+          <w:p>
+            <w:r>
+              <w:rPr>
+                <w:b w:val="0"/>
+              </w:rPr>
+              <w:t>cài xong thư viện</w:t>
+            </w:r>
+          </w:p>
+        </w:tc>
+      </w:tr>
+      <w:tr>
+        <w:tc>
+          <w:tcPr>
+            <w:tcW w:type="dxa" w:w="4320"/>
+          </w:tcPr>
+          <w:p>
+            <w:r>
+              <w:rPr>
+                <w:rFonts w:ascii="Consolas" w:hAnsi="Consolas"/>
+                <w:b w:val="0"/>
+                <w:color w:val="A31F34"/>
+                <w:sz w:val="20"/>
+              </w:rPr>
+              <w:t>CÓ MẠNG -&gt; tải các mô hình</w:t>
+            </w:r>
+          </w:p>
+        </w:tc>
+        <w:tc>
+          <w:tcPr>
+            <w:tcW w:type="dxa" w:w="4320"/>
+          </w:tcPr>
+          <w:p>
+            <w:r>
+              <w:rPr>
+                <w:b w:val="0"/>
+              </w:rPr>
+              <w:t>tự tải mô hình bài 2, đợi</w:t>
+            </w:r>
+          </w:p>
+        </w:tc>
+      </w:tr>
+      <w:tr>
+        <w:tc>
+          <w:tcPr>
+            <w:tcW w:type="dxa" w:w="4320"/>
+          </w:tcPr>
+          <w:p>
+            <w:r>
+              <w:rPr>
+                <w:rFonts w:ascii="Consolas" w:hAnsi="Consolas"/>
+                <w:b w:val="0"/>
+                <w:color w:val="A31F34"/>
+                <w:sz w:val="20"/>
+              </w:rPr>
+              <w:t>KHÔNG CÓ MẠNG</w:t>
+            </w:r>
+          </w:p>
+        </w:tc>
+        <w:tc>
+          <w:tcPr>
+            <w:tcW w:type="dxa" w:w="4320"/>
+          </w:tcPr>
+          <w:p>
+            <w:r>
+              <w:rPr>
+                <w:b w:val="0"/>
+              </w:rPr>
+              <w:t xml:space="preserve">upload thêm </w:t>
+            </w:r>
+            <w:r>
+              <w:rPr>
+                <w:rFonts w:ascii="Consolas" w:hAnsi="Consolas"/>
+                <w:b w:val="0"/>
+                <w:color w:val="A31F34"/>
+                <w:sz w:val="20"/>
+              </w:rPr>
+              <w:t>mo_hinh_bai2.zip</w:t>
+            </w:r>
+            <w:r>
+              <w:rPr>
+                <w:b w:val="0"/>
+              </w:rPr>
+              <w:t xml:space="preserve"> vào thư mục nhà (như bước 2A) rồi chạy lại lệnh cài đặt</w:t>
+            </w:r>
+          </w:p>
+        </w:tc>
+      </w:tr>
+      <w:tr>
+        <w:tc>
+          <w:tcPr>
+            <w:tcW w:type="dxa" w:w="4320"/>
+          </w:tcPr>
+          <w:p>
+            <w:r>
+              <w:rPr>
+                <w:rFonts w:ascii="Consolas" w:hAnsi="Consolas"/>
+                <w:b w:val="0"/>
+                <w:color w:val="A31F34"/>
+                <w:sz w:val="20"/>
+              </w:rPr>
+              <w:t>[ok] mô hình đọc câu của bài 1 có đủ</w:t>
+            </w:r>
+          </w:p>
+        </w:tc>
+        <w:tc>
+          <w:tcPr>
+            <w:tcW w:type="dxa" w:w="4320"/>
+          </w:tcPr>
+          <w:p>
+            <w:r>
+              <w:rPr>
+                <w:b w:val="0"/>
+              </w:rPr>
+              <w:t>bài 1 sẵn sàng</w:t>
+            </w:r>
+          </w:p>
+        </w:tc>
+      </w:tr>
+      <w:tr>
+        <w:tc>
+          <w:tcPr>
+            <w:tcW w:type="dxa" w:w="4320"/>
+          </w:tcPr>
+          <w:p>
+            <w:r>
+              <w:rPr>
+                <w:rFonts w:ascii="Consolas" w:hAnsi="Consolas"/>
+                <w:b w:val="0"/>
+                <w:color w:val="A31F34"/>
+                <w:sz w:val="20"/>
+              </w:rPr>
+              <w:t>[LỖI] ...</w:t>
+            </w:r>
+          </w:p>
+        </w:tc>
+        <w:tc>
+          <w:tcPr>
+            <w:tcW w:type="dxa" w:w="4320"/>
+          </w:tcPr>
+          <w:p>
+            <w:r>
+              <w:rPr>
+                <w:b w:val="0"/>
+              </w:rPr>
+              <w:t>chụp màn hình phần chữ lỗi → hỏi AI của BTC (mẫu A trong sổ tay)</w:t>
+            </w:r>
+          </w:p>
+        </w:tc>
+      </w:tr>
+    </w:tbl>
+    <w:p/>
+    <w:p>
+      <w:r>
+        <w:rPr>
+          <w:b w:val="0"/>
+        </w:rPr>
+        <w:t xml:space="preserve">Đề là DỊCH mà máy chủ không có mạng: ở nhà chạy thêm </w:t>
+      </w:r>
+      <w:r>
+        <w:rPr>
+          <w:rFonts w:ascii="Consolas" w:hAnsi="Consolas"/>
+          <w:b w:val="0"/>
+          <w:color w:val="A31F34"/>
+          <w:sz w:val="20"/>
+        </w:rPr>
+        <w:t>JUPYTER\dong_goi.py nllb</w:t>
+      </w:r>
+      <w:r>
+        <w:rPr>
+          <w:b w:val="0"/>
+        </w:rPr>
+        <w:t xml:space="preserve">, mang </w:t>
+      </w:r>
+      <w:r>
+        <w:rPr>
+          <w:rFonts w:ascii="Consolas" w:hAnsi="Consolas"/>
+          <w:b w:val="0"/>
+          <w:color w:val="A31F34"/>
+          <w:sz w:val="20"/>
+        </w:rPr>
+        <w:t>mo_hinh_nllb.zip</w:t>
+      </w:r>
+      <w:r>
+        <w:rPr>
+          <w:b w:val="0"/>
+        </w:rPr>
+        <w:t xml:space="preserve"> lên, upload rồi chạy lại lệnh cài đặt.</w:t>
+      </w:r>
+    </w:p>
+    <w:p>
+      <w:pPr>
+        <w:pStyle w:val="Heading2"/>
+      </w:pPr>
+      <w:r>
+        <w:rPr>
+          <w:b w:val="0"/>
+        </w:rPr>
+        <w:t>Bước 4. Bài 1</w:t>
+      </w:r>
+    </w:p>
+    <w:p>
+      <w:pPr>
+        <w:ind w:left="360"/>
+      </w:pPr>
+      <w:r>
+        <w:rPr>
+          <w:b/>
+        </w:rPr>
+        <w:t xml:space="preserve">1. </w:t>
+      </w:r>
+      <w:r>
+        <w:rPr>
+          <w:b w:val="0"/>
+        </w:rPr>
+        <w:t xml:space="preserve">Tìm thư mục dữ liệu bài 1 BTC phát trong cây thư mục bên trái (nếu BTC phát file zip: upload lên rồi giải nén bằng </w:t>
+      </w:r>
+      <w:r>
+        <w:rPr>
+          <w:rFonts w:ascii="Consolas" w:hAnsi="Consolas"/>
+          <w:b w:val="0"/>
+          <w:color w:val="A31F34"/>
+          <w:sz w:val="20"/>
+        </w:rPr>
+        <w:t>cd ~ &amp;&amp; python -m zipfile -e &lt;tên file&gt;.zip ~/du_lieu</w:t>
+      </w:r>
+      <w:r>
+        <w:rPr>
+          <w:b w:val="0"/>
+        </w:rPr>
+        <w:t>).</w:t>
+      </w:r>
+    </w:p>
+    <w:p>
+      <w:pPr>
+        <w:ind w:left="360"/>
+      </w:pPr>
+      <w:r>
+        <w:rPr>
+          <w:b/>
+        </w:rPr>
+        <w:t xml:space="preserve">2. </w:t>
+      </w:r>
+      <w:r>
+        <w:rPr>
+          <w:b/>
+        </w:rPr>
+        <w:t>Chuột phải vào thư mục dữ liệu → Copy Path.</w:t>
+      </w:r>
+    </w:p>
+    <w:p>
+      <w:pPr>
+        <w:ind w:left="360"/>
+      </w:pPr>
+      <w:r>
+        <w:rPr>
+          <w:b/>
+        </w:rPr>
+        <w:t xml:space="preserve">3. </w:t>
+      </w:r>
+      <w:r>
+        <w:rPr>
+          <w:b w:val="0"/>
+        </w:rPr>
+        <w:t xml:space="preserve">Trong Terminal gõ </w:t>
+      </w:r>
+      <w:r>
+        <w:rPr>
+          <w:rFonts w:ascii="Consolas" w:hAnsi="Consolas"/>
+          <w:b w:val="0"/>
+          <w:color w:val="A31F34"/>
+          <w:sz w:val="20"/>
+        </w:rPr>
+        <w:t xml:space="preserve">bash ~/B1/JUPYTER/bai1.sh </w:t>
+      </w:r>
+      <w:r>
+        <w:rPr>
+          <w:b w:val="0"/>
+        </w:rPr>
+        <w:t xml:space="preserve"> (có dấu cách ở cuối), rồi </w:t>
+      </w:r>
+      <w:r>
+        <w:rPr>
+          <w:b/>
+        </w:rPr>
+        <w:t>dán</w:t>
+      </w:r>
+      <w:r>
+        <w:rPr>
+          <w:b w:val="0"/>
+        </w:rPr>
+        <w:t xml:space="preserve"> đường dẫn vừa copy, Enter. Ví dụ:</w:t>
+      </w:r>
+    </w:p>
+    <w:tbl>
+      <w:tblPr>
+        <w:tblStyle w:val="TableGrid"/>
+        <w:tblW w:type="auto" w:w="0"/>
+        <w:tblLook w:firstColumn="1" w:firstRow="1" w:lastColumn="0" w:lastRow="0" w:noHBand="0" w:noVBand="1" w:val="04A0"/>
+      </w:tblPr>
+      <w:tblGrid>
+        <w:gridCol w:w="8640"/>
+      </w:tblGrid>
+      <w:tr>
+        <w:tc>
+          <w:tcPr>
+            <w:tcW w:type="dxa" w:w="8640"/>
+            <w:shd w:val="clear" w:color="auto" w:fill="F2F2F2"/>
+          </w:tcPr>
+          <w:p>
+            <w:r>
+              <w:rPr>
+                <w:rFonts w:ascii="Consolas" w:hAnsi="Consolas"/>
+                <w:sz w:val="19"/>
+              </w:rPr>
+              <w:t>bash ~/B1/JUPYTER/bai1.sh du_lieu/chung_ket</w:t>
+            </w:r>
+          </w:p>
+        </w:tc>
+      </w:tr>
+    </w:tbl>
+    <w:p/>
+    <w:p>
+      <w:pPr>
+        <w:ind w:left="360"/>
+      </w:pPr>
+      <w:r>
+        <w:rPr>
+          <w:b/>
+        </w:rPr>
+        <w:t xml:space="preserve">4. </w:t>
+      </w:r>
+      <w:r>
+        <w:rPr>
+          <w:b w:val="0"/>
+        </w:rPr>
+        <w:t xml:space="preserve">Màn hình chạy y như trên máy nhà: </w:t>
+      </w:r>
+      <w:r>
+        <w:rPr>
+          <w:rFonts w:ascii="Consolas" w:hAnsi="Consolas"/>
+          <w:b w:val="0"/>
+          <w:color w:val="A31F34"/>
+          <w:sz w:val="20"/>
+        </w:rPr>
+        <w:t>KHÁC</w:t>
+      </w:r>
+      <w:r>
+        <w:rPr>
+          <w:b w:val="0"/>
+        </w:rPr>
+        <w:t xml:space="preserve">, </w:t>
+      </w:r>
+      <w:r>
+        <w:rPr>
+          <w:rFonts w:ascii="Consolas" w:hAnsi="Consolas"/>
+          <w:b w:val="0"/>
+          <w:color w:val="A31F34"/>
+          <w:sz w:val="20"/>
+        </w:rPr>
+        <w:t>LỆCH</w:t>
+      </w:r>
+      <w:r>
+        <w:rPr>
+          <w:b w:val="0"/>
+        </w:rPr>
+        <w:t xml:space="preserve">, bảng CHẨN ĐOÁN, </w:t>
+      </w:r>
+      <w:r>
+        <w:rPr>
+          <w:rFonts w:ascii="Consolas" w:hAnsi="Consolas"/>
+          <w:b w:val="0"/>
+          <w:color w:val="A31F34"/>
+          <w:sz w:val="20"/>
+        </w:rPr>
+        <w:t>&gt;&gt;&gt; FILE NỘP (bản nền)</w:t>
+      </w:r>
+      <w:r>
+        <w:rPr>
+          <w:b w:val="0"/>
+        </w:rPr>
+        <w:t xml:space="preserve">, </w:t>
+      </w:r>
+      <w:r>
+        <w:rPr>
+          <w:rFonts w:ascii="Consolas" w:hAnsi="Consolas"/>
+          <w:b w:val="0"/>
+          <w:color w:val="A31F34"/>
+          <w:sz w:val="20"/>
+        </w:rPr>
+        <w:t>&gt;&gt;&gt; FILE NỘP (bản NÂNG CAO)</w:t>
+      </w:r>
+      <w:r>
+        <w:rPr>
+          <w:b w:val="0"/>
+        </w:rPr>
+        <w:t xml:space="preserve">, </w:t>
+      </w:r>
+      <w:r>
+        <w:rPr>
+          <w:rFonts w:ascii="Consolas" w:hAnsi="Consolas"/>
+          <w:b w:val="0"/>
+          <w:color w:val="A31F34"/>
+          <w:sz w:val="20"/>
+        </w:rPr>
+        <w:t>XONG TẤT CẢ</w:t>
+      </w:r>
+      <w:r>
+        <w:rPr>
+          <w:b w:val="0"/>
+        </w:rPr>
+        <w:t xml:space="preserve">. Cách đọc và cách nộp: </w:t>
+      </w:r>
+      <w:r>
+        <w:rPr>
+          <w:b/>
+        </w:rPr>
+        <w:t>giống hệt sổ tay bài 1</w:t>
+      </w:r>
+      <w:r>
+        <w:rPr>
+          <w:b w:val="0"/>
+        </w:rPr>
+        <w:t>.</w:t>
+      </w:r>
+    </w:p>
+    <w:p>
+      <w:pPr>
+        <w:ind w:left="360"/>
+      </w:pPr>
+      <w:r>
+        <w:rPr>
+          <w:b/>
+        </w:rPr>
+        <w:t xml:space="preserve">5. </w:t>
+      </w:r>
+      <w:r>
+        <w:rPr>
+          <w:b w:val="0"/>
+        </w:rPr>
+        <w:t xml:space="preserve">File nộp: </w:t>
+      </w:r>
+      <w:r>
+        <w:rPr>
+          <w:rFonts w:ascii="Consolas" w:hAnsi="Consolas"/>
+          <w:b w:val="0"/>
+          <w:color w:val="A31F34"/>
+          <w:sz w:val="20"/>
+        </w:rPr>
+        <w:t>B1/KIT_BAI1/runs/chungket/predictions.json</w:t>
+      </w:r>
+      <w:r>
+        <w:rPr>
+          <w:b w:val="0"/>
+        </w:rPr>
+        <w:t xml:space="preserve">. Trong cây thư mục bên trái đi tới file đó → </w:t>
+      </w:r>
+      <w:r>
+        <w:rPr>
+          <w:b/>
+        </w:rPr>
+        <w:t>chuột phải → Download</w:t>
+      </w:r>
+      <w:r>
+        <w:rPr>
+          <w:b w:val="0"/>
+        </w:rPr>
+        <w:t xml:space="preserve"> → nộp lên trang của BTC.</w:t>
+      </w:r>
+    </w:p>
+    <w:p>
+      <w:r>
+        <w:rPr>
+          <w:b/>
+        </w:rPr>
+        <w:t>Lỡ đóng trình duyệt / mất mạng:</w:t>
+      </w:r>
+      <w:r>
+        <w:rPr>
+          <w:b w:val="0"/>
+        </w:rPr>
+        <w:t xml:space="preserve"> đăng nhập lại; tab Terminal cũ thường vẫn còn và vẫn chạy (menu </w:t>
+      </w:r>
+      <w:r>
+        <w:rPr>
+          <w:b/>
+        </w:rPr>
+        <w:t>View → Running Terminals and Kernels</w:t>
+      </w:r>
+      <w:r>
+        <w:rPr>
+          <w:b w:val="0"/>
+        </w:rPr>
+        <w:t xml:space="preserve">). Mọi chữ đã hiện cũng được ghi vào file </w:t>
+      </w:r>
+      <w:r>
+        <w:rPr>
+          <w:rFonts w:ascii="Consolas" w:hAnsi="Consolas"/>
+          <w:b w:val="0"/>
+          <w:color w:val="A31F34"/>
+          <w:sz w:val="20"/>
+        </w:rPr>
+        <w:t>B1/KIT_BAI1/runs/man_hinh_chungket.txt</w:t>
+      </w:r>
+      <w:r>
+        <w:rPr>
+          <w:b w:val="0"/>
+        </w:rPr>
+        <w:t xml:space="preserve"> (bấm đúp để xem). Muốn xem tiếp trực tiếp: </w:t>
+      </w:r>
+      <w:r>
+        <w:rPr>
+          <w:rFonts w:ascii="Consolas" w:hAnsi="Consolas"/>
+          <w:b w:val="0"/>
+          <w:color w:val="A31F34"/>
+          <w:sz w:val="20"/>
+        </w:rPr>
+        <w:t>tail -f ~/B1/KIT_BAI1/runs/man_hinh_chungket.txt</w:t>
+      </w:r>
+      <w:r>
+        <w:rPr>
+          <w:b w:val="0"/>
+        </w:rPr>
+        <w:t xml:space="preserve"> (thoát: Ctrl + C, việc chạy không bị dừng).</w:t>
+      </w:r>
+    </w:p>
+    <w:p>
+      <w:r>
+        <w:rPr>
+          <w:b/>
+        </w:rPr>
+        <w:t>Dừng hẳn việc đang chạy:</w:t>
+      </w:r>
+      <w:r>
+        <w:rPr>
+          <w:b w:val="0"/>
+        </w:rPr>
+        <w:t xml:space="preserve"> bấm vào Terminal, nhấn </w:t>
+      </w:r>
+      <w:r>
+        <w:rPr>
+          <w:b/>
+        </w:rPr>
+        <w:t>Ctrl + C</w:t>
+      </w:r>
+      <w:r>
+        <w:rPr>
+          <w:b w:val="0"/>
+        </w:rPr>
+        <w:t>.</w:t>
+      </w:r>
+    </w:p>
+    <w:p>
+      <w:pPr>
+        <w:pStyle w:val="Heading2"/>
+      </w:pPr>
+      <w:r>
+        <w:rPr>
+          <w:b w:val="0"/>
+        </w:rPr>
+        <w:t>Bước 5. Sửa code và học lại</w:t>
+      </w:r>
+    </w:p>
+    <w:p>
+      <w:pPr>
+        <w:pStyle w:val="ListBullet"/>
+      </w:pPr>
+      <w:r>
+        <w:rPr>
+          <w:b w:val="0"/>
+        </w:rPr>
+        <w:t xml:space="preserve">Sửa code: trong cây thư mục, bấm đúp vào file </w:t>
+      </w:r>
+      <w:r>
+        <w:rPr>
+          <w:rFonts w:ascii="Consolas" w:hAnsi="Consolas"/>
+          <w:b w:val="0"/>
+          <w:color w:val="A31F34"/>
+          <w:sz w:val="20"/>
+        </w:rPr>
+        <w:t>.py</w:t>
+      </w:r>
+      <w:r>
+        <w:rPr>
+          <w:b w:val="0"/>
+        </w:rPr>
+        <w:t xml:space="preserve"> (vd </w:t>
+      </w:r>
+      <w:r>
+        <w:rPr>
+          <w:rFonts w:ascii="Consolas" w:hAnsi="Consolas"/>
+          <w:b w:val="0"/>
+          <w:color w:val="A31F34"/>
+          <w:sz w:val="20"/>
+        </w:rPr>
+        <w:t>B1/KIT_BAI1/nen.py</w:t>
+      </w:r>
+      <w:r>
+        <w:rPr>
+          <w:b w:val="0"/>
+        </w:rPr>
+        <w:t xml:space="preserve">) → nó mở ra như VS Code → sửa → </w:t>
+      </w:r>
+      <w:r>
+        <w:rPr>
+          <w:b/>
+        </w:rPr>
+        <w:t>Ctrl + S</w:t>
+      </w:r>
+      <w:r>
+        <w:rPr>
+          <w:b w:val="0"/>
+        </w:rPr>
+        <w:t>.</w:t>
+      </w:r>
+    </w:p>
+    <w:p>
+      <w:r>
+        <w:rPr>
+          <w:b w:val="0"/>
+        </w:rPr>
+        <w:t xml:space="preserve">Sao lưu trước khi sửa: chuột phải file → </w:t>
+      </w:r>
+      <w:r>
+        <w:rPr>
+          <w:b/>
+        </w:rPr>
+        <w:t>Duplicate</w:t>
+      </w:r>
+      <w:r>
+        <w:rPr>
+          <w:b w:val="0"/>
+        </w:rPr>
+        <w:t xml:space="preserve"> (tạo bản </w:t>
+      </w:r>
+      <w:r>
+        <w:rPr>
+          <w:rFonts w:ascii="Consolas" w:hAnsi="Consolas"/>
+          <w:b w:val="0"/>
+          <w:color w:val="A31F34"/>
+          <w:sz w:val="20"/>
+        </w:rPr>
+        <w:t>nen-Copy1.py</w:t>
+      </w:r>
+      <w:r>
+        <w:rPr>
+          <w:b w:val="0"/>
+        </w:rPr>
+        <w:t>).</w:t>
+      </w:r>
+    </w:p>
+    <w:p>
+      <w:pPr>
+        <w:pStyle w:val="ListBullet"/>
+      </w:pPr>
+      <w:r>
+        <w:rPr>
+          <w:b w:val="0"/>
+        </w:rPr>
+        <w:t xml:space="preserve">Học lại (thay cho </w:t>
+      </w:r>
+      <w:r>
+        <w:rPr>
+          <w:rFonts w:ascii="Consolas" w:hAnsi="Consolas"/>
+          <w:b w:val="0"/>
+          <w:color w:val="A31F34"/>
+          <w:sz w:val="20"/>
+        </w:rPr>
+        <w:t>HOC_LAI.bat</w:t>
+      </w:r>
+      <w:r>
+        <w:rPr>
+          <w:b w:val="0"/>
+        </w:rPr>
+        <w:t>):</w:t>
+      </w:r>
+    </w:p>
+    <w:tbl>
+      <w:tblPr>
+        <w:tblStyle w:val="TableGrid"/>
+        <w:tblW w:type="auto" w:w="0"/>
+        <w:tblLook w:firstColumn="1" w:firstRow="1" w:lastColumn="0" w:lastRow="0" w:noHBand="0" w:noVBand="1" w:val="04A0"/>
+      </w:tblPr>
+      <w:tblGrid>
+        <w:gridCol w:w="8640"/>
+      </w:tblGrid>
+      <w:tr>
+        <w:tc>
+          <w:tcPr>
+            <w:tcW w:type="dxa" w:w="8640"/>
+            <w:shd w:val="clear" w:color="auto" w:fill="F2F2F2"/>
+          </w:tcPr>
+          <w:p>
+            <w:r>
+              <w:rPr>
+                <w:rFonts w:ascii="Consolas" w:hAnsi="Consolas"/>
+                <w:sz w:val="19"/>
+              </w:rPr>
+              <w:t>bash ~/B1/JUPYTER/hoc_lai.sh</w:t>
+            </w:r>
+          </w:p>
+        </w:tc>
+      </w:tr>
+    </w:tbl>
+    <w:p/>
+    <w:p>
+      <w:pPr>
+        <w:pStyle w:val="ListBullet"/>
+      </w:pPr>
+      <w:r>
+        <w:rPr>
+          <w:b w:val="0"/>
+        </w:rPr>
+        <w:t xml:space="preserve">Xem sổ điểm: bấm đúp </w:t>
+      </w:r>
+      <w:r>
+        <w:rPr>
+          <w:rFonts w:ascii="Consolas" w:hAnsi="Consolas"/>
+          <w:b w:val="0"/>
+          <w:color w:val="A31F34"/>
+          <w:sz w:val="20"/>
+        </w:rPr>
+        <w:t>B1/KIT_BAI1/runs/chungket/nhat_ky_diem.txt</w:t>
+      </w:r>
+      <w:r>
+        <w:rPr>
+          <w:b w:val="0"/>
+        </w:rPr>
+        <w:t>.</w:t>
+      </w:r>
+    </w:p>
+    <w:p>
+      <w:pPr>
+        <w:pStyle w:val="Heading2"/>
+      </w:pPr>
+      <w:r>
+        <w:rPr>
+          <w:b w:val="0"/>
+        </w:rPr>
+        <w:t>Bước 6. Bài 2</w:t>
+      </w:r>
+    </w:p>
+    <w:p>
+      <w:r>
+        <w:rPr>
+          <w:b w:val="0"/>
+        </w:rPr>
+        <w:t xml:space="preserve">Mở </w:t>
+      </w:r>
+      <w:r>
+        <w:rPr>
+          <w:b/>
+        </w:rPr>
+        <w:t>thêm một Terminal</w:t>
+      </w:r>
+      <w:r>
+        <w:rPr>
+          <w:b w:val="0"/>
+        </w:rPr>
+        <w:t xml:space="preserve"> (File → New → Terminal) để bài 1 vẫn chạy ở Terminal kia:</w:t>
+      </w:r>
+    </w:p>
+    <w:tbl>
+      <w:tblPr>
+        <w:tblStyle w:val="TableGrid"/>
+        <w:tblW w:type="auto" w:w="0"/>
+        <w:tblLook w:firstColumn="1" w:firstRow="1" w:lastColumn="0" w:lastRow="0" w:noHBand="0" w:noVBand="1" w:val="04A0"/>
+      </w:tblPr>
+      <w:tblGrid>
+        <w:gridCol w:w="8640"/>
+      </w:tblGrid>
+      <w:tr>
+        <w:tc>
+          <w:tcPr>
+            <w:tcW w:type="dxa" w:w="8640"/>
+            <w:shd w:val="clear" w:color="auto" w:fill="F2F2F2"/>
+          </w:tcPr>
+          <w:p>
+            <w:r>
+              <w:rPr>
+                <w:rFonts w:ascii="Consolas" w:hAnsi="Consolas"/>
+                <w:sz w:val="19"/>
+              </w:rPr>
+              <w:t>cd ~/B1/KIT_BAI2</w:t>
+              <w:br/>
+            </w:r>
+            <w:r>
+              <w:rPr>
+                <w:rFonts w:ascii="Consolas" w:hAnsi="Consolas"/>
+                <w:sz w:val="19"/>
+              </w:rPr>
+              <w:t>python bai2.py</w:t>
+            </w:r>
+          </w:p>
+        </w:tc>
+      </w:tr>
+    </w:tbl>
+    <w:p/>
+    <w:p>
+      <w:r>
+        <w:rPr>
+          <w:b w:val="0"/>
+        </w:rPr>
+        <w:t xml:space="preserve">(khoanh vật thể: </w:t>
+      </w:r>
+      <w:r>
+        <w:rPr>
+          <w:rFonts w:ascii="Consolas" w:hAnsi="Consolas"/>
+          <w:b w:val="0"/>
+          <w:color w:val="A31F34"/>
+          <w:sz w:val="20"/>
+        </w:rPr>
+        <w:t>python yolo_mau.py</w:t>
+      </w:r>
+      <w:r>
+        <w:rPr>
+          <w:b w:val="0"/>
+        </w:rPr>
+        <w:t xml:space="preserve">; đọc chữ: </w:t>
+      </w:r>
+      <w:r>
+        <w:rPr>
+          <w:rFonts w:ascii="Consolas" w:hAnsi="Consolas"/>
+          <w:b w:val="0"/>
+          <w:color w:val="A31F34"/>
+          <w:sz w:val="20"/>
+        </w:rPr>
+        <w:t>python ocr_mau.py</w:t>
+      </w:r>
+      <w:r>
+        <w:rPr>
+          <w:b w:val="0"/>
+        </w:rPr>
+        <w:t>)</w:t>
+      </w:r>
+    </w:p>
+    <w:p>
+      <w:r>
+        <w:rPr>
+          <w:b w:val="0"/>
+        </w:rPr>
+        <w:t xml:space="preserve">Máy hỏi từng câu y như trên máy nhà; chỉ khác là </w:t>
+      </w:r>
+      <w:r>
+        <w:rPr>
+          <w:b/>
+        </w:rPr>
+        <w:t>không kéo thả được</w:t>
+      </w:r>
+      <w:r>
+        <w:rPr>
+          <w:b w:val="0"/>
+        </w:rPr>
+        <w:t xml:space="preserve">: thay vào đó chuột phải file / thư mục trong cây bên trái → </w:t>
+      </w:r>
+      <w:r>
+        <w:rPr>
+          <w:b/>
+        </w:rPr>
+        <w:t>Copy Path</w:t>
+      </w:r>
+      <w:r>
+        <w:rPr>
+          <w:b w:val="0"/>
+        </w:rPr>
+        <w:t xml:space="preserve"> → dán vào Terminal → Enter.</w:t>
+      </w:r>
+    </w:p>
+    <w:p>
+      <w:r>
+        <w:rPr>
+          <w:b w:val="0"/>
+        </w:rPr>
+        <w:t xml:space="preserve">File nộp: </w:t>
+      </w:r>
+      <w:r>
+        <w:rPr>
+          <w:rFonts w:ascii="Consolas" w:hAnsi="Consolas"/>
+          <w:b w:val="0"/>
+          <w:color w:val="A31F34"/>
+          <w:sz w:val="20"/>
+        </w:rPr>
+        <w:t>B1/KIT_BAI2/ket_qua/&lt;tên lần chạy&gt;/submission.csv</w:t>
+      </w:r>
+      <w:r>
+        <w:rPr>
+          <w:b w:val="0"/>
+        </w:rPr>
+        <w:t xml:space="preserve"> → chuột phải → Download.</w:t>
+      </w:r>
+    </w:p>
+    <w:p>
+      <w:r>
+        <w:rPr>
+          <w:b w:val="0"/>
+        </w:rPr>
+        <w:t>Chạy lại không phải trả lời lại:</w:t>
+      </w:r>
+    </w:p>
+    <w:tbl>
+      <w:tblPr>
+        <w:tblStyle w:val="TableGrid"/>
+        <w:tblW w:type="auto" w:w="0"/>
+        <w:tblLook w:firstColumn="1" w:firstRow="1" w:lastColumn="0" w:lastRow="0" w:noHBand="0" w:noVBand="1" w:val="04A0"/>
+      </w:tblPr>
+      <w:tblGrid>
+        <w:gridCol w:w="8640"/>
+      </w:tblGrid>
+      <w:tr>
+        <w:tc>
+          <w:tcPr>
+            <w:tcW w:type="dxa" w:w="8640"/>
+            <w:shd w:val="clear" w:color="auto" w:fill="F2F2F2"/>
+          </w:tcPr>
+          <w:p>
+            <w:r>
+              <w:rPr>
+                <w:rFonts w:ascii="Consolas" w:hAnsi="Consolas"/>
+                <w:sz w:val="19"/>
+              </w:rPr>
+              <w:t>cd ~/B1/KIT_BAI2 &amp;&amp; python bai2.py --lai ket_qua/&lt;tên lần chạy&gt;/cau_hinh.json</w:t>
+            </w:r>
+          </w:p>
+        </w:tc>
+      </w:tr>
+    </w:tbl>
+    <w:p/>
+    <w:p>
+      <w:pPr>
+        <w:pStyle w:val="Heading2"/>
+      </w:pPr>
+      <w:r>
+        <w:rPr>
+          <w:b w:val="0"/>
+        </w:rPr>
+        <w:t>Có GPU thì nhanh hơn ở đâu</w:t>
+      </w:r>
+    </w:p>
+    <w:tbl>
+      <w:tblPr>
+        <w:tblStyle w:val="TableGrid"/>
+        <w:tblW w:type="auto" w:w="0"/>
+        <w:tblLook w:firstColumn="1" w:firstRow="1" w:lastColumn="0" w:lastRow="0" w:noHBand="0" w:noVBand="1" w:val="04A0"/>
+      </w:tblPr>
+      <w:tblGrid>
+        <w:gridCol w:w="4320"/>
+        <w:gridCol w:w="4320"/>
+      </w:tblGrid>
+      <w:tr>
+        <w:tc>
+          <w:tcPr>
+            <w:tcW w:type="dxa" w:w="4320"/>
+            <w:shd w:val="clear" w:color="auto" w:fill="DCE6F1"/>
+          </w:tcPr>
+          <w:p>
+            <w:r>
+              <w:rPr>
+                <w:b/>
+              </w:rPr>
+              <w:t>phần</w:t>
+            </w:r>
+          </w:p>
+        </w:tc>
+        <w:tc>
+          <w:tcPr>
+            <w:tcW w:type="dxa" w:w="4320"/>
+            <w:shd w:val="clear" w:color="auto" w:fill="DCE6F1"/>
+          </w:tcPr>
+          <w:p>
+            <w:r>
+              <w:rPr>
+                <w:b/>
+              </w:rPr>
+              <w:t>dùng GPU</w:t>
+            </w:r>
+          </w:p>
+        </w:tc>
+      </w:tr>
+      <w:tr>
+        <w:tc>
+          <w:tcPr>
+            <w:tcW w:type="dxa" w:w="4320"/>
+          </w:tcPr>
+          <w:p>
+            <w:r>
+              <w:rPr>
+                <w:b w:val="0"/>
+              </w:rPr>
+              <w:t>bài 2: đọc ảnh bằng ResNet / CLIP / DINOv2, tinh chỉnh ảnh, YOLO, nhúng câu, dịch</w:t>
+            </w:r>
+          </w:p>
+        </w:tc>
+        <w:tc>
+          <w:tcPr>
+            <w:tcW w:type="dxa" w:w="4320"/>
+          </w:tcPr>
+          <w:p>
+            <w:r>
+              <w:rPr>
+                <w:b/>
+              </w:rPr>
+              <w:t>có</w:t>
+            </w:r>
+            <w:r>
+              <w:rPr>
+                <w:b w:val="0"/>
+              </w:rPr>
+              <w:t xml:space="preserve"> → nhanh hơn nhiều lần; tinh chỉnh có thể đặt nhiều phút hơn</w:t>
+            </w:r>
+          </w:p>
+        </w:tc>
+      </w:tr>
+      <w:tr>
+        <w:tc>
+          <w:tcPr>
+            <w:tcW w:type="dxa" w:w="4320"/>
+          </w:tcPr>
+          <w:p>
+            <w:r>
+              <w:rPr>
+                <w:b w:val="0"/>
+              </w:rPr>
+              <w:t>bài 1</w:t>
+            </w:r>
+          </w:p>
+        </w:tc>
+        <w:tc>
+          <w:tcPr>
+            <w:tcW w:type="dxa" w:w="4320"/>
+          </w:tcPr>
+          <w:p>
+            <w:r>
+              <w:rPr>
+                <w:b w:val="0"/>
+              </w:rPr>
+              <w:t>phần lớn chạy CPU (đọc ảnh bằng onnx, mô hình cây); không sao, vẫn như máy nhà</w:t>
+            </w:r>
+          </w:p>
+        </w:tc>
+      </w:tr>
+    </w:tbl>
+    <w:p/>
+    <w:p>
+      <w:pPr>
+        <w:pStyle w:val="Heading2"/>
+      </w:pPr>
+      <w:r>
+        <w:rPr>
+          <w:b w:val="0"/>
+        </w:rPr>
+        <w:t>Thêm: notebook</w:t>
+      </w:r>
+    </w:p>
+    <w:p>
+      <w:r>
+        <w:rPr>
+          <w:b w:val="0"/>
+        </w:rPr>
+        <w:t xml:space="preserve">Thích bấm nút hơn gõ lệnh: mở </w:t>
+      </w:r>
+      <w:r>
+        <w:rPr>
+          <w:rFonts w:ascii="Consolas" w:hAnsi="Consolas"/>
+          <w:b w:val="0"/>
+          <w:color w:val="A31F34"/>
+          <w:sz w:val="20"/>
+        </w:rPr>
+        <w:t>B1/JUPYTER/CHAY_TREN_JUPYTER.ipynb</w:t>
+      </w:r>
+      <w:r>
+        <w:rPr>
+          <w:b w:val="0"/>
+        </w:rPr>
+        <w:t xml:space="preserve">, bấm vào từng ô rồi </w:t>
+      </w:r>
+      <w:r>
+        <w:rPr>
+          <w:b/>
+        </w:rPr>
+        <w:t>Shift + Enter</w:t>
+      </w:r>
+      <w:r>
+        <w:rPr>
+          <w:b w:val="0"/>
+        </w:rPr>
+        <w:t xml:space="preserve"> lần lượt từ trên xuống. Bài 2 vẫn phải chạy trong Terminal (vì máy cần hỏi đáp).</w:t>
       </w:r>
     </w:p>
     <w:p>

</xml_diff>

<commit_message>
JupyterHub: git clone la cach chinh; cai_dat.sh tu tai lai model.onnx bai 1 neu thieu git-lfs
Co-Authored-By: Claude Opus 5.5 <noreply@anthropic.com>
</commit_message>
<xml_diff>
--- a/KIT_BAI1/HUONG_DAN_THI.docx
+++ b/KIT_BAI1/HUONG_DAN_THI.docx
@@ -363,22 +363,7 @@
               <w:rPr>
                 <w:b w:val="0"/>
               </w:rPr>
-              <w:t xml:space="preserve">giải nén bộ đồ nghề (sau khi upload </w:t>
-            </w:r>
-            <w:r>
-              <w:rPr>
-                <w:rFonts w:ascii="Consolas" w:hAnsi="Consolas"/>
-                <w:b w:val="0"/>
-                <w:color w:val="A31F34"/>
-                <w:sz w:val="20"/>
-              </w:rPr>
-              <w:t>kit.zip</w:t>
-            </w:r>
-            <w:r>
-              <w:rPr>
-                <w:b w:val="0"/>
-              </w:rPr>
-              <w:t>)</w:t>
+              <w:t>lấy bộ đồ nghề về máy chủ</w:t>
             </w:r>
           </w:p>
         </w:tc>
@@ -394,7 +379,7 @@
                 <w:color w:val="A31F34"/>
                 <w:sz w:val="20"/>
               </w:rPr>
-              <w:t>cd ~ &amp;&amp; python -m zipfile -e kit.zip ~</w:t>
+              <w:t>cd ~ &amp;&amp; git clone https://github.com/nguyenthithanhhue-13/B1</w:t>
             </w:r>
           </w:p>
         </w:tc>
@@ -3085,7 +3070,7 @@
         <w:rPr>
           <w:b w:val="0"/>
         </w:rPr>
-        <w:t>Bước 0. Tối nay ở nhà: đóng gói (máy Huệ, cần làm một lần)</w:t>
+        <w:t>Bước 0. Dự phòng (đã làm sẵn trên máy Huệ)</w:t>
       </w:r>
     </w:p>
     <w:p>
@@ -3334,7 +3319,7 @@
         <w:rPr>
           <w:b w:val="0"/>
         </w:rPr>
-        <w:t>Bước 2. Đưa bộ đồ nghề lên (chọn một cách)</w:t>
+        <w:t>Bước 2. Đưa bộ đồ nghề lên</w:t>
       </w:r>
     </w:p>
     <w:p>
@@ -3342,83 +3327,13 @@
         <w:rPr>
           <w:b/>
         </w:rPr>
-        <w:t xml:space="preserve">Cách A — upload </w:t>
-      </w:r>
-      <w:r>
-        <w:rPr>
-          <w:rFonts w:ascii="Consolas" w:hAnsi="Consolas"/>
-          <w:b/>
-          <w:color w:val="A31F34"/>
-          <w:sz w:val="20"/>
-        </w:rPr>
-        <w:t>kit.zip</w:t>
-      </w:r>
-      <w:r>
-        <w:rPr>
-          <w:b/>
-        </w:rPr>
-        <w:t xml:space="preserve"> (chắc chắn chạy được):</w:t>
-      </w:r>
-    </w:p>
-    <w:p>
-      <w:pPr>
-        <w:ind w:left="360"/>
-      </w:pPr>
-      <w:r>
-        <w:rPr>
-          <w:b/>
-        </w:rPr>
-        <w:t xml:space="preserve">1. </w:t>
-      </w:r>
-      <w:r>
-        <w:rPr>
-          <w:b w:val="0"/>
-        </w:rPr>
-        <w:t xml:space="preserve">Ở cây thư mục bên trái, bấm biểu tượng </w:t>
-      </w:r>
-      <w:r>
-        <w:rPr>
-          <w:b/>
-        </w:rPr>
-        <w:t>mũi tên lên (Upload)</w:t>
-      </w:r>
-      <w:r>
-        <w:rPr>
-          <w:b w:val="0"/>
-        </w:rPr>
-        <w:t xml:space="preserve"> ở phía trên → chọn </w:t>
-      </w:r>
-      <w:r>
-        <w:rPr>
-          <w:rFonts w:ascii="Consolas" w:hAnsi="Consolas"/>
-          <w:b w:val="0"/>
-          <w:color w:val="A31F34"/>
-          <w:sz w:val="20"/>
-        </w:rPr>
-        <w:t>Desktop\GOI_JUPYTER\kit.zip</w:t>
-      </w:r>
-      <w:r>
-        <w:rPr>
-          <w:b w:val="0"/>
-        </w:rPr>
-        <w:t>. Đợi thanh tiến trình chạy xong (550 MB).</w:t>
-      </w:r>
-    </w:p>
-    <w:p>
-      <w:pPr>
-        <w:ind w:left="360"/>
-      </w:pPr>
-      <w:r>
-        <w:rPr>
-          <w:b/>
-        </w:rPr>
-        <w:t xml:space="preserve">2. </w:t>
-      </w:r>
-      <w:r>
-        <w:rPr>
-          <w:b w:val="0"/>
-        </w:rPr>
-        <w:t>Dán vào Terminal:</w:t>
+        <w:t>Cách A — máy chủ có mạng (cách chính, nhanh nhất).</w:t>
+      </w:r>
+      <w:r>
+        <w:rPr>
+          <w:b w:val="0"/>
+        </w:rPr>
+        <w:t xml:space="preserve"> Dán vào Terminal:</w:t>
       </w:r>
     </w:p>
     <w:tbl>
@@ -3442,7 +3357,7 @@
                 <w:rFonts w:ascii="Consolas" w:hAnsi="Consolas"/>
                 <w:sz w:val="19"/>
               </w:rPr>
-              <w:t>cd ~ &amp;&amp; python -m zipfile -e kit.zip ~ &amp;&amp; ls ~/B1</w:t>
+              <w:t>cd ~ &amp;&amp; git clone https://github.com/nguyenthithanhhue-13/B1 &amp;&amp; ls ~/B1</w:t>
             </w:r>
           </w:p>
         </w:tc>
@@ -3463,13 +3378,13 @@
           <w:color w:val="A31F34"/>
           <w:sz w:val="20"/>
         </w:rPr>
-        <w:t>JUPYTER  KIT_BAI1  KIT_BAI2  du_lieu_tap_duot</w:t>
-      </w:r>
-      <w:r>
-        <w:rPr>
-          <w:b w:val="0"/>
-        </w:rPr>
-        <w:t xml:space="preserve"> là được.</w:t>
+        <w:t>JUPYTER  KIT_BAI1  KIT_BAI2  README.md  du_lieu_tap_duot</w:t>
+      </w:r>
+      <w:r>
+        <w:rPr>
+          <w:b w:val="0"/>
+        </w:rPr>
+        <w:t xml:space="preserve"> là được. (File mô hình 470 MB của bài 1 nếu thiếu sẽ được lệnh cài đặt ở bước 3 tự tải lại.)</w:t>
       </w:r>
     </w:p>
     <w:p>
@@ -3477,7 +3392,55 @@
         <w:rPr>
           <w:b/>
         </w:rPr>
-        <w:t>Cách B — máy chủ có mạng và có git-lfs:</w:t>
+        <w:t xml:space="preserve">Cách B — dự phòng, khi </w:t>
+      </w:r>
+      <w:r>
+        <w:rPr>
+          <w:rFonts w:ascii="Consolas" w:hAnsi="Consolas"/>
+          <w:b/>
+          <w:color w:val="A31F34"/>
+          <w:sz w:val="20"/>
+        </w:rPr>
+        <w:t>git clone</w:t>
+      </w:r>
+      <w:r>
+        <w:rPr>
+          <w:b/>
+        </w:rPr>
+        <w:t xml:space="preserve"> báo lỗi:</w:t>
+      </w:r>
+      <w:r>
+        <w:rPr>
+          <w:b w:val="0"/>
+        </w:rPr>
+        <w:t xml:space="preserve"> ở cây thư mục bên trái bấm biểu tượng </w:t>
+      </w:r>
+      <w:r>
+        <w:rPr>
+          <w:b/>
+        </w:rPr>
+        <w:t>mũi tên lên (Upload)</w:t>
+      </w:r>
+      <w:r>
+        <w:rPr>
+          <w:b w:val="0"/>
+        </w:rPr>
+        <w:t xml:space="preserve"> → chọn </w:t>
+      </w:r>
+      <w:r>
+        <w:rPr>
+          <w:rFonts w:ascii="Consolas" w:hAnsi="Consolas"/>
+          <w:b w:val="0"/>
+          <w:color w:val="A31F34"/>
+          <w:sz w:val="20"/>
+        </w:rPr>
+        <w:t>Desktop\GOI_JUPYTER\kit.zip</w:t>
+      </w:r>
+      <w:r>
+        <w:rPr>
+          <w:b w:val="0"/>
+        </w:rPr>
+        <w:t xml:space="preserve"> trên máy mình → đợi tải lên xong (0,6 GB), rồi dán:</w:t>
       </w:r>
     </w:p>
     <w:tbl>
@@ -3501,36 +3464,13 @@
                 <w:rFonts w:ascii="Consolas" w:hAnsi="Consolas"/>
                 <w:sz w:val="19"/>
               </w:rPr>
-              <w:t>cd ~ &amp;&amp; git lfs install &amp;&amp; git clone https://github.com/nguyenthithanhhue-13/B1</w:t>
+              <w:t>cd ~ &amp;&amp; python -m zipfile -e kit.zip ~ &amp;&amp; ls ~/B1</w:t>
             </w:r>
           </w:p>
         </w:tc>
       </w:tr>
     </w:tbl>
     <w:p/>
-    <w:p>
-      <w:r>
-        <w:rPr>
-          <w:b w:val="0"/>
-        </w:rPr>
-        <w:t xml:space="preserve">(Nếu bước 3 báo </w:t>
-      </w:r>
-      <w:r>
-        <w:rPr>
-          <w:rFonts w:ascii="Consolas" w:hAnsi="Consolas"/>
-          <w:b w:val="0"/>
-          <w:color w:val="A31F34"/>
-          <w:sz w:val="20"/>
-        </w:rPr>
-        <w:t>thiếu ... model.onnx</w:t>
-      </w:r>
-      <w:r>
-        <w:rPr>
-          <w:b w:val="0"/>
-        </w:rPr>
-        <w:t xml:space="preserve"> thì dùng cách A.)</w:t>
-      </w:r>
-    </w:p>
     <w:p>
       <w:pPr>
         <w:pStyle w:val="Heading2"/>

</xml_diff>

<commit_message>
File Word: luat moi (AI cua BTC, cam LLM ngoai, Jupyter GPU cua BTC sau 3 gio dau), the gioi thieu cho AI
Co-Authored-By: Claude Opus 5.5 <noreply@anthropic.com>
</commit_message>
<xml_diff>
--- a/KIT_BAI1/HUONG_DAN_THI.docx
+++ b/KIT_BAI1/HUONG_DAN_THI.docx
@@ -94,6 +94,541 @@
         <w:rPr>
           <w:b w:val="0"/>
         </w:rPr>
+        <w:t>LUẬT MỚI (thầy báo tối 14/10) — ĐỌC ĐẦU TIÊN</w:t>
+      </w:r>
+    </w:p>
+    <w:tbl>
+      <w:tblPr>
+        <w:tblStyle w:val="TableGrid"/>
+        <w:tblW w:type="auto" w:w="0"/>
+        <w:tblLook w:firstColumn="1" w:firstRow="1" w:lastColumn="0" w:lastRow="0" w:noHBand="0" w:noVBand="1" w:val="04A0"/>
+      </w:tblPr>
+      <w:tblGrid>
+        <w:gridCol w:w="4320"/>
+        <w:gridCol w:w="4320"/>
+      </w:tblGrid>
+      <w:tr>
+        <w:tc>
+          <w:tcPr>
+            <w:tcW w:type="dxa" w:w="4320"/>
+            <w:shd w:val="clear" w:color="auto" w:fill="DCE6F1"/>
+          </w:tcPr>
+          <w:p>
+            <w:r>
+              <w:rPr>
+                <w:b/>
+              </w:rPr>
+              <w:t>luật</w:t>
+            </w:r>
+          </w:p>
+        </w:tc>
+        <w:tc>
+          <w:tcPr>
+            <w:tcW w:type="dxa" w:w="4320"/>
+            <w:shd w:val="clear" w:color="auto" w:fill="DCE6F1"/>
+          </w:tcPr>
+          <w:p>
+            <w:r>
+              <w:rPr>
+                <w:b/>
+              </w:rPr>
+              <w:t>nghĩa là</w:t>
+            </w:r>
+          </w:p>
+        </w:tc>
+      </w:tr>
+      <w:tr>
+        <w:tc>
+          <w:tcPr>
+            <w:tcW w:type="dxa" w:w="4320"/>
+          </w:tcPr>
+          <w:p>
+            <w:r>
+              <w:rPr>
+                <w:b w:val="0"/>
+              </w:rPr>
+              <w:t>các đội dùng AI của BTC</w:t>
+            </w:r>
+          </w:p>
+        </w:tc>
+        <w:tc>
+          <w:tcPr>
+            <w:tcW w:type="dxa" w:w="4320"/>
+          </w:tcPr>
+          <w:p>
+            <w:r>
+              <w:rPr>
+                <w:b w:val="0"/>
+              </w:rPr>
+              <w:t>được hỏi AI của BTC</w:t>
+            </w:r>
+          </w:p>
+        </w:tc>
+      </w:tr>
+      <w:tr>
+        <w:tc>
+          <w:tcPr>
+            <w:tcW w:type="dxa" w:w="4320"/>
+          </w:tcPr>
+          <w:p>
+            <w:r>
+              <w:rPr>
+                <w:b/>
+              </w:rPr>
+              <w:t>cấm dùng tài khoản chat LLM ngoài</w:t>
+            </w:r>
+          </w:p>
+        </w:tc>
+        <w:tc>
+          <w:tcPr>
+            <w:tcW w:type="dxa" w:w="4320"/>
+          </w:tcPr>
+          <w:p>
+            <w:r>
+              <w:rPr>
+                <w:b/>
+              </w:rPr>
+              <w:t>tắt hẳn extension Claude trong VS Code</w:t>
+            </w:r>
+            <w:r>
+              <w:rPr>
+                <w:b w:val="0"/>
+              </w:rPr>
+              <w:t>, không mở ChatGPT, Gemini, Claude...</w:t>
+            </w:r>
+          </w:p>
+        </w:tc>
+      </w:tr>
+      <w:tr>
+        <w:tc>
+          <w:tcPr>
+            <w:tcW w:type="dxa" w:w="4320"/>
+          </w:tcPr>
+          <w:p>
+            <w:r>
+              <w:rPr>
+                <w:b w:val="0"/>
+              </w:rPr>
+              <w:t xml:space="preserve">AI của BTC giới hạn </w:t>
+            </w:r>
+            <w:r>
+              <w:rPr>
+                <w:b/>
+              </w:rPr>
+              <w:t>200k context một phiên</w:t>
+            </w:r>
+          </w:p>
+        </w:tc>
+        <w:tc>
+          <w:tcPr>
+            <w:tcW w:type="dxa" w:w="4320"/>
+          </w:tcPr>
+          <w:p>
+            <w:r>
+              <w:rPr>
+                <w:b w:val="0"/>
+              </w:rPr>
+              <w:t xml:space="preserve">hỏi ngắn; hết chỗ thì mở phiên mới và dán </w:t>
+            </w:r>
+            <w:r>
+              <w:rPr>
+                <w:b/>
+              </w:rPr>
+              <w:t>Thẻ giới thiệu cho AI</w:t>
+            </w:r>
+            <w:r>
+              <w:rPr>
+                <w:b w:val="0"/>
+              </w:rPr>
+              <w:t xml:space="preserve"> (ngay dưới)</w:t>
+            </w:r>
+          </w:p>
+        </w:tc>
+      </w:tr>
+      <w:tr>
+        <w:tc>
+          <w:tcPr>
+            <w:tcW w:type="dxa" w:w="4320"/>
+          </w:tcPr>
+          <w:p>
+            <w:r>
+              <w:rPr>
+                <w:b w:val="0"/>
+              </w:rPr>
+              <w:t>mỗi đội 1 tài khoản Jupyter có GPU, tổng VRAM dưới 24 GB</w:t>
+            </w:r>
+          </w:p>
+        </w:tc>
+        <w:tc>
+          <w:tcPr>
+            <w:tcW w:type="dxa" w:w="4320"/>
+          </w:tcPr>
+          <w:p>
+            <w:r>
+              <w:rPr>
+                <w:b w:val="0"/>
+              </w:rPr>
+              <w:t>mô hình của mình nhỏ, không vượt</w:t>
+            </w:r>
+          </w:p>
+        </w:tc>
+      </w:tr>
+      <w:tr>
+        <w:tc>
+          <w:tcPr>
+            <w:tcW w:type="dxa" w:w="4320"/>
+          </w:tcPr>
+          <w:p>
+            <w:r>
+              <w:rPr>
+                <w:b/>
+              </w:rPr>
+              <w:t>3 giờ đầu</w:t>
+            </w:r>
+            <w:r>
+              <w:rPr>
+                <w:b w:val="0"/>
+              </w:rPr>
+              <w:t xml:space="preserve"> được thử trên Kaggle cá nhân; </w:t>
+            </w:r>
+            <w:r>
+              <w:rPr>
+                <w:b/>
+              </w:rPr>
+              <w:t>sau đó phải train và submit trên GPU của BTC</w:t>
+            </w:r>
+          </w:p>
+        </w:tc>
+        <w:tc>
+          <w:tcPr>
+            <w:tcW w:type="dxa" w:w="4320"/>
+          </w:tcPr>
+          <w:p>
+            <w:r>
+              <w:rPr>
+                <w:b/>
+              </w:rPr>
+              <w:t>lời giải cuối cùng phải chạy trên Jupyter của BTC</w:t>
+            </w:r>
+          </w:p>
+        </w:tc>
+      </w:tr>
+    </w:tbl>
+    <w:p/>
+    <w:p>
+      <w:r>
+        <w:rPr>
+          <w:b/>
+        </w:rPr>
+        <w:t>Kế hoạch theo luật mới:</w:t>
+      </w:r>
+    </w:p>
+    <w:p>
+      <w:pPr>
+        <w:ind w:left="360"/>
+      </w:pPr>
+      <w:r>
+        <w:rPr>
+          <w:b/>
+        </w:rPr>
+        <w:t xml:space="preserve">1. </w:t>
+      </w:r>
+      <w:r>
+        <w:rPr>
+          <w:b/>
+        </w:rPr>
+        <w:t>Phút 0:</w:t>
+      </w:r>
+      <w:r>
+        <w:rPr>
+          <w:b w:val="0"/>
+        </w:rPr>
+        <w:t xml:space="preserve"> đăng nhập Jupyter của BTC → Terminal → </w:t>
+      </w:r>
+      <w:r>
+        <w:rPr>
+          <w:rFonts w:ascii="Consolas" w:hAnsi="Consolas"/>
+          <w:b w:val="0"/>
+          <w:color w:val="A31F34"/>
+          <w:sz w:val="20"/>
+        </w:rPr>
+        <w:t>cd ~ &amp;&amp; git clone https://github.com/nguyenthithanhhue-13/B1</w:t>
+      </w:r>
+      <w:r>
+        <w:rPr>
+          <w:b w:val="0"/>
+        </w:rPr>
+        <w:t xml:space="preserve"> → </w:t>
+      </w:r>
+      <w:r>
+        <w:rPr>
+          <w:rFonts w:ascii="Consolas" w:hAnsi="Consolas"/>
+          <w:b w:val="0"/>
+          <w:color w:val="A31F34"/>
+          <w:sz w:val="20"/>
+        </w:rPr>
+        <w:t>bash ~/B1/JUPYTER/cai_dat.sh</w:t>
+      </w:r>
+      <w:r>
+        <w:rPr>
+          <w:b w:val="0"/>
+        </w:rPr>
+        <w:t xml:space="preserve"> (chi tiết: phần CHẠY TRÊN JUPYTERHUB).</w:t>
+      </w:r>
+    </w:p>
+    <w:p>
+      <w:pPr>
+        <w:ind w:left="360"/>
+      </w:pPr>
+      <w:r>
+        <w:rPr>
+          <w:b/>
+        </w:rPr>
+        <w:t xml:space="preserve">2. </w:t>
+      </w:r>
+      <w:r>
+        <w:rPr>
+          <w:b w:val="0"/>
+        </w:rPr>
+        <w:t xml:space="preserve">Cài xong: </w:t>
+      </w:r>
+      <w:r>
+        <w:rPr>
+          <w:rFonts w:ascii="Consolas" w:hAnsi="Consolas"/>
+          <w:b w:val="0"/>
+          <w:color w:val="A31F34"/>
+          <w:sz w:val="20"/>
+        </w:rPr>
+        <w:t>bash ~/B1/JUPYTER/bai1.sh &lt;Copy Path thư mục dữ liệu&gt;</w:t>
+      </w:r>
+      <w:r>
+        <w:rPr>
+          <w:b w:val="0"/>
+        </w:rPr>
+        <w:t xml:space="preserve">. </w:t>
+      </w:r>
+      <w:r>
+        <w:rPr>
+          <w:b/>
+        </w:rPr>
+        <w:t>Đây là lần chạy chính thức</w:t>
+      </w:r>
+      <w:r>
+        <w:rPr>
+          <w:b w:val="0"/>
+        </w:rPr>
+        <w:t xml:space="preserve"> của bài 1; file nộp lấy từ đây.</w:t>
+      </w:r>
+    </w:p>
+    <w:p>
+      <w:pPr>
+        <w:ind w:left="360"/>
+      </w:pPr>
+      <w:r>
+        <w:rPr>
+          <w:b/>
+        </w:rPr>
+        <w:t xml:space="preserve">3. </w:t>
+      </w:r>
+      <w:r>
+        <w:rPr>
+          <w:b w:val="0"/>
+        </w:rPr>
+        <w:t xml:space="preserve">Cùng lúc, nếu muốn: chạy </w:t>
+      </w:r>
+      <w:r>
+        <w:rPr>
+          <w:rFonts w:ascii="Consolas" w:hAnsi="Consolas"/>
+          <w:b w:val="0"/>
+          <w:color w:val="A31F34"/>
+          <w:sz w:val="20"/>
+        </w:rPr>
+        <w:t>CHAY_BAI1.bat</w:t>
+      </w:r>
+      <w:r>
+        <w:rPr>
+          <w:b w:val="0"/>
+        </w:rPr>
+        <w:t xml:space="preserve"> trên máy mình </w:t>
+      </w:r>
+      <w:r>
+        <w:rPr>
+          <w:b/>
+        </w:rPr>
+        <w:t>chỉ để thử / xem trước</w:t>
+      </w:r>
+      <w:r>
+        <w:rPr>
+          <w:b w:val="0"/>
+        </w:rPr>
+        <w:t xml:space="preserve"> (trong 3 giờ đầu). Không lấy file nộp từ máy mình, trừ khi BTC nói rõ là được.</w:t>
+      </w:r>
+    </w:p>
+    <w:p>
+      <w:pPr>
+        <w:ind w:left="360"/>
+      </w:pPr>
+      <w:r>
+        <w:rPr>
+          <w:b/>
+        </w:rPr>
+        <w:t xml:space="preserve">4. </w:t>
+      </w:r>
+      <w:r>
+        <w:rPr>
+          <w:b w:val="0"/>
+        </w:rPr>
+        <w:t xml:space="preserve">Mở </w:t>
+      </w:r>
+      <w:r>
+        <w:rPr>
+          <w:b/>
+        </w:rPr>
+        <w:t>Terminal thứ hai</w:t>
+      </w:r>
+      <w:r>
+        <w:rPr>
+          <w:b w:val="0"/>
+        </w:rPr>
+        <w:t xml:space="preserve"> trên Jupyter cho bài 2.</w:t>
+      </w:r>
+    </w:p>
+    <w:p>
+      <w:pPr>
+        <w:ind w:left="360"/>
+      </w:pPr>
+      <w:r>
+        <w:rPr>
+          <w:b/>
+        </w:rPr>
+        <w:t xml:space="preserve">5. </w:t>
+      </w:r>
+      <w:r>
+        <w:rPr>
+          <w:b/>
+        </w:rPr>
+        <w:t>Hỏi BTC đầu giờ:</w:t>
+      </w:r>
+      <w:r>
+        <w:rPr>
+          <w:b w:val="0"/>
+        </w:rPr>
+        <w:t xml:space="preserve"> "Trong 3 giờ đầu có được nộp kết quả chạy trên Kaggle / máy cá nhân không, hay mọi lần nộp phải từ Jupyter của BTC?"</w:t>
+      </w:r>
+    </w:p>
+    <w:p>
+      <w:pPr>
+        <w:ind w:left="360"/>
+      </w:pPr>
+      <w:r>
+        <w:rPr>
+          <w:b/>
+        </w:rPr>
+        <w:t xml:space="preserve">6. </w:t>
+      </w:r>
+      <w:r>
+        <w:rPr>
+          <w:b w:val="0"/>
+        </w:rPr>
+        <w:t xml:space="preserve">Nếu </w:t>
+      </w:r>
+      <w:r>
+        <w:rPr>
+          <w:rFonts w:ascii="Consolas" w:hAnsi="Consolas"/>
+          <w:b w:val="0"/>
+          <w:color w:val="A31F34"/>
+          <w:sz w:val="20"/>
+        </w:rPr>
+        <w:t>cai_dat.sh</w:t>
+      </w:r>
+      <w:r>
+        <w:rPr>
+          <w:b w:val="0"/>
+        </w:rPr>
+        <w:t xml:space="preserve"> hoặc </w:t>
+      </w:r>
+      <w:r>
+        <w:rPr>
+          <w:rFonts w:ascii="Consolas" w:hAnsi="Consolas"/>
+          <w:b w:val="0"/>
+          <w:color w:val="A31F34"/>
+          <w:sz w:val="20"/>
+        </w:rPr>
+        <w:t>bai1.sh</w:t>
+      </w:r>
+      <w:r>
+        <w:rPr>
+          <w:b w:val="0"/>
+        </w:rPr>
+        <w:t xml:space="preserve"> báo lỗi trên Jupyter: chụp phần lỗi → hỏi AI của BTC (mẫu A). Trong lúc sửa, máy mình vẫn chạy được để không mất thời gian.</w:t>
+      </w:r>
+    </w:p>
+    <w:p>
+      <w:r>
+        <w:rPr>
+          <w:b/>
+        </w:rPr>
+        <w:t>Thẻ giới thiệu cho AI</w:t>
+      </w:r>
+      <w:r>
+        <w:rPr>
+          <w:b w:val="0"/>
+        </w:rPr>
+        <w:t xml:space="preserve"> (dán vào đầu mỗi phiên AI mới, rồi mới hỏi):</w:t>
+      </w:r>
+    </w:p>
+    <w:tbl>
+      <w:tblPr>
+        <w:tblStyle w:val="TableGrid"/>
+        <w:tblW w:type="auto" w:w="0"/>
+        <w:tblLook w:firstColumn="1" w:firstRow="1" w:lastColumn="0" w:lastRow="0" w:noHBand="0" w:noVBand="1" w:val="04A0"/>
+      </w:tblPr>
+      <w:tblGrid>
+        <w:gridCol w:w="8640"/>
+      </w:tblGrid>
+      <w:tr>
+        <w:tc>
+          <w:tcPr>
+            <w:tcW w:type="dxa" w:w="8640"/>
+            <w:shd w:val="clear" w:color="auto" w:fill="F2F2F2"/>
+          </w:tcPr>
+          <w:p>
+            <w:r>
+              <w:rPr>
+                <w:rFonts w:ascii="Consolas" w:hAnsi="Consolas"/>
+                <w:sz w:val="19"/>
+              </w:rPr>
+              <w:t>Tôi đang chạy một bộ code Python cho bài toán: mỗi cảnh có ảnh bản đồ campus + câu tiếng Việt giao nhiệm vụ cho robot; phải đoán bước đi đầu tiên (0=UP,1=DOWN,2=LEFT,3=RIGHT); chấm macro accuracy theo robot.</w:t>
+              <w:br/>
+            </w:r>
+            <w:r>
+              <w:rPr>
+                <w:rFonts w:ascii="Consolas" w:hAnsi="Consolas"/>
+                <w:sz w:val="19"/>
+              </w:rPr>
+              <w:t>Luồng: src/run_cv.py đọc ảnh ra đồ thị lưới (onnx) -&gt; nen.py: nlp3 đọc câu, scene_feats/move_feats tính đặc trưng 4 hướng, mỗi robot một HistGradientBoosting -&gt; nang_cao.py: mô hình siêu tuyến tính (train/hyper_train.py) + luật tham lam, chọn theo validation. tu_dong.py chạy tất cả; kết quả trong runs/chungket/.</w:t>
+              <w:br/>
+            </w:r>
+            <w:r>
+              <w:rPr>
+                <w:rFonts w:ascii="Consolas" w:hAnsi="Consolas"/>
+                <w:sz w:val="19"/>
+              </w:rPr>
+              <w:t>Máy: Jupyter Linux có GPU, Python 3. Tôi không biết code: hãy trả lời ngắn, chỉ đưa lại đúng hàm đã sửa, đầy đủ, để tôi dán đè.</w:t>
+            </w:r>
+          </w:p>
+        </w:tc>
+      </w:tr>
+    </w:tbl>
+    <w:p/>
+    <w:p>
+      <w:pPr>
+        <w:pStyle w:val="Heading2"/>
+      </w:pPr>
+      <w:r>
+        <w:rPr>
+          <w:b w:val="0"/>
+        </w:rPr>
         <w:t>TÓM TẮT NHANH (đọc trước khi thi)</w:t>
       </w:r>
     </w:p>
@@ -198,9 +733,15 @@
       </w:r>
       <w:r>
         <w:rPr>
-          <w:b w:val="0"/>
-        </w:rPr>
-        <w:t>Tắt extension AI (Claude) trong VS Code. BTC giám sát qua Wi-Fi.</w:t>
+          <w:b/>
+        </w:rPr>
+        <w:t>Tắt hẳn extension AI (Claude) trong VS Code</w:t>
+      </w:r>
+      <w:r>
+        <w:rPr>
+          <w:b w:val="0"/>
+        </w:rPr>
+        <w:t>: luật cấm dùng tài khoản chat LLM ngoài.</w:t>
       </w:r>
     </w:p>
     <w:p>

</xml_diff>

<commit_message>
File Word: 3 gio dau duoc chay tren may ca nhan
Co-Authored-By: Claude Opus 5.5 <noreply@anthropic.com>
</commit_message>
<xml_diff>
--- a/KIT_BAI1/HUONG_DAN_THI.docx
+++ b/KIT_BAI1/HUONG_DAN_THI.docx
@@ -289,7 +289,7 @@
               <w:rPr>
                 <w:b w:val="0"/>
               </w:rPr>
-              <w:t xml:space="preserve"> được thử trên Kaggle cá nhân; </w:t>
+              <w:t xml:space="preserve"> được thử trên Kaggle / máy cá nhân; </w:t>
             </w:r>
             <w:r>
               <w:rPr>
@@ -432,9 +432,15 @@
       </w:r>
       <w:r>
         <w:rPr>
-          <w:b w:val="0"/>
-        </w:rPr>
-        <w:t xml:space="preserve">Cùng lúc, nếu muốn: chạy </w:t>
+          <w:b/>
+        </w:rPr>
+        <w:t>Cùng lúc, trong 3 giờ đầu</w:t>
+      </w:r>
+      <w:r>
+        <w:rPr>
+          <w:b w:val="0"/>
+        </w:rPr>
+        <w:t xml:space="preserve"> (máy cá nhân được phép như Kaggle): bấm </w:t>
       </w:r>
       <w:r>
         <w:rPr>
@@ -449,19 +455,19 @@
         <w:rPr>
           <w:b w:val="0"/>
         </w:rPr>
-        <w:t xml:space="preserve"> trên máy mình </w:t>
+        <w:t xml:space="preserve"> trên laptop. Hai nơi chạy song song: laptop thường ra kết quả sớm để xem dòng KHÁC, LỆCH, điểm tự chấm và thử sửa code; </w:t>
       </w:r>
       <w:r>
         <w:rPr>
           <w:b/>
         </w:rPr>
-        <w:t>chỉ để thử / xem trước</w:t>
-      </w:r>
-      <w:r>
-        <w:rPr>
-          <w:b w:val="0"/>
-        </w:rPr>
-        <w:t xml:space="preserve"> (trong 3 giờ đầu). Không lấy file nộp từ máy mình, trừ khi BTC nói rõ là được.</w:t>
+        <w:t>file nộp cuối cùng lấy từ Jupyter của BTC</w:t>
+      </w:r>
+      <w:r>
+        <w:rPr>
+          <w:b w:val="0"/>
+        </w:rPr>
+        <w:t>. Sau 3 giờ đầu: chỉ train và nộp trên Jupyter.</w:t>
       </w:r>
     </w:p>
     <w:p>

</xml_diff>

<commit_message>
File Word: BTC xac nhan duoc dung lai model vong loai
Co-Authored-By: Claude Opus 5.5 <noreply@anthropic.com>
</commit_message>
<xml_diff>
--- a/KIT_BAI1/HUONG_DAN_THI.docx
+++ b/KIT_BAI1/HUONG_DAN_THI.docx
@@ -241,6 +241,67 @@
                 <w:b w:val="0"/>
               </w:rPr>
               <w:t xml:space="preserve"> (ngay dưới)</w:t>
+            </w:r>
+          </w:p>
+        </w:tc>
+      </w:tr>
+      <w:tr>
+        <w:tc>
+          <w:tcPr>
+            <w:tcW w:type="dxa" w:w="4320"/>
+          </w:tcPr>
+          <w:p>
+            <w:r>
+              <w:rPr>
+                <w:b/>
+              </w:rPr>
+              <w:t>được dùng lại model / lời giải đã làm ở vòng loại</w:t>
+            </w:r>
+            <w:r>
+              <w:rPr>
+                <w:b w:val="0"/>
+              </w:rPr>
+              <w:t xml:space="preserve"> (BTC trả lời 22:19: "Có thể")</w:t>
+            </w:r>
+          </w:p>
+        </w:tc>
+        <w:tc>
+          <w:tcPr>
+            <w:tcW w:type="dxa" w:w="4320"/>
+          </w:tcPr>
+          <w:p>
+            <w:r>
+              <w:rPr>
+                <w:b w:val="0"/>
+              </w:rPr>
+              <w:t xml:space="preserve">dùng bộ đồ nghề </w:t>
+            </w:r>
+            <w:r>
+              <w:rPr>
+                <w:rFonts w:ascii="Consolas" w:hAnsi="Consolas"/>
+                <w:b w:val="0"/>
+                <w:color w:val="A31F34"/>
+                <w:sz w:val="20"/>
+              </w:rPr>
+              <w:t>KIT_BAI1</w:t>
+            </w:r>
+            <w:r>
+              <w:rPr>
+                <w:b w:val="0"/>
+              </w:rPr>
+              <w:t xml:space="preserve"> là </w:t>
+            </w:r>
+            <w:r>
+              <w:rPr>
+                <w:b/>
+              </w:rPr>
+              <w:t>đúng luật</w:t>
+            </w:r>
+            <w:r>
+              <w:rPr>
+                <w:b w:val="0"/>
+              </w:rPr>
+              <w:t>; lúc bảo vệ nói thẳng là đội dùng lời giải vòng loại làm nền</w:t>
             </w:r>
           </w:p>
         </w:tc>

</xml_diff>

<commit_message>
Them MAI_LAM_THEO_THU_TU.docx: 38 buoc tuan tu cho ngay thi
Co-Authored-By: Claude Opus 5.5 <noreply@anthropic.com>
</commit_message>
<xml_diff>
--- a/KIT_BAI1/HUONG_DAN_THI.docx
+++ b/KIT_BAI1/HUONG_DAN_THI.docx
@@ -2,6 +2,2730 @@
 <file path=word/document.xml><?xml version="1.0" encoding="utf-8"?>
 <w:document xmlns:wpc="http://schemas.microsoft.com/office/word/2010/wordprocessingCanvas" xmlns:mo="http://schemas.microsoft.com/office/mac/office/2008/main" xmlns:mc="http://schemas.openxmlformats.org/markup-compatibility/2006" xmlns:mv="urn:schemas-microsoft-com:mac:vml" xmlns:o="urn:schemas-microsoft-com:office:office" xmlns:r="http://schemas.openxmlformats.org/officeDocument/2006/relationships" xmlns:m="http://schemas.openxmlformats.org/officeDocument/2006/math" xmlns:v="urn:schemas-microsoft-com:vml" xmlns:wp14="http://schemas.microsoft.com/office/word/2010/wordprocessingDrawing" xmlns:wp="http://schemas.openxmlformats.org/drawingml/2006/wordprocessingDrawing" xmlns:w10="urn:schemas-microsoft-com:office:word" xmlns:w="http://schemas.openxmlformats.org/wordprocessingml/2006/main" xmlns:w14="http://schemas.microsoft.com/office/word/2010/wordml" xmlns:wpg="http://schemas.microsoft.com/office/word/2010/wordprocessingGroup" xmlns:wpi="http://schemas.microsoft.com/office/word/2010/wordprocessingInk" xmlns:wne="http://schemas.microsoft.com/office/word/2006/wordml" xmlns:wps="http://schemas.microsoft.com/office/word/2010/wordprocessingShape" mc:Ignorable="w14 wp14">
   <w:body>
+    <w:p>
+      <w:pPr>
+        <w:pStyle w:val="Heading1"/>
+      </w:pPr>
+      <w:r>
+        <w:rPr>
+          <w:b w:val="0"/>
+        </w:rPr>
+        <w:t>MAI LÀM ĐÚNG THEO THỨ TỰ NÀY</w:t>
+      </w:r>
+    </w:p>
+    <w:p>
+      <w:r>
+        <w:rPr>
+          <w:b w:val="0"/>
+        </w:rPr>
+        <w:t xml:space="preserve">Làm từ bước 1 xuống dưới. Xong bước nào đánh dấu bước đó. Gặp chữ đỏ / lỗi: xem mục </w:t>
+      </w:r>
+      <w:r>
+        <w:rPr>
+          <w:b/>
+        </w:rPr>
+        <w:t>NẾU CÓ LỖI</w:t>
+      </w:r>
+      <w:r>
+        <w:rPr>
+          <w:b w:val="0"/>
+        </w:rPr>
+        <w:t xml:space="preserve"> ở cuối.</w:t>
+      </w:r>
+    </w:p>
+    <w:p>
+      <w:r>
+        <w:rPr>
+          <w:b w:val="0"/>
+        </w:rPr>
+        <w:t>Hai nơi chạy:</w:t>
+      </w:r>
+    </w:p>
+    <w:p>
+      <w:pPr>
+        <w:pStyle w:val="ListBullet"/>
+      </w:pPr>
+      <w:r>
+        <w:rPr>
+          <w:b/>
+        </w:rPr>
+        <w:t>LAPTOP</w:t>
+      </w:r>
+      <w:r>
+        <w:rPr>
+          <w:b w:val="0"/>
+        </w:rPr>
+        <w:t xml:space="preserve"> = máy của em, chạy bằng cửa sổ đen (đã thử nhiều lần, chắc chắn chạy được). Chỉ dùng trong </w:t>
+      </w:r>
+      <w:r>
+        <w:rPr>
+          <w:b/>
+        </w:rPr>
+        <w:t>3 giờ đầu</w:t>
+      </w:r>
+      <w:r>
+        <w:rPr>
+          <w:b w:val="0"/>
+        </w:rPr>
+        <w:t>.</w:t>
+      </w:r>
+    </w:p>
+    <w:p>
+      <w:pPr>
+        <w:pStyle w:val="ListBullet"/>
+      </w:pPr>
+      <w:r>
+        <w:rPr>
+          <w:b/>
+        </w:rPr>
+        <w:t>JUPYTER</w:t>
+      </w:r>
+      <w:r>
+        <w:rPr>
+          <w:b w:val="0"/>
+        </w:rPr>
+        <w:t xml:space="preserve"> = máy chủ của BTC, mở bằng trình duyệt. </w:t>
+      </w:r>
+      <w:r>
+        <w:rPr>
+          <w:b/>
+        </w:rPr>
+        <w:t>File nộp chính thức lấy từ đây.</w:t>
+      </w:r>
+    </w:p>
+    <w:p>
+      <w:pPr>
+        <w:pStyle w:val="Heading2"/>
+      </w:pPr>
+      <w:r>
+        <w:rPr>
+          <w:b w:val="0"/>
+        </w:rPr>
+        <w:t>TRƯỚC GIỜ THI (ở nhà / lúc vào phòng)</w:t>
+      </w:r>
+    </w:p>
+    <w:p>
+      <w:pPr>
+        <w:ind w:left="360"/>
+      </w:pPr>
+      <w:r>
+        <w:rPr>
+          <w:b/>
+        </w:rPr>
+        <w:t xml:space="preserve">1. </w:t>
+      </w:r>
+      <w:r>
+        <w:rPr>
+          <w:b w:val="0"/>
+        </w:rPr>
+        <w:t xml:space="preserve">Mở VS Code → bấm biểu tượng </w:t>
+      </w:r>
+      <w:r>
+        <w:rPr>
+          <w:b/>
+        </w:rPr>
+        <w:t>Extensions</w:t>
+      </w:r>
+      <w:r>
+        <w:rPr>
+          <w:b w:val="0"/>
+        </w:rPr>
+        <w:t xml:space="preserve"> (4 ô vuông, cột bên trái) → tìm </w:t>
+      </w:r>
+      <w:r>
+        <w:rPr>
+          <w:b/>
+        </w:rPr>
+        <w:t>Claude</w:t>
+      </w:r>
+      <w:r>
+        <w:rPr>
+          <w:b w:val="0"/>
+        </w:rPr>
+        <w:t xml:space="preserve"> → bấm </w:t>
+      </w:r>
+      <w:r>
+        <w:rPr>
+          <w:b/>
+        </w:rPr>
+        <w:t>Disable</w:t>
+      </w:r>
+      <w:r>
+        <w:rPr>
+          <w:b w:val="0"/>
+        </w:rPr>
+        <w:t>. (Luật cấm dùng AI ngoài.)</w:t>
+      </w:r>
+    </w:p>
+    <w:p>
+      <w:pPr>
+        <w:ind w:left="360"/>
+      </w:pPr>
+      <w:r>
+        <w:rPr>
+          <w:b/>
+        </w:rPr>
+        <w:t xml:space="preserve">2. </w:t>
+      </w:r>
+      <w:r>
+        <w:rPr>
+          <w:b w:val="0"/>
+        </w:rPr>
+        <w:t>Cắm sạc. Cắm chuột.</w:t>
+      </w:r>
+    </w:p>
+    <w:p>
+      <w:pPr>
+        <w:ind w:left="360"/>
+      </w:pPr>
+      <w:r>
+        <w:rPr>
+          <w:b/>
+        </w:rPr>
+        <w:t xml:space="preserve">3. </w:t>
+      </w:r>
+      <w:r>
+        <w:rPr>
+          <w:b w:val="0"/>
+        </w:rPr>
+        <w:t>Kết nối Wi-Fi của trường.</w:t>
+      </w:r>
+    </w:p>
+    <w:p>
+      <w:pPr>
+        <w:ind w:left="360"/>
+      </w:pPr>
+      <w:r>
+        <w:rPr>
+          <w:b/>
+        </w:rPr>
+        <w:t xml:space="preserve">4. </w:t>
+      </w:r>
+      <w:r>
+        <w:rPr>
+          <w:b w:val="0"/>
+        </w:rPr>
+        <w:t>Hỏi BTC 1 câu: "Trong 3 giờ đầu có được nộp kết quả chạy trên máy cá nhân không ạ?" Ghi câu trả lời ra giấy.</w:t>
+      </w:r>
+    </w:p>
+    <w:p>
+      <w:pPr>
+        <w:pStyle w:val="Heading2"/>
+      </w:pPr>
+      <w:r>
+        <w:rPr>
+          <w:b w:val="0"/>
+        </w:rPr>
+        <w:t>PHẦN 1. BÀI 1 TRÊN LAPTOP (làm ngay khi BTC phát đề)</w:t>
+      </w:r>
+    </w:p>
+    <w:p>
+      <w:pPr>
+        <w:ind w:left="360"/>
+      </w:pPr>
+      <w:r>
+        <w:rPr>
+          <w:b/>
+        </w:rPr>
+        <w:t xml:space="preserve">5. </w:t>
+      </w:r>
+      <w:r>
+        <w:rPr>
+          <w:b w:val="0"/>
+        </w:rPr>
+        <w:t xml:space="preserve">Tải dữ liệu bài 1 về. Nếu là file </w:t>
+      </w:r>
+      <w:r>
+        <w:rPr>
+          <w:rFonts w:ascii="Consolas" w:hAnsi="Consolas"/>
+          <w:b w:val="0"/>
+          <w:color w:val="A31F34"/>
+          <w:sz w:val="20"/>
+        </w:rPr>
+        <w:t>.zip</w:t>
+      </w:r>
+      <w:r>
+        <w:rPr>
+          <w:b w:val="0"/>
+        </w:rPr>
+        <w:t xml:space="preserve">: </w:t>
+      </w:r>
+      <w:r>
+        <w:rPr>
+          <w:b/>
+        </w:rPr>
+        <w:t>chuột phải</w:t>
+      </w:r>
+      <w:r>
+        <w:rPr>
+          <w:b w:val="0"/>
+        </w:rPr>
+        <w:t xml:space="preserve"> vào file → </w:t>
+      </w:r>
+      <w:r>
+        <w:rPr>
+          <w:b/>
+        </w:rPr>
+        <w:t>Extract All</w:t>
+      </w:r>
+      <w:r>
+        <w:rPr>
+          <w:b w:val="0"/>
+        </w:rPr>
+        <w:t xml:space="preserve"> → </w:t>
+      </w:r>
+      <w:r>
+        <w:rPr>
+          <w:b/>
+        </w:rPr>
+        <w:t>Extract</w:t>
+      </w:r>
+      <w:r>
+        <w:rPr>
+          <w:b w:val="0"/>
+        </w:rPr>
+        <w:t>.</w:t>
+      </w:r>
+    </w:p>
+    <w:p>
+      <w:pPr>
+        <w:ind w:left="360"/>
+      </w:pPr>
+      <w:r>
+        <w:rPr>
+          <w:b/>
+        </w:rPr>
+        <w:t xml:space="preserve">6. </w:t>
+      </w:r>
+      <w:r>
+        <w:rPr>
+          <w:b w:val="0"/>
+        </w:rPr>
+        <w:t xml:space="preserve">Bấm phím </w:t>
+      </w:r>
+      <w:r>
+        <w:rPr>
+          <w:b/>
+        </w:rPr>
+        <w:t>Windows + E</w:t>
+      </w:r>
+      <w:r>
+        <w:rPr>
+          <w:b w:val="0"/>
+        </w:rPr>
+        <w:t xml:space="preserve"> (mở File Explorer).</w:t>
+      </w:r>
+    </w:p>
+    <w:p>
+      <w:pPr>
+        <w:ind w:left="360"/>
+      </w:pPr>
+      <w:r>
+        <w:rPr>
+          <w:b/>
+        </w:rPr>
+        <w:t xml:space="preserve">7. </w:t>
+      </w:r>
+      <w:r>
+        <w:rPr>
+          <w:b w:val="0"/>
+        </w:rPr>
+        <w:t xml:space="preserve">Ở cột trái bấm </w:t>
+      </w:r>
+      <w:r>
+        <w:rPr>
+          <w:b/>
+        </w:rPr>
+        <w:t>Downloads</w:t>
+      </w:r>
+      <w:r>
+        <w:rPr>
+          <w:b w:val="0"/>
+        </w:rPr>
+        <w:t xml:space="preserve"> → bấm đúp </w:t>
+      </w:r>
+      <w:r>
+        <w:rPr>
+          <w:b/>
+        </w:rPr>
+        <w:t>Phenikaa_Campus_Courier_2026</w:t>
+      </w:r>
+      <w:r>
+        <w:rPr>
+          <w:b w:val="0"/>
+        </w:rPr>
+        <w:t xml:space="preserve"> → bấm đúp </w:t>
+      </w:r>
+      <w:r>
+        <w:rPr>
+          <w:b/>
+        </w:rPr>
+        <w:t>KIT_BAI1</w:t>
+      </w:r>
+      <w:r>
+        <w:rPr>
+          <w:b w:val="0"/>
+        </w:rPr>
+        <w:t>.</w:t>
+      </w:r>
+    </w:p>
+    <w:p>
+      <w:pPr>
+        <w:ind w:left="360"/>
+      </w:pPr>
+      <w:r>
+        <w:rPr>
+          <w:b/>
+        </w:rPr>
+        <w:t xml:space="preserve">8. </w:t>
+      </w:r>
+      <w:r>
+        <w:rPr>
+          <w:b/>
+        </w:rPr>
+        <w:t>Bấm đúp</w:t>
+      </w:r>
+      <w:r>
+        <w:rPr>
+          <w:b w:val="0"/>
+        </w:rPr>
+        <w:t xml:space="preserve"> file </w:t>
+      </w:r>
+      <w:r>
+        <w:rPr>
+          <w:rFonts w:ascii="Consolas" w:hAnsi="Consolas"/>
+          <w:b/>
+          <w:color w:val="A31F34"/>
+          <w:sz w:val="20"/>
+        </w:rPr>
+        <w:t>CHAY_BAI1.bat</w:t>
+      </w:r>
+      <w:r>
+        <w:rPr>
+          <w:b w:val="0"/>
+        </w:rPr>
+        <w:t xml:space="preserve"> (biểu tượng bánh răng). Một </w:t>
+      </w:r>
+      <w:r>
+        <w:rPr>
+          <w:b/>
+        </w:rPr>
+        <w:t>cửa sổ đen</w:t>
+      </w:r>
+      <w:r>
+        <w:rPr>
+          <w:b w:val="0"/>
+        </w:rPr>
+        <w:t xml:space="preserve"> hiện ra.</w:t>
+      </w:r>
+    </w:p>
+    <w:p>
+      <w:pPr>
+        <w:ind w:left="360"/>
+      </w:pPr>
+      <w:r>
+        <w:rPr>
+          <w:b/>
+        </w:rPr>
+        <w:t xml:space="preserve">9. </w:t>
+      </w:r>
+      <w:r>
+        <w:rPr>
+          <w:b w:val="0"/>
+        </w:rPr>
+        <w:t xml:space="preserve">Mở thêm một cửa sổ File Explorer (Windows + E), tìm tới </w:t>
+      </w:r>
+      <w:r>
+        <w:rPr>
+          <w:b/>
+        </w:rPr>
+        <w:t>thư mục dữ liệu vừa giải nén</w:t>
+      </w:r>
+      <w:r>
+        <w:rPr>
+          <w:b w:val="0"/>
+        </w:rPr>
+        <w:t xml:space="preserve"> (thư mục có bên trong 3 thư mục </w:t>
+      </w:r>
+      <w:r>
+        <w:rPr>
+          <w:rFonts w:ascii="Consolas" w:hAnsi="Consolas"/>
+          <w:b w:val="0"/>
+          <w:color w:val="A31F34"/>
+          <w:sz w:val="20"/>
+        </w:rPr>
+        <w:t>train</w:t>
+      </w:r>
+      <w:r>
+        <w:rPr>
+          <w:b w:val="0"/>
+        </w:rPr>
+        <w:t xml:space="preserve">, </w:t>
+      </w:r>
+      <w:r>
+        <w:rPr>
+          <w:rFonts w:ascii="Consolas" w:hAnsi="Consolas"/>
+          <w:b w:val="0"/>
+          <w:color w:val="A31F34"/>
+          <w:sz w:val="20"/>
+        </w:rPr>
+        <w:t>validation</w:t>
+      </w:r>
+      <w:r>
+        <w:rPr>
+          <w:b w:val="0"/>
+        </w:rPr>
+        <w:t xml:space="preserve">, </w:t>
+      </w:r>
+      <w:r>
+        <w:rPr>
+          <w:rFonts w:ascii="Consolas" w:hAnsi="Consolas"/>
+          <w:b w:val="0"/>
+          <w:color w:val="A31F34"/>
+          <w:sz w:val="20"/>
+        </w:rPr>
+        <w:t>test</w:t>
+      </w:r>
+      <w:r>
+        <w:rPr>
+          <w:b w:val="0"/>
+        </w:rPr>
+        <w:t>).</w:t>
+      </w:r>
+    </w:p>
+    <w:p>
+      <w:pPr>
+        <w:ind w:left="360"/>
+      </w:pPr>
+      <w:r>
+        <w:rPr>
+          <w:b/>
+        </w:rPr>
+        <w:t xml:space="preserve">10. </w:t>
+      </w:r>
+      <w:r>
+        <w:rPr>
+          <w:b/>
+        </w:rPr>
+        <w:t>Dùng chuột kéo thư mục dữ liệu đó, thả vào cửa sổ đen.</w:t>
+      </w:r>
+      <w:r>
+        <w:rPr>
+          <w:b w:val="0"/>
+        </w:rPr>
+        <w:t xml:space="preserve"> Đường dẫn tự hiện ra.</w:t>
+      </w:r>
+    </w:p>
+    <w:p>
+      <w:pPr>
+        <w:ind w:left="360"/>
+      </w:pPr>
+      <w:r>
+        <w:rPr>
+          <w:b/>
+        </w:rPr>
+        <w:t xml:space="preserve">11. </w:t>
+      </w:r>
+      <w:r>
+        <w:rPr>
+          <w:b w:val="0"/>
+        </w:rPr>
+        <w:t xml:space="preserve">Bấm </w:t>
+      </w:r>
+      <w:r>
+        <w:rPr>
+          <w:b/>
+        </w:rPr>
+        <w:t>Enter</w:t>
+      </w:r>
+      <w:r>
+        <w:rPr>
+          <w:b w:val="0"/>
+        </w:rPr>
+        <w:t xml:space="preserve">. Máy bắt đầu chạy. </w:t>
+      </w:r>
+      <w:r>
+        <w:rPr>
+          <w:b/>
+        </w:rPr>
+        <w:t>Không tắt cửa sổ đen.</w:t>
+      </w:r>
+    </w:p>
+    <w:p>
+      <w:pPr>
+        <w:ind w:left="360"/>
+      </w:pPr>
+      <w:r>
+        <w:rPr>
+          <w:b/>
+        </w:rPr>
+        <w:t xml:space="preserve">12. </w:t>
+      </w:r>
+      <w:r>
+        <w:rPr>
+          <w:b w:val="0"/>
+        </w:rPr>
+        <w:t xml:space="preserve">Khoảng 10 giây sau hiện các dòng có chữ </w:t>
+      </w:r>
+      <w:r>
+        <w:rPr>
+          <w:rFonts w:ascii="Consolas" w:hAnsi="Consolas"/>
+          <w:b/>
+          <w:color w:val="A31F34"/>
+          <w:sz w:val="20"/>
+        </w:rPr>
+        <w:t>KHÁC</w:t>
+      </w:r>
+      <w:r>
+        <w:rPr>
+          <w:b w:val="0"/>
+        </w:rPr>
+        <w:t xml:space="preserve"> và </w:t>
+      </w:r>
+      <w:r>
+        <w:rPr>
+          <w:rFonts w:ascii="Consolas" w:hAnsi="Consolas"/>
+          <w:b/>
+          <w:color w:val="A31F34"/>
+          <w:sz w:val="20"/>
+        </w:rPr>
+        <w:t>LỆCH</w:t>
+      </w:r>
+      <w:r>
+        <w:rPr>
+          <w:b w:val="0"/>
+        </w:rPr>
+        <w:t xml:space="preserve"> → </w:t>
+      </w:r>
+      <w:r>
+        <w:rPr>
+          <w:b/>
+        </w:rPr>
+        <w:t>chép ra giấy</w:t>
+      </w:r>
+      <w:r>
+        <w:rPr>
+          <w:b w:val="0"/>
+        </w:rPr>
+        <w:t xml:space="preserve"> (dùng cho bảo vệ).</w:t>
+      </w:r>
+    </w:p>
+    <w:p>
+      <w:r>
+        <w:rPr>
+          <w:b w:val="0"/>
+        </w:rPr>
+        <w:t>Để laptop tự chạy, chuyển sang Phần 2.</w:t>
+      </w:r>
+    </w:p>
+    <w:p>
+      <w:pPr>
+        <w:pStyle w:val="Heading2"/>
+      </w:pPr>
+      <w:r>
+        <w:rPr>
+          <w:b w:val="0"/>
+        </w:rPr>
+        <w:t>PHẦN 2. BÀI 1 TRÊN JUPYTER (làm song song)</w:t>
+      </w:r>
+    </w:p>
+    <w:p>
+      <w:r>
+        <w:rPr>
+          <w:b/>
+        </w:rPr>
+        <w:t>Mở Jupyter và Terminal</w:t>
+      </w:r>
+    </w:p>
+    <w:p>
+      <w:pPr>
+        <w:ind w:left="360"/>
+      </w:pPr>
+      <w:r>
+        <w:rPr>
+          <w:b/>
+        </w:rPr>
+        <w:t xml:space="preserve">13. </w:t>
+      </w:r>
+      <w:r>
+        <w:rPr>
+          <w:b w:val="0"/>
+        </w:rPr>
+        <w:t xml:space="preserve">Mở trình duyệt (Chrome / Edge) → vào </w:t>
+      </w:r>
+      <w:r>
+        <w:rPr>
+          <w:b/>
+        </w:rPr>
+        <w:t>địa chỉ BTC cho</w:t>
+      </w:r>
+      <w:r>
+        <w:rPr>
+          <w:b w:val="0"/>
+        </w:rPr>
+        <w:t xml:space="preserve"> → nhập </w:t>
+      </w:r>
+      <w:r>
+        <w:rPr>
+          <w:b/>
+        </w:rPr>
+        <w:t>tên đăng nhập + mật khẩu</w:t>
+      </w:r>
+      <w:r>
+        <w:rPr>
+          <w:b w:val="0"/>
+        </w:rPr>
+        <w:t xml:space="preserve"> của đội.</w:t>
+      </w:r>
+    </w:p>
+    <w:p>
+      <w:pPr>
+        <w:ind w:left="360"/>
+      </w:pPr>
+      <w:r>
+        <w:rPr>
+          <w:b/>
+        </w:rPr>
+        <w:t xml:space="preserve">14. </w:t>
+      </w:r>
+      <w:r>
+        <w:rPr>
+          <w:b w:val="0"/>
+        </w:rPr>
+        <w:t>Nếu hiện trang chọn máy (</w:t>
+      </w:r>
+      <w:r>
+        <w:rPr>
+          <w:b/>
+        </w:rPr>
+        <w:t>Server Options</w:t>
+      </w:r>
+      <w:r>
+        <w:rPr>
+          <w:b w:val="0"/>
+        </w:rPr>
+        <w:t xml:space="preserve">): chọn loại có </w:t>
+      </w:r>
+      <w:r>
+        <w:rPr>
+          <w:b/>
+        </w:rPr>
+        <w:t>GPU</w:t>
+      </w:r>
+      <w:r>
+        <w:rPr>
+          <w:b w:val="0"/>
+        </w:rPr>
+        <w:t xml:space="preserve"> → bấm </w:t>
+      </w:r>
+      <w:r>
+        <w:rPr>
+          <w:b/>
+        </w:rPr>
+        <w:t>Start</w:t>
+      </w:r>
+      <w:r>
+        <w:rPr>
+          <w:b w:val="0"/>
+        </w:rPr>
+        <w:t>.</w:t>
+      </w:r>
+    </w:p>
+    <w:p>
+      <w:pPr>
+        <w:ind w:left="360"/>
+      </w:pPr>
+      <w:r>
+        <w:rPr>
+          <w:b/>
+        </w:rPr>
+        <w:t xml:space="preserve">15. </w:t>
+      </w:r>
+      <w:r>
+        <w:rPr>
+          <w:b w:val="0"/>
+        </w:rPr>
+        <w:t xml:space="preserve">Màn hình Jupyter hiện ra: bên trái là </w:t>
+      </w:r>
+      <w:r>
+        <w:rPr>
+          <w:b/>
+        </w:rPr>
+        <w:t>danh sách file</w:t>
+      </w:r>
+      <w:r>
+        <w:rPr>
+          <w:b w:val="0"/>
+        </w:rPr>
+        <w:t xml:space="preserve">, bên phải là trang </w:t>
+      </w:r>
+      <w:r>
+        <w:rPr>
+          <w:b/>
+        </w:rPr>
+        <w:t>Launcher</w:t>
+      </w:r>
+      <w:r>
+        <w:rPr>
+          <w:b w:val="0"/>
+        </w:rPr>
+        <w:t xml:space="preserve"> (nhiều ô vuông).</w:t>
+      </w:r>
+    </w:p>
+    <w:p>
+      <w:pPr>
+        <w:ind w:left="360"/>
+      </w:pPr>
+      <w:r>
+        <w:rPr>
+          <w:b/>
+        </w:rPr>
+        <w:t xml:space="preserve">16. </w:t>
+      </w:r>
+      <w:r>
+        <w:rPr>
+          <w:b w:val="0"/>
+        </w:rPr>
+        <w:t xml:space="preserve">Trong Launcher, bấm ô </w:t>
+      </w:r>
+      <w:r>
+        <w:rPr>
+          <w:b/>
+        </w:rPr>
+        <w:t>Terminal</w:t>
+      </w:r>
+      <w:r>
+        <w:rPr>
+          <w:b w:val="0"/>
+        </w:rPr>
+        <w:t xml:space="preserve">. Một </w:t>
+      </w:r>
+      <w:r>
+        <w:rPr>
+          <w:b/>
+        </w:rPr>
+        <w:t>cửa sổ đen trong trình duyệt</w:t>
+      </w:r>
+      <w:r>
+        <w:rPr>
+          <w:b w:val="0"/>
+        </w:rPr>
+        <w:t xml:space="preserve"> hiện ra.</w:t>
+      </w:r>
+    </w:p>
+    <w:p>
+      <w:r>
+        <w:rPr>
+          <w:b/>
+        </w:rPr>
+        <w:t>Cách dán lệnh vào Terminal (dùng cho mọi bước dưới):</w:t>
+      </w:r>
+      <w:r>
+        <w:rPr>
+          <w:b w:val="0"/>
+        </w:rPr>
+        <w:t xml:space="preserve"> bôi đen dòng lệnh trong file này → </w:t>
+      </w:r>
+      <w:r>
+        <w:rPr>
+          <w:b/>
+        </w:rPr>
+        <w:t>Ctrl + C</w:t>
+      </w:r>
+      <w:r>
+        <w:rPr>
+          <w:b w:val="0"/>
+        </w:rPr>
+        <w:t xml:space="preserve"> → bấm chuột vào Terminal → </w:t>
+      </w:r>
+      <w:r>
+        <w:rPr>
+          <w:b/>
+        </w:rPr>
+        <w:t>Ctrl + Shift + V</w:t>
+      </w:r>
+      <w:r>
+        <w:rPr>
+          <w:b w:val="0"/>
+        </w:rPr>
+        <w:t xml:space="preserve"> (hoặc chuột phải → </w:t>
+      </w:r>
+      <w:r>
+        <w:rPr>
+          <w:b/>
+        </w:rPr>
+        <w:t>Paste</w:t>
+      </w:r>
+      <w:r>
+        <w:rPr>
+          <w:b w:val="0"/>
+        </w:rPr>
+        <w:t xml:space="preserve">) → bấm </w:t>
+      </w:r>
+      <w:r>
+        <w:rPr>
+          <w:b/>
+        </w:rPr>
+        <w:t>Enter</w:t>
+      </w:r>
+      <w:r>
+        <w:rPr>
+          <w:b w:val="0"/>
+        </w:rPr>
+        <w:t>.</w:t>
+      </w:r>
+    </w:p>
+    <w:p>
+      <w:r>
+        <w:rPr>
+          <w:b/>
+        </w:rPr>
+        <w:t>Lấy bộ code về Jupyter</w:t>
+      </w:r>
+    </w:p>
+    <w:p>
+      <w:pPr>
+        <w:ind w:left="360"/>
+      </w:pPr>
+      <w:r>
+        <w:rPr>
+          <w:b/>
+        </w:rPr>
+        <w:t xml:space="preserve">17. </w:t>
+      </w:r>
+      <w:r>
+        <w:rPr>
+          <w:b w:val="0"/>
+        </w:rPr>
+        <w:t>Dán lệnh này → Enter:</w:t>
+      </w:r>
+    </w:p>
+    <w:tbl>
+      <w:tblPr>
+        <w:tblStyle w:val="TableGrid"/>
+        <w:tblW w:type="auto" w:w="0"/>
+        <w:tblLook w:firstColumn="1" w:firstRow="1" w:lastColumn="0" w:lastRow="0" w:noHBand="0" w:noVBand="1" w:val="04A0"/>
+      </w:tblPr>
+      <w:tblGrid>
+        <w:gridCol w:w="8640"/>
+      </w:tblGrid>
+      <w:tr>
+        <w:tc>
+          <w:tcPr>
+            <w:tcW w:type="dxa" w:w="8640"/>
+            <w:shd w:val="clear" w:color="auto" w:fill="F2F2F2"/>
+          </w:tcPr>
+          <w:p>
+            <w:r>
+              <w:rPr>
+                <w:rFonts w:ascii="Consolas" w:hAnsi="Consolas"/>
+                <w:sz w:val="19"/>
+              </w:rPr>
+              <w:t>cd ~ &amp;&amp; git clone https://github.com/nguyenthithanhhue-13/B1</w:t>
+            </w:r>
+          </w:p>
+        </w:tc>
+      </w:tr>
+    </w:tbl>
+    <w:p/>
+    <w:p>
+      <w:r>
+        <w:rPr>
+          <w:b w:val="0"/>
+        </w:rPr>
+        <w:t xml:space="preserve">Đợi 1–2 phút. Bên trái hiện thêm thư mục </w:t>
+      </w:r>
+      <w:r>
+        <w:rPr>
+          <w:b/>
+        </w:rPr>
+        <w:t>B1</w:t>
+      </w:r>
+      <w:r>
+        <w:rPr>
+          <w:b w:val="0"/>
+        </w:rPr>
+        <w:t xml:space="preserve"> là được.</w:t>
+      </w:r>
+    </w:p>
+    <w:p>
+      <w:r>
+        <w:rPr>
+          <w:b/>
+        </w:rPr>
+        <w:t>Cài đặt (một lần)</w:t>
+      </w:r>
+    </w:p>
+    <w:p>
+      <w:pPr>
+        <w:ind w:left="360"/>
+      </w:pPr>
+      <w:r>
+        <w:rPr>
+          <w:b/>
+        </w:rPr>
+        <w:t xml:space="preserve">18. </w:t>
+      </w:r>
+      <w:r>
+        <w:rPr>
+          <w:b w:val="0"/>
+        </w:rPr>
+        <w:t>Dán lệnh này → Enter:</w:t>
+      </w:r>
+    </w:p>
+    <w:tbl>
+      <w:tblPr>
+        <w:tblStyle w:val="TableGrid"/>
+        <w:tblW w:type="auto" w:w="0"/>
+        <w:tblLook w:firstColumn="1" w:firstRow="1" w:lastColumn="0" w:lastRow="0" w:noHBand="0" w:noVBand="1" w:val="04A0"/>
+      </w:tblPr>
+      <w:tblGrid>
+        <w:gridCol w:w="8640"/>
+      </w:tblGrid>
+      <w:tr>
+        <w:tc>
+          <w:tcPr>
+            <w:tcW w:type="dxa" w:w="8640"/>
+            <w:shd w:val="clear" w:color="auto" w:fill="F2F2F2"/>
+          </w:tcPr>
+          <w:p>
+            <w:r>
+              <w:rPr>
+                <w:rFonts w:ascii="Consolas" w:hAnsi="Consolas"/>
+                <w:sz w:val="19"/>
+              </w:rPr>
+              <w:t>bash ~/B1/JUPYTER/cai_dat.sh</w:t>
+            </w:r>
+          </w:p>
+        </w:tc>
+      </w:tr>
+    </w:tbl>
+    <w:p/>
+    <w:p>
+      <w:r>
+        <w:rPr>
+          <w:b w:val="0"/>
+        </w:rPr>
+        <w:t xml:space="preserve">Đợi 5–15 phút. Thấy dòng </w:t>
+      </w:r>
+      <w:r>
+        <w:rPr>
+          <w:rFonts w:ascii="Consolas" w:hAnsi="Consolas"/>
+          <w:b/>
+          <w:color w:val="A31F34"/>
+          <w:sz w:val="20"/>
+        </w:rPr>
+        <w:t>XONG CÀI ĐẶT</w:t>
+      </w:r>
+      <w:r>
+        <w:rPr>
+          <w:b w:val="0"/>
+        </w:rPr>
+        <w:t xml:space="preserve"> là xong. Nếu có dòng </w:t>
+      </w:r>
+      <w:r>
+        <w:rPr>
+          <w:rFonts w:ascii="Consolas" w:hAnsi="Consolas"/>
+          <w:b/>
+          <w:color w:val="A31F34"/>
+          <w:sz w:val="20"/>
+        </w:rPr>
+        <w:t>[LỖI]</w:t>
+      </w:r>
+      <w:r>
+        <w:rPr>
+          <w:b w:val="0"/>
+        </w:rPr>
+        <w:t xml:space="preserve"> → xem mục NẾU CÓ LỖI.</w:t>
+      </w:r>
+    </w:p>
+    <w:p>
+      <w:r>
+        <w:rPr>
+          <w:b/>
+        </w:rPr>
+        <w:t>Đưa dữ liệu lên Jupyter</w:t>
+      </w:r>
+    </w:p>
+    <w:p>
+      <w:pPr>
+        <w:ind w:left="360"/>
+      </w:pPr>
+      <w:r>
+        <w:rPr>
+          <w:b/>
+        </w:rPr>
+        <w:t xml:space="preserve">19. </w:t>
+      </w:r>
+      <w:r>
+        <w:rPr>
+          <w:b w:val="0"/>
+        </w:rPr>
+        <w:t>Nếu BTC đã để sẵn dữ liệu trên Jupyter: bỏ qua bước này.</w:t>
+      </w:r>
+    </w:p>
+    <w:p>
+      <w:pPr>
+        <w:ind w:left="720"/>
+      </w:pPr>
+      <w:r>
+        <w:rPr>
+          <w:b w:val="0"/>
+        </w:rPr>
+        <w:t xml:space="preserve">Nếu dữ liệu chỉ có trên laptop: ở danh sách file bên trái, bấm biểu tượng </w:t>
+      </w:r>
+      <w:r>
+        <w:rPr>
+          <w:b/>
+        </w:rPr>
+        <w:t>mũi tên hướng lên (Upload)</w:t>
+      </w:r>
+      <w:r>
+        <w:rPr>
+          <w:b w:val="0"/>
+        </w:rPr>
+        <w:t xml:space="preserve"> → chọn file </w:t>
+      </w:r>
+      <w:r>
+        <w:rPr>
+          <w:rFonts w:ascii="Consolas" w:hAnsi="Consolas"/>
+          <w:b/>
+          <w:color w:val="A31F34"/>
+          <w:sz w:val="20"/>
+        </w:rPr>
+        <w:t>.zip</w:t>
+      </w:r>
+      <w:r>
+        <w:rPr>
+          <w:b w:val="0"/>
+        </w:rPr>
+        <w:t xml:space="preserve"> dữ liệu → đợi tải xong → dán lệnh (thay </w:t>
+      </w:r>
+      <w:r>
+        <w:rPr>
+          <w:rFonts w:ascii="Consolas" w:hAnsi="Consolas"/>
+          <w:b w:val="0"/>
+          <w:color w:val="A31F34"/>
+          <w:sz w:val="20"/>
+        </w:rPr>
+        <w:t>ten_file.zip</w:t>
+      </w:r>
+      <w:r>
+        <w:rPr>
+          <w:b w:val="0"/>
+        </w:rPr>
+        <w:t xml:space="preserve"> bằng tên thật):</w:t>
+      </w:r>
+    </w:p>
+    <w:tbl>
+      <w:tblPr>
+        <w:tblStyle w:val="TableGrid"/>
+        <w:tblW w:type="auto" w:w="0"/>
+        <w:tblLook w:firstColumn="1" w:firstRow="1" w:lastColumn="0" w:lastRow="0" w:noHBand="0" w:noVBand="1" w:val="04A0"/>
+      </w:tblPr>
+      <w:tblGrid>
+        <w:gridCol w:w="8640"/>
+      </w:tblGrid>
+      <w:tr>
+        <w:tc>
+          <w:tcPr>
+            <w:tcW w:type="dxa" w:w="8640"/>
+            <w:shd w:val="clear" w:color="auto" w:fill="F2F2F2"/>
+          </w:tcPr>
+          <w:p>
+            <w:r>
+              <w:rPr>
+                <w:rFonts w:ascii="Consolas" w:hAnsi="Consolas"/>
+                <w:sz w:val="19"/>
+              </w:rPr>
+              <w:t>cd ~ &amp;&amp; python -m zipfile -e ten_file.zip ~/du_lieu</w:t>
+            </w:r>
+          </w:p>
+        </w:tc>
+      </w:tr>
+    </w:tbl>
+    <w:p/>
+    <w:p>
+      <w:r>
+        <w:rPr>
+          <w:b/>
+        </w:rPr>
+        <w:t>Chạy bài 1</w:t>
+      </w:r>
+    </w:p>
+    <w:p>
+      <w:pPr>
+        <w:ind w:left="360"/>
+      </w:pPr>
+      <w:r>
+        <w:rPr>
+          <w:b/>
+        </w:rPr>
+        <w:t xml:space="preserve">20. </w:t>
+      </w:r>
+      <w:r>
+        <w:rPr>
+          <w:b w:val="0"/>
+        </w:rPr>
+        <w:t xml:space="preserve">Trong danh sách file bên trái, tìm </w:t>
+      </w:r>
+      <w:r>
+        <w:rPr>
+          <w:b/>
+        </w:rPr>
+        <w:t>thư mục dữ liệu</w:t>
+      </w:r>
+      <w:r>
+        <w:rPr>
+          <w:b w:val="0"/>
+        </w:rPr>
+        <w:t xml:space="preserve"> (thư mục có </w:t>
+      </w:r>
+      <w:r>
+        <w:rPr>
+          <w:rFonts w:ascii="Consolas" w:hAnsi="Consolas"/>
+          <w:b w:val="0"/>
+          <w:color w:val="A31F34"/>
+          <w:sz w:val="20"/>
+        </w:rPr>
+        <w:t>train</w:t>
+      </w:r>
+      <w:r>
+        <w:rPr>
+          <w:b w:val="0"/>
+        </w:rPr>
+        <w:t xml:space="preserve">, </w:t>
+      </w:r>
+      <w:r>
+        <w:rPr>
+          <w:rFonts w:ascii="Consolas" w:hAnsi="Consolas"/>
+          <w:b w:val="0"/>
+          <w:color w:val="A31F34"/>
+          <w:sz w:val="20"/>
+        </w:rPr>
+        <w:t>validation</w:t>
+      </w:r>
+      <w:r>
+        <w:rPr>
+          <w:b w:val="0"/>
+        </w:rPr>
+        <w:t xml:space="preserve">, </w:t>
+      </w:r>
+      <w:r>
+        <w:rPr>
+          <w:rFonts w:ascii="Consolas" w:hAnsi="Consolas"/>
+          <w:b w:val="0"/>
+          <w:color w:val="A31F34"/>
+          <w:sz w:val="20"/>
+        </w:rPr>
+        <w:t>test</w:t>
+      </w:r>
+      <w:r>
+        <w:rPr>
+          <w:b w:val="0"/>
+        </w:rPr>
+        <w:t xml:space="preserve">) → </w:t>
+      </w:r>
+      <w:r>
+        <w:rPr>
+          <w:b/>
+        </w:rPr>
+        <w:t>chuột phải</w:t>
+      </w:r>
+      <w:r>
+        <w:rPr>
+          <w:b w:val="0"/>
+        </w:rPr>
+        <w:t xml:space="preserve"> vào nó → </w:t>
+      </w:r>
+      <w:r>
+        <w:rPr>
+          <w:b/>
+        </w:rPr>
+        <w:t>Copy Path</w:t>
+      </w:r>
+      <w:r>
+        <w:rPr>
+          <w:b w:val="0"/>
+        </w:rPr>
+        <w:t>.</w:t>
+      </w:r>
+    </w:p>
+    <w:p>
+      <w:pPr>
+        <w:ind w:left="360"/>
+      </w:pPr>
+      <w:r>
+        <w:rPr>
+          <w:b/>
+        </w:rPr>
+        <w:t xml:space="preserve">21. </w:t>
+      </w:r>
+      <w:r>
+        <w:rPr>
+          <w:b w:val="0"/>
+        </w:rPr>
+        <w:t xml:space="preserve">Trong Terminal gõ (có </w:t>
+      </w:r>
+      <w:r>
+        <w:rPr>
+          <w:b/>
+        </w:rPr>
+        <w:t>một dấu cách</w:t>
+      </w:r>
+      <w:r>
+        <w:rPr>
+          <w:b w:val="0"/>
+        </w:rPr>
+        <w:t xml:space="preserve"> ở cuối):</w:t>
+      </w:r>
+    </w:p>
+    <w:tbl>
+      <w:tblPr>
+        <w:tblStyle w:val="TableGrid"/>
+        <w:tblW w:type="auto" w:w="0"/>
+        <w:tblLook w:firstColumn="1" w:firstRow="1" w:lastColumn="0" w:lastRow="0" w:noHBand="0" w:noVBand="1" w:val="04A0"/>
+      </w:tblPr>
+      <w:tblGrid>
+        <w:gridCol w:w="8640"/>
+      </w:tblGrid>
+      <w:tr>
+        <w:tc>
+          <w:tcPr>
+            <w:tcW w:type="dxa" w:w="8640"/>
+            <w:shd w:val="clear" w:color="auto" w:fill="F2F2F2"/>
+          </w:tcPr>
+          <w:p>
+            <w:r>
+              <w:rPr>
+                <w:rFonts w:ascii="Consolas" w:hAnsi="Consolas"/>
+                <w:sz w:val="19"/>
+              </w:rPr>
+              <w:t xml:space="preserve">bash ~/B1/JUPYTER/bai1.sh </w:t>
+            </w:r>
+          </w:p>
+        </w:tc>
+      </w:tr>
+    </w:tbl>
+    <w:p/>
+    <w:p>
+      <w:r>
+        <w:rPr>
+          <w:b w:val="0"/>
+        </w:rPr>
+        <w:t xml:space="preserve">rồi </w:t>
+      </w:r>
+      <w:r>
+        <w:rPr>
+          <w:b/>
+        </w:rPr>
+        <w:t>dán</w:t>
+      </w:r>
+      <w:r>
+        <w:rPr>
+          <w:b w:val="0"/>
+        </w:rPr>
+        <w:t xml:space="preserve"> đường dẫn vừa copy (Ctrl + Shift + V) → </w:t>
+      </w:r>
+      <w:r>
+        <w:rPr>
+          <w:b/>
+        </w:rPr>
+        <w:t>Enter</w:t>
+      </w:r>
+      <w:r>
+        <w:rPr>
+          <w:b w:val="0"/>
+        </w:rPr>
+        <w:t>. Màn hình chạy giống hệt cửa sổ đen trên laptop.</w:t>
+      </w:r>
+    </w:p>
+    <w:p>
+      <w:pPr>
+        <w:pStyle w:val="Heading2"/>
+      </w:pPr>
+      <w:r>
+        <w:rPr>
+          <w:b w:val="0"/>
+        </w:rPr>
+        <w:t>PHẦN 3. NỘP BÀI 1</w:t>
+      </w:r>
+    </w:p>
+    <w:p>
+      <w:pPr>
+        <w:ind w:left="360"/>
+      </w:pPr>
+      <w:r>
+        <w:rPr>
+          <w:b/>
+        </w:rPr>
+        <w:t xml:space="preserve">22. </w:t>
+      </w:r>
+      <w:r>
+        <w:rPr>
+          <w:b w:val="0"/>
+        </w:rPr>
+        <w:t xml:space="preserve">Khoảng 30–40 phút sau, màn hình hiện </w:t>
+      </w:r>
+      <w:r>
+        <w:rPr>
+          <w:rFonts w:ascii="Consolas" w:hAnsi="Consolas"/>
+          <w:b/>
+          <w:color w:val="A31F34"/>
+          <w:sz w:val="20"/>
+        </w:rPr>
+        <w:t>&gt;&gt;&gt; FILE NỘP (bản nền)</w:t>
+      </w:r>
+      <w:r>
+        <w:rPr>
+          <w:b w:val="0"/>
+        </w:rPr>
+        <w:t>.</w:t>
+      </w:r>
+    </w:p>
+    <w:p>
+      <w:pPr>
+        <w:ind w:left="360"/>
+      </w:pPr>
+      <w:r>
+        <w:rPr>
+          <w:b/>
+        </w:rPr>
+        <w:t xml:space="preserve">23. </w:t>
+      </w:r>
+      <w:r>
+        <w:rPr>
+          <w:b w:val="0"/>
+        </w:rPr>
+        <w:t>Lấy file nộp:</w:t>
+      </w:r>
+    </w:p>
+    <w:p>
+      <w:pPr>
+        <w:pStyle w:val="ListBullet2"/>
+      </w:pPr>
+      <w:r>
+        <w:rPr>
+          <w:b/>
+        </w:rPr>
+        <w:t>Trên Jupyter:</w:t>
+      </w:r>
+      <w:r>
+        <w:rPr>
+          <w:b w:val="0"/>
+        </w:rPr>
+        <w:t xml:space="preserve"> danh sách file bên trái → bấm đúp </w:t>
+      </w:r>
+      <w:r>
+        <w:rPr>
+          <w:b/>
+        </w:rPr>
+        <w:t>B1</w:t>
+      </w:r>
+      <w:r>
+        <w:rPr>
+          <w:b w:val="0"/>
+        </w:rPr>
+        <w:t xml:space="preserve"> → </w:t>
+      </w:r>
+      <w:r>
+        <w:rPr>
+          <w:b/>
+        </w:rPr>
+        <w:t>KIT_BAI1</w:t>
+      </w:r>
+      <w:r>
+        <w:rPr>
+          <w:b w:val="0"/>
+        </w:rPr>
+        <w:t xml:space="preserve"> → </w:t>
+      </w:r>
+      <w:r>
+        <w:rPr>
+          <w:b/>
+        </w:rPr>
+        <w:t>runs</w:t>
+      </w:r>
+      <w:r>
+        <w:rPr>
+          <w:b w:val="0"/>
+        </w:rPr>
+        <w:t xml:space="preserve"> → </w:t>
+      </w:r>
+      <w:r>
+        <w:rPr>
+          <w:b/>
+        </w:rPr>
+        <w:t>chungket</w:t>
+      </w:r>
+      <w:r>
+        <w:rPr>
+          <w:b w:val="0"/>
+        </w:rPr>
+        <w:t xml:space="preserve"> → </w:t>
+      </w:r>
+      <w:r>
+        <w:rPr>
+          <w:b/>
+        </w:rPr>
+        <w:t xml:space="preserve">chuột phải </w:t>
+      </w:r>
+      <w:r>
+        <w:rPr>
+          <w:rFonts w:ascii="Consolas" w:hAnsi="Consolas"/>
+          <w:b/>
+          <w:color w:val="A31F34"/>
+          <w:sz w:val="20"/>
+        </w:rPr>
+        <w:t>predictions.json</w:t>
+      </w:r>
+      <w:r>
+        <w:rPr>
+          <w:b w:val="0"/>
+        </w:rPr>
+        <w:t xml:space="preserve"> → </w:t>
+      </w:r>
+      <w:r>
+        <w:rPr>
+          <w:b/>
+        </w:rPr>
+        <w:t>Download</w:t>
+      </w:r>
+      <w:r>
+        <w:rPr>
+          <w:b w:val="0"/>
+        </w:rPr>
+        <w:t xml:space="preserve">. File về thư mục </w:t>
+      </w:r>
+      <w:r>
+        <w:rPr>
+          <w:b/>
+        </w:rPr>
+        <w:t>Downloads</w:t>
+      </w:r>
+      <w:r>
+        <w:rPr>
+          <w:b w:val="0"/>
+        </w:rPr>
+        <w:t xml:space="preserve"> của laptop.</w:t>
+      </w:r>
+    </w:p>
+    <w:p>
+      <w:pPr>
+        <w:pStyle w:val="ListBullet2"/>
+      </w:pPr>
+      <w:r>
+        <w:rPr>
+          <w:b w:val="0"/>
+        </w:rPr>
+        <w:t xml:space="preserve">(Trên laptop, nếu BTC cho nộp file máy cá nhân: </w:t>
+      </w:r>
+      <w:r>
+        <w:rPr>
+          <w:rFonts w:ascii="Consolas" w:hAnsi="Consolas"/>
+          <w:b w:val="0"/>
+          <w:color w:val="A31F34"/>
+          <w:sz w:val="20"/>
+        </w:rPr>
+        <w:t>KIT_BAI1\runs\chungket\predictions.json</w:t>
+      </w:r>
+      <w:r>
+        <w:rPr>
+          <w:b w:val="0"/>
+        </w:rPr>
+        <w:t>.)</w:t>
+      </w:r>
+    </w:p>
+    <w:p>
+      <w:pPr>
+        <w:ind w:left="360"/>
+      </w:pPr>
+      <w:r>
+        <w:rPr>
+          <w:b/>
+        </w:rPr>
+        <w:t xml:space="preserve">24. </w:t>
+      </w:r>
+      <w:r>
+        <w:rPr>
+          <w:b w:val="0"/>
+        </w:rPr>
+        <w:t xml:space="preserve">Vào trang nộp bài của BTC → chọn file vừa tải → nộp. </w:t>
+      </w:r>
+      <w:r>
+        <w:rPr>
+          <w:b/>
+        </w:rPr>
+        <w:t>Ghi ra giấy:</w:t>
+      </w:r>
+      <w:r>
+        <w:rPr>
+          <w:b w:val="0"/>
+        </w:rPr>
+        <w:t xml:space="preserve"> giờ nộp + điểm web.</w:t>
+      </w:r>
+    </w:p>
+    <w:p>
+      <w:pPr>
+        <w:ind w:left="360"/>
+      </w:pPr>
+      <w:r>
+        <w:rPr>
+          <w:b/>
+        </w:rPr>
+        <w:t xml:space="preserve">25. </w:t>
+      </w:r>
+      <w:r>
+        <w:rPr>
+          <w:b w:val="0"/>
+        </w:rPr>
+        <w:t xml:space="preserve">Đợi thêm 25–45 phút: hiện </w:t>
+      </w:r>
+      <w:r>
+        <w:rPr>
+          <w:rFonts w:ascii="Consolas" w:hAnsi="Consolas"/>
+          <w:b/>
+          <w:color w:val="A31F34"/>
+          <w:sz w:val="20"/>
+        </w:rPr>
+        <w:t>&gt;&gt;&gt; FILE NỘP (bản NÂNG CAO)</w:t>
+      </w:r>
+      <w:r>
+        <w:rPr>
+          <w:b w:val="0"/>
+        </w:rPr>
+        <w:t xml:space="preserve"> và một trong hai dòng:</w:t>
+      </w:r>
+    </w:p>
+    <w:p>
+      <w:pPr>
+        <w:pStyle w:val="ListBullet2"/>
+      </w:pPr>
+      <w:r>
+        <w:rPr>
+          <w:rFonts w:ascii="Consolas" w:hAnsi="Consolas"/>
+          <w:b w:val="0"/>
+          <w:color w:val="A31F34"/>
+          <w:sz w:val="20"/>
+        </w:rPr>
+        <w:t>Bản nâng cao TỐT HƠN ... =&gt; NỘP</w:t>
+      </w:r>
+      <w:r>
+        <w:rPr>
+          <w:b w:val="0"/>
+        </w:rPr>
+        <w:t xml:space="preserve"> → làm lại bước 23–24 (nộp file mới).</w:t>
+      </w:r>
+    </w:p>
+    <w:p>
+      <w:pPr>
+        <w:pStyle w:val="ListBullet2"/>
+      </w:pPr>
+      <w:r>
+        <w:rPr>
+          <w:rFonts w:ascii="Consolas" w:hAnsi="Consolas"/>
+          <w:b w:val="0"/>
+          <w:color w:val="A31F34"/>
+          <w:sz w:val="20"/>
+        </w:rPr>
+        <w:t>TRẢ VỀ BẢN NỀN</w:t>
+      </w:r>
+      <w:r>
+        <w:rPr>
+          <w:b w:val="0"/>
+        </w:rPr>
+        <w:t xml:space="preserve"> → </w:t>
+      </w:r>
+      <w:r>
+        <w:rPr>
+          <w:b/>
+        </w:rPr>
+        <w:t>không nộp</w:t>
+      </w:r>
+      <w:r>
+        <w:rPr>
+          <w:b w:val="0"/>
+        </w:rPr>
+        <w:t xml:space="preserve"> nữa.</w:t>
+      </w:r>
+    </w:p>
+    <w:p>
+      <w:pPr>
+        <w:ind w:left="360"/>
+      </w:pPr>
+      <w:r>
+        <w:rPr>
+          <w:b/>
+        </w:rPr>
+        <w:t xml:space="preserve">26. </w:t>
+      </w:r>
+      <w:r>
+        <w:rPr>
+          <w:b w:val="0"/>
+        </w:rPr>
+        <w:t xml:space="preserve">Thấy </w:t>
+      </w:r>
+      <w:r>
+        <w:rPr>
+          <w:rFonts w:ascii="Consolas" w:hAnsi="Consolas"/>
+          <w:b/>
+          <w:color w:val="A31F34"/>
+          <w:sz w:val="20"/>
+        </w:rPr>
+        <w:t>XONG TẤT CẢ</w:t>
+      </w:r>
+      <w:r>
+        <w:rPr>
+          <w:b w:val="0"/>
+        </w:rPr>
+        <w:t xml:space="preserve"> là bài 1 xong.</w:t>
+      </w:r>
+    </w:p>
+    <w:p>
+      <w:pPr>
+        <w:pStyle w:val="Heading2"/>
+      </w:pPr>
+      <w:r>
+        <w:rPr>
+          <w:b w:val="0"/>
+        </w:rPr>
+        <w:t>PHẦN 4. BÀI 2 (trong lúc bài 1 đang chạy)</w:t>
+      </w:r>
+    </w:p>
+    <w:p>
+      <w:pPr>
+        <w:ind w:left="360"/>
+      </w:pPr>
+      <w:r>
+        <w:rPr>
+          <w:b/>
+        </w:rPr>
+        <w:t xml:space="preserve">27. </w:t>
+      </w:r>
+      <w:r>
+        <w:rPr>
+          <w:b w:val="0"/>
+        </w:rPr>
+        <w:t xml:space="preserve">Trên Jupyter: bấm dấu </w:t>
+      </w:r>
+      <w:r>
+        <w:rPr>
+          <w:rFonts w:ascii="Consolas" w:hAnsi="Consolas"/>
+          <w:b/>
+          <w:color w:val="A31F34"/>
+          <w:sz w:val="20"/>
+        </w:rPr>
+        <w:t>+</w:t>
+      </w:r>
+      <w:r>
+        <w:rPr>
+          <w:b w:val="0"/>
+        </w:rPr>
+        <w:t xml:space="preserve"> (góc trên bên trái) → </w:t>
+      </w:r>
+      <w:r>
+        <w:rPr>
+          <w:b/>
+        </w:rPr>
+        <w:t>Terminal</w:t>
+      </w:r>
+      <w:r>
+        <w:rPr>
+          <w:b w:val="0"/>
+        </w:rPr>
+        <w:t xml:space="preserve"> để mở </w:t>
+      </w:r>
+      <w:r>
+        <w:rPr>
+          <w:b/>
+        </w:rPr>
+        <w:t>Terminal thứ hai</w:t>
+      </w:r>
+      <w:r>
+        <w:rPr>
+          <w:b w:val="0"/>
+        </w:rPr>
+        <w:t>. (Terminal thứ nhất vẫn đang chạy bài 1, đừng gõ vào đó.)</w:t>
+      </w:r>
+    </w:p>
+    <w:p>
+      <w:pPr>
+        <w:ind w:left="360"/>
+      </w:pPr>
+      <w:r>
+        <w:rPr>
+          <w:b/>
+        </w:rPr>
+        <w:t xml:space="preserve">28. </w:t>
+      </w:r>
+      <w:r>
+        <w:rPr>
+          <w:b w:val="0"/>
+        </w:rPr>
+        <w:t xml:space="preserve">Đọc đề bài 2, xem nó thuộc kiểu nào (bảng, văn bản, ảnh, âm thanh, video, dịch, khoanh vật thể, đọc chữ) — tra </w:t>
+      </w:r>
+      <w:r>
+        <w:rPr>
+          <w:b/>
+        </w:rPr>
+        <w:t>Sổ tay bài 2, Phần A</w:t>
+      </w:r>
+      <w:r>
+        <w:rPr>
+          <w:b w:val="0"/>
+        </w:rPr>
+        <w:t xml:space="preserve"> trong file </w:t>
+      </w:r>
+      <w:r>
+        <w:rPr>
+          <w:rFonts w:ascii="Consolas" w:hAnsi="Consolas"/>
+          <w:b w:val="0"/>
+          <w:color w:val="A31F34"/>
+          <w:sz w:val="20"/>
+        </w:rPr>
+        <w:t>HUONG_DAN_THI.docx</w:t>
+      </w:r>
+      <w:r>
+        <w:rPr>
+          <w:b w:val="0"/>
+        </w:rPr>
+        <w:t>.</w:t>
+      </w:r>
+    </w:p>
+    <w:p>
+      <w:pPr>
+        <w:ind w:left="360"/>
+      </w:pPr>
+      <w:r>
+        <w:rPr>
+          <w:b/>
+        </w:rPr>
+        <w:t xml:space="preserve">29. </w:t>
+      </w:r>
+      <w:r>
+        <w:rPr>
+          <w:b w:val="0"/>
+        </w:rPr>
+        <w:t>Dán lệnh tương ứng → Enter:</w:t>
+      </w:r>
+    </w:p>
+    <w:tbl>
+      <w:tblPr>
+        <w:tblStyle w:val="TableGrid"/>
+        <w:tblW w:type="auto" w:w="0"/>
+        <w:tblLook w:firstColumn="1" w:firstRow="1" w:lastColumn="0" w:lastRow="0" w:noHBand="0" w:noVBand="1" w:val="04A0"/>
+      </w:tblPr>
+      <w:tblGrid>
+        <w:gridCol w:w="4320"/>
+        <w:gridCol w:w="4320"/>
+      </w:tblGrid>
+      <w:tr>
+        <w:tc>
+          <w:tcPr>
+            <w:tcW w:type="dxa" w:w="4320"/>
+            <w:shd w:val="clear" w:color="auto" w:fill="DCE6F1"/>
+          </w:tcPr>
+          <w:p>
+            <w:r>
+              <w:rPr>
+                <w:b/>
+              </w:rPr>
+              <w:t>đề bài 2</w:t>
+            </w:r>
+          </w:p>
+        </w:tc>
+        <w:tc>
+          <w:tcPr>
+            <w:tcW w:type="dxa" w:w="4320"/>
+            <w:shd w:val="clear" w:color="auto" w:fill="DCE6F1"/>
+          </w:tcPr>
+          <w:p>
+            <w:r>
+              <w:rPr>
+                <w:b/>
+              </w:rPr>
+              <w:t>lệnh</w:t>
+            </w:r>
+          </w:p>
+        </w:tc>
+      </w:tr>
+      <w:tr>
+        <w:tc>
+          <w:tcPr>
+            <w:tcW w:type="dxa" w:w="4320"/>
+          </w:tcPr>
+          <w:p>
+            <w:r>
+              <w:rPr>
+                <w:b w:val="0"/>
+              </w:rPr>
+              <w:t>bảng, văn bản, phân loại ảnh, âm thanh, chia nhóm, video, dịch</w:t>
+            </w:r>
+          </w:p>
+        </w:tc>
+        <w:tc>
+          <w:tcPr>
+            <w:tcW w:type="dxa" w:w="4320"/>
+          </w:tcPr>
+          <w:p>
+            <w:r>
+              <w:rPr>
+                <w:rFonts w:ascii="Consolas" w:hAnsi="Consolas"/>
+                <w:b w:val="0"/>
+                <w:color w:val="A31F34"/>
+                <w:sz w:val="20"/>
+              </w:rPr>
+              <w:t>cd ~/B1/KIT_BAI2 &amp;&amp; python bai2.py</w:t>
+            </w:r>
+          </w:p>
+        </w:tc>
+      </w:tr>
+      <w:tr>
+        <w:tc>
+          <w:tcPr>
+            <w:tcW w:type="dxa" w:w="4320"/>
+          </w:tcPr>
+          <w:p>
+            <w:r>
+              <w:rPr>
+                <w:b w:val="0"/>
+              </w:rPr>
+              <w:t>khoanh / đếm vật thể, tô vùng ảnh</w:t>
+            </w:r>
+          </w:p>
+        </w:tc>
+        <w:tc>
+          <w:tcPr>
+            <w:tcW w:type="dxa" w:w="4320"/>
+          </w:tcPr>
+          <w:p>
+            <w:r>
+              <w:rPr>
+                <w:rFonts w:ascii="Consolas" w:hAnsi="Consolas"/>
+                <w:b w:val="0"/>
+                <w:color w:val="A31F34"/>
+                <w:sz w:val="20"/>
+              </w:rPr>
+              <w:t>cd ~/B1/KIT_BAI2 &amp;&amp; python yolo_mau.py</w:t>
+            </w:r>
+          </w:p>
+        </w:tc>
+      </w:tr>
+      <w:tr>
+        <w:tc>
+          <w:tcPr>
+            <w:tcW w:type="dxa" w:w="4320"/>
+          </w:tcPr>
+          <w:p>
+            <w:r>
+              <w:rPr>
+                <w:b w:val="0"/>
+              </w:rPr>
+              <w:t>đọc chữ trong ảnh</w:t>
+            </w:r>
+          </w:p>
+        </w:tc>
+        <w:tc>
+          <w:tcPr>
+            <w:tcW w:type="dxa" w:w="4320"/>
+          </w:tcPr>
+          <w:p>
+            <w:r>
+              <w:rPr>
+                <w:rFonts w:ascii="Consolas" w:hAnsi="Consolas"/>
+                <w:b w:val="0"/>
+                <w:color w:val="A31F34"/>
+                <w:sz w:val="20"/>
+              </w:rPr>
+              <w:t>cd ~/B1/KIT_BAI2 &amp;&amp; python ocr_mau.py</w:t>
+            </w:r>
+          </w:p>
+        </w:tc>
+      </w:tr>
+    </w:tbl>
+    <w:p/>
+    <w:p>
+      <w:pPr>
+        <w:ind w:left="360"/>
+      </w:pPr>
+      <w:r>
+        <w:rPr>
+          <w:b/>
+        </w:rPr>
+        <w:t xml:space="preserve">30. </w:t>
+      </w:r>
+      <w:r>
+        <w:rPr>
+          <w:b w:val="0"/>
+        </w:rPr>
+        <w:t xml:space="preserve">Máy hỏi từng câu. Câu nào hỏi </w:t>
+      </w:r>
+      <w:r>
+        <w:rPr>
+          <w:b/>
+        </w:rPr>
+        <w:t>file / thư mục</w:t>
+      </w:r>
+      <w:r>
+        <w:rPr>
+          <w:b w:val="0"/>
+        </w:rPr>
+        <w:t xml:space="preserve">: ở danh sách bên trái </w:t>
+      </w:r>
+      <w:r>
+        <w:rPr>
+          <w:b/>
+        </w:rPr>
+        <w:t>chuột phải file đó → Copy Path</w:t>
+      </w:r>
+      <w:r>
+        <w:rPr>
+          <w:b w:val="0"/>
+        </w:rPr>
+        <w:t xml:space="preserve"> → dán vào Terminal → Enter. Câu có sẵn đáp án trong ngoặc </w:t>
+      </w:r>
+      <w:r>
+        <w:rPr>
+          <w:rFonts w:ascii="Consolas" w:hAnsi="Consolas"/>
+          <w:b w:val="0"/>
+          <w:color w:val="A31F34"/>
+          <w:sz w:val="20"/>
+        </w:rPr>
+        <w:t>[...]</w:t>
+      </w:r>
+      <w:r>
+        <w:rPr>
+          <w:b w:val="0"/>
+        </w:rPr>
+        <w:t xml:space="preserve"> mà đúng thì chỉ cần Enter.</w:t>
+      </w:r>
+    </w:p>
+    <w:p>
+      <w:pPr>
+        <w:ind w:left="360"/>
+      </w:pPr>
+      <w:r>
+        <w:rPr>
+          <w:b/>
+        </w:rPr>
+        <w:t xml:space="preserve">31. </w:t>
+      </w:r>
+      <w:r>
+        <w:rPr>
+          <w:b w:val="0"/>
+        </w:rPr>
+        <w:t xml:space="preserve">Xong hiện </w:t>
+      </w:r>
+      <w:r>
+        <w:rPr>
+          <w:rFonts w:ascii="Consolas" w:hAnsi="Consolas"/>
+          <w:b/>
+          <w:color w:val="A31F34"/>
+          <w:sz w:val="20"/>
+        </w:rPr>
+        <w:t>&gt;&gt;&gt; FILE NỘP</w:t>
+      </w:r>
+      <w:r>
+        <w:rPr>
+          <w:b w:val="0"/>
+        </w:rPr>
+        <w:t xml:space="preserve"> → danh sách bên trái: </w:t>
+      </w:r>
+      <w:r>
+        <w:rPr>
+          <w:b/>
+        </w:rPr>
+        <w:t xml:space="preserve">B1 → KIT_BAI2 → ket_qua → (tên lần chạy) → chuột phải </w:t>
+      </w:r>
+      <w:r>
+        <w:rPr>
+          <w:rFonts w:ascii="Consolas" w:hAnsi="Consolas"/>
+          <w:b/>
+          <w:color w:val="A31F34"/>
+          <w:sz w:val="20"/>
+        </w:rPr>
+        <w:t>submission.csv</w:t>
+      </w:r>
+      <w:r>
+        <w:rPr>
+          <w:b/>
+        </w:rPr>
+        <w:t xml:space="preserve"> → Download</w:t>
+      </w:r>
+      <w:r>
+        <w:rPr>
+          <w:b w:val="0"/>
+        </w:rPr>
+        <w:t xml:space="preserve"> → nộp. Ghi điểm ra giấy.</w:t>
+      </w:r>
+    </w:p>
+    <w:p>
+      <w:pPr>
+        <w:pStyle w:val="Heading2"/>
+      </w:pPr>
+      <w:r>
+        <w:rPr>
+          <w:b w:val="0"/>
+        </w:rPr>
+        <w:t>PHẦN 5. SAU 3 GIỜ ĐẦU</w:t>
+      </w:r>
+    </w:p>
+    <w:p>
+      <w:pPr>
+        <w:ind w:left="360"/>
+      </w:pPr>
+      <w:r>
+        <w:rPr>
+          <w:b/>
+        </w:rPr>
+        <w:t xml:space="preserve">32. </w:t>
+      </w:r>
+      <w:r>
+        <w:rPr>
+          <w:b/>
+        </w:rPr>
+        <w:t>Thôi dùng laptop để chạy.</w:t>
+      </w:r>
+      <w:r>
+        <w:rPr>
+          <w:b w:val="0"/>
+        </w:rPr>
+        <w:t xml:space="preserve"> Mọi việc chạy và nộp chỉ làm trên Jupyter.</w:t>
+      </w:r>
+    </w:p>
+    <w:p>
+      <w:pPr>
+        <w:ind w:left="360"/>
+      </w:pPr>
+      <w:r>
+        <w:rPr>
+          <w:b/>
+        </w:rPr>
+        <w:t xml:space="preserve">33. </w:t>
+      </w:r>
+      <w:r>
+        <w:rPr>
+          <w:b w:val="0"/>
+        </w:rPr>
+        <w:t xml:space="preserve">Muốn tăng điểm: hỏi AI của BTC (bước 35), sửa code </w:t>
+      </w:r>
+      <w:r>
+        <w:rPr>
+          <w:b/>
+        </w:rPr>
+        <w:t>trên Jupyter</w:t>
+      </w:r>
+      <w:r>
+        <w:rPr>
+          <w:b w:val="0"/>
+        </w:rPr>
+        <w:t xml:space="preserve"> (bấm đúp file </w:t>
+      </w:r>
+      <w:r>
+        <w:rPr>
+          <w:rFonts w:ascii="Consolas" w:hAnsi="Consolas"/>
+          <w:b w:val="0"/>
+          <w:color w:val="A31F34"/>
+          <w:sz w:val="20"/>
+        </w:rPr>
+        <w:t>.py</w:t>
+      </w:r>
+      <w:r>
+        <w:rPr>
+          <w:b w:val="0"/>
+        </w:rPr>
+        <w:t xml:space="preserve"> trong danh sách bên trái → sửa → </w:t>
+      </w:r>
+      <w:r>
+        <w:rPr>
+          <w:b/>
+        </w:rPr>
+        <w:t>Ctrl + S</w:t>
+      </w:r>
+      <w:r>
+        <w:rPr>
+          <w:b w:val="0"/>
+        </w:rPr>
+        <w:t>), rồi dán lệnh học lại:</w:t>
+      </w:r>
+    </w:p>
+    <w:tbl>
+      <w:tblPr>
+        <w:tblStyle w:val="TableGrid"/>
+        <w:tblW w:type="auto" w:w="0"/>
+        <w:tblLook w:firstColumn="1" w:firstRow="1" w:lastColumn="0" w:lastRow="0" w:noHBand="0" w:noVBand="1" w:val="04A0"/>
+      </w:tblPr>
+      <w:tblGrid>
+        <w:gridCol w:w="8640"/>
+      </w:tblGrid>
+      <w:tr>
+        <w:tc>
+          <w:tcPr>
+            <w:tcW w:type="dxa" w:w="8640"/>
+            <w:shd w:val="clear" w:color="auto" w:fill="F2F2F2"/>
+          </w:tcPr>
+          <w:p>
+            <w:r>
+              <w:rPr>
+                <w:rFonts w:ascii="Consolas" w:hAnsi="Consolas"/>
+                <w:sz w:val="19"/>
+              </w:rPr>
+              <w:t>bash ~/B1/JUPYTER/hoc_lai.sh</w:t>
+            </w:r>
+          </w:p>
+        </w:tc>
+      </w:tr>
+    </w:tbl>
+    <w:p/>
+    <w:p>
+      <w:pPr>
+        <w:ind w:left="360"/>
+      </w:pPr>
+      <w:r>
+        <w:rPr>
+          <w:b/>
+        </w:rPr>
+        <w:t xml:space="preserve">34. </w:t>
+      </w:r>
+      <w:r>
+        <w:rPr>
+          <w:b w:val="0"/>
+        </w:rPr>
+        <w:t xml:space="preserve">Mở sổ điểm: danh sách bên trái </w:t>
+      </w:r>
+      <w:r>
+        <w:rPr>
+          <w:b/>
+        </w:rPr>
+        <w:t xml:space="preserve">B1 → KIT_BAI1 → runs → chungket → bấm đúp </w:t>
+      </w:r>
+      <w:r>
+        <w:rPr>
+          <w:rFonts w:ascii="Consolas" w:hAnsi="Consolas"/>
+          <w:b/>
+          <w:color w:val="A31F34"/>
+          <w:sz w:val="20"/>
+        </w:rPr>
+        <w:t>nhat_ky_diem.txt</w:t>
+      </w:r>
+      <w:r>
+        <w:rPr>
+          <w:b w:val="0"/>
+        </w:rPr>
+        <w:t xml:space="preserve">. Dòng mới cao hơn file đã nộp </w:t>
+      </w:r>
+      <w:r>
+        <w:rPr>
+          <w:b/>
+        </w:rPr>
+        <w:t>ít nhất 0,01</w:t>
+      </w:r>
+      <w:r>
+        <w:rPr>
+          <w:b w:val="0"/>
+        </w:rPr>
+        <w:t xml:space="preserve"> thì nộp, không thì thôi.</w:t>
+      </w:r>
+    </w:p>
+    <w:p>
+      <w:pPr>
+        <w:pStyle w:val="Heading2"/>
+      </w:pPr>
+      <w:r>
+        <w:rPr>
+          <w:b w:val="0"/>
+        </w:rPr>
+        <w:t>PHẦN 6. DÙNG AI CỦA BTC (mỗi phiên tối đa 200k)</w:t>
+      </w:r>
+    </w:p>
+    <w:p>
+      <w:pPr>
+        <w:ind w:left="360"/>
+      </w:pPr>
+      <w:r>
+        <w:rPr>
+          <w:b/>
+        </w:rPr>
+        <w:t xml:space="preserve">35. </w:t>
+      </w:r>
+      <w:r>
+        <w:rPr>
+          <w:b w:val="0"/>
+        </w:rPr>
+        <w:t xml:space="preserve">Mỗi lần mở phiên AI mới: </w:t>
+      </w:r>
+      <w:r>
+        <w:rPr>
+          <w:b/>
+        </w:rPr>
+        <w:t>dán "Thẻ giới thiệu cho AI"</w:t>
+      </w:r>
+      <w:r>
+        <w:rPr>
+          <w:b w:val="0"/>
+        </w:rPr>
+        <w:t xml:space="preserve"> (trong file </w:t>
+      </w:r>
+      <w:r>
+        <w:rPr>
+          <w:rFonts w:ascii="Consolas" w:hAnsi="Consolas"/>
+          <w:b w:val="0"/>
+          <w:color w:val="A31F34"/>
+          <w:sz w:val="20"/>
+        </w:rPr>
+        <w:t>HUONG_DAN_THI.docx</w:t>
+      </w:r>
+      <w:r>
+        <w:rPr>
+          <w:b w:val="0"/>
+        </w:rPr>
+        <w:t>, mục LUẬT MỚI) trước, rồi mới hỏi.</w:t>
+      </w:r>
+    </w:p>
+    <w:p>
+      <w:pPr>
+        <w:ind w:left="360"/>
+      </w:pPr>
+      <w:r>
+        <w:rPr>
+          <w:b/>
+        </w:rPr>
+        <w:t xml:space="preserve">36. </w:t>
+      </w:r>
+      <w:r>
+        <w:rPr>
+          <w:b w:val="0"/>
+        </w:rPr>
+        <w:t xml:space="preserve">Khi hỏi: chỉ dán </w:t>
+      </w:r>
+      <w:r>
+        <w:rPr>
+          <w:b/>
+        </w:rPr>
+        <w:t>20 dòng lỗi cuối</w:t>
+      </w:r>
+      <w:r>
+        <w:rPr>
+          <w:b w:val="0"/>
+        </w:rPr>
+        <w:t xml:space="preserve"> + </w:t>
+      </w:r>
+      <w:r>
+        <w:rPr>
+          <w:b/>
+        </w:rPr>
+        <w:t>đúng một hàm</w:t>
+      </w:r>
+      <w:r>
+        <w:rPr>
+          <w:b w:val="0"/>
+        </w:rPr>
+        <w:t>, không dán cả file. Dùng mẫu A / B / C trong sổ tay.</w:t>
+      </w:r>
+    </w:p>
+    <w:p>
+      <w:pPr>
+        <w:pStyle w:val="Heading2"/>
+      </w:pPr>
+      <w:r>
+        <w:rPr>
+          <w:b w:val="0"/>
+        </w:rPr>
+        <w:t>PHẦN 7. CUỐI GIỜ: BẢO VỆ</w:t>
+      </w:r>
+    </w:p>
+    <w:p>
+      <w:pPr>
+        <w:ind w:left="360"/>
+      </w:pPr>
+      <w:r>
+        <w:rPr>
+          <w:b/>
+        </w:rPr>
+        <w:t xml:space="preserve">37. </w:t>
+      </w:r>
+      <w:r>
+        <w:rPr>
+          <w:b w:val="0"/>
+        </w:rPr>
+        <w:t xml:space="preserve">15 phút trước giờ bảo vệ: mở </w:t>
+      </w:r>
+      <w:r>
+        <w:rPr>
+          <w:rFonts w:ascii="Consolas" w:hAnsi="Consolas"/>
+          <w:b w:val="0"/>
+          <w:color w:val="A31F34"/>
+          <w:sz w:val="20"/>
+        </w:rPr>
+        <w:t>HUONG_DAN_THI.docx</w:t>
+      </w:r>
+      <w:r>
+        <w:rPr>
+          <w:b w:val="0"/>
+        </w:rPr>
+        <w:t xml:space="preserve"> → mục </w:t>
+      </w:r>
+      <w:r>
+        <w:rPr>
+          <w:b/>
+        </w:rPr>
+        <w:t>BẢO VỆ CUỐI GIỜ</w:t>
+      </w:r>
+      <w:r>
+        <w:rPr>
+          <w:b w:val="0"/>
+        </w:rPr>
+        <w:t xml:space="preserve"> → điền các chỗ </w:t>
+      </w:r>
+      <w:r>
+        <w:rPr>
+          <w:rFonts w:ascii="Consolas" w:hAnsi="Consolas"/>
+          <w:b w:val="0"/>
+          <w:color w:val="A31F34"/>
+          <w:sz w:val="20"/>
+        </w:rPr>
+        <w:t>&lt; &gt;</w:t>
+      </w:r>
+      <w:r>
+        <w:rPr>
+          <w:b w:val="0"/>
+        </w:rPr>
+        <w:t xml:space="preserve"> bằng số trên giấy (dòng KHÁC, LỆCH, điểm tự chấm, điểm web).</w:t>
+      </w:r>
+    </w:p>
+    <w:p>
+      <w:pPr>
+        <w:ind w:left="360"/>
+      </w:pPr>
+      <w:r>
+        <w:rPr>
+          <w:b/>
+        </w:rPr>
+        <w:t xml:space="preserve">38. </w:t>
+      </w:r>
+      <w:r>
+        <w:rPr>
+          <w:b w:val="0"/>
+        </w:rPr>
+        <w:t>Câu mở đầu: "Đội dùng lời giải vòng loại làm nền (BTC cho phép), hôm nay chạy lại trên dữ liệu mới và chỉnh theo phần nâng cấp."</w:t>
+      </w:r>
+    </w:p>
+    <w:p>
+      <w:pPr>
+        <w:pStyle w:val="Heading2"/>
+      </w:pPr>
+      <w:r>
+        <w:rPr>
+          <w:b w:val="0"/>
+        </w:rPr>
+        <w:t>NẾU CÓ LỖI</w:t>
+      </w:r>
+    </w:p>
+    <w:tbl>
+      <w:tblPr>
+        <w:tblStyle w:val="TableGrid"/>
+        <w:tblW w:type="auto" w:w="0"/>
+        <w:tblLook w:firstColumn="1" w:firstRow="1" w:lastColumn="0" w:lastRow="0" w:noHBand="0" w:noVBand="1" w:val="04A0"/>
+      </w:tblPr>
+      <w:tblGrid>
+        <w:gridCol w:w="4320"/>
+        <w:gridCol w:w="4320"/>
+      </w:tblGrid>
+      <w:tr>
+        <w:tc>
+          <w:tcPr>
+            <w:tcW w:type="dxa" w:w="4320"/>
+            <w:shd w:val="clear" w:color="auto" w:fill="DCE6F1"/>
+          </w:tcPr>
+          <w:p>
+            <w:r>
+              <w:rPr>
+                <w:b/>
+              </w:rPr>
+              <w:t>thấy gì</w:t>
+            </w:r>
+          </w:p>
+        </w:tc>
+        <w:tc>
+          <w:tcPr>
+            <w:tcW w:type="dxa" w:w="4320"/>
+            <w:shd w:val="clear" w:color="auto" w:fill="DCE6F1"/>
+          </w:tcPr>
+          <w:p>
+            <w:r>
+              <w:rPr>
+                <w:b/>
+              </w:rPr>
+              <w:t>làm gì</w:t>
+            </w:r>
+          </w:p>
+        </w:tc>
+      </w:tr>
+      <w:tr>
+        <w:tc>
+          <w:tcPr>
+            <w:tcW w:type="dxa" w:w="4320"/>
+          </w:tcPr>
+          <w:p>
+            <w:r>
+              <w:rPr>
+                <w:b w:val="0"/>
+              </w:rPr>
+              <w:t xml:space="preserve">laptop: </w:t>
+            </w:r>
+            <w:r>
+              <w:rPr>
+                <w:rFonts w:ascii="Consolas" w:hAnsi="Consolas"/>
+                <w:b w:val="0"/>
+                <w:color w:val="A31F34"/>
+                <w:sz w:val="20"/>
+              </w:rPr>
+              <w:t>!!! BƯỚC LỖI</w:t>
+            </w:r>
+          </w:p>
+        </w:tc>
+        <w:tc>
+          <w:tcPr>
+            <w:tcW w:type="dxa" w:w="4320"/>
+          </w:tcPr>
+          <w:p>
+            <w:r>
+              <w:rPr>
+                <w:b w:val="0"/>
+              </w:rPr>
+              <w:t>mở file log nó ghi, đọc dòng cuối, tra sổ tay bài 1 Phần B</w:t>
+            </w:r>
+          </w:p>
+        </w:tc>
+      </w:tr>
+      <w:tr>
+        <w:tc>
+          <w:tcPr>
+            <w:tcW w:type="dxa" w:w="4320"/>
+          </w:tcPr>
+          <w:p>
+            <w:r>
+              <w:rPr>
+                <w:b w:val="0"/>
+              </w:rPr>
+              <w:t xml:space="preserve">Jupyter: </w:t>
+            </w:r>
+            <w:r>
+              <w:rPr>
+                <w:rFonts w:ascii="Consolas" w:hAnsi="Consolas"/>
+                <w:b w:val="0"/>
+                <w:color w:val="A31F34"/>
+                <w:sz w:val="20"/>
+              </w:rPr>
+              <w:t>git clone</w:t>
+            </w:r>
+            <w:r>
+              <w:rPr>
+                <w:b w:val="0"/>
+              </w:rPr>
+              <w:t xml:space="preserve"> báo lỗi</w:t>
+            </w:r>
+          </w:p>
+        </w:tc>
+        <w:tc>
+          <w:tcPr>
+            <w:tcW w:type="dxa" w:w="4320"/>
+          </w:tcPr>
+          <w:p>
+            <w:r>
+              <w:rPr>
+                <w:b w:val="0"/>
+              </w:rPr>
+              <w:t xml:space="preserve">upload </w:t>
+            </w:r>
+            <w:r>
+              <w:rPr>
+                <w:rFonts w:ascii="Consolas" w:hAnsi="Consolas"/>
+                <w:b w:val="0"/>
+                <w:color w:val="A31F34"/>
+                <w:sz w:val="20"/>
+              </w:rPr>
+              <w:t>Desktop\GOI_JUPYTER\kit.zip</w:t>
+            </w:r>
+            <w:r>
+              <w:rPr>
+                <w:b w:val="0"/>
+              </w:rPr>
+              <w:t xml:space="preserve"> (nút mũi tên lên) rồi dán </w:t>
+            </w:r>
+            <w:r>
+              <w:rPr>
+                <w:rFonts w:ascii="Consolas" w:hAnsi="Consolas"/>
+                <w:b w:val="0"/>
+                <w:color w:val="A31F34"/>
+                <w:sz w:val="20"/>
+              </w:rPr>
+              <w:t>cd ~ &amp;&amp; python -m zipfile -e kit.zip ~</w:t>
+            </w:r>
+          </w:p>
+        </w:tc>
+      </w:tr>
+      <w:tr>
+        <w:tc>
+          <w:tcPr>
+            <w:tcW w:type="dxa" w:w="4320"/>
+          </w:tcPr>
+          <w:p>
+            <w:r>
+              <w:rPr>
+                <w:b w:val="0"/>
+              </w:rPr>
+              <w:t xml:space="preserve">Jupyter: </w:t>
+            </w:r>
+            <w:r>
+              <w:rPr>
+                <w:rFonts w:ascii="Consolas" w:hAnsi="Consolas"/>
+                <w:b w:val="0"/>
+                <w:color w:val="A31F34"/>
+                <w:sz w:val="20"/>
+              </w:rPr>
+              <w:t>cai_dat.sh</w:t>
+            </w:r>
+            <w:r>
+              <w:rPr>
+                <w:b w:val="0"/>
+              </w:rPr>
+              <w:t xml:space="preserve"> có dòng </w:t>
+            </w:r>
+            <w:r>
+              <w:rPr>
+                <w:rFonts w:ascii="Consolas" w:hAnsi="Consolas"/>
+                <w:b w:val="0"/>
+                <w:color w:val="A31F34"/>
+                <w:sz w:val="20"/>
+              </w:rPr>
+              <w:t>[LỖI]</w:t>
+            </w:r>
+          </w:p>
+        </w:tc>
+        <w:tc>
+          <w:tcPr>
+            <w:tcW w:type="dxa" w:w="4320"/>
+          </w:tcPr>
+          <w:p>
+            <w:r>
+              <w:rPr>
+                <w:b w:val="0"/>
+              </w:rPr>
+              <w:t>chụp màn hình phần lỗi → hỏi AI của BTC (mẫu A). Trong lúc đó laptop vẫn chạy</w:t>
+            </w:r>
+          </w:p>
+        </w:tc>
+      </w:tr>
+      <w:tr>
+        <w:tc>
+          <w:tcPr>
+            <w:tcW w:type="dxa" w:w="4320"/>
+          </w:tcPr>
+          <w:p>
+            <w:r>
+              <w:rPr>
+                <w:b w:val="0"/>
+              </w:rPr>
+              <w:t>Terminal đứng yên lâu, không chữ mới</w:t>
+            </w:r>
+          </w:p>
+        </w:tc>
+        <w:tc>
+          <w:tcPr>
+            <w:tcW w:type="dxa" w:w="4320"/>
+          </w:tcPr>
+          <w:p>
+            <w:r>
+              <w:rPr>
+                <w:b w:val="0"/>
+              </w:rPr>
+              <w:t>bình thường khi đọc ảnh (bước lâu nhất). Đợi</w:t>
+            </w:r>
+          </w:p>
+        </w:tc>
+      </w:tr>
+      <w:tr>
+        <w:tc>
+          <w:tcPr>
+            <w:tcW w:type="dxa" w:w="4320"/>
+          </w:tcPr>
+          <w:p>
+            <w:r>
+              <w:rPr>
+                <w:b w:val="0"/>
+              </w:rPr>
+              <w:t>lỡ đóng trình duyệt</w:t>
+            </w:r>
+          </w:p>
+        </w:tc>
+        <w:tc>
+          <w:tcPr>
+            <w:tcW w:type="dxa" w:w="4320"/>
+          </w:tcPr>
+          <w:p>
+            <w:r>
+              <w:rPr>
+                <w:b w:val="0"/>
+              </w:rPr>
+              <w:t xml:space="preserve">đăng nhập lại; menu </w:t>
+            </w:r>
+            <w:r>
+              <w:rPr>
+                <w:b/>
+              </w:rPr>
+              <w:t>View → Running Terminals and Kernels</w:t>
+            </w:r>
+            <w:r>
+              <w:rPr>
+                <w:b w:val="0"/>
+              </w:rPr>
+              <w:t xml:space="preserve"> để mở lại Terminal cũ</w:t>
+            </w:r>
+          </w:p>
+        </w:tc>
+      </w:tr>
+      <w:tr>
+        <w:tc>
+          <w:tcPr>
+            <w:tcW w:type="dxa" w:w="4320"/>
+          </w:tcPr>
+          <w:p>
+            <w:r>
+              <w:rPr>
+                <w:b w:val="0"/>
+              </w:rPr>
+              <w:t>muốn dừng việc đang chạy</w:t>
+            </w:r>
+          </w:p>
+        </w:tc>
+        <w:tc>
+          <w:tcPr>
+            <w:tcW w:type="dxa" w:w="4320"/>
+          </w:tcPr>
+          <w:p>
+            <w:r>
+              <w:rPr>
+                <w:b w:val="0"/>
+              </w:rPr>
+              <w:t xml:space="preserve">bấm vào Terminal → </w:t>
+            </w:r>
+            <w:r>
+              <w:rPr>
+                <w:b/>
+              </w:rPr>
+              <w:t>Ctrl + C</w:t>
+            </w:r>
+          </w:p>
+        </w:tc>
+      </w:tr>
+    </w:tbl>
+    <w:p/>
+    <w:p>
+      <w:r>
+        <w:br w:type="page"/>
+      </w:r>
+    </w:p>
     <w:p>
       <w:pPr>
         <w:pStyle w:val="Heading1"/>

</xml_diff>

<commit_message>
Huong dan tuan tu: upload kit.zip la cach chinh, git clone la cach phu
Co-Authored-By: Claude Opus 5.5 <noreply@anthropic.com>
</commit_message>
<xml_diff>
--- a/KIT_BAI1/HUONG_DAN_THI.docx
+++ b/KIT_BAI1/HUONG_DAN_THI.docx
@@ -880,7 +880,7 @@
         <w:rPr>
           <w:b/>
         </w:rPr>
-        <w:t>Lấy bộ code về Jupyter</w:t>
+        <w:t>Đưa bộ code lên Jupyter (upload từ laptop, không cần GitHub)</w:t>
       </w:r>
     </w:p>
     <w:p>
@@ -897,7 +897,87 @@
         <w:rPr>
           <w:b w:val="0"/>
         </w:rPr>
-        <w:t>Dán lệnh này → Enter:</w:t>
+        <w:t xml:space="preserve">Ở danh sách file bên trái của Jupyter, phía trên có hàng biểu tượng nhỏ → bấm biểu tượng </w:t>
+      </w:r>
+      <w:r>
+        <w:rPr>
+          <w:b/>
+        </w:rPr>
+        <w:t>mũi tên hướng lên (Upload Files)</w:t>
+      </w:r>
+      <w:r>
+        <w:rPr>
+          <w:b w:val="0"/>
+        </w:rPr>
+        <w:t xml:space="preserve"> → cửa sổ chọn file hiện ra → bấm </w:t>
+      </w:r>
+      <w:r>
+        <w:rPr>
+          <w:b/>
+        </w:rPr>
+        <w:t>Desktop</w:t>
+      </w:r>
+      <w:r>
+        <w:rPr>
+          <w:b w:val="0"/>
+        </w:rPr>
+        <w:t xml:space="preserve"> → bấm đúp </w:t>
+      </w:r>
+      <w:r>
+        <w:rPr>
+          <w:b/>
+        </w:rPr>
+        <w:t>GOI_JUPYTER</w:t>
+      </w:r>
+      <w:r>
+        <w:rPr>
+          <w:b w:val="0"/>
+        </w:rPr>
+        <w:t xml:space="preserve"> → chọn </w:t>
+      </w:r>
+      <w:r>
+        <w:rPr>
+          <w:rFonts w:ascii="Consolas" w:hAnsi="Consolas"/>
+          <w:b/>
+          <w:color w:val="A31F34"/>
+          <w:sz w:val="20"/>
+        </w:rPr>
+        <w:t>kit.zip</w:t>
+      </w:r>
+      <w:r>
+        <w:rPr>
+          <w:b w:val="0"/>
+        </w:rPr>
+        <w:t xml:space="preserve"> → </w:t>
+      </w:r>
+      <w:r>
+        <w:rPr>
+          <w:b/>
+        </w:rPr>
+        <w:t>Open</w:t>
+      </w:r>
+      <w:r>
+        <w:rPr>
+          <w:b w:val="0"/>
+        </w:rPr>
+        <w:t xml:space="preserve">. Đợi thanh tiến trình chạy hết (0,6 GB, vài phút). </w:t>
+      </w:r>
+      <w:r>
+        <w:rPr>
+          <w:b/>
+        </w:rPr>
+        <w:t>Không tắt trình duyệt lúc đang tải.</w:t>
+      </w:r>
+    </w:p>
+    <w:p>
+      <w:pPr>
+        <w:ind w:left="720"/>
+      </w:pPr>
+      <w:r>
+        <w:rPr>
+          <w:b w:val="0"/>
+        </w:rPr>
+        <w:t>Rồi dán lệnh này vào Terminal → Enter (giải nén):</w:t>
       </w:r>
     </w:p>
     <w:tbl>
@@ -921,7 +1001,7 @@
                 <w:rFonts w:ascii="Consolas" w:hAnsi="Consolas"/>
                 <w:sz w:val="19"/>
               </w:rPr>
-              <w:t>cd ~ &amp;&amp; git clone https://github.com/nguyenthithanhhue-13/B1</w:t>
+              <w:t>cd ~ &amp;&amp; python -m zipfile -e kit.zip ~ &amp;&amp; ls ~/B1</w:t>
             </w:r>
           </w:p>
         </w:tc>
@@ -933,19 +1013,45 @@
         <w:rPr>
           <w:b w:val="0"/>
         </w:rPr>
-        <w:t xml:space="preserve">Đợi 1–2 phút. Bên trái hiện thêm thư mục </w:t>
-      </w:r>
-      <w:r>
-        <w:rPr>
-          <w:b/>
-        </w:rPr>
-        <w:t>B1</w:t>
+        <w:t xml:space="preserve">Thấy </w:t>
+      </w:r>
+      <w:r>
+        <w:rPr>
+          <w:rFonts w:ascii="Consolas" w:hAnsi="Consolas"/>
+          <w:b w:val="0"/>
+          <w:color w:val="A31F34"/>
+          <w:sz w:val="20"/>
+        </w:rPr>
+        <w:t>JUPYTER  KIT_BAI1  KIT_BAI2  du_lieu_tap_duot</w:t>
       </w:r>
       <w:r>
         <w:rPr>
           <w:b w:val="0"/>
         </w:rPr>
         <w:t xml:space="preserve"> là được.</w:t>
+      </w:r>
+    </w:p>
+    <w:p>
+      <w:r>
+        <w:rPr>
+          <w:b w:val="0"/>
+        </w:rPr>
+        <w:t xml:space="preserve">*(Cách phụ, nếu upload báo lỗi: dán </w:t>
+      </w:r>
+      <w:r>
+        <w:rPr>
+          <w:rFonts w:ascii="Consolas" w:hAnsi="Consolas"/>
+          <w:b w:val="0"/>
+          <w:color w:val="A31F34"/>
+          <w:sz w:val="20"/>
+        </w:rPr>
+        <w:t>cd ~ &amp;&amp; git clone https://github.com/nguyenthithanhhue-13/B1</w:t>
+      </w:r>
+      <w:r>
+        <w:rPr>
+          <w:b w:val="0"/>
+        </w:rPr>
+        <w:t xml:space="preserve"> → Enter.)*</w:t>
       </w:r>
     </w:p>
     <w:p>
@@ -2508,7 +2614,7 @@
               <w:rPr>
                 <w:b w:val="0"/>
               </w:rPr>
-              <w:t xml:space="preserve">Jupyter: </w:t>
+              <w:t xml:space="preserve">Jupyter: upload </w:t>
             </w:r>
             <w:r>
               <w:rPr>
@@ -2517,7 +2623,7 @@
                 <w:color w:val="A31F34"/>
                 <w:sz w:val="20"/>
               </w:rPr>
-              <w:t>git clone</w:t>
+              <w:t>kit.zip</w:t>
             </w:r>
             <w:r>
               <w:rPr>
@@ -2536,7 +2642,7 @@
               <w:rPr>
                 <w:b w:val="0"/>
               </w:rPr>
-              <w:t xml:space="preserve">upload </w:t>
+              <w:t xml:space="preserve">thử lại lần nữa; vẫn lỗi thì dùng cách phụ </w:t>
             </w:r>
             <w:r>
               <w:rPr>
@@ -2545,13 +2651,28 @@
                 <w:color w:val="A31F34"/>
                 <w:sz w:val="20"/>
               </w:rPr>
-              <w:t>Desktop\GOI_JUPYTER\kit.zip</w:t>
-            </w:r>
-            <w:r>
-              <w:rPr>
-                <w:b w:val="0"/>
-              </w:rPr>
-              <w:t xml:space="preserve"> (nút mũi tên lên) rồi dán </w:t>
+              <w:t>git clone</w:t>
+            </w:r>
+            <w:r>
+              <w:rPr>
+                <w:b w:val="0"/>
+              </w:rPr>
+              <w:t xml:space="preserve"> ở bước 17</w:t>
+            </w:r>
+          </w:p>
+        </w:tc>
+      </w:tr>
+      <w:tr>
+        <w:tc>
+          <w:tcPr>
+            <w:tcW w:type="dxa" w:w="4320"/>
+          </w:tcPr>
+          <w:p>
+            <w:r>
+              <w:rPr>
+                <w:b w:val="0"/>
+              </w:rPr>
+              <w:t xml:space="preserve">Jupyter: </w:t>
             </w:r>
             <w:r>
               <w:rPr>
@@ -2560,7 +2681,41 @@
                 <w:color w:val="A31F34"/>
                 <w:sz w:val="20"/>
               </w:rPr>
-              <w:t>cd ~ &amp;&amp; python -m zipfile -e kit.zip ~</w:t>
+              <w:t>cai_dat.sh</w:t>
+            </w:r>
+            <w:r>
+              <w:rPr>
+                <w:b w:val="0"/>
+              </w:rPr>
+              <w:t xml:space="preserve"> báo không cài được thư viện (máy chủ chặn mạng)</w:t>
+            </w:r>
+          </w:p>
+        </w:tc>
+        <w:tc>
+          <w:tcPr>
+            <w:tcW w:type="dxa" w:w="4320"/>
+          </w:tcPr>
+          <w:p>
+            <w:r>
+              <w:rPr>
+                <w:b w:val="0"/>
+              </w:rPr>
+              <w:t xml:space="preserve">báo BTC: máy chủ cần cài thư viện bằng </w:t>
+            </w:r>
+            <w:r>
+              <w:rPr>
+                <w:rFonts w:ascii="Consolas" w:hAnsi="Consolas"/>
+                <w:b w:val="0"/>
+                <w:color w:val="A31F34"/>
+                <w:sz w:val="20"/>
+              </w:rPr>
+              <w:t>pip</w:t>
+            </w:r>
+            <w:r>
+              <w:rPr>
+                <w:b w:val="0"/>
+              </w:rPr>
+              <w:t>. Trong lúc chờ, laptop vẫn chạy</w:t>
             </w:r>
           </w:p>
         </w:tc>
@@ -2600,6 +2755,12 @@
                 <w:sz w:val="20"/>
               </w:rPr>
               <w:t>[LỖI]</w:t>
+            </w:r>
+            <w:r>
+              <w:rPr>
+                <w:b w:val="0"/>
+              </w:rPr>
+              <w:t xml:space="preserve"> khác</w:t>
             </w:r>
           </w:p>
         </w:tc>

</xml_diff>

<commit_message>
Bai 2: bo notebook B0-B6 (anh + chu, GPU) + b2lib.py, noi voi bo lam sach cua Thai; HUONG_DAN_BAI2.docx
Co-Authored-By: Claude Opus 5.5 <noreply@anthropic.com>
</commit_message>
<xml_diff>
--- a/KIT_BAI1/HUONG_DAN_THI.docx
+++ b/KIT_BAI1/HUONG_DAN_THI.docx
@@ -1796,6 +1796,50 @@
           <w:b w:val="0"/>
         </w:rPr>
         <w:t>PHẦN 4. BÀI 2 (trong lúc bài 1 đang chạy)</w:t>
+      </w:r>
+    </w:p>
+    <w:p>
+      <w:r>
+        <w:rPr>
+          <w:b/>
+        </w:rPr>
+        <w:t xml:space="preserve">Đề có ẢNH + CHỮ (BTC báo bài 2 kết hợp NLP và thị giác máy tính): dùng bộ notebook </w:t>
+      </w:r>
+      <w:r>
+        <w:rPr>
+          <w:rFonts w:ascii="Consolas" w:hAnsi="Consolas"/>
+          <w:b/>
+          <w:color w:val="A31F34"/>
+          <w:sz w:val="20"/>
+        </w:rPr>
+        <w:t>KIT_BAI2/notebooks</w:t>
+      </w:r>
+      <w:r>
+        <w:rPr>
+          <w:b/>
+        </w:rPr>
+        <w:t xml:space="preserve"> (B0–B6) — xem file riêng </w:t>
+      </w:r>
+      <w:r>
+        <w:rPr>
+          <w:rFonts w:ascii="Consolas" w:hAnsi="Consolas"/>
+          <w:b/>
+          <w:color w:val="A31F34"/>
+          <w:sz w:val="20"/>
+        </w:rPr>
+        <w:t>HUONG_DAN_BAI2.docx</w:t>
+      </w:r>
+      <w:r>
+        <w:rPr>
+          <w:b/>
+        </w:rPr>
+        <w:t xml:space="preserve"> trên Desktop.</w:t>
+      </w:r>
+      <w:r>
+        <w:rPr>
+          <w:b w:val="0"/>
+        </w:rPr>
+        <w:t xml:space="preserve"> Các bước 27–31 dưới đây dùng cho các kiểu bài khác.</w:t>
       </w:r>
     </w:p>
     <w:p>

</xml_diff>

<commit_message>
File Word: muc luc bam duoc
Co-Authored-By: Claude Opus 5.5 <noreply@anthropic.com>
</commit_message>
<xml_diff>
--- a/KIT_BAI1/HUONG_DAN_THI.docx
+++ b/KIT_BAI1/HUONG_DAN_THI.docx
@@ -3,6 +3,611 @@
 <w:document xmlns:wpc="http://schemas.microsoft.com/office/word/2010/wordprocessingCanvas" xmlns:mo="http://schemas.microsoft.com/office/mac/office/2008/main" xmlns:mc="http://schemas.openxmlformats.org/markup-compatibility/2006" xmlns:mv="urn:schemas-microsoft-com:mac:vml" xmlns:o="urn:schemas-microsoft-com:office:office" xmlns:r="http://schemas.openxmlformats.org/officeDocument/2006/relationships" xmlns:m="http://schemas.openxmlformats.org/officeDocument/2006/math" xmlns:v="urn:schemas-microsoft-com:vml" xmlns:wp14="http://schemas.microsoft.com/office/word/2010/wordprocessingDrawing" xmlns:wp="http://schemas.openxmlformats.org/drawingml/2006/wordprocessingDrawing" xmlns:w10="urn:schemas-microsoft-com:office:word" xmlns:w="http://schemas.openxmlformats.org/wordprocessingml/2006/main" xmlns:w14="http://schemas.microsoft.com/office/word/2010/wordml" xmlns:wpg="http://schemas.microsoft.com/office/word/2010/wordprocessingGroup" xmlns:wpi="http://schemas.microsoft.com/office/word/2010/wordprocessingInk" xmlns:wne="http://schemas.microsoft.com/office/word/2006/wordml" xmlns:wps="http://schemas.microsoft.com/office/word/2010/wordprocessingShape" mc:Ignorable="w14 wp14">
   <w:body>
     <w:p>
+      <w:r>
+        <w:rPr>
+          <w:b/>
+          <w:sz w:val="28"/>
+        </w:rPr>
+        <w:t>MỤC LỤC  (giữ Ctrl + bấm vào dòng để nhảy tới phần đó)</w:t>
+      </w:r>
+    </w:p>
+    <w:p>
+      <w:pPr>
+        <w:spacing w:after="40"/>
+        <w:ind w:left="0"/>
+      </w:pPr>
+      <w:hyperlink w:anchor="muc_0">
+        <w:r>
+          <w:rPr>
+            <w:color w:val="1F4E99"/>
+            <w:u w:val="single"/>
+            <w:b/>
+          </w:rPr>
+          <w:t xml:space="preserve">MAI LÀM ĐÚNG THEO THỨ TỰ NÀY</w:t>
+        </w:r>
+      </w:hyperlink>
+    </w:p>
+    <w:p>
+      <w:pPr>
+        <w:spacing w:after="40"/>
+        <w:ind w:left="360"/>
+      </w:pPr>
+      <w:hyperlink w:anchor="muc_1">
+        <w:r>
+          <w:rPr>
+            <w:color w:val="1F4E99"/>
+            <w:u w:val="single"/>
+          </w:rPr>
+          <w:t xml:space="preserve">TRƯỚC GIỜ THI (ở nhà / lúc vào phòng)</w:t>
+        </w:r>
+      </w:hyperlink>
+    </w:p>
+    <w:p>
+      <w:pPr>
+        <w:spacing w:after="40"/>
+        <w:ind w:left="360"/>
+      </w:pPr>
+      <w:hyperlink w:anchor="muc_2">
+        <w:r>
+          <w:rPr>
+            <w:color w:val="1F4E99"/>
+            <w:u w:val="single"/>
+          </w:rPr>
+          <w:t xml:space="preserve">PHẦN 1. BÀI 1 TRÊN LAPTOP (làm ngay khi BTC phát đề)</w:t>
+        </w:r>
+      </w:hyperlink>
+    </w:p>
+    <w:p>
+      <w:pPr>
+        <w:spacing w:after="40"/>
+        <w:ind w:left="360"/>
+      </w:pPr>
+      <w:hyperlink w:anchor="muc_3">
+        <w:r>
+          <w:rPr>
+            <w:color w:val="1F4E99"/>
+            <w:u w:val="single"/>
+          </w:rPr>
+          <w:t xml:space="preserve">PHẦN 2. BÀI 1 TRÊN JUPYTER (làm song song)</w:t>
+        </w:r>
+      </w:hyperlink>
+    </w:p>
+    <w:p>
+      <w:pPr>
+        <w:spacing w:after="40"/>
+        <w:ind w:left="360"/>
+      </w:pPr>
+      <w:hyperlink w:anchor="muc_4">
+        <w:r>
+          <w:rPr>
+            <w:color w:val="1F4E99"/>
+            <w:u w:val="single"/>
+          </w:rPr>
+          <w:t xml:space="preserve">PHẦN 3. NỘP BÀI 1</w:t>
+        </w:r>
+      </w:hyperlink>
+    </w:p>
+    <w:p>
+      <w:pPr>
+        <w:spacing w:after="40"/>
+        <w:ind w:left="360"/>
+      </w:pPr>
+      <w:hyperlink w:anchor="muc_5">
+        <w:r>
+          <w:rPr>
+            <w:color w:val="1F4E99"/>
+            <w:u w:val="single"/>
+          </w:rPr>
+          <w:t xml:space="preserve">PHẦN 4. BÀI 2 (trong lúc bài 1 đang chạy)</w:t>
+        </w:r>
+      </w:hyperlink>
+    </w:p>
+    <w:p>
+      <w:pPr>
+        <w:spacing w:after="40"/>
+        <w:ind w:left="360"/>
+      </w:pPr>
+      <w:hyperlink w:anchor="muc_6">
+        <w:r>
+          <w:rPr>
+            <w:color w:val="1F4E99"/>
+            <w:u w:val="single"/>
+          </w:rPr>
+          <w:t xml:space="preserve">PHẦN 5. SAU 3 GIỜ ĐẦU</w:t>
+        </w:r>
+      </w:hyperlink>
+    </w:p>
+    <w:p>
+      <w:pPr>
+        <w:spacing w:after="40"/>
+        <w:ind w:left="360"/>
+      </w:pPr>
+      <w:hyperlink w:anchor="muc_7">
+        <w:r>
+          <w:rPr>
+            <w:color w:val="1F4E99"/>
+            <w:u w:val="single"/>
+          </w:rPr>
+          <w:t xml:space="preserve">PHẦN 6. DÙNG AI CỦA BTC (mỗi phiên tối đa 200k)</w:t>
+        </w:r>
+      </w:hyperlink>
+    </w:p>
+    <w:p>
+      <w:pPr>
+        <w:spacing w:after="40"/>
+        <w:ind w:left="360"/>
+      </w:pPr>
+      <w:hyperlink w:anchor="muc_8">
+        <w:r>
+          <w:rPr>
+            <w:color w:val="1F4E99"/>
+            <w:u w:val="single"/>
+          </w:rPr>
+          <w:t xml:space="preserve">PHẦN 7. CUỐI GIỜ: BẢO VỆ</w:t>
+        </w:r>
+      </w:hyperlink>
+    </w:p>
+    <w:p>
+      <w:pPr>
+        <w:spacing w:after="40"/>
+        <w:ind w:left="360"/>
+      </w:pPr>
+      <w:hyperlink w:anchor="muc_9">
+        <w:r>
+          <w:rPr>
+            <w:color w:val="1F4E99"/>
+            <w:u w:val="single"/>
+          </w:rPr>
+          <w:t xml:space="preserve">NẾU CÓ LỖI</w:t>
+        </w:r>
+      </w:hyperlink>
+    </w:p>
+    <w:p>
+      <w:pPr>
+        <w:spacing w:after="40"/>
+        <w:ind w:left="0"/>
+      </w:pPr>
+      <w:hyperlink w:anchor="muc_10">
+        <w:r>
+          <w:rPr>
+            <w:color w:val="1F4E99"/>
+            <w:u w:val="single"/>
+            <w:b/>
+          </w:rPr>
+          <w:t xml:space="preserve">HƯỚNG DẪN NGÀY THI — Phenikaa AI Hackathon 2026</w:t>
+        </w:r>
+      </w:hyperlink>
+    </w:p>
+    <w:p>
+      <w:pPr>
+        <w:spacing w:after="40"/>
+        <w:ind w:left="360"/>
+      </w:pPr>
+      <w:hyperlink w:anchor="muc_11">
+        <w:r>
+          <w:rPr>
+            <w:color w:val="1F4E99"/>
+            <w:u w:val="single"/>
+          </w:rPr>
+          <w:t xml:space="preserve">LUẬT MỚI (thầy báo tối 14/10) — ĐỌC ĐẦU TIÊN</w:t>
+        </w:r>
+      </w:hyperlink>
+    </w:p>
+    <w:p>
+      <w:pPr>
+        <w:spacing w:after="40"/>
+        <w:ind w:left="360"/>
+      </w:pPr>
+      <w:hyperlink w:anchor="muc_12">
+        <w:r>
+          <w:rPr>
+            <w:color w:val="1F4E99"/>
+            <w:u w:val="single"/>
+          </w:rPr>
+          <w:t xml:space="preserve">TÓM TẮT NHANH (đọc trước khi thi)</w:t>
+        </w:r>
+      </w:hyperlink>
+    </w:p>
+    <w:p>
+      <w:pPr>
+        <w:spacing w:after="40"/>
+        <w:ind w:left="360"/>
+      </w:pPr>
+      <w:hyperlink w:anchor="muc_13">
+        <w:r>
+          <w:rPr>
+            <w:color w:val="1F4E99"/>
+            <w:u w:val="single"/>
+          </w:rPr>
+          <w:t xml:space="preserve">BẢO VỆ CUỐI GIỜ (đọc thuộc, 3–5 phút)</w:t>
+        </w:r>
+      </w:hyperlink>
+    </w:p>
+    <w:p>
+      <w:pPr>
+        <w:spacing w:after="40"/>
+        <w:ind w:left="0"/>
+      </w:pPr>
+      <w:hyperlink w:anchor="muc_14">
+        <w:r>
+          <w:rPr>
+            <w:color w:val="1F4E99"/>
+            <w:u w:val="single"/>
+            <w:b/>
+          </w:rPr>
+          <w:t xml:space="preserve">CHẠY TRÊN JUPYTERHUB (máy chủ của BTC)</w:t>
+        </w:r>
+      </w:hyperlink>
+    </w:p>
+    <w:p>
+      <w:pPr>
+        <w:spacing w:after="40"/>
+        <w:ind w:left="360"/>
+      </w:pPr>
+      <w:hyperlink w:anchor="muc_15">
+        <w:r>
+          <w:rPr>
+            <w:color w:val="1F4E99"/>
+            <w:u w:val="single"/>
+          </w:rPr>
+          <w:t xml:space="preserve">Bước 0. Dự phòng (đã làm sẵn trên máy Huệ)</w:t>
+        </w:r>
+      </w:hyperlink>
+    </w:p>
+    <w:p>
+      <w:pPr>
+        <w:spacing w:after="40"/>
+        <w:ind w:left="360"/>
+      </w:pPr>
+      <w:hyperlink w:anchor="muc_16">
+        <w:r>
+          <w:rPr>
+            <w:color w:val="1F4E99"/>
+            <w:u w:val="single"/>
+          </w:rPr>
+          <w:t xml:space="preserve">Bước 1. Đăng nhập và mở Terminal</w:t>
+        </w:r>
+      </w:hyperlink>
+    </w:p>
+    <w:p>
+      <w:pPr>
+        <w:spacing w:after="40"/>
+        <w:ind w:left="360"/>
+      </w:pPr>
+      <w:hyperlink w:anchor="muc_17">
+        <w:r>
+          <w:rPr>
+            <w:color w:val="1F4E99"/>
+            <w:u w:val="single"/>
+          </w:rPr>
+          <w:t xml:space="preserve">Bước 2. Đưa bộ đồ nghề lên</w:t>
+        </w:r>
+      </w:hyperlink>
+    </w:p>
+    <w:p>
+      <w:pPr>
+        <w:spacing w:after="40"/>
+        <w:ind w:left="360"/>
+      </w:pPr>
+      <w:hyperlink w:anchor="muc_18">
+        <w:r>
+          <w:rPr>
+            <w:color w:val="1F4E99"/>
+            <w:u w:val="single"/>
+          </w:rPr>
+          <w:t xml:space="preserve">Bước 3. Cài đặt (một lần, 5–20 phút)</w:t>
+        </w:r>
+      </w:hyperlink>
+    </w:p>
+    <w:p>
+      <w:pPr>
+        <w:spacing w:after="40"/>
+        <w:ind w:left="360"/>
+      </w:pPr>
+      <w:hyperlink w:anchor="muc_19">
+        <w:r>
+          <w:rPr>
+            <w:color w:val="1F4E99"/>
+            <w:u w:val="single"/>
+          </w:rPr>
+          <w:t xml:space="preserve">Bước 4. Bài 1</w:t>
+        </w:r>
+      </w:hyperlink>
+    </w:p>
+    <w:p>
+      <w:pPr>
+        <w:spacing w:after="40"/>
+        <w:ind w:left="360"/>
+      </w:pPr>
+      <w:hyperlink w:anchor="muc_20">
+        <w:r>
+          <w:rPr>
+            <w:color w:val="1F4E99"/>
+            <w:u w:val="single"/>
+          </w:rPr>
+          <w:t xml:space="preserve">Bước 5. Sửa code và học lại</w:t>
+        </w:r>
+      </w:hyperlink>
+    </w:p>
+    <w:p>
+      <w:pPr>
+        <w:spacing w:after="40"/>
+        <w:ind w:left="360"/>
+      </w:pPr>
+      <w:hyperlink w:anchor="muc_21">
+        <w:r>
+          <w:rPr>
+            <w:color w:val="1F4E99"/>
+            <w:u w:val="single"/>
+          </w:rPr>
+          <w:t xml:space="preserve">Bước 6. Bài 2</w:t>
+        </w:r>
+      </w:hyperlink>
+    </w:p>
+    <w:p>
+      <w:pPr>
+        <w:spacing w:after="40"/>
+        <w:ind w:left="360"/>
+      </w:pPr>
+      <w:hyperlink w:anchor="muc_22">
+        <w:r>
+          <w:rPr>
+            <w:color w:val="1F4E99"/>
+            <w:u w:val="single"/>
+          </w:rPr>
+          <w:t xml:space="preserve">Có GPU thì nhanh hơn ở đâu</w:t>
+        </w:r>
+      </w:hyperlink>
+    </w:p>
+    <w:p>
+      <w:pPr>
+        <w:spacing w:after="40"/>
+        <w:ind w:left="360"/>
+      </w:pPr>
+      <w:hyperlink w:anchor="muc_23">
+        <w:r>
+          <w:rPr>
+            <w:color w:val="1F4E99"/>
+            <w:u w:val="single"/>
+          </w:rPr>
+          <w:t xml:space="preserve">Thêm: notebook</w:t>
+        </w:r>
+      </w:hyperlink>
+    </w:p>
+    <w:p>
+      <w:pPr>
+        <w:spacing w:after="40"/>
+        <w:ind w:left="0"/>
+      </w:pPr>
+      <w:hyperlink w:anchor="muc_24">
+        <w:r>
+          <w:rPr>
+            <w:color w:val="1F4E99"/>
+            <w:u w:val="single"/>
+            <w:b/>
+          </w:rPr>
+          <w:t xml:space="preserve">SỔ TAY BÀI 1 — Campus Courier nâng cấp</w:t>
+        </w:r>
+      </w:hyperlink>
+    </w:p>
+    <w:p>
+      <w:pPr>
+        <w:spacing w:after="40"/>
+        <w:ind w:left="360"/>
+      </w:pPr>
+      <w:hyperlink w:anchor="muc_25">
+        <w:r>
+          <w:rPr>
+            <w:color w:val="1F4E99"/>
+            <w:u w:val="single"/>
+          </w:rPr>
+          <w:t xml:space="preserve">PHẦN A. Làm bài (trường hợp bình thường)</w:t>
+        </w:r>
+      </w:hyperlink>
+    </w:p>
+    <w:p>
+      <w:pPr>
+        <w:spacing w:after="40"/>
+        <w:ind w:left="360"/>
+      </w:pPr>
+      <w:hyperlink w:anchor="muc_26">
+        <w:r>
+          <w:rPr>
+            <w:color w:val="1F4E99"/>
+            <w:u w:val="single"/>
+          </w:rPr>
+          <w:t xml:space="preserve">PHẦN B. Khi có trục trặc</w:t>
+        </w:r>
+      </w:hyperlink>
+    </w:p>
+    <w:p>
+      <w:pPr>
+        <w:spacing w:after="40"/>
+        <w:ind w:left="360"/>
+      </w:pPr>
+      <w:hyperlink w:anchor="muc_27">
+        <w:r>
+          <w:rPr>
+            <w:color w:val="1F4E99"/>
+            <w:u w:val="single"/>
+          </w:rPr>
+          <w:t xml:space="preserve">PHẦN C. Dùng AI của BTC để sửa code (token có hạn)</w:t>
+        </w:r>
+      </w:hyperlink>
+    </w:p>
+    <w:p>
+      <w:pPr>
+        <w:spacing w:after="40"/>
+        <w:ind w:left="360"/>
+      </w:pPr>
+      <w:hyperlink w:anchor="muc_28">
+        <w:r>
+          <w:rPr>
+            <w:color w:val="1F4E99"/>
+            <w:u w:val="single"/>
+          </w:rPr>
+          <w:t xml:space="preserve">PHẦN D. Đề đổi gì thì kết quả ra sao</w:t>
+        </w:r>
+      </w:hyperlink>
+    </w:p>
+    <w:p>
+      <w:pPr>
+        <w:spacing w:after="40"/>
+        <w:ind w:left="360"/>
+      </w:pPr>
+      <w:hyperlink w:anchor="muc_29">
+        <w:r>
+          <w:rPr>
+            <w:color w:val="1F4E99"/>
+            <w:u w:val="single"/>
+          </w:rPr>
+          <w:t xml:space="preserve">PHẦN E. Chia thời gian (5 giờ, 2 bài)</w:t>
+        </w:r>
+      </w:hyperlink>
+    </w:p>
+    <w:p>
+      <w:pPr>
+        <w:spacing w:after="40"/>
+        <w:ind w:left="360"/>
+      </w:pPr>
+      <w:hyperlink w:anchor="muc_30">
+        <w:r>
+          <w:rPr>
+            <w:color w:val="1F4E99"/>
+            <w:u w:val="single"/>
+          </w:rPr>
+          <w:t xml:space="preserve">PHẦN F. Tập trước ở nhà (10 phút)</w:t>
+        </w:r>
+      </w:hyperlink>
+    </w:p>
+    <w:p>
+      <w:pPr>
+        <w:spacing w:after="40"/>
+        <w:ind w:left="360"/>
+      </w:pPr>
+      <w:hyperlink w:anchor="muc_31">
+        <w:r>
+          <w:rPr>
+            <w:color w:val="1F4E99"/>
+            <w:u w:val="single"/>
+          </w:rPr>
+          <w:t xml:space="preserve">PHẦN G. Ghi chú kỹ thuật (không cần đọc khi thi)</w:t>
+        </w:r>
+      </w:hyperlink>
+    </w:p>
+    <w:p>
+      <w:pPr>
+        <w:spacing w:after="40"/>
+        <w:ind w:left="0"/>
+      </w:pPr>
+      <w:hyperlink w:anchor="muc_32">
+        <w:r>
+          <w:rPr>
+            <w:color w:val="1F4E99"/>
+            <w:u w:val="single"/>
+            <w:b/>
+          </w:rPr>
+          <w:t xml:space="preserve">SỔ TAY BÀI 2 — bài mới chưa biết đề</w:t>
+        </w:r>
+      </w:hyperlink>
+    </w:p>
+    <w:p>
+      <w:pPr>
+        <w:spacing w:after="40"/>
+        <w:ind w:left="360"/>
+      </w:pPr>
+      <w:hyperlink w:anchor="muc_33">
+        <w:r>
+          <w:rPr>
+            <w:color w:val="1F4E99"/>
+            <w:u w:val="single"/>
+          </w:rPr>
+          <w:t xml:space="preserve">PHẦN A. Đọc đề, xác định kiểu bài (5 phút)</w:t>
+        </w:r>
+      </w:hyperlink>
+    </w:p>
+    <w:p>
+      <w:pPr>
+        <w:spacing w:after="40"/>
+        <w:ind w:left="360"/>
+      </w:pPr>
+      <w:hyperlink w:anchor="muc_34">
+        <w:r>
+          <w:rPr>
+            <w:color w:val="1F4E99"/>
+            <w:u w:val="single"/>
+          </w:rPr>
+          <w:t xml:space="preserve">PHẦN B. Chạy (kiểu 1–7)</w:t>
+        </w:r>
+      </w:hyperlink>
+    </w:p>
+    <w:p>
+      <w:pPr>
+        <w:spacing w:after="40"/>
+        <w:ind w:left="360"/>
+      </w:pPr>
+      <w:hyperlink w:anchor="muc_35">
+        <w:r>
+          <w:rPr>
+            <w:color w:val="1F4E99"/>
+            <w:u w:val="single"/>
+          </w:rPr>
+          <w:t xml:space="preserve">PHẦN C. Gặp lỗi</w:t>
+        </w:r>
+      </w:hyperlink>
+    </w:p>
+    <w:p>
+      <w:pPr>
+        <w:spacing w:after="40"/>
+        <w:ind w:left="360"/>
+      </w:pPr>
+      <w:hyperlink w:anchor="muc_36">
+        <w:r>
+          <w:rPr>
+            <w:color w:val="1F4E99"/>
+            <w:u w:val="single"/>
+          </w:rPr>
+          <w:t xml:space="preserve">PHẦN D. Dùng AI của BTC cho bài 2</w:t>
+        </w:r>
+      </w:hyperlink>
+    </w:p>
+    <w:p>
+      <w:pPr>
+        <w:spacing w:after="40"/>
+        <w:ind w:left="360"/>
+      </w:pPr>
+      <w:hyperlink w:anchor="muc_37">
+        <w:r>
+          <w:rPr>
+            <w:color w:val="1F4E99"/>
+            <w:u w:val="single"/>
+          </w:rPr>
+          <w:t xml:space="preserve">PHẦN E. Bộ này dùng gì (đối chiếu với danh mục kiến thức IOAI)</w:t>
+        </w:r>
+      </w:hyperlink>
+    </w:p>
+    <w:p>
+      <w:pPr>
+        <w:spacing w:after="40"/>
+        <w:ind w:left="360"/>
+      </w:pPr>
+      <w:hyperlink w:anchor="muc_38">
+        <w:r>
+          <w:rPr>
+            <w:color w:val="1F4E99"/>
+            <w:u w:val="single"/>
+          </w:rPr>
+          <w:t xml:space="preserve">PHẦN F. Ghi chú</w:t>
+        </w:r>
+      </w:hyperlink>
+    </w:p>
+    <w:p>
+      <w:r>
+        <w:br w:type="page"/>
+      </w:r>
+    </w:p>
+    <w:p>
+      <w:bookmarkStart w:id="0" w:name="muc_0"/>
       <w:pPr>
         <w:pStyle w:val="Heading1"/>
       </w:pPr>
@@ -12,6 +617,7 @@
         </w:rPr>
         <w:t>MAI LÀM ĐÚNG THEO THỨ TỰ NÀY</w:t>
       </w:r>
+      <w:bookmarkEnd w:id="0"/>
     </w:p>
     <w:p>
       <w:r>
@@ -94,6 +700,7 @@
       </w:r>
     </w:p>
     <w:p>
+      <w:bookmarkStart w:id="1" w:name="muc_1"/>
       <w:pPr>
         <w:pStyle w:val="Heading2"/>
       </w:pPr>
@@ -103,6 +710,7 @@
         </w:rPr>
         <w:t>TRƯỚC GIỜ THI (ở nhà / lúc vào phòng)</w:t>
       </w:r>
+      <w:bookmarkEnd w:id="1"/>
     </w:p>
     <w:p>
       <w:pPr>
@@ -209,6 +817,7 @@
       </w:r>
     </w:p>
     <w:p>
+      <w:bookmarkStart w:id="2" w:name="muc_2"/>
       <w:pPr>
         <w:pStyle w:val="Heading2"/>
       </w:pPr>
@@ -218,6 +827,7 @@
         </w:rPr>
         <w:t>PHẦN 1. BÀI 1 TRÊN LAPTOP (làm ngay khi BTC phát đề)</w:t>
       </w:r>
+      <w:bookmarkEnd w:id="2"/>
     </w:p>
     <w:p>
       <w:pPr>
@@ -619,6 +1229,7 @@
       </w:r>
     </w:p>
     <w:p>
+      <w:bookmarkStart w:id="3" w:name="muc_3"/>
       <w:pPr>
         <w:pStyle w:val="Heading2"/>
       </w:pPr>
@@ -628,6 +1239,7 @@
         </w:rPr>
         <w:t>PHẦN 2. BÀI 1 TRÊN JUPYTER (làm song song)</w:t>
       </w:r>
+      <w:bookmarkEnd w:id="3"/>
     </w:p>
     <w:p>
       <w:r>
@@ -1447,6 +2059,7 @@
       </w:r>
     </w:p>
     <w:p>
+      <w:bookmarkStart w:id="4" w:name="muc_4"/>
       <w:pPr>
         <w:pStyle w:val="Heading2"/>
       </w:pPr>
@@ -1456,6 +2069,7 @@
         </w:rPr>
         <w:t>PHẦN 3. NỘP BÀI 1</w:t>
       </w:r>
+      <w:bookmarkEnd w:id="4"/>
     </w:p>
     <w:p>
       <w:pPr>
@@ -1788,6 +2402,7 @@
       </w:r>
     </w:p>
     <w:p>
+      <w:bookmarkStart w:id="5" w:name="muc_5"/>
       <w:pPr>
         <w:pStyle w:val="Heading2"/>
       </w:pPr>
@@ -1797,6 +2412,7 @@
         </w:rPr>
         <w:t>PHẦN 4. BÀI 2 (trong lúc bài 1 đang chạy)</w:t>
       </w:r>
+      <w:bookmarkEnd w:id="5"/>
     </w:p>
     <w:p>
       <w:r>
@@ -2210,6 +2826,7 @@
       </w:r>
     </w:p>
     <w:p>
+      <w:bookmarkStart w:id="6" w:name="muc_6"/>
       <w:pPr>
         <w:pStyle w:val="Heading2"/>
       </w:pPr>
@@ -2219,6 +2836,7 @@
         </w:rPr>
         <w:t>PHẦN 5. SAU 3 GIỜ ĐẦU</w:t>
       </w:r>
+      <w:bookmarkEnd w:id="6"/>
     </w:p>
     <w:p>
       <w:pPr>
@@ -2378,6 +2996,7 @@
       </w:r>
     </w:p>
     <w:p>
+      <w:bookmarkStart w:id="7" w:name="muc_7"/>
       <w:pPr>
         <w:pStyle w:val="Heading2"/>
       </w:pPr>
@@ -2387,6 +3006,7 @@
         </w:rPr>
         <w:t>PHẦN 6. DÙNG AI CỦA BTC (mỗi phiên tối đa 200k)</w:t>
       </w:r>
+      <w:bookmarkEnd w:id="7"/>
     </w:p>
     <w:p>
       <w:pPr>
@@ -2474,6 +3094,7 @@
       </w:r>
     </w:p>
     <w:p>
+      <w:bookmarkStart w:id="8" w:name="muc_8"/>
       <w:pPr>
         <w:pStyle w:val="Heading2"/>
       </w:pPr>
@@ -2483,6 +3104,7 @@
         </w:rPr>
         <w:t>PHẦN 7. CUỐI GIỜ: BẢO VỆ</w:t>
       </w:r>
+      <w:bookmarkEnd w:id="8"/>
     </w:p>
     <w:p>
       <w:pPr>
@@ -2561,6 +3183,7 @@
       </w:r>
     </w:p>
     <w:p>
+      <w:bookmarkStart w:id="9" w:name="muc_9"/>
       <w:pPr>
         <w:pStyle w:val="Heading2"/>
       </w:pPr>
@@ -2570,6 +3193,7 @@
         </w:rPr>
         <w:t>NẾU CÓ LỖI</w:t>
       </w:r>
+      <w:bookmarkEnd w:id="9"/>
     </w:p>
     <w:tbl>
       <w:tblPr>
@@ -2932,6 +3556,7 @@
       </w:r>
     </w:p>
     <w:p>
+      <w:bookmarkStart w:id="10" w:name="muc_10"/>
       <w:pPr>
         <w:pStyle w:val="Heading1"/>
       </w:pPr>
@@ -2941,6 +3566,7 @@
         </w:rPr>
         <w:t>HƯỚNG DẪN NGÀY THI — Phenikaa AI Hackathon 2026</w:t>
       </w:r>
+      <w:bookmarkEnd w:id="10"/>
     </w:p>
     <w:p>
       <w:r>
@@ -3016,6 +3642,7 @@
       </w:r>
     </w:p>
     <w:p>
+      <w:bookmarkStart w:id="11" w:name="muc_11"/>
       <w:pPr>
         <w:pStyle w:val="Heading2"/>
       </w:pPr>
@@ -3025,6 +3652,7 @@
         </w:rPr>
         <w:t>LUẬT MỚI (thầy báo tối 14/10) — ĐỌC ĐẦU TIÊN</w:t>
       </w:r>
+      <w:bookmarkEnd w:id="11"/>
     </w:p>
     <w:tbl>
       <w:tblPr>
@@ -3618,6 +4246,7 @@
     </w:tbl>
     <w:p/>
     <w:p>
+      <w:bookmarkStart w:id="12" w:name="muc_12"/>
       <w:pPr>
         <w:pStyle w:val="Heading2"/>
       </w:pPr>
@@ -3627,6 +4256,7 @@
         </w:rPr>
         <w:t>TÓM TẮT NHANH (đọc trước khi thi)</w:t>
       </w:r>
+      <w:bookmarkEnd w:id="12"/>
     </w:p>
     <w:p>
       <w:pPr>
@@ -5754,6 +6384,7 @@
       </w:r>
     </w:p>
     <w:p>
+      <w:bookmarkStart w:id="13" w:name="muc_13"/>
       <w:pPr>
         <w:pStyle w:val="Heading2"/>
       </w:pPr>
@@ -5763,6 +6394,7 @@
         </w:rPr>
         <w:t>BẢO VỆ CUỐI GIỜ (đọc thuộc, 3–5 phút)</w:t>
       </w:r>
+      <w:bookmarkEnd w:id="13"/>
     </w:p>
     <w:p>
       <w:r>
@@ -6510,6 +7142,7 @@
       </w:r>
     </w:p>
     <w:p>
+      <w:bookmarkStart w:id="14" w:name="muc_14"/>
       <w:pPr>
         <w:pStyle w:val="Heading1"/>
       </w:pPr>
@@ -6519,6 +7152,7 @@
         </w:rPr>
         <w:t>CHẠY TRÊN JUPYTERHUB (máy chủ của BTC)</w:t>
       </w:r>
+      <w:bookmarkEnd w:id="14"/>
     </w:p>
     <w:p>
       <w:r>
@@ -6600,6 +7234,7 @@
       </w:r>
     </w:p>
     <w:p>
+      <w:bookmarkStart w:id="15" w:name="muc_15"/>
       <w:pPr>
         <w:pStyle w:val="Heading2"/>
       </w:pPr>
@@ -6609,6 +7244,7 @@
         </w:rPr>
         <w:t>Bước 0. Dự phòng (đã làm sẵn trên máy Huệ)</w:t>
       </w:r>
+      <w:bookmarkEnd w:id="15"/>
     </w:p>
     <w:p>
       <w:r>
@@ -6727,6 +7363,7 @@
       </w:r>
     </w:p>
     <w:p>
+      <w:bookmarkStart w:id="16" w:name="muc_16"/>
       <w:pPr>
         <w:pStyle w:val="Heading2"/>
       </w:pPr>
@@ -6736,6 +7373,7 @@
         </w:rPr>
         <w:t>Bước 1. Đăng nhập và mở Terminal</w:t>
       </w:r>
+      <w:bookmarkEnd w:id="16"/>
     </w:p>
     <w:p>
       <w:pPr>
@@ -6849,6 +7487,7 @@
       </w:r>
     </w:p>
     <w:p>
+      <w:bookmarkStart w:id="17" w:name="muc_17"/>
       <w:pPr>
         <w:pStyle w:val="Heading2"/>
       </w:pPr>
@@ -6858,6 +7497,7 @@
         </w:rPr>
         <w:t>Bước 2. Đưa bộ đồ nghề lên</w:t>
       </w:r>
+      <w:bookmarkEnd w:id="17"/>
     </w:p>
     <w:p>
       <w:r>
@@ -7009,6 +7649,7 @@
     </w:tbl>
     <w:p/>
     <w:p>
+      <w:bookmarkStart w:id="18" w:name="muc_18"/>
       <w:pPr>
         <w:pStyle w:val="Heading2"/>
       </w:pPr>
@@ -7018,6 +7659,7 @@
         </w:rPr>
         <w:t>Bước 3. Cài đặt (một lần, 5–20 phút)</w:t>
       </w:r>
+      <w:bookmarkEnd w:id="18"/>
     </w:p>
     <w:tbl>
       <w:tblPr>
@@ -7352,6 +7994,7 @@
       </w:r>
     </w:p>
     <w:p>
+      <w:bookmarkStart w:id="19" w:name="muc_19"/>
       <w:pPr>
         <w:pStyle w:val="Heading2"/>
       </w:pPr>
@@ -7361,6 +8004,7 @@
         </w:rPr>
         <w:t>Bước 4. Bài 1</w:t>
       </w:r>
+      <w:bookmarkEnd w:id="19"/>
     </w:p>
     <w:p>
       <w:pPr>
@@ -7714,6 +8358,7 @@
       </w:r>
     </w:p>
     <w:p>
+      <w:bookmarkStart w:id="20" w:name="muc_20"/>
       <w:pPr>
         <w:pStyle w:val="Heading2"/>
       </w:pPr>
@@ -7723,6 +8368,7 @@
         </w:rPr>
         <w:t>Bước 5. Sửa code và học lại</w:t>
       </w:r>
+      <w:bookmarkEnd w:id="20"/>
     </w:p>
     <w:p>
       <w:pPr>
@@ -7893,6 +8539,7 @@
       </w:r>
     </w:p>
     <w:p>
+      <w:bookmarkStart w:id="21" w:name="muc_21"/>
       <w:pPr>
         <w:pStyle w:val="Heading2"/>
       </w:pPr>
@@ -7902,6 +8549,7 @@
         </w:rPr>
         <w:t>Bước 6. Bài 2</w:t>
       </w:r>
+      <w:bookmarkEnd w:id="21"/>
     </w:p>
     <w:p>
       <w:r>
@@ -8089,6 +8737,7 @@
     </w:tbl>
     <w:p/>
     <w:p>
+      <w:bookmarkStart w:id="22" w:name="muc_22"/>
       <w:pPr>
         <w:pStyle w:val="Heading2"/>
       </w:pPr>
@@ -8098,6 +8747,7 @@
         </w:rPr>
         <w:t>Có GPU thì nhanh hơn ở đâu</w:t>
       </w:r>
+      <w:bookmarkEnd w:id="22"/>
     </w:p>
     <w:tbl>
       <w:tblPr>
@@ -8204,6 +8854,7 @@
     </w:tbl>
     <w:p/>
     <w:p>
+      <w:bookmarkStart w:id="23" w:name="muc_23"/>
       <w:pPr>
         <w:pStyle w:val="Heading2"/>
       </w:pPr>
@@ -8213,6 +8864,7 @@
         </w:rPr>
         <w:t>Thêm: notebook</w:t>
       </w:r>
+      <w:bookmarkEnd w:id="23"/>
     </w:p>
     <w:p>
       <w:r>
@@ -8255,6 +8907,7 @@
       </w:r>
     </w:p>
     <w:p>
+      <w:bookmarkStart w:id="24" w:name="muc_24"/>
       <w:pPr>
         <w:pStyle w:val="Heading1"/>
       </w:pPr>
@@ -8264,6 +8917,7 @@
         </w:rPr>
         <w:t>SỔ TAY BÀI 1 — Campus Courier nâng cấp</w:t>
       </w:r>
+      <w:bookmarkEnd w:id="24"/>
     </w:p>
     <w:p>
       <w:r>
@@ -8291,6 +8945,7 @@
       </w:r>
     </w:p>
     <w:p>
+      <w:bookmarkStart w:id="25" w:name="muc_25"/>
       <w:pPr>
         <w:pStyle w:val="Heading2"/>
       </w:pPr>
@@ -8300,6 +8955,7 @@
         </w:rPr>
         <w:t>PHẦN A. Làm bài (trường hợp bình thường)</w:t>
       </w:r>
+      <w:bookmarkEnd w:id="25"/>
     </w:p>
     <w:p>
       <w:pPr>
@@ -10049,6 +10705,7 @@
       </w:r>
     </w:p>
     <w:p>
+      <w:bookmarkStart w:id="26" w:name="muc_26"/>
       <w:pPr>
         <w:pStyle w:val="Heading2"/>
       </w:pPr>
@@ -10058,6 +10715,7 @@
         </w:rPr>
         <w:t>PHẦN B. Khi có trục trặc</w:t>
       </w:r>
+      <w:bookmarkEnd w:id="26"/>
     </w:p>
     <w:p>
       <w:pPr>
@@ -10824,6 +11482,7 @@
       </w:r>
     </w:p>
     <w:p>
+      <w:bookmarkStart w:id="27" w:name="muc_27"/>
       <w:pPr>
         <w:pStyle w:val="Heading2"/>
       </w:pPr>
@@ -10833,6 +11492,7 @@
         </w:rPr>
         <w:t>PHẦN C. Dùng AI của BTC để sửa code (token có hạn)</w:t>
       </w:r>
+      <w:bookmarkEnd w:id="27"/>
     </w:p>
     <w:p>
       <w:r>
@@ -12585,6 +13245,7 @@
       </w:r>
     </w:p>
     <w:p>
+      <w:bookmarkStart w:id="28" w:name="muc_28"/>
       <w:pPr>
         <w:pStyle w:val="Heading2"/>
       </w:pPr>
@@ -12594,6 +13255,7 @@
         </w:rPr>
         <w:t>PHẦN D. Đề đổi gì thì kết quả ra sao</w:t>
       </w:r>
+      <w:bookmarkEnd w:id="28"/>
     </w:p>
     <w:p>
       <w:r>
@@ -12990,6 +13652,7 @@
     </w:tbl>
     <w:p/>
     <w:p>
+      <w:bookmarkStart w:id="29" w:name="muc_29"/>
       <w:pPr>
         <w:pStyle w:val="Heading2"/>
       </w:pPr>
@@ -12999,6 +13662,7 @@
         </w:rPr>
         <w:t>PHẦN E. Chia thời gian (5 giờ, 2 bài)</w:t>
       </w:r>
+      <w:bookmarkEnd w:id="29"/>
     </w:p>
     <w:tbl>
       <w:tblPr>
@@ -13239,6 +13903,7 @@
       </w:r>
     </w:p>
     <w:p>
+      <w:bookmarkStart w:id="30" w:name="muc_30"/>
       <w:pPr>
         <w:pStyle w:val="Heading2"/>
       </w:pPr>
@@ -13248,6 +13913,7 @@
         </w:rPr>
         <w:t>PHẦN F. Tập trước ở nhà (10 phút)</w:t>
       </w:r>
+      <w:bookmarkEnd w:id="30"/>
     </w:p>
     <w:p>
       <w:r>
@@ -13394,6 +14060,7 @@
       </w:r>
     </w:p>
     <w:p>
+      <w:bookmarkStart w:id="31" w:name="muc_31"/>
       <w:pPr>
         <w:pStyle w:val="Heading2"/>
       </w:pPr>
@@ -13403,6 +14070,7 @@
         </w:rPr>
         <w:t>PHẦN G. Ghi chú kỹ thuật (không cần đọc khi thi)</w:t>
       </w:r>
+      <w:bookmarkEnd w:id="31"/>
     </w:p>
     <w:p>
       <w:pPr>
@@ -13725,6 +14393,7 @@
       </w:r>
     </w:p>
     <w:p>
+      <w:bookmarkStart w:id="32" w:name="muc_32"/>
       <w:pPr>
         <w:pStyle w:val="Heading1"/>
       </w:pPr>
@@ -13734,6 +14403,7 @@
         </w:rPr>
         <w:t>SỔ TAY BÀI 2 — bài mới chưa biết đề</w:t>
       </w:r>
+      <w:bookmarkEnd w:id="32"/>
     </w:p>
     <w:p>
       <w:r>
@@ -13785,6 +14455,7 @@
       </w:r>
     </w:p>
     <w:p>
+      <w:bookmarkStart w:id="33" w:name="muc_33"/>
       <w:pPr>
         <w:pStyle w:val="Heading2"/>
       </w:pPr>
@@ -13794,6 +14465,7 @@
         </w:rPr>
         <w:t>PHẦN A. Đọc đề, xác định kiểu bài (5 phút)</w:t>
       </w:r>
+      <w:bookmarkEnd w:id="33"/>
     </w:p>
     <w:p>
       <w:r>
@@ -14826,6 +15498,7 @@
       </w:r>
     </w:p>
     <w:p>
+      <w:bookmarkStart w:id="34" w:name="muc_34"/>
       <w:pPr>
         <w:pStyle w:val="Heading2"/>
       </w:pPr>
@@ -14835,6 +15508,7 @@
         </w:rPr>
         <w:t>PHẦN B. Chạy (kiểu 1–7)</w:t>
       </w:r>
+      <w:bookmarkEnd w:id="34"/>
     </w:p>
     <w:p>
       <w:pPr>
@@ -16940,6 +17614,7 @@
       </w:r>
     </w:p>
     <w:p>
+      <w:bookmarkStart w:id="35" w:name="muc_35"/>
       <w:pPr>
         <w:pStyle w:val="Heading2"/>
       </w:pPr>
@@ -16949,6 +17624,7 @@
         </w:rPr>
         <w:t>PHẦN C. Gặp lỗi</w:t>
       </w:r>
+      <w:bookmarkEnd w:id="35"/>
     </w:p>
     <w:p>
       <w:r>
@@ -17266,6 +17942,7 @@
     </w:tbl>
     <w:p/>
     <w:p>
+      <w:bookmarkStart w:id="36" w:name="muc_36"/>
       <w:pPr>
         <w:pStyle w:val="Heading2"/>
       </w:pPr>
@@ -17275,6 +17952,7 @@
         </w:rPr>
         <w:t>PHẦN D. Dùng AI của BTC cho bài 2</w:t>
       </w:r>
+      <w:bookmarkEnd w:id="36"/>
     </w:p>
     <w:p>
       <w:r>
@@ -18252,6 +18930,7 @@
     </w:tbl>
     <w:p/>
     <w:p>
+      <w:bookmarkStart w:id="37" w:name="muc_37"/>
       <w:pPr>
         <w:pStyle w:val="Heading2"/>
       </w:pPr>
@@ -18261,6 +18940,7 @@
         </w:rPr>
         <w:t>PHẦN E. Bộ này dùng gì (đối chiếu với danh mục kiến thức IOAI)</w:t>
       </w:r>
+      <w:bookmarkEnd w:id="37"/>
     </w:p>
     <w:tbl>
       <w:tblPr>
@@ -18721,6 +19401,7 @@
     </w:tbl>
     <w:p/>
     <w:p>
+      <w:bookmarkStart w:id="38" w:name="muc_38"/>
       <w:pPr>
         <w:pStyle w:val="Heading2"/>
       </w:pPr>
@@ -18730,6 +19411,7 @@
         </w:rPr>
         <w:t>PHẦN F. Ghi chú</w:t>
       </w:r>
+      <w:bookmarkEnd w:id="38"/>
     </w:p>
     <w:p>
       <w:pPr>

</xml_diff>